<commit_message>
Woops, forgot the document
</commit_message>
<xml_diff>
--- a/ANE21_PCB.docx
+++ b/ANE21_PCB.docx
@@ -4,6 +4,15 @@
   <w:body>
     <w:sdt>
       <w:sdtPr>
+        <w:rPr>
+          <w:rFonts w:asciiTheme="minorHAnsi" w:eastAsiaTheme="minorHAnsi" w:hAnsiTheme="minorHAnsi" w:cstheme="minorBidi"/>
+          <w:color w:val="auto"/>
+          <w:kern w:val="2"/>
+          <w:sz w:val="24"/>
+          <w:szCs w:val="24"/>
+          <w:lang w:val="nl-NL"/>
+          <w14:ligatures w14:val="standardContextual"/>
+        </w:rPr>
         <w:id w:val="1859695297"/>
         <w:docPartObj>
           <w:docPartGallery w:val="Table of Contents"/>
@@ -12,16 +21,9 @@
       </w:sdtPr>
       <w:sdtEndPr>
         <w:rPr>
-          <w:rFonts w:asciiTheme="minorHAnsi" w:eastAsiaTheme="minorHAnsi" w:hAnsiTheme="minorHAnsi" w:cstheme="minorBidi"/>
           <w:b/>
           <w:bCs/>
           <w:noProof/>
-          <w:color w:val="auto"/>
-          <w:kern w:val="2"/>
-          <w:sz w:val="24"/>
-          <w:szCs w:val="24"/>
-          <w:lang w:val="nl-NL"/>
-          <w14:ligatures w14:val="standardContextual"/>
         </w:rPr>
       </w:sdtEndPr>
       <w:sdtContent>
@@ -1045,44 +1047,36 @@
       <w:pPr>
         <w:pStyle w:val="NoSpacing"/>
         <w:ind w:left="720"/>
-        <w:rPr>
-          <w:lang w:val="nl-NL"/>
-        </w:rPr>
       </w:pPr>
       <w:r>
-        <w:rPr>
-          <w:lang w:val="nl-NL"/>
-        </w:rPr>
         <w:t>10. Fan</w:t>
       </w:r>
     </w:p>
     <w:p>
       <w:pPr>
         <w:pStyle w:val="NoSpacing"/>
-        <w:rPr>
-          <w:lang w:val="nl-NL"/>
-        </w:rPr>
       </w:pPr>
-      <w:r>
-        <w:rPr>
-          <w:lang w:val="nl-NL"/>
-        </w:rPr>
-        <w:t>Optioneel:</w:t>
+      <w:proofErr w:type="spellStart"/>
+      <w:r>
+        <w:t>Optioneel</w:t>
+      </w:r>
+      <w:proofErr w:type="spellEnd"/>
+      <w:r>
+        <w:t>:</w:t>
       </w:r>
     </w:p>
     <w:p>
       <w:pPr>
         <w:pStyle w:val="NoSpacing"/>
         <w:ind w:left="720"/>
-        <w:rPr>
-          <w:lang w:val="nl-NL"/>
-        </w:rPr>
       </w:pPr>
-      <w:r>
-        <w:rPr>
-          <w:lang w:val="nl-NL"/>
-        </w:rPr>
-        <w:t>Hardwarematig debugging LED</w:t>
+      <w:proofErr w:type="spellStart"/>
+      <w:r>
+        <w:t>Hardwarematig</w:t>
+      </w:r>
+      <w:proofErr w:type="spellEnd"/>
+      <w:r>
+        <w:t xml:space="preserve"> debugging LED</w:t>
       </w:r>
     </w:p>
     <w:p>
@@ -1187,40 +1181,19 @@
     <w:p>
       <w:pPr>
         <w:pStyle w:val="NoSpacing"/>
-        <w:rPr>
-          <w:lang w:val="nl-NL"/>
-        </w:rPr>
       </w:pPr>
       <w:hyperlink r:id="rId8" w:history="1">
         <w:r>
           <w:rPr>
             <w:rStyle w:val="Hyperlink"/>
-            <w:lang w:val="nl-NL"/>
           </w:rPr>
-          <w:t>CM4 B</w:t>
-        </w:r>
-        <w:r>
-          <w:rPr>
-            <w:rStyle w:val="Hyperlink"/>
-            <w:lang w:val="nl-NL"/>
-          </w:rPr>
-          <w:t>O</w:t>
-        </w:r>
-        <w:r>
-          <w:rPr>
-            <w:rStyle w:val="Hyperlink"/>
-            <w:lang w:val="nl-NL"/>
-          </w:rPr>
-          <w:t>M</w:t>
+          <w:t>CM4 BOM</w:t>
         </w:r>
       </w:hyperlink>
     </w:p>
     <w:p>
       <w:pPr>
         <w:pStyle w:val="NoSpacing"/>
-        <w:rPr>
-          <w:lang w:val="nl-NL"/>
-        </w:rPr>
       </w:pPr>
     </w:p>
     <w:p>
@@ -1373,9 +1346,15 @@
     <w:p>
       <w:pPr>
         <w:pStyle w:val="Heading1"/>
+        <w:rPr>
+          <w:lang w:val="en-GB"/>
+        </w:rPr>
       </w:pPr>
       <w:bookmarkStart w:id="0" w:name="_Toc223434583"/>
       <w:r>
+        <w:rPr>
+          <w:lang w:val="en-GB"/>
+        </w:rPr>
         <w:lastRenderedPageBreak/>
         <w:t>Pin definitions per unit</w:t>
       </w:r>
@@ -1384,26 +1363,21 @@
     <w:p>
       <w:pPr>
         <w:pStyle w:val="NoSpacing"/>
-        <w:rPr>
-          <w:lang w:val="nl-NL"/>
-        </w:rPr>
       </w:pPr>
-      <w:r>
-        <w:rPr>
-          <w:lang w:val="nl-NL"/>
-        </w:rPr>
-        <w:t>Pinnen: (</w:t>
-      </w:r>
-      <w:r>
-        <w:rPr>
-          <w:lang w:val="nl-NL"/>
-        </w:rPr>
+      <w:proofErr w:type="spellStart"/>
+      <w:r>
+        <w:t>Pinnen</w:t>
+      </w:r>
+      <w:proofErr w:type="spellEnd"/>
+      <w:r>
+        <w:t>: (</w:t>
+      </w:r>
+      <w:proofErr w:type="spellStart"/>
+      <w:r>
         <w:t>aantal</w:t>
       </w:r>
-      <w:r>
-        <w:rPr>
-          <w:lang w:val="nl-NL"/>
-        </w:rPr>
+      <w:proofErr w:type="spellEnd"/>
+      <w:r>
         <w:t>)</w:t>
       </w:r>
     </w:p>
@@ -1476,20 +1450,33 @@
     <w:p>
       <w:pPr>
         <w:pStyle w:val="NoSpacing"/>
+        <w:rPr>
+          <w:lang w:val="nl-NL"/>
+        </w:rPr>
       </w:pPr>
       <w:r>
+        <w:rPr>
+          <w:lang w:val="nl-NL"/>
+        </w:rPr>
         <w:t>USB-C</w:t>
       </w:r>
       <w:r>
+        <w:rPr>
+          <w:lang w:val="nl-NL"/>
+        </w:rPr>
         <w:tab/>
       </w:r>
       <w:r>
+        <w:rPr>
+          <w:lang w:val="nl-NL"/>
+        </w:rPr>
         <w:tab/>
       </w:r>
       <w:r>
+        <w:rPr>
+          <w:lang w:val="nl-NL"/>
+        </w:rPr>
         <w:tab/>
-      </w:r>
-      <w:r>
         <w:t>x</w:t>
       </w:r>
     </w:p>
@@ -1538,23 +1525,14 @@
     <w:p>
       <w:pPr>
         <w:pStyle w:val="NoSpacing"/>
-        <w:rPr>
-          <w:lang w:val="nl-NL"/>
-        </w:rPr>
       </w:pPr>
       <w:r>
-        <w:rPr>
-          <w:lang w:val="nl-NL"/>
-        </w:rPr>
         <w:t xml:space="preserve">TRD0_N / TRD0_P + TRD0_TAP (0 t/m 3) + ETH_LEDG + ETH_LEDY </w:t>
       </w:r>
       <w:r>
         <w:sym w:font="Wingdings" w:char="F0E0"/>
       </w:r>
       <w:r>
-        <w:rPr>
-          <w:lang w:val="nl-NL"/>
-        </w:rPr>
         <w:t xml:space="preserve"> 14 pins</w:t>
       </w:r>
     </w:p>
@@ -3076,42 +3054,15 @@
           <w:lang w:val="nl-NL"/>
         </w:rPr>
       </w:pPr>
-      <w:r>
-        <w:rPr>
-          <w:lang w:val="nl-NL"/>
-        </w:rPr>
-        <w:fldChar w:fldCharType="begin"/>
-      </w:r>
-      <w:r>
-        <w:rPr>
-          <w:lang w:val="nl-NL"/>
-        </w:rPr>
-        <w:instrText>HYPERLINK "https://www.diodes.com/assets/Datasheets/AP64501.pdf"</w:instrText>
-      </w:r>
-      <w:r>
-        <w:rPr>
-          <w:lang w:val="nl-NL"/>
-        </w:rPr>
-      </w:r>
-      <w:r>
-        <w:rPr>
-          <w:lang w:val="nl-NL"/>
-        </w:rPr>
-        <w:fldChar w:fldCharType="separate"/>
-      </w:r>
-      <w:r>
-        <w:rPr>
-          <w:rStyle w:val="Hyperlink"/>
-          <w:lang w:val="nl-NL"/>
-        </w:rPr>
-        <w:t>AP64501SP-13</w:t>
-      </w:r>
-      <w:r>
-        <w:rPr>
-          <w:lang w:val="nl-NL"/>
-        </w:rPr>
-        <w:fldChar w:fldCharType="end"/>
-      </w:r>
+      <w:hyperlink r:id="rId11" w:history="1">
+        <w:r>
+          <w:rPr>
+            <w:rStyle w:val="Hyperlink"/>
+            <w:lang w:val="nl-NL"/>
+          </w:rPr>
+          <w:t>AP64501SP-13</w:t>
+        </w:r>
+      </w:hyperlink>
       <w:r>
         <w:rPr>
           <w:lang w:val="nl-NL"/>
@@ -3142,24 +3093,12 @@
       <w:r>
         <w:t xml:space="preserve"> </w:t>
       </w:r>
-      <w:hyperlink r:id="rId11" w:anchor="page=11" w:history="1">
+      <w:hyperlink r:id="rId12" w:anchor="page=11" w:history="1">
         <w:r>
           <w:rPr>
             <w:rStyle w:val="Hyperlink"/>
           </w:rPr>
-          <w:t>(</w:t>
-        </w:r>
-        <w:r>
-          <w:rPr>
-            <w:rStyle w:val="Hyperlink"/>
-          </w:rPr>
-          <w:t>2.6. Dual HDMI 2.0</w:t>
-        </w:r>
-        <w:r>
-          <w:rPr>
-            <w:rStyle w:val="Hyperlink"/>
-          </w:rPr>
-          <w:t xml:space="preserve"> in datasheet)</w:t>
+          <w:t>(2.6. Dual HDMI 2.0 in datasheet)</w:t>
         </w:r>
       </w:hyperlink>
     </w:p>
@@ -3406,13 +3345,7 @@
               <w:rPr>
                 <w:lang w:val="nl-NL"/>
               </w:rPr>
-              <w:t>_D2</w:t>
-            </w:r>
-            <w:r>
-              <w:rPr>
-                <w:lang w:val="nl-NL"/>
-              </w:rPr>
-              <w:t>N</w:t>
+              <w:t>_D2N</w:t>
             </w:r>
           </w:p>
         </w:tc>
@@ -3509,19 +3442,7 @@
               <w:rPr>
                 <w:lang w:val="nl-NL"/>
               </w:rPr>
-              <w:t>_D</w:t>
-            </w:r>
-            <w:r>
-              <w:rPr>
-                <w:lang w:val="nl-NL"/>
-              </w:rPr>
-              <w:t>1</w:t>
-            </w:r>
-            <w:r>
-              <w:rPr>
-                <w:lang w:val="nl-NL"/>
-              </w:rPr>
-              <w:t>P</w:t>
+              <w:t>_D1P</w:t>
             </w:r>
           </w:p>
         </w:tc>
@@ -3618,13 +3539,7 @@
               <w:rPr>
                 <w:lang w:val="nl-NL"/>
               </w:rPr>
-              <w:t>_D</w:t>
-            </w:r>
-            <w:r>
-              <w:rPr>
-                <w:lang w:val="nl-NL"/>
-              </w:rPr>
-              <w:t>1N</w:t>
+              <w:t>_D1N</w:t>
             </w:r>
           </w:p>
         </w:tc>
@@ -3721,7 +3636,92 @@
               <w:rPr>
                 <w:lang w:val="nl-NL"/>
               </w:rPr>
-              <w:t>_D</w:t>
+              <w:t>_D0P</w:t>
+            </w:r>
+          </w:p>
+        </w:tc>
+        <w:tc>
+          <w:tcPr>
+            <w:tcW w:w="1701" w:type="dxa"/>
+          </w:tcPr>
+          <w:p>
+            <w:pPr>
+              <w:pStyle w:val="NoSpacing"/>
+              <w:rPr>
+                <w:lang w:val="nl-NL"/>
+              </w:rPr>
+            </w:pPr>
+            <w:r>
+              <w:rPr>
+                <w:lang w:val="nl-NL"/>
+              </w:rPr>
+              <w:t>182</w:t>
+            </w:r>
+          </w:p>
+        </w:tc>
+        <w:tc>
+          <w:tcPr>
+            <w:tcW w:w="2012" w:type="dxa"/>
+          </w:tcPr>
+          <w:p>
+            <w:pPr>
+              <w:pStyle w:val="NoSpacing"/>
+              <w:rPr>
+                <w:lang w:val="nl-NL"/>
+              </w:rPr>
+            </w:pPr>
+            <w:r>
+              <w:rPr>
+                <w:lang w:val="nl-NL"/>
+              </w:rPr>
+              <w:t>7</w:t>
+            </w:r>
+          </w:p>
+        </w:tc>
+        <w:tc>
+          <w:tcPr>
+            <w:tcW w:w="1803" w:type="dxa"/>
+          </w:tcPr>
+          <w:p>
+            <w:pPr>
+              <w:pStyle w:val="NoSpacing"/>
+              <w:rPr>
+                <w:lang w:val="nl-NL"/>
+              </w:rPr>
+            </w:pPr>
+          </w:p>
+        </w:tc>
+        <w:tc>
+          <w:tcPr>
+            <w:tcW w:w="1804" w:type="dxa"/>
+          </w:tcPr>
+          <w:p>
+            <w:pPr>
+              <w:pStyle w:val="NoSpacing"/>
+              <w:rPr>
+                <w:lang w:val="nl-NL"/>
+              </w:rPr>
+            </w:pPr>
+          </w:p>
+        </w:tc>
+      </w:tr>
+      <w:tr>
+        <w:tc>
+          <w:tcPr>
+            <w:tcW w:w="1696" w:type="dxa"/>
+          </w:tcPr>
+          <w:p>
+            <w:pPr>
+              <w:pStyle w:val="NoSpacing"/>
+              <w:rPr>
+                <w:lang w:val="nl-NL"/>
+              </w:rPr>
+            </w:pPr>
+            <w:r>
+              <w:rPr>
+                <w:lang w:val="nl-NL"/>
+              </w:rPr>
+              <w:t>HDMI</w:t>
             </w:r>
             <w:r>
               <w:rPr>
@@ -3733,7 +3733,7 @@
               <w:rPr>
                 <w:lang w:val="nl-NL"/>
               </w:rPr>
-              <w:t>P</w:t>
+              <w:t>_D0N</w:t>
             </w:r>
           </w:p>
         </w:tc>
@@ -3752,7 +3752,7 @@
               <w:rPr>
                 <w:lang w:val="nl-NL"/>
               </w:rPr>
-              <w:t>182</w:t>
+              <w:t>184</w:t>
             </w:r>
           </w:p>
         </w:tc>
@@ -3771,7 +3771,7 @@
               <w:rPr>
                 <w:lang w:val="nl-NL"/>
               </w:rPr>
-              <w:t>7</w:t>
+              <w:t>9</w:t>
             </w:r>
           </w:p>
         </w:tc>
@@ -3830,13 +3830,7 @@
               <w:rPr>
                 <w:lang w:val="nl-NL"/>
               </w:rPr>
-              <w:t>_D</w:t>
-            </w:r>
-            <w:r>
-              <w:rPr>
-                <w:lang w:val="nl-NL"/>
-              </w:rPr>
-              <w:t>0N</w:t>
+              <w:t>_CKP</w:t>
             </w:r>
           </w:p>
         </w:tc>
@@ -3855,7 +3849,7 @@
               <w:rPr>
                 <w:lang w:val="nl-NL"/>
               </w:rPr>
-              <w:t>184</w:t>
+              <w:t>180</w:t>
             </w:r>
           </w:p>
         </w:tc>
@@ -3874,7 +3868,7 @@
               <w:rPr>
                 <w:lang w:val="nl-NL"/>
               </w:rPr>
-              <w:t>9</w:t>
+              <w:t>10</w:t>
             </w:r>
           </w:p>
         </w:tc>
@@ -3933,13 +3927,7 @@
               <w:rPr>
                 <w:lang w:val="nl-NL"/>
               </w:rPr>
-              <w:t>_</w:t>
-            </w:r>
-            <w:r>
-              <w:rPr>
-                <w:lang w:val="nl-NL"/>
-              </w:rPr>
-              <w:t>CKP</w:t>
+              <w:t>_CKN</w:t>
             </w:r>
           </w:p>
         </w:tc>
@@ -3958,7 +3946,7 @@
               <w:rPr>
                 <w:lang w:val="nl-NL"/>
               </w:rPr>
-              <w:t>180</w:t>
+              <w:t>190</w:t>
             </w:r>
           </w:p>
         </w:tc>
@@ -3977,7 +3965,7 @@
               <w:rPr>
                 <w:lang w:val="nl-NL"/>
               </w:rPr>
-              <w:t>10</w:t>
+              <w:t>12</w:t>
             </w:r>
           </w:p>
         </w:tc>
@@ -4036,13 +4024,7 @@
               <w:rPr>
                 <w:lang w:val="nl-NL"/>
               </w:rPr>
-              <w:t>_</w:t>
-            </w:r>
-            <w:r>
-              <w:rPr>
-                <w:lang w:val="nl-NL"/>
-              </w:rPr>
-              <w:t>CKN</w:t>
+              <w:t>_CEC</w:t>
             </w:r>
           </w:p>
         </w:tc>
@@ -4061,7 +4043,7 @@
               <w:rPr>
                 <w:lang w:val="nl-NL"/>
               </w:rPr>
-              <w:t>190</w:t>
+              <w:t>151</w:t>
             </w:r>
           </w:p>
         </w:tc>
@@ -4080,7 +4062,7 @@
               <w:rPr>
                 <w:lang w:val="nl-NL"/>
               </w:rPr>
-              <w:t>12</w:t>
+              <w:t>13</w:t>
             </w:r>
           </w:p>
         </w:tc>
@@ -4139,13 +4121,13 @@
               <w:rPr>
                 <w:lang w:val="nl-NL"/>
               </w:rPr>
-              <w:t>_</w:t>
-            </w:r>
-            <w:r>
-              <w:rPr>
-                <w:lang w:val="nl-NL"/>
-              </w:rPr>
-              <w:t>CEC</w:t>
+              <w:t>_S</w:t>
+            </w:r>
+            <w:r>
+              <w:rPr>
+                <w:lang w:val="nl-NL"/>
+              </w:rPr>
+              <w:t>DA</w:t>
             </w:r>
           </w:p>
         </w:tc>
@@ -4164,7 +4146,7 @@
               <w:rPr>
                 <w:lang w:val="nl-NL"/>
               </w:rPr>
-              <w:t>151</w:t>
+              <w:t>199</w:t>
             </w:r>
           </w:p>
         </w:tc>
@@ -4183,7 +4165,7 @@
               <w:rPr>
                 <w:lang w:val="nl-NL"/>
               </w:rPr>
-              <w:t>13</w:t>
+              <w:t>16</w:t>
             </w:r>
           </w:p>
         </w:tc>
@@ -4242,122 +4224,7 @@
               <w:rPr>
                 <w:lang w:val="nl-NL"/>
               </w:rPr>
-              <w:t>_</w:t>
-            </w:r>
-            <w:r>
-              <w:rPr>
-                <w:lang w:val="nl-NL"/>
-              </w:rPr>
-              <w:t>S</w:t>
-            </w:r>
-            <w:r>
-              <w:rPr>
-                <w:lang w:val="nl-NL"/>
-              </w:rPr>
-              <w:t>DA</w:t>
-            </w:r>
-          </w:p>
-        </w:tc>
-        <w:tc>
-          <w:tcPr>
-            <w:tcW w:w="1701" w:type="dxa"/>
-          </w:tcPr>
-          <w:p>
-            <w:pPr>
-              <w:pStyle w:val="NoSpacing"/>
-              <w:rPr>
-                <w:lang w:val="nl-NL"/>
-              </w:rPr>
-            </w:pPr>
-            <w:r>
-              <w:rPr>
-                <w:lang w:val="nl-NL"/>
-              </w:rPr>
-              <w:t>199</w:t>
-            </w:r>
-          </w:p>
-        </w:tc>
-        <w:tc>
-          <w:tcPr>
-            <w:tcW w:w="2012" w:type="dxa"/>
-          </w:tcPr>
-          <w:p>
-            <w:pPr>
-              <w:pStyle w:val="NoSpacing"/>
-              <w:rPr>
-                <w:lang w:val="nl-NL"/>
-              </w:rPr>
-            </w:pPr>
-            <w:r>
-              <w:rPr>
-                <w:lang w:val="nl-NL"/>
-              </w:rPr>
-              <w:t>16</w:t>
-            </w:r>
-          </w:p>
-        </w:tc>
-        <w:tc>
-          <w:tcPr>
-            <w:tcW w:w="1803" w:type="dxa"/>
-          </w:tcPr>
-          <w:p>
-            <w:pPr>
-              <w:pStyle w:val="NoSpacing"/>
-              <w:rPr>
-                <w:lang w:val="nl-NL"/>
-              </w:rPr>
-            </w:pPr>
-          </w:p>
-        </w:tc>
-        <w:tc>
-          <w:tcPr>
-            <w:tcW w:w="1804" w:type="dxa"/>
-          </w:tcPr>
-          <w:p>
-            <w:pPr>
-              <w:pStyle w:val="NoSpacing"/>
-              <w:rPr>
-                <w:lang w:val="nl-NL"/>
-              </w:rPr>
-            </w:pPr>
-          </w:p>
-        </w:tc>
-      </w:tr>
-      <w:tr>
-        <w:tc>
-          <w:tcPr>
-            <w:tcW w:w="1696" w:type="dxa"/>
-          </w:tcPr>
-          <w:p>
-            <w:pPr>
-              <w:pStyle w:val="NoSpacing"/>
-              <w:rPr>
-                <w:lang w:val="nl-NL"/>
-              </w:rPr>
-            </w:pPr>
-            <w:r>
-              <w:rPr>
-                <w:lang w:val="nl-NL"/>
-              </w:rPr>
-              <w:t>HDMI</w:t>
-            </w:r>
-            <w:r>
-              <w:rPr>
-                <w:lang w:val="nl-NL"/>
-              </w:rPr>
-              <w:t>0</w:t>
-            </w:r>
-            <w:r>
-              <w:rPr>
-                <w:lang w:val="nl-NL"/>
-              </w:rPr>
-              <w:t>_</w:t>
-            </w:r>
-            <w:r>
-              <w:rPr>
-                <w:lang w:val="nl-NL"/>
-              </w:rPr>
-              <w:t>S</w:t>
+              <w:t>_S</w:t>
             </w:r>
             <w:r>
               <w:rPr>
@@ -4461,13 +4328,7 @@
               <w:rPr>
                 <w:lang w:val="nl-NL"/>
               </w:rPr>
-              <w:t>_</w:t>
-            </w:r>
-            <w:r>
-              <w:rPr>
-                <w:lang w:val="nl-NL"/>
-              </w:rPr>
-              <w:t>HOTP</w:t>
+              <w:t>_HOTP</w:t>
             </w:r>
           </w:p>
         </w:tc>
@@ -4713,7 +4574,7 @@
           <w:noProof/>
         </w:rPr>
         <w:drawing>
-          <wp:inline distT="0" distB="0" distL="0" distR="0" wp14:anchorId="2020065A" wp14:editId="51E1F4F6">
+          <wp:inline distT="0" distB="0" distL="0" distR="0" wp14:anchorId="2020065A" wp14:editId="1D150756">
             <wp:extent cx="2719346" cy="2008025"/>
             <wp:effectExtent l="0" t="0" r="5080" b="0"/>
             <wp:docPr id="619101385" name="Picture 1" descr="Does HDMI 2.0 Support 1080p 120Hz? Addressing HDMI Questions ..."/>
@@ -4730,7 +4591,7 @@
                     </pic:cNvPicPr>
                   </pic:nvPicPr>
                   <pic:blipFill>
-                    <a:blip r:embed="rId12" cstate="print">
+                    <a:blip r:embed="rId13" cstate="print">
                       <a:extLst>
                         <a:ext uri="{28A0092B-C50C-407E-A947-70E740481C1C}">
                           <a14:useLocalDpi xmlns:a14="http://schemas.microsoft.com/office/drawing/2010/main" val="0"/>
@@ -4781,6 +4642,7 @@
       <w:r>
         <w:rPr>
           <w:rStyle w:val="Heading3Char"/>
+          <w:lang w:val="nl-NL"/>
         </w:rPr>
         <w:t>NVME</w:t>
       </w:r>
@@ -4791,63 +4653,15 @@
         </w:rPr>
         <w:t xml:space="preserve"> (</w:t>
       </w:r>
-      <w:r>
-        <w:rPr>
-          <w:lang w:val="nl-NL"/>
-        </w:rPr>
-        <w:fldChar w:fldCharType="begin"/>
-      </w:r>
-      <w:r>
-        <w:rPr>
-          <w:lang w:val="nl-NL"/>
-        </w:rPr>
-        <w:instrText>HYPERLINK "https://pip-assets.raspberrypi.com/categories/634-raspberry-pi-compute-module-4/documents/RP-008168-DS-1-cm4-datasheet.pdf?disposition=inline" \l "page=7"</w:instrText>
-      </w:r>
-      <w:r>
-        <w:rPr>
-          <w:lang w:val="nl-NL"/>
-        </w:rPr>
-      </w:r>
-      <w:r>
-        <w:rPr>
-          <w:lang w:val="nl-NL"/>
-        </w:rPr>
-        <w:fldChar w:fldCharType="separate"/>
-      </w:r>
-      <w:r>
-        <w:rPr>
-          <w:rStyle w:val="Hyperlink"/>
-          <w:lang w:val="nl-NL"/>
-        </w:rPr>
-        <w:t>2.3. PCIe (Gen2 x</w:t>
-      </w:r>
-      <w:r>
-        <w:rPr>
-          <w:rStyle w:val="Hyperlink"/>
-          <w:lang w:val="nl-NL"/>
-        </w:rPr>
-        <w:t>1</w:t>
-      </w:r>
-      <w:r>
-        <w:rPr>
-          <w:rStyle w:val="Hyperlink"/>
-          <w:lang w:val="nl-NL"/>
-        </w:rPr>
-        <w:t>)</w:t>
-      </w:r>
-      <w:r>
-        <w:rPr>
-          <w:rStyle w:val="Hyperlink"/>
-          <w:lang w:val="nl-NL"/>
-        </w:rPr>
-        <w:t xml:space="preserve"> Datasheet</w:t>
-      </w:r>
-      <w:r>
-        <w:rPr>
-          <w:lang w:val="nl-NL"/>
-        </w:rPr>
-        <w:fldChar w:fldCharType="end"/>
-      </w:r>
+      <w:hyperlink r:id="rId14" w:anchor="page=7" w:history="1">
+        <w:r>
+          <w:rPr>
+            <w:rStyle w:val="Hyperlink"/>
+            <w:lang w:val="nl-NL"/>
+          </w:rPr>
+          <w:t>2.3. PCIe (Gen2 x1) Datasheet</w:t>
+        </w:r>
+      </w:hyperlink>
       <w:r>
         <w:rPr>
           <w:lang w:val="nl-NL"/>
@@ -4910,38 +4724,25 @@
     <w:p>
       <w:pPr>
         <w:pStyle w:val="NoSpacing"/>
-        <w:rPr>
-          <w:lang w:val="nl-NL"/>
-        </w:rPr>
       </w:pPr>
-      <w:hyperlink r:id="rId13" w:anchor="page=12" w:history="1">
+      <w:hyperlink r:id="rId15" w:anchor="page=12" w:history="1">
         <w:r>
           <w:rPr>
             <w:rStyle w:val="Hyperlink"/>
-            <w:lang w:val="nl-NL"/>
           </w:rPr>
           <w:t>Web</w:t>
         </w:r>
         <w:r>
           <w:rPr>
             <w:rStyle w:val="Hyperlink"/>
-            <w:lang w:val="nl-NL"/>
           </w:rPr>
           <w:t>s</w:t>
         </w:r>
         <w:r>
           <w:rPr>
             <w:rStyle w:val="Hyperlink"/>
-            <w:lang w:val="nl-NL"/>
           </w:rPr>
-          <w:t>i</w:t>
-        </w:r>
-        <w:r>
-          <w:rPr>
-            <w:rStyle w:val="Hyperlink"/>
-            <w:lang w:val="nl-NL"/>
-          </w:rPr>
-          <w:t>te</w:t>
+          <w:t>ite</w:t>
         </w:r>
       </w:hyperlink>
     </w:p>
@@ -5988,13 +5789,7 @@
               <w:rPr>
                 <w:lang w:val="nl-NL"/>
               </w:rPr>
-              <w:t xml:space="preserve">122 </w:t>
-            </w:r>
-            <w:r>
-              <w:rPr>
-                <w:lang w:val="nl-NL"/>
-              </w:rPr>
-              <w:t>(kicad)</w:t>
+              <w:t>122 (kicad)</w:t>
             </w:r>
           </w:p>
         </w:tc>
@@ -6073,13 +5868,7 @@
               <w:rPr>
                 <w:lang w:val="nl-NL"/>
               </w:rPr>
-              <w:t xml:space="preserve">124 </w:t>
-            </w:r>
-            <w:r>
-              <w:rPr>
-                <w:lang w:val="nl-NL"/>
-              </w:rPr>
-              <w:t>(kicad)</w:t>
+              <w:t>124 (kicad)</w:t>
             </w:r>
           </w:p>
         </w:tc>
@@ -6237,13 +6026,7 @@
               <w:rPr>
                 <w:lang w:val="nl-NL"/>
               </w:rPr>
-              <w:t xml:space="preserve">118 </w:t>
-            </w:r>
-            <w:r>
-              <w:rPr>
-                <w:lang w:val="nl-NL"/>
-              </w:rPr>
-              <w:t>(kicad)</w:t>
+              <w:t>118 (kicad)</w:t>
             </w:r>
           </w:p>
         </w:tc>
@@ -6382,13 +6165,7 @@
               <w:rPr>
                 <w:lang w:val="nl-NL"/>
               </w:rPr>
-              <w:t>CLKREQ</w:t>
-            </w:r>
-            <w:r>
-              <w:rPr>
-                <w:lang w:val="nl-NL"/>
-              </w:rPr>
-              <w:t>#</w:t>
+              <w:t>CLKREQ#</w:t>
             </w:r>
           </w:p>
         </w:tc>
@@ -6407,13 +6184,7 @@
               <w:rPr>
                 <w:lang w:val="nl-NL"/>
               </w:rPr>
-              <w:t xml:space="preserve">102 </w:t>
-            </w:r>
-            <w:r>
-              <w:rPr>
-                <w:lang w:val="nl-NL"/>
-              </w:rPr>
-              <w:t>(ds)</w:t>
+              <w:t>102 (ds)</w:t>
             </w:r>
           </w:p>
         </w:tc>
@@ -6492,13 +6263,7 @@
               <w:rPr>
                 <w:lang w:val="nl-NL"/>
               </w:rPr>
-              <w:t xml:space="preserve">112 </w:t>
-            </w:r>
-            <w:r>
-              <w:rPr>
-                <w:lang w:val="nl-NL"/>
-              </w:rPr>
-              <w:t>(ds)</w:t>
+              <w:t>112 (ds)</w:t>
             </w:r>
           </w:p>
         </w:tc>
@@ -6650,13 +6415,7 @@
               <w:rPr>
                 <w:lang w:val="nl-NL"/>
               </w:rPr>
-              <w:t xml:space="preserve">110 </w:t>
-            </w:r>
-            <w:r>
-              <w:rPr>
-                <w:lang w:val="nl-NL"/>
-              </w:rPr>
-              <w:t>(ds)</w:t>
+              <w:t>110 (ds)</w:t>
             </w:r>
           </w:p>
         </w:tc>
@@ -7452,6 +7211,7 @@
       </w:pPr>
       <w:r>
         <w:rPr>
+          <w:noProof/>
           <w:lang w:val="nl-NL"/>
         </w:rPr>
         <w:drawing>
@@ -7470,7 +7230,7 @@
                     <pic:cNvPicPr/>
                   </pic:nvPicPr>
                   <pic:blipFill>
-                    <a:blip r:embed="rId14"/>
+                    <a:blip r:embed="rId16"/>
                     <a:stretch>
                       <a:fillRect/>
                     </a:stretch>
@@ -7494,23 +7254,14 @@
     <w:p>
       <w:pPr>
         <w:pStyle w:val="NoSpacing"/>
-        <w:rPr>
-          <w:lang w:val="nl-NL"/>
-        </w:rPr>
       </w:pPr>
       <w:r>
-        <w:rPr>
-          <w:lang w:val="nl-NL"/>
-        </w:rPr>
         <w:t xml:space="preserve"> </w:t>
       </w:r>
     </w:p>
     <w:p>
       <w:pPr>
         <w:pStyle w:val="NoSpacing"/>
-        <w:rPr>
-          <w:lang w:val="nl-NL"/>
-        </w:rPr>
       </w:pPr>
     </w:p>
     <w:p>
@@ -7522,42 +7273,18 @@
         <w:rPr>
           <w:rStyle w:val="Heading3Char"/>
         </w:rPr>
-        <w:t>USB</w:t>
-      </w:r>
-      <w:r>
-        <w:rPr>
-          <w:rStyle w:val="Heading3Char"/>
-        </w:rPr>
-        <w:t xml:space="preserve"> / USB_OTG</w:t>
+        <w:t>USB / USB_OTG</w:t>
       </w:r>
       <w:bookmarkEnd w:id="4"/>
       <w:r>
         <w:t xml:space="preserve"> (</w:t>
       </w:r>
-      <w:hyperlink r:id="rId15" w:anchor="page=8" w:history="1">
+      <w:hyperlink r:id="rId17" w:anchor="page=8" w:history="1">
         <w:r>
           <w:rPr>
             <w:rStyle w:val="Hyperlink"/>
           </w:rPr>
-          <w:t>2.4. USB 2.0 (high sp</w:t>
-        </w:r>
-        <w:r>
-          <w:rPr>
-            <w:rStyle w:val="Hyperlink"/>
-          </w:rPr>
-          <w:t>e</w:t>
-        </w:r>
-        <w:r>
-          <w:rPr>
-            <w:rStyle w:val="Hyperlink"/>
-          </w:rPr>
-          <w:t>ed)</w:t>
-        </w:r>
-        <w:r>
-          <w:rPr>
-            <w:rStyle w:val="Hyperlink"/>
-          </w:rPr>
-          <w:t xml:space="preserve"> datasheet</w:t>
+          <w:t>2.4. USB 2.0 (high speed) datasheet</w:t>
         </w:r>
       </w:hyperlink>
       <w:r>
@@ -8121,7 +7848,7 @@
                     </pic:cNvPicPr>
                   </pic:nvPicPr>
                   <pic:blipFill rotWithShape="1">
-                    <a:blip r:embed="rId16">
+                    <a:blip r:embed="rId18">
                       <a:extLst>
                         <a:ext uri="{28A0092B-C50C-407E-A947-70E740481C1C}">
                           <a14:useLocalDpi xmlns:a14="http://schemas.microsoft.com/office/drawing/2010/main" val="0"/>
@@ -8165,7 +7892,7 @@
           <w:noProof/>
         </w:rPr>
         <w:drawing>
-          <wp:inline distT="0" distB="0" distL="0" distR="0" wp14:anchorId="0A4037B6" wp14:editId="0242A5DE">
+          <wp:inline distT="0" distB="0" distL="0" distR="0" wp14:anchorId="0A4037B6" wp14:editId="144E5B66">
             <wp:extent cx="1148504" cy="1764803"/>
             <wp:effectExtent l="0" t="0" r="0" b="6985"/>
             <wp:docPr id="958528632" name="Picture 4" descr="What is Micro USB OTG (On-The-Go)? Build DIY OTG Cable"/>
@@ -8182,7 +7909,7 @@
                     </pic:cNvPicPr>
                   </pic:nvPicPr>
                   <pic:blipFill rotWithShape="1">
-                    <a:blip r:embed="rId17" cstate="print">
+                    <a:blip r:embed="rId19" cstate="print">
                       <a:extLst>
                         <a:ext uri="{28A0092B-C50C-407E-A947-70E740481C1C}">
                           <a14:useLocalDpi xmlns:a14="http://schemas.microsoft.com/office/drawing/2010/main" val="0"/>
@@ -8256,27 +7983,13 @@
         </w:rPr>
         <w:t xml:space="preserve"> </w:t>
       </w:r>
-      <w:hyperlink r:id="rId18" w:anchor="page=7" w:history="1">
+      <w:hyperlink r:id="rId20" w:anchor="page=7" w:history="1">
         <w:r>
           <w:rPr>
             <w:rStyle w:val="Hyperlink"/>
             <w:lang w:val="nl-NL"/>
           </w:rPr>
-          <w:t>(</w:t>
-        </w:r>
-        <w:r>
-          <w:rPr>
-            <w:rStyle w:val="Hyperlink"/>
-            <w:lang w:val="nl-NL"/>
-          </w:rPr>
-          <w:t>2.2. Ethernet</w:t>
-        </w:r>
-        <w:r>
-          <w:rPr>
-            <w:rStyle w:val="Hyperlink"/>
-            <w:lang w:val="nl-NL"/>
-          </w:rPr>
-          <w:t xml:space="preserve"> Datasheet)</w:t>
+          <w:t>(2.2. Ethernet Datasheet)</w:t>
         </w:r>
       </w:hyperlink>
     </w:p>
@@ -8500,13 +8213,7 @@
                 <w:lang w:val="nl-NL"/>
               </w:rPr>
               <w:lastRenderedPageBreak/>
-              <w:t>Ethernet_P</w:t>
-            </w:r>
-            <w:r>
-              <w:rPr>
-                <w:lang w:val="nl-NL"/>
-              </w:rPr>
-              <w:t>1P</w:t>
+              <w:t>Ethernet_P1P</w:t>
             </w:r>
           </w:p>
         </w:tc>
@@ -8591,13 +8298,7 @@
               <w:rPr>
                 <w:lang w:val="nl-NL"/>
               </w:rPr>
-              <w:t>Ethernet_P</w:t>
-            </w:r>
-            <w:r>
-              <w:rPr>
-                <w:lang w:val="nl-NL"/>
-              </w:rPr>
-              <w:t>3N</w:t>
+              <w:t>Ethernet_P3N</w:t>
             </w:r>
           </w:p>
         </w:tc>
@@ -8682,13 +8383,7 @@
               <w:rPr>
                 <w:lang w:val="nl-NL"/>
               </w:rPr>
-              <w:t>Ethernet_P</w:t>
-            </w:r>
-            <w:r>
-              <w:rPr>
-                <w:lang w:val="nl-NL"/>
-              </w:rPr>
-              <w:t>1N</w:t>
+              <w:t>Ethernet_P1N</w:t>
             </w:r>
           </w:p>
         </w:tc>
@@ -8773,13 +8468,7 @@
               <w:rPr>
                 <w:lang w:val="nl-NL"/>
               </w:rPr>
-              <w:t>Ethernet_P</w:t>
-            </w:r>
-            <w:r>
-              <w:rPr>
-                <w:lang w:val="nl-NL"/>
-              </w:rPr>
-              <w:t>2N</w:t>
+              <w:t>Ethernet_P2N</w:t>
             </w:r>
           </w:p>
         </w:tc>
@@ -8864,13 +8553,7 @@
               <w:rPr>
                 <w:lang w:val="nl-NL"/>
               </w:rPr>
-              <w:t>Ethernet_P</w:t>
-            </w:r>
-            <w:r>
-              <w:rPr>
-                <w:lang w:val="nl-NL"/>
-              </w:rPr>
-              <w:t>0N</w:t>
+              <w:t>Ethernet_P0N</w:t>
             </w:r>
           </w:p>
         </w:tc>
@@ -8955,13 +8638,7 @@
               <w:rPr>
                 <w:lang w:val="nl-NL"/>
               </w:rPr>
-              <w:t>Ethernet_P</w:t>
-            </w:r>
-            <w:r>
-              <w:rPr>
-                <w:lang w:val="nl-NL"/>
-              </w:rPr>
-              <w:t>2P</w:t>
+              <w:t>Ethernet_P2P</w:t>
             </w:r>
           </w:p>
         </w:tc>
@@ -9046,13 +8723,7 @@
               <w:rPr>
                 <w:lang w:val="nl-NL"/>
               </w:rPr>
-              <w:t>Ethernet_P</w:t>
-            </w:r>
-            <w:r>
-              <w:rPr>
-                <w:lang w:val="nl-NL"/>
-              </w:rPr>
-              <w:t>0P</w:t>
+              <w:t>Ethernet_P0P</w:t>
             </w:r>
           </w:p>
         </w:tc>
@@ -9137,13 +8808,7 @@
               <w:rPr>
                 <w:lang w:val="nl-NL"/>
               </w:rPr>
-              <w:t>Ethernet_</w:t>
-            </w:r>
-            <w:r>
-              <w:rPr>
-                <w:lang w:val="nl-NL"/>
-              </w:rPr>
-              <w:t>LED3</w:t>
+              <w:t>Ethernet_LED3</w:t>
             </w:r>
           </w:p>
         </w:tc>
@@ -9228,13 +8893,7 @@
               <w:rPr>
                 <w:lang w:val="nl-NL"/>
               </w:rPr>
-              <w:t>Ethernet_</w:t>
-            </w:r>
-            <w:r>
-              <w:rPr>
-                <w:lang w:val="nl-NL"/>
-              </w:rPr>
-              <w:t>SyncIn</w:t>
+              <w:t>Ethernet_SyncIn</w:t>
             </w:r>
           </w:p>
         </w:tc>
@@ -9319,13 +8978,7 @@
               <w:rPr>
                 <w:lang w:val="nl-NL"/>
               </w:rPr>
-              <w:t>Ethernet_</w:t>
-            </w:r>
-            <w:r>
-              <w:rPr>
-                <w:lang w:val="nl-NL"/>
-              </w:rPr>
-              <w:t>LED2</w:t>
+              <w:t>Ethernet_LED2</w:t>
             </w:r>
           </w:p>
         </w:tc>
@@ -9410,13 +9063,7 @@
               <w:rPr>
                 <w:lang w:val="nl-NL"/>
               </w:rPr>
-              <w:t>Ethernet_</w:t>
-            </w:r>
-            <w:r>
-              <w:rPr>
-                <w:lang w:val="nl-NL"/>
-              </w:rPr>
-              <w:t>SyncOut</w:t>
+              <w:t>Ethernet_SyncOut</w:t>
             </w:r>
           </w:p>
         </w:tc>
@@ -9501,13 +9148,7 @@
               <w:rPr>
                 <w:lang w:val="nl-NL"/>
               </w:rPr>
-              <w:t>Ethernet_</w:t>
-            </w:r>
-            <w:r>
-              <w:rPr>
-                <w:lang w:val="nl-NL"/>
-              </w:rPr>
-              <w:t>LED1</w:t>
+              <w:t>Ethernet_LED1</w:t>
             </w:r>
           </w:p>
         </w:tc>
@@ -9690,7 +9331,7 @@
           <w:lang w:val="nl-NL"/>
         </w:rPr>
       </w:pPr>
-      <w:hyperlink r:id="rId19" w:anchor="page=18" w:history="1">
+      <w:hyperlink r:id="rId21" w:anchor="page=18" w:history="1">
         <w:r>
           <w:rPr>
             <w:rStyle w:val="Hyperlink"/>
@@ -12485,7 +12126,7 @@
                 <w:sz w:val="20"/>
                 <w:szCs w:val="20"/>
               </w:rPr>
-              <w:t>57</w:t>
+              <w:t>58</w:t>
             </w:r>
           </w:p>
         </w:tc>
@@ -12508,7 +12149,7 @@
                 <w:szCs w:val="20"/>
                 <w:lang w:val="nl-NL"/>
               </w:rPr>
-              <w:t>SD_CLK</w:t>
+              <w:t>GPIO4</w:t>
             </w:r>
           </w:p>
         </w:tc>
@@ -12576,7 +12217,7 @@
                 <w:sz w:val="20"/>
                 <w:szCs w:val="20"/>
               </w:rPr>
-              <w:t>58</w:t>
+              <w:t>77,79,81,83,85,87</w:t>
             </w:r>
           </w:p>
         </w:tc>
@@ -12599,7 +12240,7 @@
                 <w:szCs w:val="20"/>
                 <w:lang w:val="nl-NL"/>
               </w:rPr>
-              <w:t>GPIO4</w:t>
+              <w:t>+5V (input)</w:t>
             </w:r>
           </w:p>
         </w:tc>
@@ -12667,7 +12308,7 @@
                 <w:sz w:val="20"/>
                 <w:szCs w:val="20"/>
               </w:rPr>
-              <w:t>73</w:t>
+              <w:t>78</w:t>
             </w:r>
           </w:p>
         </w:tc>
@@ -12679,18 +12320,34 @@
             <w:pPr>
               <w:pStyle w:val="NoSpacing"/>
               <w:rPr>
-                <w:sz w:val="20"/>
-                <w:szCs w:val="20"/>
-                <w:lang w:val="nl-NL"/>
-              </w:rPr>
-            </w:pPr>
-            <w:r>
-              <w:rPr>
-                <w:sz w:val="20"/>
-                <w:szCs w:val="20"/>
-                <w:lang w:val="nl-NL"/>
-              </w:rPr>
-              <w:t>SD_VDD_OVERRIDE</w:t>
+                <w:b/>
+                <w:bCs/>
+                <w:sz w:val="20"/>
+                <w:szCs w:val="20"/>
+              </w:rPr>
+            </w:pPr>
+            <w:r>
+              <w:rPr>
+                <w:sz w:val="20"/>
+                <w:szCs w:val="20"/>
+              </w:rPr>
+              <w:t>GPIO_VREF</w:t>
+            </w:r>
+            <w:r>
+              <w:rPr>
+                <w:sz w:val="20"/>
+                <w:szCs w:val="20"/>
+              </w:rPr>
+              <w:t xml:space="preserve"> (</w:t>
+            </w:r>
+            <w:r>
+              <w:rPr>
+                <w:b/>
+                <w:bCs/>
+                <w:sz w:val="20"/>
+                <w:szCs w:val="20"/>
+              </w:rPr>
+              <w:t>Can’t be floating)</w:t>
             </w:r>
           </w:p>
         </w:tc>
@@ -12758,7 +12415,7 @@
                 <w:sz w:val="20"/>
                 <w:szCs w:val="20"/>
               </w:rPr>
-              <w:t>77,79,81,83,85,87</w:t>
+              <w:t>80</w:t>
             </w:r>
           </w:p>
         </w:tc>
@@ -12781,7 +12438,7 @@
                 <w:szCs w:val="20"/>
                 <w:lang w:val="nl-NL"/>
               </w:rPr>
-              <w:t>+5V (input)</w:t>
+              <w:t>SCL0</w:t>
             </w:r>
           </w:p>
         </w:tc>
@@ -12849,7 +12506,7 @@
                 <w:sz w:val="20"/>
                 <w:szCs w:val="20"/>
               </w:rPr>
-              <w:t>78</w:t>
+              <w:t>82</w:t>
             </w:r>
           </w:p>
         </w:tc>
@@ -12872,7 +12529,7 @@
                 <w:szCs w:val="20"/>
                 <w:lang w:val="nl-NL"/>
               </w:rPr>
-              <w:t>GPIO_VREF</w:t>
+              <w:t>SDA0</w:t>
             </w:r>
           </w:p>
         </w:tc>
@@ -12935,13 +12592,6 @@
                 <w:szCs w:val="20"/>
               </w:rPr>
             </w:pPr>
-            <w:r>
-              <w:rPr>
-                <w:sz w:val="20"/>
-                <w:szCs w:val="20"/>
-              </w:rPr>
-              <w:t>80</w:t>
-            </w:r>
           </w:p>
         </w:tc>
         <w:tc>
@@ -12957,14 +12607,6 @@
                 <w:lang w:val="nl-NL"/>
               </w:rPr>
             </w:pPr>
-            <w:r>
-              <w:rPr>
-                <w:sz w:val="20"/>
-                <w:szCs w:val="20"/>
-                <w:lang w:val="nl-NL"/>
-              </w:rPr>
-              <w:t>SCL0</w:t>
-            </w:r>
           </w:p>
         </w:tc>
         <w:tc>
@@ -13026,13 +12668,6 @@
                 <w:szCs w:val="20"/>
               </w:rPr>
             </w:pPr>
-            <w:r>
-              <w:rPr>
-                <w:sz w:val="20"/>
-                <w:szCs w:val="20"/>
-              </w:rPr>
-              <w:t>82</w:t>
-            </w:r>
           </w:p>
         </w:tc>
         <w:tc>
@@ -13048,14 +12683,6 @@
                 <w:lang w:val="nl-NL"/>
               </w:rPr>
             </w:pPr>
-            <w:r>
-              <w:rPr>
-                <w:sz w:val="20"/>
-                <w:szCs w:val="20"/>
-                <w:lang w:val="nl-NL"/>
-              </w:rPr>
-              <w:t>SDA0</w:t>
-            </w:r>
           </w:p>
         </w:tc>
         <w:tc>
@@ -13147,7 +12774,7 @@
           <w:lang w:val="nl-NL"/>
         </w:rPr>
       </w:pPr>
-      <w:hyperlink r:id="rId20" w:anchor="page=18" w:history="1">
+      <w:hyperlink r:id="rId22" w:anchor="page=18" w:history="1">
         <w:r>
           <w:rPr>
             <w:rStyle w:val="Hyperlink"/>
@@ -20534,6 +20161,7 @@
           <w:color w:val="0F4761" w:themeColor="accent1" w:themeShade="BF"/>
           <w:sz w:val="28"/>
           <w:szCs w:val="28"/>
+          <w:lang w:val="nl-NL"/>
         </w:rPr>
       </w:pPr>
       <w:r>
@@ -20572,6 +20200,9 @@
         <w:t xml:space="preserve"> </w:t>
       </w:r>
       <w:r>
+        <w:rPr>
+          <w:lang w:val="nl-NL"/>
+        </w:rPr>
         <w:br w:type="page"/>
       </w:r>
     </w:p>
@@ -20860,7 +20491,7 @@
       <w:pPr>
         <w:pStyle w:val="NoSpacing"/>
       </w:pPr>
-      <w:hyperlink r:id="rId21" w:history="1">
+      <w:hyperlink r:id="rId23" w:history="1">
         <w:r>
           <w:rPr>
             <w:rStyle w:val="Hyperlink"/>
@@ -20886,7 +20517,7 @@
       <w:pPr>
         <w:pStyle w:val="NoSpacing"/>
       </w:pPr>
-      <w:hyperlink r:id="rId22" w:history="1">
+      <w:hyperlink r:id="rId24" w:history="1">
         <w:r>
           <w:rPr>
             <w:rStyle w:val="Hyperlink"/>
@@ -20949,7 +20580,7 @@
           <w:lang w:val="nl-NL"/>
         </w:rPr>
       </w:pPr>
-      <w:hyperlink r:id="rId23" w:history="1">
+      <w:hyperlink r:id="rId25" w:history="1">
         <w:r>
           <w:rPr>
             <w:rStyle w:val="Hyperlink"/>
@@ -20987,7 +20618,7 @@
       <w:pPr>
         <w:pStyle w:val="NoSpacing"/>
       </w:pPr>
-      <w:hyperlink r:id="rId24" w:history="1">
+      <w:hyperlink r:id="rId26" w:history="1">
         <w:r>
           <w:rPr>
             <w:rStyle w:val="Hyperlink"/>
@@ -21056,7 +20687,7 @@
       <w:pPr>
         <w:pStyle w:val="NoSpacing"/>
       </w:pPr>
-      <w:hyperlink r:id="rId25" w:history="1">
+      <w:hyperlink r:id="rId27" w:history="1">
         <w:r>
           <w:rPr>
             <w:rStyle w:val="Hyperlink"/>
@@ -21102,7 +20733,7 @@
       <w:pPr>
         <w:pStyle w:val="NoSpacing"/>
       </w:pPr>
-      <w:hyperlink r:id="rId26" w:history="1">
+      <w:hyperlink r:id="rId28" w:history="1">
         <w:r>
           <w:rPr>
             <w:rStyle w:val="Hyperlink"/>
@@ -21128,7 +20759,7 @@
       <w:pPr>
         <w:pStyle w:val="NoSpacing"/>
       </w:pPr>
-      <w:hyperlink r:id="rId27" w:history="1">
+      <w:hyperlink r:id="rId29" w:history="1">
         <w:r>
           <w:rPr>
             <w:rStyle w:val="Hyperlink"/>
@@ -22269,6 +21900,7 @@
   <w:style w:type="character" w:default="1" w:styleId="DefaultParagraphFont">
     <w:name w:val="Default Paragraph Font"/>
     <w:uiPriority w:val="1"/>
+    <w:semiHidden/>
     <w:unhideWhenUsed/>
   </w:style>
   <w:style w:type="table" w:default="1" w:styleId="TableNormal">

</xml_diff>

<commit_message>
Cleaned up schematics and added gnds and no-connects
</commit_message>
<xml_diff>
--- a/ANE21_PCB.docx
+++ b/ANE21_PCB.docx
@@ -778,7 +778,66 @@
         </w:p>
       </w:sdtContent>
     </w:sdt>
+    <w:p/>
+    <w:p/>
     <w:p>
+      <w:pPr>
+        <w:pStyle w:val="NoSpacing"/>
+      </w:pPr>
+      <w:r>
+        <w:t>Taken:</w:t>
+      </w:r>
+    </w:p>
+    <w:p>
+      <w:pPr>
+        <w:pStyle w:val="NoSpacing"/>
+        <w:numPr>
+          <w:ilvl w:val="0"/>
+          <w:numId w:val="5"/>
+        </w:numPr>
+        <w:rPr>
+          <w:lang w:val="nl-NL"/>
+        </w:rPr>
+      </w:pPr>
+      <w:r>
+        <w:rPr>
+          <w:lang w:val="nl-NL"/>
+        </w:rPr>
+        <w:t xml:space="preserve">PSU voor CM4 vervangen van AP64501S-13 vervangen met </w:t>
+      </w:r>
+      <w:r>
+        <w:rPr>
+          <w:lang w:val="nl-NL"/>
+        </w:rPr>
+        <w:t>AP62300WU</w:t>
+      </w:r>
+      <w:r>
+        <w:rPr>
+          <w:lang w:val="nl-NL"/>
+        </w:rPr>
+        <w:t>-7</w:t>
+      </w:r>
+    </w:p>
+    <w:p>
+      <w:pPr>
+        <w:pStyle w:val="NoSpacing"/>
+        <w:numPr>
+          <w:ilvl w:val="0"/>
+          <w:numId w:val="5"/>
+        </w:numPr>
+        <w:rPr>
+          <w:lang w:val="nl-NL"/>
+        </w:rPr>
+      </w:pPr>
+    </w:p>
+    <w:p>
+      <w:pPr>
+        <w:pStyle w:val="ListParagraph"/>
+        <w:numPr>
+          <w:ilvl w:val="0"/>
+          <w:numId w:val="5"/>
+        </w:numPr>
+      </w:pPr>
       <w:r>
         <w:br w:type="page"/>
       </w:r>
@@ -4574,7 +4633,7 @@
           <w:noProof/>
         </w:rPr>
         <w:drawing>
-          <wp:inline distT="0" distB="0" distL="0" distR="0" wp14:anchorId="2020065A" wp14:editId="1D150756">
+          <wp:inline distT="0" distB="0" distL="0" distR="0" wp14:anchorId="2020065A" wp14:editId="55648F36">
             <wp:extent cx="2719346" cy="2008025"/>
             <wp:effectExtent l="0" t="0" r="5080" b="0"/>
             <wp:docPr id="619101385" name="Picture 1" descr="Does HDMI 2.0 Support 1080p 120Hz? Addressing HDMI Questions ..."/>
@@ -4730,19 +4789,7 @@
           <w:rPr>
             <w:rStyle w:val="Hyperlink"/>
           </w:rPr>
-          <w:t>Web</w:t>
-        </w:r>
-        <w:r>
-          <w:rPr>
-            <w:rStyle w:val="Hyperlink"/>
-          </w:rPr>
-          <w:t>s</w:t>
-        </w:r>
-        <w:r>
-          <w:rPr>
-            <w:rStyle w:val="Hyperlink"/>
-          </w:rPr>
-          <w:t>ite</w:t>
+          <w:t>Website</w:t>
         </w:r>
       </w:hyperlink>
     </w:p>
@@ -7892,7 +7939,7 @@
           <w:noProof/>
         </w:rPr>
         <w:drawing>
-          <wp:inline distT="0" distB="0" distL="0" distR="0" wp14:anchorId="0A4037B6" wp14:editId="144E5B66">
+          <wp:inline distT="0" distB="0" distL="0" distR="0" wp14:anchorId="0A4037B6" wp14:editId="22313901">
             <wp:extent cx="1148504" cy="1764803"/>
             <wp:effectExtent l="0" t="0" r="0" b="6985"/>
             <wp:docPr id="958528632" name="Picture 4" descr="What is Micro USB OTG (On-The-Go)? Build DIY OTG Cable"/>
@@ -12331,14 +12378,7 @@
                 <w:sz w:val="20"/>
                 <w:szCs w:val="20"/>
               </w:rPr>
-              <w:t>GPIO_VREF</w:t>
-            </w:r>
-            <w:r>
-              <w:rPr>
-                <w:sz w:val="20"/>
-                <w:szCs w:val="20"/>
-              </w:rPr>
-              <w:t xml:space="preserve"> (</w:t>
+              <w:t>GPIO_VREF (</w:t>
             </w:r>
             <w:r>
               <w:rPr>
@@ -20603,15 +20643,7 @@
         <w:pStyle w:val="NoSpacing"/>
       </w:pPr>
       <w:r>
-        <w:t>Connector DF40C-100DS-0.4</w:t>
-      </w:r>
-      <w:proofErr w:type="gramStart"/>
-      <w:r>
-        <w:t>V(</w:t>
-      </w:r>
-      <w:proofErr w:type="gramEnd"/>
-      <w:r>
-        <w:t>51):</w:t>
+        <w:t>Connector DF40C-100DS-0.4V(51):</w:t>
       </w:r>
     </w:p>
     <w:p>
@@ -20944,123 +20976,11 @@
     </w:lvl>
   </w:abstractNum>
   <w:abstractNum w:abstractNumId="1" w15:restartNumberingAfterBreak="0">
-    <w:nsid w:val="55B011DF"/>
-    <w:multiLevelType w:val="multilevel"/>
-    <w:tmpl w:val="7720A45C"/>
-    <w:lvl w:ilvl="0">
-      <w:start w:val="1"/>
-      <w:numFmt w:val="decimal"/>
-      <w:lvlText w:val="%1."/>
-      <w:lvlJc w:val="left"/>
-      <w:pPr>
-        <w:tabs>
-          <w:tab w:val="num" w:pos="720"/>
-        </w:tabs>
-        <w:ind w:left="720" w:hanging="360"/>
-      </w:pPr>
-    </w:lvl>
-    <w:lvl w:ilvl="1" w:tentative="1">
-      <w:start w:val="1"/>
-      <w:numFmt w:val="decimal"/>
-      <w:lvlText w:val="%2."/>
-      <w:lvlJc w:val="left"/>
-      <w:pPr>
-        <w:tabs>
-          <w:tab w:val="num" w:pos="1440"/>
-        </w:tabs>
-        <w:ind w:left="1440" w:hanging="360"/>
-      </w:pPr>
-    </w:lvl>
-    <w:lvl w:ilvl="2" w:tentative="1">
-      <w:start w:val="1"/>
-      <w:numFmt w:val="decimal"/>
-      <w:lvlText w:val="%3."/>
-      <w:lvlJc w:val="left"/>
-      <w:pPr>
-        <w:tabs>
-          <w:tab w:val="num" w:pos="2160"/>
-        </w:tabs>
-        <w:ind w:left="2160" w:hanging="360"/>
-      </w:pPr>
-    </w:lvl>
-    <w:lvl w:ilvl="3" w:tentative="1">
-      <w:start w:val="1"/>
-      <w:numFmt w:val="decimal"/>
-      <w:lvlText w:val="%4."/>
-      <w:lvlJc w:val="left"/>
-      <w:pPr>
-        <w:tabs>
-          <w:tab w:val="num" w:pos="2880"/>
-        </w:tabs>
-        <w:ind w:left="2880" w:hanging="360"/>
-      </w:pPr>
-    </w:lvl>
-    <w:lvl w:ilvl="4" w:tentative="1">
-      <w:start w:val="1"/>
-      <w:numFmt w:val="decimal"/>
-      <w:lvlText w:val="%5."/>
-      <w:lvlJc w:val="left"/>
-      <w:pPr>
-        <w:tabs>
-          <w:tab w:val="num" w:pos="3600"/>
-        </w:tabs>
-        <w:ind w:left="3600" w:hanging="360"/>
-      </w:pPr>
-    </w:lvl>
-    <w:lvl w:ilvl="5" w:tentative="1">
-      <w:start w:val="1"/>
-      <w:numFmt w:val="decimal"/>
-      <w:lvlText w:val="%6."/>
-      <w:lvlJc w:val="left"/>
-      <w:pPr>
-        <w:tabs>
-          <w:tab w:val="num" w:pos="4320"/>
-        </w:tabs>
-        <w:ind w:left="4320" w:hanging="360"/>
-      </w:pPr>
-    </w:lvl>
-    <w:lvl w:ilvl="6" w:tentative="1">
-      <w:start w:val="1"/>
-      <w:numFmt w:val="decimal"/>
-      <w:lvlText w:val="%7."/>
-      <w:lvlJc w:val="left"/>
-      <w:pPr>
-        <w:tabs>
-          <w:tab w:val="num" w:pos="5040"/>
-        </w:tabs>
-        <w:ind w:left="5040" w:hanging="360"/>
-      </w:pPr>
-    </w:lvl>
-    <w:lvl w:ilvl="7" w:tentative="1">
-      <w:start w:val="1"/>
-      <w:numFmt w:val="decimal"/>
-      <w:lvlText w:val="%8."/>
-      <w:lvlJc w:val="left"/>
-      <w:pPr>
-        <w:tabs>
-          <w:tab w:val="num" w:pos="5760"/>
-        </w:tabs>
-        <w:ind w:left="5760" w:hanging="360"/>
-      </w:pPr>
-    </w:lvl>
-    <w:lvl w:ilvl="8" w:tentative="1">
-      <w:start w:val="1"/>
-      <w:numFmt w:val="decimal"/>
-      <w:lvlText w:val="%9."/>
-      <w:lvlJc w:val="left"/>
-      <w:pPr>
-        <w:tabs>
-          <w:tab w:val="num" w:pos="6480"/>
-        </w:tabs>
-        <w:ind w:left="6480" w:hanging="360"/>
-      </w:pPr>
-    </w:lvl>
-  </w:abstractNum>
-  <w:abstractNum w:abstractNumId="2" w15:restartNumberingAfterBreak="0">
-    <w:nsid w:val="6DA235FE"/>
+    <w:nsid w:val="1800671B"/>
     <w:multiLevelType w:val="hybridMultilevel"/>
-    <w:tmpl w:val="9EB8861E"/>
-    <w:lvl w:ilvl="0" w:tplc="6010C8E6">
+    <w:tmpl w:val="790C215C"/>
+    <w:lvl w:ilvl="0" w:tplc="9BC8D75C">
+      <w:start w:val="4"/>
       <w:numFmt w:val="bullet"/>
       <w:lvlText w:val=""/>
       <w:lvlJc w:val="left"/>
@@ -21168,7 +21088,232 @@
       </w:rPr>
     </w:lvl>
   </w:abstractNum>
+  <w:abstractNum w:abstractNumId="2" w15:restartNumberingAfterBreak="0">
+    <w:nsid w:val="55B011DF"/>
+    <w:multiLevelType w:val="multilevel"/>
+    <w:tmpl w:val="7720A45C"/>
+    <w:lvl w:ilvl="0">
+      <w:start w:val="1"/>
+      <w:numFmt w:val="decimal"/>
+      <w:lvlText w:val="%1."/>
+      <w:lvlJc w:val="left"/>
+      <w:pPr>
+        <w:tabs>
+          <w:tab w:val="num" w:pos="720"/>
+        </w:tabs>
+        <w:ind w:left="720" w:hanging="360"/>
+      </w:pPr>
+    </w:lvl>
+    <w:lvl w:ilvl="1" w:tentative="1">
+      <w:start w:val="1"/>
+      <w:numFmt w:val="decimal"/>
+      <w:lvlText w:val="%2."/>
+      <w:lvlJc w:val="left"/>
+      <w:pPr>
+        <w:tabs>
+          <w:tab w:val="num" w:pos="1440"/>
+        </w:tabs>
+        <w:ind w:left="1440" w:hanging="360"/>
+      </w:pPr>
+    </w:lvl>
+    <w:lvl w:ilvl="2" w:tentative="1">
+      <w:start w:val="1"/>
+      <w:numFmt w:val="decimal"/>
+      <w:lvlText w:val="%3."/>
+      <w:lvlJc w:val="left"/>
+      <w:pPr>
+        <w:tabs>
+          <w:tab w:val="num" w:pos="2160"/>
+        </w:tabs>
+        <w:ind w:left="2160" w:hanging="360"/>
+      </w:pPr>
+    </w:lvl>
+    <w:lvl w:ilvl="3" w:tentative="1">
+      <w:start w:val="1"/>
+      <w:numFmt w:val="decimal"/>
+      <w:lvlText w:val="%4."/>
+      <w:lvlJc w:val="left"/>
+      <w:pPr>
+        <w:tabs>
+          <w:tab w:val="num" w:pos="2880"/>
+        </w:tabs>
+        <w:ind w:left="2880" w:hanging="360"/>
+      </w:pPr>
+    </w:lvl>
+    <w:lvl w:ilvl="4" w:tentative="1">
+      <w:start w:val="1"/>
+      <w:numFmt w:val="decimal"/>
+      <w:lvlText w:val="%5."/>
+      <w:lvlJc w:val="left"/>
+      <w:pPr>
+        <w:tabs>
+          <w:tab w:val="num" w:pos="3600"/>
+        </w:tabs>
+        <w:ind w:left="3600" w:hanging="360"/>
+      </w:pPr>
+    </w:lvl>
+    <w:lvl w:ilvl="5" w:tentative="1">
+      <w:start w:val="1"/>
+      <w:numFmt w:val="decimal"/>
+      <w:lvlText w:val="%6."/>
+      <w:lvlJc w:val="left"/>
+      <w:pPr>
+        <w:tabs>
+          <w:tab w:val="num" w:pos="4320"/>
+        </w:tabs>
+        <w:ind w:left="4320" w:hanging="360"/>
+      </w:pPr>
+    </w:lvl>
+    <w:lvl w:ilvl="6" w:tentative="1">
+      <w:start w:val="1"/>
+      <w:numFmt w:val="decimal"/>
+      <w:lvlText w:val="%7."/>
+      <w:lvlJc w:val="left"/>
+      <w:pPr>
+        <w:tabs>
+          <w:tab w:val="num" w:pos="5040"/>
+        </w:tabs>
+        <w:ind w:left="5040" w:hanging="360"/>
+      </w:pPr>
+    </w:lvl>
+    <w:lvl w:ilvl="7" w:tentative="1">
+      <w:start w:val="1"/>
+      <w:numFmt w:val="decimal"/>
+      <w:lvlText w:val="%8."/>
+      <w:lvlJc w:val="left"/>
+      <w:pPr>
+        <w:tabs>
+          <w:tab w:val="num" w:pos="5760"/>
+        </w:tabs>
+        <w:ind w:left="5760" w:hanging="360"/>
+      </w:pPr>
+    </w:lvl>
+    <w:lvl w:ilvl="8" w:tentative="1">
+      <w:start w:val="1"/>
+      <w:numFmt w:val="decimal"/>
+      <w:lvlText w:val="%9."/>
+      <w:lvlJc w:val="left"/>
+      <w:pPr>
+        <w:tabs>
+          <w:tab w:val="num" w:pos="6480"/>
+        </w:tabs>
+        <w:ind w:left="6480" w:hanging="360"/>
+      </w:pPr>
+    </w:lvl>
+  </w:abstractNum>
   <w:abstractNum w:abstractNumId="3" w15:restartNumberingAfterBreak="0">
+    <w:nsid w:val="6DA235FE"/>
+    <w:multiLevelType w:val="hybridMultilevel"/>
+    <w:tmpl w:val="9EB8861E"/>
+    <w:lvl w:ilvl="0" w:tplc="6010C8E6">
+      <w:numFmt w:val="bullet"/>
+      <w:lvlText w:val=""/>
+      <w:lvlJc w:val="left"/>
+      <w:pPr>
+        <w:ind w:left="720" w:hanging="360"/>
+      </w:pPr>
+      <w:rPr>
+        <w:rFonts w:ascii="Symbol" w:eastAsiaTheme="minorHAnsi" w:hAnsi="Symbol" w:cstheme="minorBidi" w:hint="default"/>
+      </w:rPr>
+    </w:lvl>
+    <w:lvl w:ilvl="1" w:tplc="08090003" w:tentative="1">
+      <w:start w:val="1"/>
+      <w:numFmt w:val="bullet"/>
+      <w:lvlText w:val="o"/>
+      <w:lvlJc w:val="left"/>
+      <w:pPr>
+        <w:ind w:left="1440" w:hanging="360"/>
+      </w:pPr>
+      <w:rPr>
+        <w:rFonts w:ascii="Courier New" w:hAnsi="Courier New" w:cs="Courier New" w:hint="default"/>
+      </w:rPr>
+    </w:lvl>
+    <w:lvl w:ilvl="2" w:tplc="08090005" w:tentative="1">
+      <w:start w:val="1"/>
+      <w:numFmt w:val="bullet"/>
+      <w:lvlText w:val=""/>
+      <w:lvlJc w:val="left"/>
+      <w:pPr>
+        <w:ind w:left="2160" w:hanging="360"/>
+      </w:pPr>
+      <w:rPr>
+        <w:rFonts w:ascii="Wingdings" w:hAnsi="Wingdings" w:hint="default"/>
+      </w:rPr>
+    </w:lvl>
+    <w:lvl w:ilvl="3" w:tplc="08090001" w:tentative="1">
+      <w:start w:val="1"/>
+      <w:numFmt w:val="bullet"/>
+      <w:lvlText w:val=""/>
+      <w:lvlJc w:val="left"/>
+      <w:pPr>
+        <w:ind w:left="2880" w:hanging="360"/>
+      </w:pPr>
+      <w:rPr>
+        <w:rFonts w:ascii="Symbol" w:hAnsi="Symbol" w:hint="default"/>
+      </w:rPr>
+    </w:lvl>
+    <w:lvl w:ilvl="4" w:tplc="08090003" w:tentative="1">
+      <w:start w:val="1"/>
+      <w:numFmt w:val="bullet"/>
+      <w:lvlText w:val="o"/>
+      <w:lvlJc w:val="left"/>
+      <w:pPr>
+        <w:ind w:left="3600" w:hanging="360"/>
+      </w:pPr>
+      <w:rPr>
+        <w:rFonts w:ascii="Courier New" w:hAnsi="Courier New" w:cs="Courier New" w:hint="default"/>
+      </w:rPr>
+    </w:lvl>
+    <w:lvl w:ilvl="5" w:tplc="08090005" w:tentative="1">
+      <w:start w:val="1"/>
+      <w:numFmt w:val="bullet"/>
+      <w:lvlText w:val=""/>
+      <w:lvlJc w:val="left"/>
+      <w:pPr>
+        <w:ind w:left="4320" w:hanging="360"/>
+      </w:pPr>
+      <w:rPr>
+        <w:rFonts w:ascii="Wingdings" w:hAnsi="Wingdings" w:hint="default"/>
+      </w:rPr>
+    </w:lvl>
+    <w:lvl w:ilvl="6" w:tplc="08090001" w:tentative="1">
+      <w:start w:val="1"/>
+      <w:numFmt w:val="bullet"/>
+      <w:lvlText w:val=""/>
+      <w:lvlJc w:val="left"/>
+      <w:pPr>
+        <w:ind w:left="5040" w:hanging="360"/>
+      </w:pPr>
+      <w:rPr>
+        <w:rFonts w:ascii="Symbol" w:hAnsi="Symbol" w:hint="default"/>
+      </w:rPr>
+    </w:lvl>
+    <w:lvl w:ilvl="7" w:tplc="08090003" w:tentative="1">
+      <w:start w:val="1"/>
+      <w:numFmt w:val="bullet"/>
+      <w:lvlText w:val="o"/>
+      <w:lvlJc w:val="left"/>
+      <w:pPr>
+        <w:ind w:left="5760" w:hanging="360"/>
+      </w:pPr>
+      <w:rPr>
+        <w:rFonts w:ascii="Courier New" w:hAnsi="Courier New" w:cs="Courier New" w:hint="default"/>
+      </w:rPr>
+    </w:lvl>
+    <w:lvl w:ilvl="8" w:tplc="08090005" w:tentative="1">
+      <w:start w:val="1"/>
+      <w:numFmt w:val="bullet"/>
+      <w:lvlText w:val=""/>
+      <w:lvlJc w:val="left"/>
+      <w:pPr>
+        <w:ind w:left="6480" w:hanging="360"/>
+      </w:pPr>
+      <w:rPr>
+        <w:rFonts w:ascii="Wingdings" w:hAnsi="Wingdings" w:hint="default"/>
+      </w:rPr>
+    </w:lvl>
+  </w:abstractNum>
+  <w:abstractNum w:abstractNumId="4" w15:restartNumberingAfterBreak="0">
     <w:nsid w:val="75E227B0"/>
     <w:multiLevelType w:val="multilevel"/>
     <w:tmpl w:val="7F903274"/>
@@ -21282,16 +21427,19 @@
     </w:lvl>
   </w:abstractNum>
   <w:num w:numId="1" w16cid:durableId="4944822">
-    <w:abstractNumId w:val="3"/>
+    <w:abstractNumId w:val="4"/>
   </w:num>
   <w:num w:numId="2" w16cid:durableId="145902259">
-    <w:abstractNumId w:val="1"/>
+    <w:abstractNumId w:val="2"/>
   </w:num>
   <w:num w:numId="3" w16cid:durableId="834222309">
     <w:abstractNumId w:val="0"/>
   </w:num>
   <w:num w:numId="4" w16cid:durableId="1889099122">
-    <w:abstractNumId w:val="2"/>
+    <w:abstractNumId w:val="3"/>
+  </w:num>
+  <w:num w:numId="5" w16cid:durableId="642080162">
+    <w:abstractNumId w:val="1"/>
   </w:num>
 </w:numbering>
 </file>
@@ -21900,7 +22048,6 @@
   <w:style w:type="character" w:default="1" w:styleId="DefaultParagraphFont">
     <w:name w:val="Default Paragraph Font"/>
     <w:uiPriority w:val="1"/>
-    <w:semiHidden/>
     <w:unhideWhenUsed/>
   </w:style>
   <w:style w:type="table" w:default="1" w:styleId="TableNormal">

</xml_diff>

<commit_message>
Heb mijn documentatie geleverd voor de USB-c en heb een BOM toegevoegd
</commit_message>
<xml_diff>
--- a/ANE21_PCB.docx
+++ b/ANE21_PCB.docx
@@ -799,23 +799,20 @@
           <w:lang w:val="nl-NL"/>
         </w:rPr>
       </w:pPr>
+      <w:commentRangeStart w:id="0"/>
       <w:r>
         <w:rPr>
           <w:lang w:val="nl-NL"/>
         </w:rPr>
-        <w:t xml:space="preserve">PSU voor CM4 vervangen van AP64501S-13 vervangen met </w:t>
-      </w:r>
+        <w:t>PSU voor CM4 vervangen van AP64501S-13 vervangen met AP62300WU-7</w:t>
+      </w:r>
+      <w:commentRangeEnd w:id="0"/>
       <w:r>
         <w:rPr>
+          <w:rStyle w:val="CommentReference"/>
           <w:lang w:val="nl-NL"/>
         </w:rPr>
-        <w:t>AP62300WU</w:t>
-      </w:r>
-      <w:r>
-        <w:rPr>
-          <w:lang w:val="nl-NL"/>
-        </w:rPr>
-        <w:t>-7</w:t>
+        <w:commentReference w:id="0"/>
       </w:r>
     </w:p>
     <w:p>
@@ -881,7 +878,7 @@
                     </pic:cNvPicPr>
                   </pic:nvPicPr>
                   <pic:blipFill>
-                    <a:blip r:embed="rId6" cstate="print">
+                    <a:blip r:embed="rId12" cstate="print">
                       <a:extLst>
                         <a:ext uri="{28A0092B-C50C-407E-A947-70E740481C1C}">
                           <a14:useLocalDpi xmlns:a14="http://schemas.microsoft.com/office/drawing/2010/main" val="0"/>
@@ -994,7 +991,21 @@
         <w:rPr>
           <w:lang w:val="nl-NL"/>
         </w:rPr>
-        <w:t>2. een HDMI interface;</w:t>
+        <w:t xml:space="preserve">2. een </w:t>
+      </w:r>
+      <w:proofErr w:type="gramStart"/>
+      <w:r>
+        <w:rPr>
+          <w:lang w:val="nl-NL"/>
+        </w:rPr>
+        <w:t>HDMI interface</w:t>
+      </w:r>
+      <w:proofErr w:type="gramEnd"/>
+      <w:r>
+        <w:rPr>
+          <w:lang w:val="nl-NL"/>
+        </w:rPr>
+        <w:t>;</w:t>
       </w:r>
     </w:p>
     <w:p>
@@ -1135,8 +1146,13 @@
       </w:r>
       <w:proofErr w:type="spellEnd"/>
       <w:r>
-        <w:t xml:space="preserve"> debugging LED</w:t>
-      </w:r>
+        <w:t xml:space="preserve"> debugging </w:t>
+      </w:r>
+      <w:proofErr w:type="gramStart"/>
+      <w:r>
+        <w:t>LED</w:t>
+      </w:r>
+      <w:proofErr w:type="gramEnd"/>
     </w:p>
     <w:p>
       <w:pPr>
@@ -1186,7 +1202,15 @@
       </w:r>
       <w:proofErr w:type="spellEnd"/>
       <w:r>
-        <w:t xml:space="preserve"> (of 2 stacked </w:t>
+        <w:t xml:space="preserve"> (of </w:t>
+      </w:r>
+      <w:proofErr w:type="gramStart"/>
+      <w:r>
+        <w:t>2</w:t>
+      </w:r>
+      <w:proofErr w:type="gramEnd"/>
+      <w:r>
+        <w:t xml:space="preserve"> stacked </w:t>
       </w:r>
       <w:proofErr w:type="spellStart"/>
       <w:r>
@@ -1228,7 +1252,7 @@
       <w:pPr>
         <w:pStyle w:val="NoSpacing"/>
       </w:pPr>
-      <w:hyperlink r:id="rId7" w:history="1">
+      <w:hyperlink r:id="rId13" w:history="1">
         <w:r>
           <w:rPr>
             <w:rStyle w:val="Hyperlink"/>
@@ -1241,7 +1265,7 @@
       <w:pPr>
         <w:pStyle w:val="NoSpacing"/>
       </w:pPr>
-      <w:hyperlink r:id="rId8" w:history="1">
+      <w:hyperlink r:id="rId14" w:history="1">
         <w:r>
           <w:rPr>
             <w:rStyle w:val="Hyperlink"/>
@@ -1262,11 +1286,19 @@
           <w:lang w:val="nl-NL"/>
         </w:rPr>
       </w:pPr>
+      <w:proofErr w:type="gramStart"/>
       <w:r>
         <w:rPr>
           <w:lang w:val="nl-NL"/>
         </w:rPr>
-        <w:t>Punten verdeling:</w:t>
+        <w:t>Punten verdeling</w:t>
+      </w:r>
+      <w:proofErr w:type="gramEnd"/>
+      <w:r>
+        <w:rPr>
+          <w:lang w:val="nl-NL"/>
+        </w:rPr>
+        <w:t>:</w:t>
       </w:r>
       <w:r>
         <w:rPr>
@@ -1365,7 +1397,7 @@
                     </pic:cNvPicPr>
                   </pic:nvPicPr>
                   <pic:blipFill rotWithShape="1">
-                    <a:blip r:embed="rId9">
+                    <a:blip r:embed="rId15">
                       <a:extLst>
                         <a:ext uri="{28A0092B-C50C-407E-A947-70E740481C1C}">
                           <a14:useLocalDpi xmlns:a14="http://schemas.microsoft.com/office/drawing/2010/main" val="0"/>
@@ -1409,15 +1441,23 @@
           <w:lang w:val="en-GB"/>
         </w:rPr>
       </w:pPr>
-      <w:bookmarkStart w:id="0" w:name="_Toc223434583"/>
+      <w:bookmarkStart w:id="1" w:name="_Toc223434583"/>
       <w:r>
         <w:rPr>
           <w:lang w:val="en-GB"/>
         </w:rPr>
         <w:lastRenderedPageBreak/>
-        <w:t>Pin definitions per unit</w:t>
-      </w:r>
-      <w:bookmarkEnd w:id="0"/>
+        <w:t xml:space="preserve">Pin definitions per </w:t>
+      </w:r>
+      <w:proofErr w:type="gramStart"/>
+      <w:r>
+        <w:rPr>
+          <w:lang w:val="en-GB"/>
+        </w:rPr>
+        <w:t>unit</w:t>
+      </w:r>
+      <w:bookmarkEnd w:id="1"/>
+      <w:proofErr w:type="gramEnd"/>
     </w:p>
     <w:p>
       <w:pPr>
@@ -3077,11 +3117,11 @@
       <w:pPr>
         <w:pStyle w:val="Heading3"/>
       </w:pPr>
-      <w:bookmarkStart w:id="1" w:name="_Toc223434584"/>
+      <w:bookmarkStart w:id="2" w:name="_Toc223434584"/>
       <w:r>
         <w:t>Voeding</w:t>
       </w:r>
-      <w:bookmarkEnd w:id="1"/>
+      <w:bookmarkEnd w:id="2"/>
     </w:p>
     <w:p>
       <w:pPr>
@@ -3090,7 +3130,7 @@
           <w:lang w:val="nl-NL"/>
         </w:rPr>
       </w:pPr>
-      <w:hyperlink r:id="rId10" w:history="1">
+      <w:hyperlink r:id="rId16" w:history="1">
         <w:r>
           <w:rPr>
             <w:rStyle w:val="Hyperlink"/>
@@ -3113,7 +3153,7 @@
           <w:lang w:val="nl-NL"/>
         </w:rPr>
       </w:pPr>
-      <w:hyperlink r:id="rId11" w:history="1">
+      <w:hyperlink r:id="rId17" w:history="1">
         <w:r>
           <w:rPr>
             <w:rStyle w:val="Hyperlink"/>
@@ -3130,29 +3170,26 @@
       </w:r>
     </w:p>
     <w:p>
-      <w:pPr>
-        <w:pStyle w:val="NoSpacing"/>
-        <w:rPr>
-          <w:lang w:val="nl-NL"/>
-        </w:rPr>
-      </w:pPr>
+      <w:r>
+        <w:br w:type="page"/>
+      </w:r>
     </w:p>
     <w:p>
       <w:pPr>
         <w:pStyle w:val="NoSpacing"/>
       </w:pPr>
-      <w:bookmarkStart w:id="2" w:name="_Toc223434585"/>
+      <w:bookmarkStart w:id="3" w:name="_Toc223434585"/>
       <w:r>
         <w:rPr>
           <w:rStyle w:val="Heading3Char"/>
         </w:rPr>
         <w:t>HDMI</w:t>
       </w:r>
-      <w:bookmarkEnd w:id="2"/>
+      <w:bookmarkEnd w:id="3"/>
       <w:r>
         <w:t xml:space="preserve"> </w:t>
       </w:r>
-      <w:hyperlink r:id="rId12" w:anchor="page=11" w:history="1">
+      <w:hyperlink r:id="rId18" w:anchor="page=11" w:history="1">
         <w:r>
           <w:rPr>
             <w:rStyle w:val="Hyperlink"/>
@@ -4374,7 +4411,6 @@
               <w:rPr>
                 <w:lang w:val="nl-NL"/>
               </w:rPr>
-              <w:lastRenderedPageBreak/>
               <w:t>HDMI</w:t>
             </w:r>
             <w:r>
@@ -4633,7 +4669,7 @@
           <w:noProof/>
         </w:rPr>
         <w:drawing>
-          <wp:inline distT="0" distB="0" distL="0" distR="0" wp14:anchorId="2020065A" wp14:editId="55648F36">
+          <wp:inline distT="0" distB="0" distL="0" distR="0" wp14:anchorId="2020065A" wp14:editId="4AEF42AD">
             <wp:extent cx="2719346" cy="2008025"/>
             <wp:effectExtent l="0" t="0" r="5080" b="0"/>
             <wp:docPr id="619101385" name="Picture 1" descr="Does HDMI 2.0 Support 1080p 120Hz? Addressing HDMI Questions ..."/>
@@ -4650,7 +4686,7 @@
                     </pic:cNvPicPr>
                   </pic:nvPicPr>
                   <pic:blipFill>
-                    <a:blip r:embed="rId13" cstate="print">
+                    <a:blip r:embed="rId19" cstate="print">
                       <a:extLst>
                         <a:ext uri="{28A0092B-C50C-407E-A947-70E740481C1C}">
                           <a14:useLocalDpi xmlns:a14="http://schemas.microsoft.com/office/drawing/2010/main" val="0"/>
@@ -4683,12 +4719,9 @@
       </w:r>
     </w:p>
     <w:p>
-      <w:pPr>
-        <w:pStyle w:val="NoSpacing"/>
-        <w:rPr>
-          <w:lang w:val="nl-NL"/>
-        </w:rPr>
-      </w:pPr>
+      <w:r>
+        <w:br w:type="page"/>
+      </w:r>
     </w:p>
     <w:p>
       <w:pPr>
@@ -4697,7 +4730,7 @@
           <w:lang w:val="nl-NL"/>
         </w:rPr>
       </w:pPr>
-      <w:bookmarkStart w:id="3" w:name="_Toc223434586"/>
+      <w:bookmarkStart w:id="4" w:name="_Toc223434586"/>
       <w:r>
         <w:rPr>
           <w:rStyle w:val="Heading3Char"/>
@@ -4705,14 +4738,14 @@
         </w:rPr>
         <w:t>NVME</w:t>
       </w:r>
-      <w:bookmarkEnd w:id="3"/>
+      <w:bookmarkEnd w:id="4"/>
       <w:r>
         <w:rPr>
           <w:lang w:val="nl-NL"/>
         </w:rPr>
         <w:t xml:space="preserve"> (</w:t>
       </w:r>
-      <w:hyperlink r:id="rId14" w:anchor="page=7" w:history="1">
+      <w:hyperlink r:id="rId20" w:anchor="page=7" w:history="1">
         <w:r>
           <w:rPr>
             <w:rStyle w:val="Hyperlink"/>
@@ -4784,7 +4817,7 @@
       <w:pPr>
         <w:pStyle w:val="NoSpacing"/>
       </w:pPr>
-      <w:hyperlink r:id="rId15" w:anchor="page=12" w:history="1">
+      <w:hyperlink r:id="rId21" w:anchor="page=12" w:history="1">
         <w:r>
           <w:rPr>
             <w:rStyle w:val="Hyperlink"/>
@@ -6820,7 +6853,6 @@
               <w:rPr>
                 <w:lang w:val="nl-NL"/>
               </w:rPr>
-              <w:lastRenderedPageBreak/>
               <w:t>PEDET</w:t>
             </w:r>
           </w:p>
@@ -7277,7 +7309,7 @@
                     <pic:cNvPicPr/>
                   </pic:nvPicPr>
                   <pic:blipFill>
-                    <a:blip r:embed="rId16"/>
+                    <a:blip r:embed="rId22"/>
                     <a:stretch>
                       <a:fillRect/>
                     </a:stretch>
@@ -7315,18 +7347,18 @@
       <w:pPr>
         <w:pStyle w:val="NoSpacing"/>
       </w:pPr>
-      <w:bookmarkStart w:id="4" w:name="_Toc223434587"/>
+      <w:bookmarkStart w:id="5" w:name="_Toc223434587"/>
       <w:r>
         <w:rPr>
           <w:rStyle w:val="Heading3Char"/>
         </w:rPr>
         <w:t>USB / USB_OTG</w:t>
       </w:r>
-      <w:bookmarkEnd w:id="4"/>
+      <w:bookmarkEnd w:id="5"/>
       <w:r>
         <w:t xml:space="preserve"> (</w:t>
       </w:r>
-      <w:hyperlink r:id="rId17" w:anchor="page=8" w:history="1">
+      <w:hyperlink r:id="rId23" w:anchor="page=8" w:history="1">
         <w:r>
           <w:rPr>
             <w:rStyle w:val="Hyperlink"/>
@@ -7895,7 +7927,7 @@
                     </pic:cNvPicPr>
                   </pic:nvPicPr>
                   <pic:blipFill rotWithShape="1">
-                    <a:blip r:embed="rId18">
+                    <a:blip r:embed="rId24">
                       <a:extLst>
                         <a:ext uri="{28A0092B-C50C-407E-A947-70E740481C1C}">
                           <a14:useLocalDpi xmlns:a14="http://schemas.microsoft.com/office/drawing/2010/main" val="0"/>
@@ -7939,7 +7971,7 @@
           <w:noProof/>
         </w:rPr>
         <w:drawing>
-          <wp:inline distT="0" distB="0" distL="0" distR="0" wp14:anchorId="0A4037B6" wp14:editId="22313901">
+          <wp:inline distT="0" distB="0" distL="0" distR="0" wp14:anchorId="0A4037B6" wp14:editId="40A9BE1D">
             <wp:extent cx="1148504" cy="1764803"/>
             <wp:effectExtent l="0" t="0" r="0" b="6985"/>
             <wp:docPr id="958528632" name="Picture 4" descr="What is Micro USB OTG (On-The-Go)? Build DIY OTG Cable"/>
@@ -7956,7 +7988,7 @@
                     </pic:cNvPicPr>
                   </pic:nvPicPr>
                   <pic:blipFill rotWithShape="1">
-                    <a:blip r:embed="rId19" cstate="print">
+                    <a:blip r:embed="rId25" cstate="print">
                       <a:extLst>
                         <a:ext uri="{28A0092B-C50C-407E-A947-70E740481C1C}">
                           <a14:useLocalDpi xmlns:a14="http://schemas.microsoft.com/office/drawing/2010/main" val="0"/>
@@ -8002,12 +8034,9 @@
       </w:pPr>
     </w:p>
     <w:p>
-      <w:pPr>
-        <w:pStyle w:val="NoSpacing"/>
-        <w:rPr>
-          <w:lang w:val="nl-NL"/>
-        </w:rPr>
-      </w:pPr>
+      <w:r>
+        <w:br w:type="page"/>
+      </w:r>
     </w:p>
     <w:p>
       <w:pPr>
@@ -8016,27 +8045,41 @@
           <w:lang w:val="nl-NL"/>
         </w:rPr>
       </w:pPr>
-      <w:bookmarkStart w:id="5" w:name="_Toc223434588"/>
+      <w:bookmarkStart w:id="6" w:name="_Toc223434588"/>
       <w:r>
         <w:rPr>
           <w:rStyle w:val="Heading3Char"/>
         </w:rPr>
         <w:t>Ethernet</w:t>
       </w:r>
-      <w:bookmarkEnd w:id="5"/>
+      <w:bookmarkEnd w:id="6"/>
       <w:r>
         <w:rPr>
           <w:lang w:val="nl-NL"/>
         </w:rPr>
         <w:t xml:space="preserve"> </w:t>
       </w:r>
-      <w:hyperlink r:id="rId20" w:anchor="page=7" w:history="1">
+      <w:hyperlink r:id="rId26" w:anchor="page=7" w:history="1">
         <w:r>
           <w:rPr>
             <w:rStyle w:val="Hyperlink"/>
             <w:lang w:val="nl-NL"/>
           </w:rPr>
-          <w:t>(2.2. Ethernet Datasheet)</w:t>
+          <w:t>(2.2. Ethernet Datas</w:t>
+        </w:r>
+        <w:r>
+          <w:rPr>
+            <w:rStyle w:val="Hyperlink"/>
+            <w:lang w:val="nl-NL"/>
+          </w:rPr>
+          <w:t>h</w:t>
+        </w:r>
+        <w:r>
+          <w:rPr>
+            <w:rStyle w:val="Hyperlink"/>
+            <w:lang w:val="nl-NL"/>
+          </w:rPr>
+          <w:t>eet)</w:t>
         </w:r>
       </w:hyperlink>
     </w:p>
@@ -8259,7 +8302,6 @@
               <w:rPr>
                 <w:lang w:val="nl-NL"/>
               </w:rPr>
-              <w:lastRenderedPageBreak/>
               <w:t>Ethernet_P1P</w:t>
             </w:r>
           </w:p>
@@ -9274,14 +9316,30 @@
       </w:pPr>
     </w:p>
     <w:p>
+      <w:r>
+        <w:br w:type="page"/>
+      </w:r>
+    </w:p>
+    <w:p>
       <w:pPr>
         <w:pStyle w:val="Heading3"/>
       </w:pPr>
-      <w:bookmarkStart w:id="6" w:name="_Toc223434589"/>
+      <w:bookmarkStart w:id="7" w:name="_Toc223434589"/>
       <w:r>
         <w:t>USB-C</w:t>
       </w:r>
-      <w:bookmarkEnd w:id="6"/>
+      <w:bookmarkEnd w:id="7"/>
+      <w:r>
+        <w:t xml:space="preserve"> connector : </w:t>
+      </w:r>
+      <w:hyperlink r:id="rId27" w:history="1">
+        <w:r>
+          <w:rPr>
+            <w:rStyle w:val="Hyperlink"/>
+          </w:rPr>
+          <w:t>SS-52400-004</w:t>
+        </w:r>
+      </w:hyperlink>
       <w:r>
         <w:tab/>
       </w:r>
@@ -9299,7 +9357,2025 @@
       <w:r>
         <w:t>IC</w:t>
       </w:r>
+      <w:r>
+        <w:t xml:space="preserve">: </w:t>
+      </w:r>
+      <w:hyperlink r:id="rId28" w:history="1">
+        <w:r>
+          <w:rPr>
+            <w:rStyle w:val="Hyperlink"/>
+          </w:rPr>
+          <w:t>HUSB</w:t>
+        </w:r>
+        <w:r>
+          <w:rPr>
+            <w:rStyle w:val="Hyperlink"/>
+          </w:rPr>
+          <w:t>238</w:t>
+        </w:r>
+      </w:hyperlink>
     </w:p>
+    <w:p>
+      <w:pPr>
+        <w:pStyle w:val="NoSpacing"/>
+      </w:pPr>
+      <w:r>
+        <w:t xml:space="preserve">Buck converter: </w:t>
+      </w:r>
+      <w:hyperlink r:id="rId29" w:anchor="page=2" w:history="1">
+        <w:r>
+          <w:rPr>
+            <w:rStyle w:val="Hyperlink"/>
+            <w:lang w:val="nl-NL"/>
+          </w:rPr>
+          <w:t>AP62</w:t>
+        </w:r>
+        <w:r>
+          <w:rPr>
+            <w:rStyle w:val="Hyperlink"/>
+            <w:lang w:val="nl-NL"/>
+          </w:rPr>
+          <w:t>3</w:t>
+        </w:r>
+        <w:r>
+          <w:rPr>
+            <w:rStyle w:val="Hyperlink"/>
+            <w:lang w:val="nl-NL"/>
+          </w:rPr>
+          <w:t>0</w:t>
+        </w:r>
+        <w:r>
+          <w:rPr>
+            <w:rStyle w:val="Hyperlink"/>
+            <w:lang w:val="nl-NL"/>
+          </w:rPr>
+          <w:t>0</w:t>
+        </w:r>
+      </w:hyperlink>
+    </w:p>
+    <w:p>
+      <w:pPr>
+        <w:pStyle w:val="NoSpacing"/>
+      </w:pPr>
+    </w:p>
+    <w:tbl>
+      <w:tblPr>
+        <w:tblStyle w:val="TableGrid"/>
+        <w:tblW w:w="0" w:type="auto"/>
+        <w:tblLook w:val="04A0" w:firstRow="1" w:lastRow="0" w:firstColumn="1" w:lastColumn="0" w:noHBand="0" w:noVBand="1"/>
+      </w:tblPr>
+      <w:tblGrid>
+        <w:gridCol w:w="1418"/>
+        <w:gridCol w:w="1487"/>
+        <w:gridCol w:w="1833"/>
+        <w:gridCol w:w="1594"/>
+        <w:gridCol w:w="1273"/>
+      </w:tblGrid>
+      <w:tr>
+        <w:tc>
+          <w:tcPr>
+            <w:tcW w:w="1418" w:type="dxa"/>
+          </w:tcPr>
+          <w:p>
+            <w:pPr>
+              <w:pStyle w:val="NoSpacing"/>
+              <w:rPr>
+                <w:b/>
+                <w:bCs/>
+                <w:lang w:val="nl-NL"/>
+              </w:rPr>
+            </w:pPr>
+            <w:r>
+              <w:rPr>
+                <w:b/>
+                <w:bCs/>
+                <w:lang w:val="nl-NL"/>
+              </w:rPr>
+              <w:t>Name</w:t>
+            </w:r>
+          </w:p>
+        </w:tc>
+        <w:tc>
+          <w:tcPr>
+            <w:tcW w:w="1487" w:type="dxa"/>
+          </w:tcPr>
+          <w:p>
+            <w:pPr>
+              <w:pStyle w:val="NoSpacing"/>
+              <w:rPr>
+                <w:b/>
+                <w:bCs/>
+                <w:lang w:val="nl-NL"/>
+              </w:rPr>
+            </w:pPr>
+            <w:r>
+              <w:rPr>
+                <w:b/>
+                <w:bCs/>
+                <w:lang w:val="nl-NL"/>
+              </w:rPr>
+              <w:t>Pin (</w:t>
+            </w:r>
+            <w:r>
+              <w:rPr>
+                <w:b/>
+                <w:bCs/>
+                <w:lang w:val="nl-NL"/>
+              </w:rPr>
+              <w:t>USB-c</w:t>
+            </w:r>
+            <w:r>
+              <w:rPr>
+                <w:b/>
+                <w:bCs/>
+                <w:lang w:val="nl-NL"/>
+              </w:rPr>
+              <w:t>)</w:t>
+            </w:r>
+          </w:p>
+        </w:tc>
+        <w:tc>
+          <w:tcPr>
+            <w:tcW w:w="1833" w:type="dxa"/>
+          </w:tcPr>
+          <w:p>
+            <w:pPr>
+              <w:pStyle w:val="NoSpacing"/>
+              <w:rPr>
+                <w:b/>
+                <w:bCs/>
+                <w:lang w:val="nl-NL"/>
+              </w:rPr>
+            </w:pPr>
+            <w:r>
+              <w:rPr>
+                <w:b/>
+                <w:bCs/>
+                <w:lang w:val="nl-NL"/>
+              </w:rPr>
+              <w:t>Pin (connector)</w:t>
+            </w:r>
+          </w:p>
+        </w:tc>
+        <w:tc>
+          <w:tcPr>
+            <w:tcW w:w="1594" w:type="dxa"/>
+          </w:tcPr>
+          <w:p>
+            <w:pPr>
+              <w:pStyle w:val="NoSpacing"/>
+              <w:rPr>
+                <w:lang w:val="nl-NL"/>
+              </w:rPr>
+            </w:pPr>
+            <w:proofErr w:type="spellStart"/>
+            <w:r>
+              <w:rPr>
+                <w:b/>
+                <w:bCs/>
+                <w:lang w:val="nl-NL"/>
+              </w:rPr>
+              <w:t>Function</w:t>
+            </w:r>
+            <w:proofErr w:type="spellEnd"/>
+          </w:p>
+        </w:tc>
+        <w:tc>
+          <w:tcPr>
+            <w:tcW w:w="1273" w:type="dxa"/>
+          </w:tcPr>
+          <w:p>
+            <w:pPr>
+              <w:pStyle w:val="NoSpacing"/>
+              <w:rPr>
+                <w:lang w:val="nl-NL"/>
+              </w:rPr>
+            </w:pPr>
+          </w:p>
+        </w:tc>
+      </w:tr>
+      <w:tr>
+        <w:tc>
+          <w:tcPr>
+            <w:tcW w:w="1418" w:type="dxa"/>
+            <w:vAlign w:val="center"/>
+          </w:tcPr>
+          <w:p>
+            <w:pPr>
+              <w:pStyle w:val="NoSpacing"/>
+              <w:rPr>
+                <w:lang w:val="nl-NL"/>
+              </w:rPr>
+            </w:pPr>
+            <w:r>
+              <w:rPr>
+                <w:rStyle w:val="Strong"/>
+              </w:rPr>
+              <w:t>A1</w:t>
+            </w:r>
+          </w:p>
+        </w:tc>
+        <w:tc>
+          <w:tcPr>
+            <w:tcW w:w="1487" w:type="dxa"/>
+            <w:vAlign w:val="center"/>
+          </w:tcPr>
+          <w:p>
+            <w:pPr>
+              <w:pStyle w:val="NoSpacing"/>
+              <w:rPr>
+                <w:lang w:val="nl-NL"/>
+              </w:rPr>
+            </w:pPr>
+            <w:r>
+              <w:t>GND_A</w:t>
+            </w:r>
+          </w:p>
+        </w:tc>
+        <w:tc>
+          <w:tcPr>
+            <w:tcW w:w="1833" w:type="dxa"/>
+            <w:vAlign w:val="center"/>
+          </w:tcPr>
+          <w:p>
+            <w:pPr>
+              <w:pStyle w:val="NoSpacing"/>
+              <w:rPr>
+                <w:lang w:val="nl-NL"/>
+              </w:rPr>
+            </w:pPr>
+            <w:r>
+              <w:rPr>
+                <w:lang w:val="nl-NL"/>
+              </w:rPr>
+              <w:t>GND</w:t>
+            </w:r>
+          </w:p>
+        </w:tc>
+        <w:tc>
+          <w:tcPr>
+            <w:tcW w:w="1594" w:type="dxa"/>
+            <w:vAlign w:val="center"/>
+          </w:tcPr>
+          <w:p>
+            <w:pPr>
+              <w:pStyle w:val="NoSpacing"/>
+              <w:rPr>
+                <w:lang w:val="nl-NL"/>
+              </w:rPr>
+            </w:pPr>
+          </w:p>
+        </w:tc>
+        <w:tc>
+          <w:tcPr>
+            <w:tcW w:w="1273" w:type="dxa"/>
+            <w:vAlign w:val="center"/>
+          </w:tcPr>
+          <w:p>
+            <w:pPr>
+              <w:pStyle w:val="NoSpacing"/>
+              <w:rPr>
+                <w:lang w:val="nl-NL"/>
+              </w:rPr>
+            </w:pPr>
+          </w:p>
+        </w:tc>
+      </w:tr>
+      <w:tr>
+        <w:tc>
+          <w:tcPr>
+            <w:tcW w:w="1418" w:type="dxa"/>
+            <w:vAlign w:val="center"/>
+          </w:tcPr>
+          <w:p>
+            <w:pPr>
+              <w:pStyle w:val="NoSpacing"/>
+              <w:rPr>
+                <w:lang w:val="nl-NL"/>
+              </w:rPr>
+            </w:pPr>
+            <w:r>
+              <w:rPr>
+                <w:rStyle w:val="Strong"/>
+              </w:rPr>
+              <w:t>A2</w:t>
+            </w:r>
+          </w:p>
+        </w:tc>
+        <w:tc>
+          <w:tcPr>
+            <w:tcW w:w="1487" w:type="dxa"/>
+            <w:vAlign w:val="center"/>
+          </w:tcPr>
+          <w:p>
+            <w:pPr>
+              <w:pStyle w:val="NoSpacing"/>
+              <w:rPr>
+                <w:lang w:val="nl-NL"/>
+              </w:rPr>
+            </w:pPr>
+            <w:r>
+              <w:t>SSTXP1</w:t>
+            </w:r>
+          </w:p>
+        </w:tc>
+        <w:tc>
+          <w:tcPr>
+            <w:tcW w:w="1833" w:type="dxa"/>
+            <w:vAlign w:val="center"/>
+          </w:tcPr>
+          <w:p>
+            <w:pPr>
+              <w:pStyle w:val="NoSpacing"/>
+              <w:rPr>
+                <w:lang w:val="nl-NL"/>
+              </w:rPr>
+            </w:pPr>
+            <w:r>
+              <w:rPr>
+                <w:lang w:val="nl-NL"/>
+              </w:rPr>
+              <w:t>-</w:t>
+            </w:r>
+          </w:p>
+        </w:tc>
+        <w:tc>
+          <w:tcPr>
+            <w:tcW w:w="1594" w:type="dxa"/>
+            <w:vAlign w:val="center"/>
+          </w:tcPr>
+          <w:p>
+            <w:pPr>
+              <w:pStyle w:val="NoSpacing"/>
+              <w:rPr>
+                <w:lang w:val="nl-NL"/>
+              </w:rPr>
+            </w:pPr>
+          </w:p>
+        </w:tc>
+        <w:tc>
+          <w:tcPr>
+            <w:tcW w:w="1273" w:type="dxa"/>
+            <w:vAlign w:val="center"/>
+          </w:tcPr>
+          <w:p>
+            <w:pPr>
+              <w:pStyle w:val="NoSpacing"/>
+              <w:rPr>
+                <w:lang w:val="nl-NL"/>
+              </w:rPr>
+            </w:pPr>
+          </w:p>
+        </w:tc>
+      </w:tr>
+      <w:tr>
+        <w:tc>
+          <w:tcPr>
+            <w:tcW w:w="1418" w:type="dxa"/>
+            <w:vAlign w:val="center"/>
+          </w:tcPr>
+          <w:p>
+            <w:pPr>
+              <w:pStyle w:val="NoSpacing"/>
+              <w:rPr>
+                <w:lang w:val="nl-NL"/>
+              </w:rPr>
+            </w:pPr>
+            <w:r>
+              <w:rPr>
+                <w:rStyle w:val="Strong"/>
+              </w:rPr>
+              <w:t>A3</w:t>
+            </w:r>
+          </w:p>
+        </w:tc>
+        <w:tc>
+          <w:tcPr>
+            <w:tcW w:w="1487" w:type="dxa"/>
+            <w:vAlign w:val="center"/>
+          </w:tcPr>
+          <w:p>
+            <w:pPr>
+              <w:pStyle w:val="NoSpacing"/>
+              <w:rPr>
+                <w:lang w:val="nl-NL"/>
+              </w:rPr>
+            </w:pPr>
+            <w:r>
+              <w:t>SSTXN1</w:t>
+            </w:r>
+          </w:p>
+        </w:tc>
+        <w:tc>
+          <w:tcPr>
+            <w:tcW w:w="1833" w:type="dxa"/>
+            <w:vAlign w:val="center"/>
+          </w:tcPr>
+          <w:p>
+            <w:pPr>
+              <w:pStyle w:val="NoSpacing"/>
+              <w:rPr>
+                <w:lang w:val="nl-NL"/>
+              </w:rPr>
+            </w:pPr>
+            <w:r>
+              <w:rPr>
+                <w:lang w:val="nl-NL"/>
+              </w:rPr>
+              <w:t>-</w:t>
+            </w:r>
+          </w:p>
+        </w:tc>
+        <w:tc>
+          <w:tcPr>
+            <w:tcW w:w="1594" w:type="dxa"/>
+            <w:vAlign w:val="center"/>
+          </w:tcPr>
+          <w:p>
+            <w:pPr>
+              <w:pStyle w:val="NoSpacing"/>
+              <w:rPr>
+                <w:lang w:val="nl-NL"/>
+              </w:rPr>
+            </w:pPr>
+          </w:p>
+        </w:tc>
+        <w:tc>
+          <w:tcPr>
+            <w:tcW w:w="1273" w:type="dxa"/>
+            <w:vAlign w:val="center"/>
+          </w:tcPr>
+          <w:p>
+            <w:pPr>
+              <w:pStyle w:val="NoSpacing"/>
+              <w:rPr>
+                <w:lang w:val="nl-NL"/>
+              </w:rPr>
+            </w:pPr>
+          </w:p>
+        </w:tc>
+      </w:tr>
+      <w:tr>
+        <w:tc>
+          <w:tcPr>
+            <w:tcW w:w="1418" w:type="dxa"/>
+            <w:vAlign w:val="center"/>
+          </w:tcPr>
+          <w:p>
+            <w:pPr>
+              <w:pStyle w:val="NoSpacing"/>
+              <w:rPr>
+                <w:lang w:val="nl-NL"/>
+              </w:rPr>
+            </w:pPr>
+            <w:r>
+              <w:rPr>
+                <w:rStyle w:val="Strong"/>
+              </w:rPr>
+              <w:t>A4</w:t>
+            </w:r>
+          </w:p>
+        </w:tc>
+        <w:tc>
+          <w:tcPr>
+            <w:tcW w:w="1487" w:type="dxa"/>
+            <w:vAlign w:val="center"/>
+          </w:tcPr>
+          <w:p>
+            <w:pPr>
+              <w:pStyle w:val="NoSpacing"/>
+              <w:rPr>
+                <w:lang w:val="nl-NL"/>
+              </w:rPr>
+            </w:pPr>
+            <w:r>
+              <w:t>VBUS_A</w:t>
+            </w:r>
+          </w:p>
+        </w:tc>
+        <w:tc>
+          <w:tcPr>
+            <w:tcW w:w="1833" w:type="dxa"/>
+            <w:vAlign w:val="center"/>
+          </w:tcPr>
+          <w:p>
+            <w:pPr>
+              <w:pStyle w:val="NoSpacing"/>
+              <w:rPr>
+                <w:lang w:val="nl-NL"/>
+              </w:rPr>
+            </w:pPr>
+            <w:r>
+              <w:rPr>
+                <w:lang w:val="nl-NL"/>
+              </w:rPr>
+              <w:t>1</w:t>
+            </w:r>
+          </w:p>
+        </w:tc>
+        <w:tc>
+          <w:tcPr>
+            <w:tcW w:w="1594" w:type="dxa"/>
+            <w:vAlign w:val="center"/>
+          </w:tcPr>
+          <w:p>
+            <w:pPr>
+              <w:pStyle w:val="NoSpacing"/>
+              <w:rPr>
+                <w:lang w:val="nl-NL"/>
+              </w:rPr>
+            </w:pPr>
+            <w:r>
+              <w:rPr>
+                <w:lang w:val="nl-NL"/>
+              </w:rPr>
+              <w:t>Vin</w:t>
+            </w:r>
+          </w:p>
+        </w:tc>
+        <w:tc>
+          <w:tcPr>
+            <w:tcW w:w="1273" w:type="dxa"/>
+            <w:vAlign w:val="center"/>
+          </w:tcPr>
+          <w:p>
+            <w:pPr>
+              <w:pStyle w:val="NoSpacing"/>
+              <w:rPr>
+                <w:lang w:val="nl-NL"/>
+              </w:rPr>
+            </w:pPr>
+          </w:p>
+        </w:tc>
+      </w:tr>
+      <w:tr>
+        <w:tc>
+          <w:tcPr>
+            <w:tcW w:w="1418" w:type="dxa"/>
+            <w:vAlign w:val="center"/>
+          </w:tcPr>
+          <w:p>
+            <w:pPr>
+              <w:pStyle w:val="NoSpacing"/>
+              <w:rPr>
+                <w:lang w:val="nl-NL"/>
+              </w:rPr>
+            </w:pPr>
+            <w:r>
+              <w:rPr>
+                <w:rStyle w:val="Strong"/>
+              </w:rPr>
+              <w:t>A5</w:t>
+            </w:r>
+          </w:p>
+        </w:tc>
+        <w:tc>
+          <w:tcPr>
+            <w:tcW w:w="1487" w:type="dxa"/>
+            <w:vAlign w:val="center"/>
+          </w:tcPr>
+          <w:p>
+            <w:pPr>
+              <w:pStyle w:val="NoSpacing"/>
+              <w:rPr>
+                <w:lang w:val="nl-NL"/>
+              </w:rPr>
+            </w:pPr>
+            <w:r>
+              <w:t>CC1</w:t>
+            </w:r>
+          </w:p>
+        </w:tc>
+        <w:tc>
+          <w:tcPr>
+            <w:tcW w:w="1833" w:type="dxa"/>
+            <w:vAlign w:val="center"/>
+          </w:tcPr>
+          <w:p>
+            <w:pPr>
+              <w:pStyle w:val="NoSpacing"/>
+              <w:rPr>
+                <w:lang w:val="nl-NL"/>
+              </w:rPr>
+            </w:pPr>
+            <w:r>
+              <w:rPr>
+                <w:lang w:val="nl-NL"/>
+              </w:rPr>
+              <w:t>4</w:t>
+            </w:r>
+          </w:p>
+        </w:tc>
+        <w:tc>
+          <w:tcPr>
+            <w:tcW w:w="1594" w:type="dxa"/>
+            <w:vAlign w:val="center"/>
+          </w:tcPr>
+          <w:p>
+            <w:pPr>
+              <w:pStyle w:val="NoSpacing"/>
+              <w:rPr>
+                <w:lang w:val="nl-NL"/>
+              </w:rPr>
+            </w:pPr>
+            <w:r>
+              <w:rPr>
+                <w:lang w:val="nl-NL"/>
+              </w:rPr>
+              <w:t>Handshake</w:t>
+            </w:r>
+          </w:p>
+        </w:tc>
+        <w:tc>
+          <w:tcPr>
+            <w:tcW w:w="1273" w:type="dxa"/>
+            <w:vAlign w:val="center"/>
+          </w:tcPr>
+          <w:p>
+            <w:pPr>
+              <w:pStyle w:val="NoSpacing"/>
+              <w:rPr>
+                <w:lang w:val="nl-NL"/>
+              </w:rPr>
+            </w:pPr>
+          </w:p>
+        </w:tc>
+      </w:tr>
+      <w:tr>
+        <w:tc>
+          <w:tcPr>
+            <w:tcW w:w="1418" w:type="dxa"/>
+            <w:vAlign w:val="center"/>
+          </w:tcPr>
+          <w:p>
+            <w:pPr>
+              <w:pStyle w:val="NoSpacing"/>
+              <w:rPr>
+                <w:lang w:val="nl-NL"/>
+              </w:rPr>
+            </w:pPr>
+            <w:r>
+              <w:rPr>
+                <w:rStyle w:val="Strong"/>
+              </w:rPr>
+              <w:t>A6</w:t>
+            </w:r>
+          </w:p>
+        </w:tc>
+        <w:tc>
+          <w:tcPr>
+            <w:tcW w:w="1487" w:type="dxa"/>
+            <w:vAlign w:val="center"/>
+          </w:tcPr>
+          <w:p>
+            <w:pPr>
+              <w:pStyle w:val="NoSpacing"/>
+              <w:rPr>
+                <w:lang w:val="nl-NL"/>
+              </w:rPr>
+            </w:pPr>
+            <w:r>
+              <w:t>DP1</w:t>
+            </w:r>
+          </w:p>
+        </w:tc>
+        <w:tc>
+          <w:tcPr>
+            <w:tcW w:w="1833" w:type="dxa"/>
+            <w:vAlign w:val="center"/>
+          </w:tcPr>
+          <w:p>
+            <w:pPr>
+              <w:pStyle w:val="NoSpacing"/>
+              <w:rPr>
+                <w:lang w:val="nl-NL"/>
+              </w:rPr>
+            </w:pPr>
+            <w:r>
+              <w:rPr>
+                <w:lang w:val="nl-NL"/>
+              </w:rPr>
+              <w:t>-</w:t>
+            </w:r>
+          </w:p>
+        </w:tc>
+        <w:tc>
+          <w:tcPr>
+            <w:tcW w:w="1594" w:type="dxa"/>
+            <w:vAlign w:val="center"/>
+          </w:tcPr>
+          <w:p>
+            <w:pPr>
+              <w:pStyle w:val="NoSpacing"/>
+              <w:rPr>
+                <w:lang w:val="nl-NL"/>
+              </w:rPr>
+            </w:pPr>
+          </w:p>
+        </w:tc>
+        <w:tc>
+          <w:tcPr>
+            <w:tcW w:w="1273" w:type="dxa"/>
+            <w:vAlign w:val="center"/>
+          </w:tcPr>
+          <w:p>
+            <w:pPr>
+              <w:pStyle w:val="NoSpacing"/>
+              <w:rPr>
+                <w:lang w:val="nl-NL"/>
+              </w:rPr>
+            </w:pPr>
+          </w:p>
+        </w:tc>
+      </w:tr>
+      <w:tr>
+        <w:tc>
+          <w:tcPr>
+            <w:tcW w:w="1418" w:type="dxa"/>
+            <w:vAlign w:val="center"/>
+          </w:tcPr>
+          <w:p>
+            <w:pPr>
+              <w:pStyle w:val="NoSpacing"/>
+              <w:rPr>
+                <w:lang w:val="nl-NL"/>
+              </w:rPr>
+            </w:pPr>
+            <w:r>
+              <w:rPr>
+                <w:rStyle w:val="Strong"/>
+              </w:rPr>
+              <w:t>A7</w:t>
+            </w:r>
+          </w:p>
+        </w:tc>
+        <w:tc>
+          <w:tcPr>
+            <w:tcW w:w="1487" w:type="dxa"/>
+            <w:vAlign w:val="center"/>
+          </w:tcPr>
+          <w:p>
+            <w:pPr>
+              <w:pStyle w:val="NoSpacing"/>
+              <w:rPr>
+                <w:lang w:val="nl-NL"/>
+              </w:rPr>
+            </w:pPr>
+            <w:r>
+              <w:t>DN1</w:t>
+            </w:r>
+          </w:p>
+        </w:tc>
+        <w:tc>
+          <w:tcPr>
+            <w:tcW w:w="1833" w:type="dxa"/>
+            <w:vAlign w:val="center"/>
+          </w:tcPr>
+          <w:p>
+            <w:pPr>
+              <w:pStyle w:val="NoSpacing"/>
+              <w:rPr>
+                <w:lang w:val="nl-NL"/>
+              </w:rPr>
+            </w:pPr>
+            <w:r>
+              <w:rPr>
+                <w:lang w:val="nl-NL"/>
+              </w:rPr>
+              <w:t>-</w:t>
+            </w:r>
+          </w:p>
+        </w:tc>
+        <w:tc>
+          <w:tcPr>
+            <w:tcW w:w="1594" w:type="dxa"/>
+            <w:vAlign w:val="center"/>
+          </w:tcPr>
+          <w:p>
+            <w:pPr>
+              <w:pStyle w:val="NoSpacing"/>
+              <w:rPr>
+                <w:lang w:val="nl-NL"/>
+              </w:rPr>
+            </w:pPr>
+          </w:p>
+        </w:tc>
+        <w:tc>
+          <w:tcPr>
+            <w:tcW w:w="1273" w:type="dxa"/>
+            <w:vAlign w:val="center"/>
+          </w:tcPr>
+          <w:p>
+            <w:pPr>
+              <w:pStyle w:val="NoSpacing"/>
+              <w:rPr>
+                <w:lang w:val="nl-NL"/>
+              </w:rPr>
+            </w:pPr>
+          </w:p>
+        </w:tc>
+      </w:tr>
+      <w:tr>
+        <w:tc>
+          <w:tcPr>
+            <w:tcW w:w="1418" w:type="dxa"/>
+            <w:vAlign w:val="center"/>
+          </w:tcPr>
+          <w:p>
+            <w:pPr>
+              <w:pStyle w:val="NoSpacing"/>
+              <w:rPr>
+                <w:lang w:val="nl-NL"/>
+              </w:rPr>
+            </w:pPr>
+            <w:r>
+              <w:rPr>
+                <w:rStyle w:val="Strong"/>
+              </w:rPr>
+              <w:t>A8</w:t>
+            </w:r>
+          </w:p>
+        </w:tc>
+        <w:tc>
+          <w:tcPr>
+            <w:tcW w:w="1487" w:type="dxa"/>
+            <w:vAlign w:val="center"/>
+          </w:tcPr>
+          <w:p>
+            <w:pPr>
+              <w:pStyle w:val="NoSpacing"/>
+              <w:rPr>
+                <w:lang w:val="nl-NL"/>
+              </w:rPr>
+            </w:pPr>
+            <w:r>
+              <w:t>SBU1</w:t>
+            </w:r>
+          </w:p>
+        </w:tc>
+        <w:tc>
+          <w:tcPr>
+            <w:tcW w:w="1833" w:type="dxa"/>
+            <w:vAlign w:val="center"/>
+          </w:tcPr>
+          <w:p>
+            <w:pPr>
+              <w:pStyle w:val="NoSpacing"/>
+              <w:rPr>
+                <w:lang w:val="nl-NL"/>
+              </w:rPr>
+            </w:pPr>
+            <w:r>
+              <w:rPr>
+                <w:lang w:val="nl-NL"/>
+              </w:rPr>
+              <w:t>-</w:t>
+            </w:r>
+          </w:p>
+        </w:tc>
+        <w:tc>
+          <w:tcPr>
+            <w:tcW w:w="1594" w:type="dxa"/>
+            <w:vAlign w:val="center"/>
+          </w:tcPr>
+          <w:p>
+            <w:pPr>
+              <w:pStyle w:val="NoSpacing"/>
+              <w:rPr>
+                <w:lang w:val="nl-NL"/>
+              </w:rPr>
+            </w:pPr>
+          </w:p>
+        </w:tc>
+        <w:tc>
+          <w:tcPr>
+            <w:tcW w:w="1273" w:type="dxa"/>
+            <w:vAlign w:val="center"/>
+          </w:tcPr>
+          <w:p>
+            <w:pPr>
+              <w:pStyle w:val="NoSpacing"/>
+              <w:rPr>
+                <w:lang w:val="nl-NL"/>
+              </w:rPr>
+            </w:pPr>
+          </w:p>
+        </w:tc>
+      </w:tr>
+      <w:tr>
+        <w:tc>
+          <w:tcPr>
+            <w:tcW w:w="1418" w:type="dxa"/>
+            <w:vAlign w:val="center"/>
+          </w:tcPr>
+          <w:p>
+            <w:pPr>
+              <w:pStyle w:val="NoSpacing"/>
+              <w:rPr>
+                <w:lang w:val="nl-NL"/>
+              </w:rPr>
+            </w:pPr>
+            <w:r>
+              <w:rPr>
+                <w:rStyle w:val="Strong"/>
+              </w:rPr>
+              <w:t>A10</w:t>
+            </w:r>
+          </w:p>
+        </w:tc>
+        <w:tc>
+          <w:tcPr>
+            <w:tcW w:w="1487" w:type="dxa"/>
+            <w:vAlign w:val="center"/>
+          </w:tcPr>
+          <w:p>
+            <w:pPr>
+              <w:pStyle w:val="NoSpacing"/>
+              <w:rPr>
+                <w:lang w:val="nl-NL"/>
+              </w:rPr>
+            </w:pPr>
+            <w:r>
+              <w:t>SSRXN2</w:t>
+            </w:r>
+          </w:p>
+        </w:tc>
+        <w:tc>
+          <w:tcPr>
+            <w:tcW w:w="1833" w:type="dxa"/>
+            <w:vAlign w:val="center"/>
+          </w:tcPr>
+          <w:p>
+            <w:pPr>
+              <w:pStyle w:val="NoSpacing"/>
+              <w:rPr>
+                <w:lang w:val="nl-NL"/>
+              </w:rPr>
+            </w:pPr>
+            <w:r>
+              <w:rPr>
+                <w:lang w:val="nl-NL"/>
+              </w:rPr>
+              <w:t>-</w:t>
+            </w:r>
+          </w:p>
+        </w:tc>
+        <w:tc>
+          <w:tcPr>
+            <w:tcW w:w="1594" w:type="dxa"/>
+            <w:vAlign w:val="center"/>
+          </w:tcPr>
+          <w:p>
+            <w:pPr>
+              <w:pStyle w:val="NoSpacing"/>
+              <w:rPr>
+                <w:lang w:val="nl-NL"/>
+              </w:rPr>
+            </w:pPr>
+          </w:p>
+        </w:tc>
+        <w:tc>
+          <w:tcPr>
+            <w:tcW w:w="1273" w:type="dxa"/>
+            <w:vAlign w:val="center"/>
+          </w:tcPr>
+          <w:p>
+            <w:pPr>
+              <w:pStyle w:val="NoSpacing"/>
+              <w:rPr>
+                <w:lang w:val="nl-NL"/>
+              </w:rPr>
+            </w:pPr>
+          </w:p>
+        </w:tc>
+      </w:tr>
+      <w:tr>
+        <w:tc>
+          <w:tcPr>
+            <w:tcW w:w="1418" w:type="dxa"/>
+            <w:vAlign w:val="center"/>
+          </w:tcPr>
+          <w:p>
+            <w:pPr>
+              <w:pStyle w:val="NoSpacing"/>
+              <w:rPr>
+                <w:lang w:val="nl-NL"/>
+              </w:rPr>
+            </w:pPr>
+            <w:r>
+              <w:rPr>
+                <w:rStyle w:val="Strong"/>
+              </w:rPr>
+              <w:t>A11</w:t>
+            </w:r>
+          </w:p>
+        </w:tc>
+        <w:tc>
+          <w:tcPr>
+            <w:tcW w:w="1487" w:type="dxa"/>
+            <w:vAlign w:val="center"/>
+          </w:tcPr>
+          <w:p>
+            <w:pPr>
+              <w:pStyle w:val="NoSpacing"/>
+              <w:rPr>
+                <w:lang w:val="nl-NL"/>
+              </w:rPr>
+            </w:pPr>
+            <w:r>
+              <w:t>SSRXP2</w:t>
+            </w:r>
+          </w:p>
+        </w:tc>
+        <w:tc>
+          <w:tcPr>
+            <w:tcW w:w="1833" w:type="dxa"/>
+            <w:vAlign w:val="center"/>
+          </w:tcPr>
+          <w:p>
+            <w:pPr>
+              <w:pStyle w:val="NoSpacing"/>
+              <w:rPr>
+                <w:lang w:val="nl-NL"/>
+              </w:rPr>
+            </w:pPr>
+            <w:r>
+              <w:rPr>
+                <w:lang w:val="nl-NL"/>
+              </w:rPr>
+              <w:t>-</w:t>
+            </w:r>
+          </w:p>
+        </w:tc>
+        <w:tc>
+          <w:tcPr>
+            <w:tcW w:w="1594" w:type="dxa"/>
+            <w:vAlign w:val="center"/>
+          </w:tcPr>
+          <w:p>
+            <w:pPr>
+              <w:pStyle w:val="NoSpacing"/>
+              <w:rPr>
+                <w:lang w:val="nl-NL"/>
+              </w:rPr>
+            </w:pPr>
+          </w:p>
+        </w:tc>
+        <w:tc>
+          <w:tcPr>
+            <w:tcW w:w="1273" w:type="dxa"/>
+            <w:vAlign w:val="center"/>
+          </w:tcPr>
+          <w:p>
+            <w:pPr>
+              <w:pStyle w:val="NoSpacing"/>
+              <w:rPr>
+                <w:lang w:val="nl-NL"/>
+              </w:rPr>
+            </w:pPr>
+          </w:p>
+        </w:tc>
+      </w:tr>
+      <w:tr>
+        <w:tc>
+          <w:tcPr>
+            <w:tcW w:w="1418" w:type="dxa"/>
+            <w:vAlign w:val="center"/>
+          </w:tcPr>
+          <w:p>
+            <w:pPr>
+              <w:pStyle w:val="NoSpacing"/>
+              <w:rPr>
+                <w:lang w:val="nl-NL"/>
+              </w:rPr>
+            </w:pPr>
+            <w:r>
+              <w:rPr>
+                <w:rStyle w:val="Strong"/>
+              </w:rPr>
+              <w:t>SH1</w:t>
+            </w:r>
+          </w:p>
+        </w:tc>
+        <w:tc>
+          <w:tcPr>
+            <w:tcW w:w="1487" w:type="dxa"/>
+            <w:vAlign w:val="center"/>
+          </w:tcPr>
+          <w:p>
+            <w:pPr>
+              <w:pStyle w:val="NoSpacing"/>
+              <w:rPr>
+                <w:lang w:val="nl-NL"/>
+              </w:rPr>
+            </w:pPr>
+            <w:r>
+              <w:t xml:space="preserve">SHIELD </w:t>
+            </w:r>
+          </w:p>
+        </w:tc>
+        <w:tc>
+          <w:tcPr>
+            <w:tcW w:w="1833" w:type="dxa"/>
+            <w:vAlign w:val="center"/>
+          </w:tcPr>
+          <w:p>
+            <w:pPr>
+              <w:pStyle w:val="NoSpacing"/>
+              <w:rPr>
+                <w:lang w:val="nl-NL"/>
+              </w:rPr>
+            </w:pPr>
+            <w:r>
+              <w:rPr>
+                <w:lang w:val="nl-NL"/>
+              </w:rPr>
+              <w:t>GND</w:t>
+            </w:r>
+          </w:p>
+        </w:tc>
+        <w:tc>
+          <w:tcPr>
+            <w:tcW w:w="1594" w:type="dxa"/>
+            <w:vAlign w:val="center"/>
+          </w:tcPr>
+          <w:p>
+            <w:pPr>
+              <w:pStyle w:val="NoSpacing"/>
+              <w:rPr>
+                <w:lang w:val="nl-NL"/>
+              </w:rPr>
+            </w:pPr>
+          </w:p>
+        </w:tc>
+        <w:tc>
+          <w:tcPr>
+            <w:tcW w:w="1273" w:type="dxa"/>
+            <w:vAlign w:val="center"/>
+          </w:tcPr>
+          <w:p>
+            <w:pPr>
+              <w:pStyle w:val="NoSpacing"/>
+              <w:rPr>
+                <w:lang w:val="nl-NL"/>
+              </w:rPr>
+            </w:pPr>
+          </w:p>
+        </w:tc>
+      </w:tr>
+      <w:tr>
+        <w:tc>
+          <w:tcPr>
+            <w:tcW w:w="1418" w:type="dxa"/>
+            <w:vAlign w:val="center"/>
+          </w:tcPr>
+          <w:p>
+            <w:pPr>
+              <w:pStyle w:val="NoSpacing"/>
+              <w:rPr>
+                <w:rStyle w:val="Strong"/>
+              </w:rPr>
+            </w:pPr>
+            <w:r>
+              <w:rPr>
+                <w:rStyle w:val="Strong"/>
+              </w:rPr>
+              <w:t>B1</w:t>
+            </w:r>
+          </w:p>
+        </w:tc>
+        <w:tc>
+          <w:tcPr>
+            <w:tcW w:w="1487" w:type="dxa"/>
+            <w:vAlign w:val="center"/>
+          </w:tcPr>
+          <w:p>
+            <w:pPr>
+              <w:pStyle w:val="NoSpacing"/>
+            </w:pPr>
+            <w:r>
+              <w:t>GND_B</w:t>
+            </w:r>
+          </w:p>
+        </w:tc>
+        <w:tc>
+          <w:tcPr>
+            <w:tcW w:w="1833" w:type="dxa"/>
+            <w:vAlign w:val="center"/>
+          </w:tcPr>
+          <w:p>
+            <w:pPr>
+              <w:pStyle w:val="NoSpacing"/>
+              <w:rPr>
+                <w:lang w:val="nl-NL"/>
+              </w:rPr>
+            </w:pPr>
+            <w:r>
+              <w:rPr>
+                <w:lang w:val="nl-NL"/>
+              </w:rPr>
+              <w:t>GND</w:t>
+            </w:r>
+          </w:p>
+        </w:tc>
+        <w:tc>
+          <w:tcPr>
+            <w:tcW w:w="1594" w:type="dxa"/>
+            <w:vAlign w:val="center"/>
+          </w:tcPr>
+          <w:p>
+            <w:pPr>
+              <w:pStyle w:val="NoSpacing"/>
+              <w:rPr>
+                <w:lang w:val="nl-NL"/>
+              </w:rPr>
+            </w:pPr>
+          </w:p>
+        </w:tc>
+        <w:tc>
+          <w:tcPr>
+            <w:tcW w:w="1273" w:type="dxa"/>
+            <w:vAlign w:val="center"/>
+          </w:tcPr>
+          <w:p>
+            <w:pPr>
+              <w:pStyle w:val="NoSpacing"/>
+              <w:rPr>
+                <w:lang w:val="nl-NL"/>
+              </w:rPr>
+            </w:pPr>
+          </w:p>
+        </w:tc>
+      </w:tr>
+      <w:tr>
+        <w:tc>
+          <w:tcPr>
+            <w:tcW w:w="1418" w:type="dxa"/>
+            <w:vAlign w:val="center"/>
+          </w:tcPr>
+          <w:p>
+            <w:pPr>
+              <w:pStyle w:val="NoSpacing"/>
+              <w:rPr>
+                <w:rStyle w:val="Strong"/>
+              </w:rPr>
+            </w:pPr>
+            <w:r>
+              <w:rPr>
+                <w:rStyle w:val="Strong"/>
+              </w:rPr>
+              <w:t>B2</w:t>
+            </w:r>
+          </w:p>
+        </w:tc>
+        <w:tc>
+          <w:tcPr>
+            <w:tcW w:w="1487" w:type="dxa"/>
+            <w:vAlign w:val="center"/>
+          </w:tcPr>
+          <w:p>
+            <w:pPr>
+              <w:pStyle w:val="NoSpacing"/>
+            </w:pPr>
+            <w:r>
+              <w:t>SSTXP2</w:t>
+            </w:r>
+          </w:p>
+        </w:tc>
+        <w:tc>
+          <w:tcPr>
+            <w:tcW w:w="1833" w:type="dxa"/>
+            <w:vAlign w:val="center"/>
+          </w:tcPr>
+          <w:p>
+            <w:pPr>
+              <w:pStyle w:val="NoSpacing"/>
+              <w:rPr>
+                <w:lang w:val="nl-NL"/>
+              </w:rPr>
+            </w:pPr>
+            <w:r>
+              <w:rPr>
+                <w:lang w:val="nl-NL"/>
+              </w:rPr>
+              <w:t>-</w:t>
+            </w:r>
+          </w:p>
+        </w:tc>
+        <w:tc>
+          <w:tcPr>
+            <w:tcW w:w="1594" w:type="dxa"/>
+            <w:vAlign w:val="center"/>
+          </w:tcPr>
+          <w:p>
+            <w:pPr>
+              <w:pStyle w:val="NoSpacing"/>
+              <w:rPr>
+                <w:lang w:val="nl-NL"/>
+              </w:rPr>
+            </w:pPr>
+          </w:p>
+        </w:tc>
+        <w:tc>
+          <w:tcPr>
+            <w:tcW w:w="1273" w:type="dxa"/>
+            <w:vAlign w:val="center"/>
+          </w:tcPr>
+          <w:p>
+            <w:pPr>
+              <w:pStyle w:val="NoSpacing"/>
+              <w:rPr>
+                <w:lang w:val="nl-NL"/>
+              </w:rPr>
+            </w:pPr>
+          </w:p>
+        </w:tc>
+      </w:tr>
+      <w:tr>
+        <w:tc>
+          <w:tcPr>
+            <w:tcW w:w="1418" w:type="dxa"/>
+            <w:vAlign w:val="center"/>
+          </w:tcPr>
+          <w:p>
+            <w:pPr>
+              <w:pStyle w:val="NoSpacing"/>
+              <w:rPr>
+                <w:rStyle w:val="Strong"/>
+              </w:rPr>
+            </w:pPr>
+            <w:r>
+              <w:rPr>
+                <w:rStyle w:val="Strong"/>
+              </w:rPr>
+              <w:t>B3</w:t>
+            </w:r>
+          </w:p>
+        </w:tc>
+        <w:tc>
+          <w:tcPr>
+            <w:tcW w:w="1487" w:type="dxa"/>
+            <w:vAlign w:val="center"/>
+          </w:tcPr>
+          <w:p>
+            <w:pPr>
+              <w:pStyle w:val="NoSpacing"/>
+            </w:pPr>
+            <w:r>
+              <w:t>SSTXN2</w:t>
+            </w:r>
+          </w:p>
+        </w:tc>
+        <w:tc>
+          <w:tcPr>
+            <w:tcW w:w="1833" w:type="dxa"/>
+            <w:vAlign w:val="center"/>
+          </w:tcPr>
+          <w:p>
+            <w:pPr>
+              <w:pStyle w:val="NoSpacing"/>
+              <w:rPr>
+                <w:lang w:val="nl-NL"/>
+              </w:rPr>
+            </w:pPr>
+            <w:r>
+              <w:rPr>
+                <w:lang w:val="nl-NL"/>
+              </w:rPr>
+              <w:t>-</w:t>
+            </w:r>
+          </w:p>
+        </w:tc>
+        <w:tc>
+          <w:tcPr>
+            <w:tcW w:w="1594" w:type="dxa"/>
+            <w:vAlign w:val="center"/>
+          </w:tcPr>
+          <w:p>
+            <w:pPr>
+              <w:pStyle w:val="NoSpacing"/>
+              <w:rPr>
+                <w:lang w:val="nl-NL"/>
+              </w:rPr>
+            </w:pPr>
+          </w:p>
+        </w:tc>
+        <w:tc>
+          <w:tcPr>
+            <w:tcW w:w="1273" w:type="dxa"/>
+            <w:vAlign w:val="center"/>
+          </w:tcPr>
+          <w:p>
+            <w:pPr>
+              <w:pStyle w:val="NoSpacing"/>
+              <w:rPr>
+                <w:lang w:val="nl-NL"/>
+              </w:rPr>
+            </w:pPr>
+          </w:p>
+        </w:tc>
+      </w:tr>
+      <w:tr>
+        <w:tc>
+          <w:tcPr>
+            <w:tcW w:w="1418" w:type="dxa"/>
+            <w:vAlign w:val="center"/>
+          </w:tcPr>
+          <w:p>
+            <w:pPr>
+              <w:pStyle w:val="NoSpacing"/>
+              <w:rPr>
+                <w:rStyle w:val="Strong"/>
+              </w:rPr>
+            </w:pPr>
+            <w:r>
+              <w:rPr>
+                <w:rStyle w:val="Strong"/>
+              </w:rPr>
+              <w:t>B4</w:t>
+            </w:r>
+          </w:p>
+        </w:tc>
+        <w:tc>
+          <w:tcPr>
+            <w:tcW w:w="1487" w:type="dxa"/>
+            <w:vAlign w:val="center"/>
+          </w:tcPr>
+          <w:p>
+            <w:pPr>
+              <w:pStyle w:val="NoSpacing"/>
+            </w:pPr>
+            <w:r>
+              <w:t>VBUS_B</w:t>
+            </w:r>
+          </w:p>
+        </w:tc>
+        <w:tc>
+          <w:tcPr>
+            <w:tcW w:w="1833" w:type="dxa"/>
+            <w:vAlign w:val="center"/>
+          </w:tcPr>
+          <w:p>
+            <w:pPr>
+              <w:pStyle w:val="NoSpacing"/>
+              <w:rPr>
+                <w:lang w:val="nl-NL"/>
+              </w:rPr>
+            </w:pPr>
+            <w:r>
+              <w:rPr>
+                <w:lang w:val="nl-NL"/>
+              </w:rPr>
+              <w:t>1</w:t>
+            </w:r>
+          </w:p>
+        </w:tc>
+        <w:tc>
+          <w:tcPr>
+            <w:tcW w:w="1594" w:type="dxa"/>
+            <w:vAlign w:val="center"/>
+          </w:tcPr>
+          <w:p>
+            <w:pPr>
+              <w:pStyle w:val="NoSpacing"/>
+              <w:rPr>
+                <w:lang w:val="nl-NL"/>
+              </w:rPr>
+            </w:pPr>
+            <w:r>
+              <w:rPr>
+                <w:lang w:val="nl-NL"/>
+              </w:rPr>
+              <w:t>Vin</w:t>
+            </w:r>
+          </w:p>
+        </w:tc>
+        <w:tc>
+          <w:tcPr>
+            <w:tcW w:w="1273" w:type="dxa"/>
+            <w:vAlign w:val="center"/>
+          </w:tcPr>
+          <w:p>
+            <w:pPr>
+              <w:pStyle w:val="NoSpacing"/>
+              <w:rPr>
+                <w:lang w:val="nl-NL"/>
+              </w:rPr>
+            </w:pPr>
+          </w:p>
+        </w:tc>
+      </w:tr>
+      <w:tr>
+        <w:tc>
+          <w:tcPr>
+            <w:tcW w:w="1418" w:type="dxa"/>
+            <w:vAlign w:val="center"/>
+          </w:tcPr>
+          <w:p>
+            <w:pPr>
+              <w:pStyle w:val="NoSpacing"/>
+              <w:rPr>
+                <w:rStyle w:val="Strong"/>
+              </w:rPr>
+            </w:pPr>
+            <w:r>
+              <w:rPr>
+                <w:rStyle w:val="Strong"/>
+              </w:rPr>
+              <w:t>B5</w:t>
+            </w:r>
+          </w:p>
+        </w:tc>
+        <w:tc>
+          <w:tcPr>
+            <w:tcW w:w="1487" w:type="dxa"/>
+            <w:vAlign w:val="center"/>
+          </w:tcPr>
+          <w:p>
+            <w:pPr>
+              <w:pStyle w:val="NoSpacing"/>
+            </w:pPr>
+            <w:r>
+              <w:t>CC2</w:t>
+            </w:r>
+          </w:p>
+        </w:tc>
+        <w:tc>
+          <w:tcPr>
+            <w:tcW w:w="1833" w:type="dxa"/>
+            <w:vAlign w:val="center"/>
+          </w:tcPr>
+          <w:p>
+            <w:pPr>
+              <w:pStyle w:val="NoSpacing"/>
+              <w:rPr>
+                <w:lang w:val="nl-NL"/>
+              </w:rPr>
+            </w:pPr>
+            <w:r>
+              <w:rPr>
+                <w:lang w:val="nl-NL"/>
+              </w:rPr>
+              <w:t>5</w:t>
+            </w:r>
+          </w:p>
+        </w:tc>
+        <w:tc>
+          <w:tcPr>
+            <w:tcW w:w="1594" w:type="dxa"/>
+            <w:vAlign w:val="center"/>
+          </w:tcPr>
+          <w:p>
+            <w:pPr>
+              <w:pStyle w:val="NoSpacing"/>
+              <w:rPr>
+                <w:lang w:val="nl-NL"/>
+              </w:rPr>
+            </w:pPr>
+            <w:r>
+              <w:rPr>
+                <w:lang w:val="nl-NL"/>
+              </w:rPr>
+              <w:t>Handshake</w:t>
+            </w:r>
+          </w:p>
+        </w:tc>
+        <w:tc>
+          <w:tcPr>
+            <w:tcW w:w="1273" w:type="dxa"/>
+            <w:vAlign w:val="center"/>
+          </w:tcPr>
+          <w:p>
+            <w:pPr>
+              <w:pStyle w:val="NoSpacing"/>
+              <w:rPr>
+                <w:lang w:val="nl-NL"/>
+              </w:rPr>
+            </w:pPr>
+          </w:p>
+        </w:tc>
+      </w:tr>
+      <w:tr>
+        <w:tc>
+          <w:tcPr>
+            <w:tcW w:w="1418" w:type="dxa"/>
+            <w:vAlign w:val="center"/>
+          </w:tcPr>
+          <w:p>
+            <w:pPr>
+              <w:pStyle w:val="NoSpacing"/>
+              <w:rPr>
+                <w:rStyle w:val="Strong"/>
+              </w:rPr>
+            </w:pPr>
+            <w:r>
+              <w:rPr>
+                <w:rStyle w:val="Strong"/>
+              </w:rPr>
+              <w:t>B6</w:t>
+            </w:r>
+          </w:p>
+        </w:tc>
+        <w:tc>
+          <w:tcPr>
+            <w:tcW w:w="1487" w:type="dxa"/>
+            <w:vAlign w:val="center"/>
+          </w:tcPr>
+          <w:p>
+            <w:pPr>
+              <w:pStyle w:val="NoSpacing"/>
+            </w:pPr>
+            <w:r>
+              <w:t>DP2</w:t>
+            </w:r>
+          </w:p>
+        </w:tc>
+        <w:tc>
+          <w:tcPr>
+            <w:tcW w:w="1833" w:type="dxa"/>
+            <w:vAlign w:val="center"/>
+          </w:tcPr>
+          <w:p>
+            <w:pPr>
+              <w:pStyle w:val="NoSpacing"/>
+              <w:rPr>
+                <w:lang w:val="nl-NL"/>
+              </w:rPr>
+            </w:pPr>
+            <w:r>
+              <w:rPr>
+                <w:lang w:val="nl-NL"/>
+              </w:rPr>
+              <w:t>-</w:t>
+            </w:r>
+          </w:p>
+        </w:tc>
+        <w:tc>
+          <w:tcPr>
+            <w:tcW w:w="1594" w:type="dxa"/>
+            <w:vAlign w:val="center"/>
+          </w:tcPr>
+          <w:p>
+            <w:pPr>
+              <w:pStyle w:val="NoSpacing"/>
+              <w:rPr>
+                <w:lang w:val="nl-NL"/>
+              </w:rPr>
+            </w:pPr>
+          </w:p>
+        </w:tc>
+        <w:tc>
+          <w:tcPr>
+            <w:tcW w:w="1273" w:type="dxa"/>
+            <w:vAlign w:val="center"/>
+          </w:tcPr>
+          <w:p>
+            <w:pPr>
+              <w:pStyle w:val="NoSpacing"/>
+              <w:rPr>
+                <w:lang w:val="nl-NL"/>
+              </w:rPr>
+            </w:pPr>
+          </w:p>
+        </w:tc>
+      </w:tr>
+      <w:tr>
+        <w:tc>
+          <w:tcPr>
+            <w:tcW w:w="1418" w:type="dxa"/>
+            <w:vAlign w:val="center"/>
+          </w:tcPr>
+          <w:p>
+            <w:pPr>
+              <w:pStyle w:val="NoSpacing"/>
+              <w:rPr>
+                <w:rStyle w:val="Strong"/>
+              </w:rPr>
+            </w:pPr>
+            <w:r>
+              <w:rPr>
+                <w:rStyle w:val="Strong"/>
+              </w:rPr>
+              <w:t>B7</w:t>
+            </w:r>
+          </w:p>
+        </w:tc>
+        <w:tc>
+          <w:tcPr>
+            <w:tcW w:w="1487" w:type="dxa"/>
+            <w:vAlign w:val="center"/>
+          </w:tcPr>
+          <w:p>
+            <w:pPr>
+              <w:pStyle w:val="NoSpacing"/>
+            </w:pPr>
+            <w:r>
+              <w:t>DN2</w:t>
+            </w:r>
+          </w:p>
+        </w:tc>
+        <w:tc>
+          <w:tcPr>
+            <w:tcW w:w="1833" w:type="dxa"/>
+            <w:vAlign w:val="center"/>
+          </w:tcPr>
+          <w:p>
+            <w:pPr>
+              <w:pStyle w:val="NoSpacing"/>
+              <w:rPr>
+                <w:lang w:val="nl-NL"/>
+              </w:rPr>
+            </w:pPr>
+            <w:r>
+              <w:rPr>
+                <w:lang w:val="nl-NL"/>
+              </w:rPr>
+              <w:t>-</w:t>
+            </w:r>
+          </w:p>
+        </w:tc>
+        <w:tc>
+          <w:tcPr>
+            <w:tcW w:w="1594" w:type="dxa"/>
+            <w:vAlign w:val="center"/>
+          </w:tcPr>
+          <w:p>
+            <w:pPr>
+              <w:pStyle w:val="NoSpacing"/>
+              <w:rPr>
+                <w:lang w:val="nl-NL"/>
+              </w:rPr>
+            </w:pPr>
+          </w:p>
+        </w:tc>
+        <w:tc>
+          <w:tcPr>
+            <w:tcW w:w="1273" w:type="dxa"/>
+            <w:vAlign w:val="center"/>
+          </w:tcPr>
+          <w:p>
+            <w:pPr>
+              <w:pStyle w:val="NoSpacing"/>
+              <w:rPr>
+                <w:lang w:val="nl-NL"/>
+              </w:rPr>
+            </w:pPr>
+          </w:p>
+        </w:tc>
+      </w:tr>
+      <w:tr>
+        <w:tc>
+          <w:tcPr>
+            <w:tcW w:w="1418" w:type="dxa"/>
+            <w:vAlign w:val="center"/>
+          </w:tcPr>
+          <w:p>
+            <w:pPr>
+              <w:pStyle w:val="NoSpacing"/>
+              <w:rPr>
+                <w:rStyle w:val="Strong"/>
+              </w:rPr>
+            </w:pPr>
+            <w:r>
+              <w:rPr>
+                <w:rStyle w:val="Strong"/>
+              </w:rPr>
+              <w:t>B8</w:t>
+            </w:r>
+          </w:p>
+        </w:tc>
+        <w:tc>
+          <w:tcPr>
+            <w:tcW w:w="1487" w:type="dxa"/>
+            <w:vAlign w:val="center"/>
+          </w:tcPr>
+          <w:p>
+            <w:pPr>
+              <w:pStyle w:val="NoSpacing"/>
+            </w:pPr>
+            <w:r>
+              <w:t>SBU2</w:t>
+            </w:r>
+          </w:p>
+        </w:tc>
+        <w:tc>
+          <w:tcPr>
+            <w:tcW w:w="1833" w:type="dxa"/>
+            <w:vAlign w:val="center"/>
+          </w:tcPr>
+          <w:p>
+            <w:pPr>
+              <w:pStyle w:val="NoSpacing"/>
+              <w:rPr>
+                <w:lang w:val="nl-NL"/>
+              </w:rPr>
+            </w:pPr>
+            <w:r>
+              <w:rPr>
+                <w:lang w:val="nl-NL"/>
+              </w:rPr>
+              <w:t>-</w:t>
+            </w:r>
+          </w:p>
+        </w:tc>
+        <w:tc>
+          <w:tcPr>
+            <w:tcW w:w="1594" w:type="dxa"/>
+            <w:vAlign w:val="center"/>
+          </w:tcPr>
+          <w:p>
+            <w:pPr>
+              <w:pStyle w:val="NoSpacing"/>
+              <w:rPr>
+                <w:lang w:val="nl-NL"/>
+              </w:rPr>
+            </w:pPr>
+          </w:p>
+        </w:tc>
+        <w:tc>
+          <w:tcPr>
+            <w:tcW w:w="1273" w:type="dxa"/>
+            <w:vAlign w:val="center"/>
+          </w:tcPr>
+          <w:p>
+            <w:pPr>
+              <w:pStyle w:val="NoSpacing"/>
+              <w:rPr>
+                <w:lang w:val="nl-NL"/>
+              </w:rPr>
+            </w:pPr>
+          </w:p>
+        </w:tc>
+      </w:tr>
+      <w:tr>
+        <w:tc>
+          <w:tcPr>
+            <w:tcW w:w="1418" w:type="dxa"/>
+            <w:vAlign w:val="center"/>
+          </w:tcPr>
+          <w:p>
+            <w:pPr>
+              <w:pStyle w:val="NoSpacing"/>
+              <w:rPr>
+                <w:rStyle w:val="Strong"/>
+              </w:rPr>
+            </w:pPr>
+            <w:r>
+              <w:rPr>
+                <w:rStyle w:val="Strong"/>
+              </w:rPr>
+              <w:t>B10</w:t>
+            </w:r>
+          </w:p>
+        </w:tc>
+        <w:tc>
+          <w:tcPr>
+            <w:tcW w:w="1487" w:type="dxa"/>
+            <w:vAlign w:val="center"/>
+          </w:tcPr>
+          <w:p>
+            <w:pPr>
+              <w:pStyle w:val="NoSpacing"/>
+            </w:pPr>
+            <w:r>
+              <w:t>SSRXN1</w:t>
+            </w:r>
+          </w:p>
+        </w:tc>
+        <w:tc>
+          <w:tcPr>
+            <w:tcW w:w="1833" w:type="dxa"/>
+            <w:vAlign w:val="center"/>
+          </w:tcPr>
+          <w:p>
+            <w:pPr>
+              <w:pStyle w:val="NoSpacing"/>
+              <w:rPr>
+                <w:lang w:val="nl-NL"/>
+              </w:rPr>
+            </w:pPr>
+            <w:r>
+              <w:rPr>
+                <w:lang w:val="nl-NL"/>
+              </w:rPr>
+              <w:t>-</w:t>
+            </w:r>
+          </w:p>
+        </w:tc>
+        <w:tc>
+          <w:tcPr>
+            <w:tcW w:w="1594" w:type="dxa"/>
+            <w:vAlign w:val="center"/>
+          </w:tcPr>
+          <w:p>
+            <w:pPr>
+              <w:pStyle w:val="NoSpacing"/>
+              <w:rPr>
+                <w:lang w:val="nl-NL"/>
+              </w:rPr>
+            </w:pPr>
+          </w:p>
+        </w:tc>
+        <w:tc>
+          <w:tcPr>
+            <w:tcW w:w="1273" w:type="dxa"/>
+            <w:vAlign w:val="center"/>
+          </w:tcPr>
+          <w:p>
+            <w:pPr>
+              <w:pStyle w:val="NoSpacing"/>
+              <w:rPr>
+                <w:lang w:val="nl-NL"/>
+              </w:rPr>
+            </w:pPr>
+          </w:p>
+        </w:tc>
+      </w:tr>
+      <w:tr>
+        <w:tc>
+          <w:tcPr>
+            <w:tcW w:w="1418" w:type="dxa"/>
+            <w:vAlign w:val="center"/>
+          </w:tcPr>
+          <w:p>
+            <w:pPr>
+              <w:pStyle w:val="NoSpacing"/>
+              <w:rPr>
+                <w:rStyle w:val="Strong"/>
+              </w:rPr>
+            </w:pPr>
+            <w:r>
+              <w:rPr>
+                <w:rStyle w:val="Strong"/>
+              </w:rPr>
+              <w:t>B11</w:t>
+            </w:r>
+          </w:p>
+        </w:tc>
+        <w:tc>
+          <w:tcPr>
+            <w:tcW w:w="1487" w:type="dxa"/>
+            <w:vAlign w:val="center"/>
+          </w:tcPr>
+          <w:p>
+            <w:pPr>
+              <w:pStyle w:val="NoSpacing"/>
+            </w:pPr>
+            <w:r>
+              <w:t>SSRXP1</w:t>
+            </w:r>
+          </w:p>
+        </w:tc>
+        <w:tc>
+          <w:tcPr>
+            <w:tcW w:w="1833" w:type="dxa"/>
+            <w:vAlign w:val="center"/>
+          </w:tcPr>
+          <w:p>
+            <w:pPr>
+              <w:pStyle w:val="NoSpacing"/>
+              <w:rPr>
+                <w:lang w:val="nl-NL"/>
+              </w:rPr>
+            </w:pPr>
+            <w:r>
+              <w:rPr>
+                <w:lang w:val="nl-NL"/>
+              </w:rPr>
+              <w:t>-</w:t>
+            </w:r>
+          </w:p>
+        </w:tc>
+        <w:tc>
+          <w:tcPr>
+            <w:tcW w:w="1594" w:type="dxa"/>
+            <w:vAlign w:val="center"/>
+          </w:tcPr>
+          <w:p>
+            <w:pPr>
+              <w:pStyle w:val="NoSpacing"/>
+              <w:rPr>
+                <w:lang w:val="nl-NL"/>
+              </w:rPr>
+            </w:pPr>
+          </w:p>
+        </w:tc>
+        <w:tc>
+          <w:tcPr>
+            <w:tcW w:w="1273" w:type="dxa"/>
+            <w:vAlign w:val="center"/>
+          </w:tcPr>
+          <w:p>
+            <w:pPr>
+              <w:pStyle w:val="NoSpacing"/>
+              <w:rPr>
+                <w:lang w:val="nl-NL"/>
+              </w:rPr>
+            </w:pPr>
+          </w:p>
+        </w:tc>
+      </w:tr>
+    </w:tbl>
     <w:p>
       <w:pPr>
         <w:pStyle w:val="NoSpacing"/>
@@ -9315,6 +11391,93 @@
         <w:rPr>
           <w:lang w:val="en-GB"/>
         </w:rPr>
+        <w:drawing>
+          <wp:inline distT="0" distB="0" distL="0" distR="0" wp14:anchorId="18D31A49" wp14:editId="00C7C00F">
+            <wp:extent cx="5141343" cy="2697696"/>
+            <wp:effectExtent l="0" t="0" r="2540" b="7620"/>
+            <wp:docPr id="1132869330" name="Picture 1" descr="A diagram of a computer circuit&#10;&#10;AI-generated content may be incorrect."/>
+            <wp:cNvGraphicFramePr>
+              <a:graphicFrameLocks xmlns:a="http://schemas.openxmlformats.org/drawingml/2006/main" noChangeAspect="1"/>
+            </wp:cNvGraphicFramePr>
+            <a:graphic xmlns:a="http://schemas.openxmlformats.org/drawingml/2006/main">
+              <a:graphicData uri="http://schemas.openxmlformats.org/drawingml/2006/picture">
+                <pic:pic xmlns:pic="http://schemas.openxmlformats.org/drawingml/2006/picture">
+                  <pic:nvPicPr>
+                    <pic:cNvPr id="1132869330" name="Picture 1" descr="A diagram of a computer circuit&#10;&#10;AI-generated content may be incorrect."/>
+                    <pic:cNvPicPr/>
+                  </pic:nvPicPr>
+                  <pic:blipFill>
+                    <a:blip r:embed="rId30"/>
+                    <a:stretch>
+                      <a:fillRect/>
+                    </a:stretch>
+                  </pic:blipFill>
+                  <pic:spPr>
+                    <a:xfrm>
+                      <a:off x="0" y="0"/>
+                      <a:ext cx="5143562" cy="2698860"/>
+                    </a:xfrm>
+                    <a:prstGeom prst="rect">
+                      <a:avLst/>
+                    </a:prstGeom>
+                  </pic:spPr>
+                </pic:pic>
+              </a:graphicData>
+            </a:graphic>
+          </wp:inline>
+        </w:drawing>
+      </w:r>
+    </w:p>
+    <w:p>
+      <w:pPr>
+        <w:rPr>
+          <w:lang w:val="en-GB"/>
+        </w:rPr>
+      </w:pPr>
+      <w:r>
+        <w:rPr>
+          <w:lang w:val="en-GB"/>
+        </w:rPr>
+        <w:drawing>
+          <wp:inline distT="0" distB="0" distL="0" distR="0" wp14:anchorId="319330D5" wp14:editId="4056F6BF">
+            <wp:extent cx="4977442" cy="2044799"/>
+            <wp:effectExtent l="0" t="0" r="0" b="0"/>
+            <wp:docPr id="2069178934" name="Picture 1" descr="A diagram of a device&#10;&#10;AI-generated content may be incorrect."/>
+            <wp:cNvGraphicFramePr>
+              <a:graphicFrameLocks xmlns:a="http://schemas.openxmlformats.org/drawingml/2006/main" noChangeAspect="1"/>
+            </wp:cNvGraphicFramePr>
+            <a:graphic xmlns:a="http://schemas.openxmlformats.org/drawingml/2006/main">
+              <a:graphicData uri="http://schemas.openxmlformats.org/drawingml/2006/picture">
+                <pic:pic xmlns:pic="http://schemas.openxmlformats.org/drawingml/2006/picture">
+                  <pic:nvPicPr>
+                    <pic:cNvPr id="2069178934" name="Picture 1" descr="A diagram of a device&#10;&#10;AI-generated content may be incorrect."/>
+                    <pic:cNvPicPr/>
+                  </pic:nvPicPr>
+                  <pic:blipFill>
+                    <a:blip r:embed="rId31"/>
+                    <a:stretch>
+                      <a:fillRect/>
+                    </a:stretch>
+                  </pic:blipFill>
+                  <pic:spPr>
+                    <a:xfrm>
+                      <a:off x="0" y="0"/>
+                      <a:ext cx="4981575" cy="2046497"/>
+                    </a:xfrm>
+                    <a:prstGeom prst="rect">
+                      <a:avLst/>
+                    </a:prstGeom>
+                  </pic:spPr>
+                </pic:pic>
+              </a:graphicData>
+            </a:graphic>
+          </wp:inline>
+        </w:drawing>
+      </w:r>
+      <w:r>
+        <w:rPr>
+          <w:lang w:val="en-GB"/>
+        </w:rPr>
         <w:br w:type="page"/>
       </w:r>
     </w:p>
@@ -9325,15 +11488,14 @@
           <w:lang w:val="en-GB"/>
         </w:rPr>
       </w:pPr>
-      <w:bookmarkStart w:id="7" w:name="_Toc223434590"/>
+      <w:bookmarkStart w:id="8" w:name="_Toc223434590"/>
       <w:r>
         <w:rPr>
           <w:lang w:val="en-GB"/>
         </w:rPr>
-        <w:lastRenderedPageBreak/>
         <w:t>Pinout table</w:t>
       </w:r>
-      <w:bookmarkEnd w:id="7"/>
+      <w:bookmarkEnd w:id="8"/>
     </w:p>
     <w:p>
       <w:pPr>
@@ -9378,7 +11540,7 @@
           <w:lang w:val="nl-NL"/>
         </w:rPr>
       </w:pPr>
-      <w:hyperlink r:id="rId21" w:anchor="page=18" w:history="1">
+      <w:hyperlink r:id="rId32" w:anchor="page=18" w:history="1">
         <w:r>
           <w:rPr>
             <w:rStyle w:val="Hyperlink"/>
@@ -12380,6 +14542,7 @@
               </w:rPr>
               <w:t>GPIO_VREF (</w:t>
             </w:r>
+            <w:proofErr w:type="gramStart"/>
             <w:r>
               <w:rPr>
                 <w:b/>
@@ -12387,7 +14550,17 @@
                 <w:sz w:val="20"/>
                 <w:szCs w:val="20"/>
               </w:rPr>
-              <w:t>Can’t be floating)</w:t>
+              <w:t>Can’t</w:t>
+            </w:r>
+            <w:proofErr w:type="gramEnd"/>
+            <w:r>
+              <w:rPr>
+                <w:b/>
+                <w:bCs/>
+                <w:sz w:val="20"/>
+                <w:szCs w:val="20"/>
+              </w:rPr>
+              <w:t xml:space="preserve"> be floating)</w:t>
             </w:r>
           </w:p>
         </w:tc>
@@ -12814,7 +14987,7 @@
           <w:lang w:val="nl-NL"/>
         </w:rPr>
       </w:pPr>
-      <w:hyperlink r:id="rId22" w:anchor="page=18" w:history="1">
+      <w:hyperlink r:id="rId33" w:anchor="page=18" w:history="1">
         <w:r>
           <w:rPr>
             <w:rStyle w:val="Hyperlink"/>
@@ -14283,7 +16456,6 @@
               <w:pStyle w:val="NoSpacing"/>
             </w:pPr>
             <w:r>
-              <w:lastRenderedPageBreak/>
               <w:t>55</w:t>
             </w:r>
           </w:p>
@@ -15854,7 +18026,6 @@
               <w:pStyle w:val="NoSpacing"/>
             </w:pPr>
             <w:r>
-              <w:lastRenderedPageBreak/>
               <w:t>110</w:t>
             </w:r>
           </w:p>
@@ -17419,7 +19590,6 @@
               <w:pStyle w:val="NoSpacing"/>
             </w:pPr>
             <w:r>
-              <w:lastRenderedPageBreak/>
               <w:t>163</w:t>
             </w:r>
           </w:p>
@@ -18455,12 +20625,449 @@
       <w:pPr>
         <w:pStyle w:val="Heading1"/>
       </w:pPr>
-      <w:bookmarkStart w:id="8" w:name="_Toc223434591"/>
-      <w:r>
-        <w:lastRenderedPageBreak/>
+      <w:r>
+        <w:t>BOM</w:t>
+      </w:r>
+    </w:p>
+    <w:tbl>
+      <w:tblPr>
+        <w:tblStyle w:val="TableGrid"/>
+        <w:tblW w:w="9183" w:type="dxa"/>
+        <w:tblLook w:val="04A0" w:firstRow="1" w:lastRow="0" w:firstColumn="1" w:lastColumn="0" w:noHBand="0" w:noVBand="1"/>
+      </w:tblPr>
+      <w:tblGrid>
+        <w:gridCol w:w="2682"/>
+        <w:gridCol w:w="1993"/>
+        <w:gridCol w:w="2254"/>
+        <w:gridCol w:w="2254"/>
+      </w:tblGrid>
+      <w:tr>
+        <w:tc>
+          <w:tcPr>
+            <w:tcW w:w="2682" w:type="dxa"/>
+          </w:tcPr>
+          <w:p>
+            <w:pPr>
+              <w:rPr>
+                <w:b/>
+                <w:bCs/>
+              </w:rPr>
+            </w:pPr>
+            <w:r>
+              <w:rPr>
+                <w:b/>
+                <w:bCs/>
+              </w:rPr>
+              <w:t>Naam</w:t>
+            </w:r>
+          </w:p>
+        </w:tc>
+        <w:tc>
+          <w:tcPr>
+            <w:tcW w:w="1993" w:type="dxa"/>
+          </w:tcPr>
+          <w:p>
+            <w:pPr>
+              <w:rPr>
+                <w:b/>
+                <w:bCs/>
+              </w:rPr>
+            </w:pPr>
+            <w:r>
+              <w:rPr>
+                <w:b/>
+                <w:bCs/>
+              </w:rPr>
+              <w:t>Functie</w:t>
+            </w:r>
+          </w:p>
+        </w:tc>
+        <w:tc>
+          <w:tcPr>
+            <w:tcW w:w="2254" w:type="dxa"/>
+          </w:tcPr>
+          <w:p>
+            <w:pPr>
+              <w:rPr>
+                <w:b/>
+                <w:bCs/>
+              </w:rPr>
+            </w:pPr>
+            <w:r>
+              <w:rPr>
+                <w:b/>
+                <w:bCs/>
+              </w:rPr>
+              <w:t>Aantal</w:t>
+            </w:r>
+          </w:p>
+        </w:tc>
+        <w:tc>
+          <w:tcPr>
+            <w:tcW w:w="2254" w:type="dxa"/>
+          </w:tcPr>
+          <w:p>
+            <w:pPr>
+              <w:rPr>
+                <w:b/>
+                <w:bCs/>
+              </w:rPr>
+            </w:pPr>
+            <w:r>
+              <w:rPr>
+                <w:b/>
+                <w:bCs/>
+              </w:rPr>
+              <w:t>Prijs</w:t>
+            </w:r>
+          </w:p>
+        </w:tc>
+      </w:tr>
+      <w:tr>
+        <w:tc>
+          <w:tcPr>
+            <w:tcW w:w="2682" w:type="dxa"/>
+          </w:tcPr>
+          <w:p>
+            <w:r>
+              <w:t>1-2199119-5</w:t>
+            </w:r>
+          </w:p>
+        </w:tc>
+        <w:tc>
+          <w:tcPr>
+            <w:tcW w:w="1993" w:type="dxa"/>
+          </w:tcPr>
+          <w:p>
+            <w:r>
+              <w:t>Connector SSD</w:t>
+            </w:r>
+          </w:p>
+        </w:tc>
+        <w:tc>
+          <w:tcPr>
+            <w:tcW w:w="2254" w:type="dxa"/>
+          </w:tcPr>
+          <w:p>
+            <w:r>
+              <w:t>1</w:t>
+            </w:r>
+          </w:p>
+        </w:tc>
+        <w:tc>
+          <w:tcPr>
+            <w:tcW w:w="2254" w:type="dxa"/>
+          </w:tcPr>
+          <w:p>
+            <w:r>
+              <w:t xml:space="preserve">Gratis </w:t>
+            </w:r>
+          </w:p>
+        </w:tc>
+      </w:tr>
+      <w:tr>
+        <w:tc>
+          <w:tcPr>
+            <w:tcW w:w="2682" w:type="dxa"/>
+          </w:tcPr>
+          <w:p>
+            <w:r>
+              <w:t>10029449-111RLF</w:t>
+            </w:r>
+          </w:p>
+        </w:tc>
+        <w:tc>
+          <w:tcPr>
+            <w:tcW w:w="1993" w:type="dxa"/>
+          </w:tcPr>
+          <w:p>
+            <w:r>
+              <w:t>HDMI-connector</w:t>
+            </w:r>
+          </w:p>
+        </w:tc>
+        <w:tc>
+          <w:tcPr>
+            <w:tcW w:w="2254" w:type="dxa"/>
+          </w:tcPr>
+          <w:p>
+            <w:r>
+              <w:t>1</w:t>
+            </w:r>
+          </w:p>
+        </w:tc>
+        <w:tc>
+          <w:tcPr>
+            <w:tcW w:w="2254" w:type="dxa"/>
+          </w:tcPr>
+          <w:p>
+            <w:r>
+              <w:t>Gratis</w:t>
+            </w:r>
+          </w:p>
+        </w:tc>
+      </w:tr>
+      <w:tr>
+        <w:tc>
+          <w:tcPr>
+            <w:tcW w:w="2682" w:type="dxa"/>
+          </w:tcPr>
+          <w:p>
+            <w:r>
+              <w:t>AP62300WU-7</w:t>
+            </w:r>
+          </w:p>
+        </w:tc>
+        <w:tc>
+          <w:tcPr>
+            <w:tcW w:w="1993" w:type="dxa"/>
+          </w:tcPr>
+          <w:p>
+            <w:r>
+              <w:t>Buck converter</w:t>
+            </w:r>
+          </w:p>
+        </w:tc>
+        <w:tc>
+          <w:tcPr>
+            <w:tcW w:w="2254" w:type="dxa"/>
+          </w:tcPr>
+          <w:p>
+            <w:r>
+              <w:t>2</w:t>
+            </w:r>
+          </w:p>
+        </w:tc>
+        <w:tc>
+          <w:tcPr>
+            <w:tcW w:w="2254" w:type="dxa"/>
+          </w:tcPr>
+          <w:p>
+            <w:r>
+              <w:t xml:space="preserve">Gratis 1 maal, </w:t>
+            </w:r>
+          </w:p>
+        </w:tc>
+      </w:tr>
+      <w:tr>
+        <w:tc>
+          <w:tcPr>
+            <w:tcW w:w="2682" w:type="dxa"/>
+          </w:tcPr>
+          <w:p>
+            <w:r>
+              <w:t>DF40C-100DS-0.4V(51</w:t>
+            </w:r>
+          </w:p>
+        </w:tc>
+        <w:tc>
+          <w:tcPr>
+            <w:tcW w:w="1993" w:type="dxa"/>
+          </w:tcPr>
+          <w:p>
+            <w:r>
+              <w:t>CM4 connector</w:t>
+            </w:r>
+          </w:p>
+        </w:tc>
+        <w:tc>
+          <w:tcPr>
+            <w:tcW w:w="2254" w:type="dxa"/>
+          </w:tcPr>
+          <w:p>
+            <w:r>
+              <w:t>2</w:t>
+            </w:r>
+          </w:p>
+        </w:tc>
+        <w:tc>
+          <w:tcPr>
+            <w:tcW w:w="2254" w:type="dxa"/>
+          </w:tcPr>
+          <w:p>
+            <w:r>
+              <w:t>Gratis</w:t>
+            </w:r>
+          </w:p>
+        </w:tc>
+      </w:tr>
+      <w:tr>
+        <w:tc>
+          <w:tcPr>
+            <w:tcW w:w="2682" w:type="dxa"/>
+          </w:tcPr>
+          <w:p>
+            <w:r>
+              <w:t>USB-A-S-VT</w:t>
+            </w:r>
+          </w:p>
+        </w:tc>
+        <w:tc>
+          <w:tcPr>
+            <w:tcW w:w="1993" w:type="dxa"/>
+          </w:tcPr>
+          <w:p>
+            <w:r>
+              <w:t>USB A connector</w:t>
+            </w:r>
+          </w:p>
+        </w:tc>
+        <w:tc>
+          <w:tcPr>
+            <w:tcW w:w="2254" w:type="dxa"/>
+          </w:tcPr>
+          <w:p>
+            <w:r>
+              <w:t>1</w:t>
+            </w:r>
+          </w:p>
+        </w:tc>
+        <w:tc>
+          <w:tcPr>
+            <w:tcW w:w="2254" w:type="dxa"/>
+          </w:tcPr>
+          <w:p>
+            <w:r>
+              <w:t>Gratis</w:t>
+            </w:r>
+          </w:p>
+        </w:tc>
+      </w:tr>
+      <w:tr>
+        <w:tc>
+          <w:tcPr>
+            <w:tcW w:w="2682" w:type="dxa"/>
+          </w:tcPr>
+          <w:p>
+            <w:hyperlink r:id="rId34" w:history="1">
+              <w:r>
+                <w:rPr>
+                  <w:rStyle w:val="Hyperlink"/>
+                </w:rPr>
+                <w:t>SS-52400-004</w:t>
+              </w:r>
+            </w:hyperlink>
+          </w:p>
+        </w:tc>
+        <w:tc>
+          <w:tcPr>
+            <w:tcW w:w="1993" w:type="dxa"/>
+          </w:tcPr>
+          <w:p>
+            <w:r>
+              <w:t>USB-c connector</w:t>
+            </w:r>
+          </w:p>
+        </w:tc>
+        <w:tc>
+          <w:tcPr>
+            <w:tcW w:w="2254" w:type="dxa"/>
+          </w:tcPr>
+          <w:p>
+            <w:r>
+              <w:t>1</w:t>
+            </w:r>
+          </w:p>
+        </w:tc>
+        <w:tc>
+          <w:tcPr>
+            <w:tcW w:w="2254" w:type="dxa"/>
+          </w:tcPr>
+          <w:p>
+            <w:r>
+              <w:t>~5 euro</w:t>
+            </w:r>
+          </w:p>
+        </w:tc>
+      </w:tr>
+      <w:tr>
+        <w:tc>
+          <w:tcPr>
+            <w:tcW w:w="2682" w:type="dxa"/>
+          </w:tcPr>
+          <w:p>
+            <w:hyperlink r:id="rId35" w:history="1">
+              <w:r>
+                <w:rPr>
+                  <w:rStyle w:val="Hyperlink"/>
+                </w:rPr>
+                <w:t>HUSB238</w:t>
+              </w:r>
+            </w:hyperlink>
+          </w:p>
+        </w:tc>
+        <w:tc>
+          <w:tcPr>
+            <w:tcW w:w="1993" w:type="dxa"/>
+          </w:tcPr>
+          <w:p>
+            <w:r>
+              <w:t>PD regelaar</w:t>
+            </w:r>
+          </w:p>
+        </w:tc>
+        <w:tc>
+          <w:tcPr>
+            <w:tcW w:w="2254" w:type="dxa"/>
+          </w:tcPr>
+          <w:p>
+            <w:r>
+              <w:t>1</w:t>
+            </w:r>
+          </w:p>
+        </w:tc>
+        <w:tc>
+          <w:tcPr>
+            <w:tcW w:w="2254" w:type="dxa"/>
+          </w:tcPr>
+          <w:p>
+            <w:r>
+              <w:t>~1 euro</w:t>
+            </w:r>
+          </w:p>
+        </w:tc>
+      </w:tr>
+      <w:tr>
+        <w:tc>
+          <w:tcPr>
+            <w:tcW w:w="2682" w:type="dxa"/>
+          </w:tcPr>
+          <w:p/>
+        </w:tc>
+        <w:tc>
+          <w:tcPr>
+            <w:tcW w:w="1993" w:type="dxa"/>
+          </w:tcPr>
+          <w:p/>
+        </w:tc>
+        <w:tc>
+          <w:tcPr>
+            <w:tcW w:w="2254" w:type="dxa"/>
+          </w:tcPr>
+          <w:p/>
+        </w:tc>
+        <w:tc>
+          <w:tcPr>
+            <w:tcW w:w="2254" w:type="dxa"/>
+          </w:tcPr>
+          <w:p/>
+        </w:tc>
+      </w:tr>
+    </w:tbl>
+    <w:p>
+      <w:r>
+        <w:br w:type="page"/>
+      </w:r>
+    </w:p>
+    <w:p>
+      <w:pPr>
+        <w:pStyle w:val="Heading1"/>
+      </w:pPr>
+      <w:bookmarkStart w:id="9" w:name="_Toc223434591"/>
+      <w:r>
         <w:t>Formules</w:t>
       </w:r>
-      <w:bookmarkEnd w:id="8"/>
+      <w:bookmarkEnd w:id="9"/>
     </w:p>
     <w:p>
       <w:pPr>
@@ -18534,7 +21141,21 @@
         <w:rPr>
           <w:lang w:val="nl-NL"/>
         </w:rPr>
-        <w:t>(CM4 wilt 90</w:t>
+        <w:t xml:space="preserve">(CM4 </w:t>
+      </w:r>
+      <w:proofErr w:type="gramStart"/>
+      <w:r>
+        <w:rPr>
+          <w:lang w:val="nl-NL"/>
+        </w:rPr>
+        <w:t>wilt</w:t>
+      </w:r>
+      <w:proofErr w:type="gramEnd"/>
+      <w:r>
+        <w:rPr>
+          <w:lang w:val="nl-NL"/>
+        </w:rPr>
+        <w:t xml:space="preserve"> 90</w:t>
       </w:r>
       <w:r>
         <w:rPr>
@@ -20253,12 +22874,11 @@
           <w:lang w:val="en-GB"/>
         </w:rPr>
       </w:pPr>
-      <w:bookmarkStart w:id="9" w:name="_Toc223434592"/>
+      <w:bookmarkStart w:id="10" w:name="_Toc223434592"/>
       <w:r>
         <w:rPr>
           <w:lang w:val="en-GB"/>
         </w:rPr>
-        <w:lastRenderedPageBreak/>
         <w:t xml:space="preserve">Copied files from existing </w:t>
       </w:r>
       <w:proofErr w:type="spellStart"/>
@@ -20273,17 +22893,30 @@
         <w:rPr>
           <w:lang w:val="en-GB"/>
         </w:rPr>
-        <w:t xml:space="preserve"> and used footprints/symbols</w:t>
-      </w:r>
-      <w:bookmarkEnd w:id="9"/>
+        <w:t xml:space="preserve"> and used footprints/</w:t>
+      </w:r>
+      <w:proofErr w:type="gramStart"/>
+      <w:r>
+        <w:rPr>
+          <w:lang w:val="en-GB"/>
+        </w:rPr>
+        <w:t>symbols</w:t>
+      </w:r>
+      <w:bookmarkEnd w:id="10"/>
+      <w:proofErr w:type="gramEnd"/>
     </w:p>
     <w:p>
       <w:pPr>
         <w:pStyle w:val="NoSpacing"/>
       </w:pPr>
       <w:r>
-        <w:t>Copied from “CM4_HighSpeed.kicad_sch”</w:t>
-      </w:r>
+        <w:t>Copied from “CM4_HighSpeed.kicad_</w:t>
+      </w:r>
+      <w:proofErr w:type="gramStart"/>
+      <w:r>
+        <w:t>sch”</w:t>
+      </w:r>
+      <w:proofErr w:type="gramEnd"/>
     </w:p>
     <w:p>
       <w:pPr>
@@ -20324,8 +22957,13 @@
         <w:pStyle w:val="NoSpacing"/>
       </w:pPr>
       <w:r>
-        <w:t>Copied from “CM4_GPIO.kicad_sch”</w:t>
-      </w:r>
+        <w:t>Copied from “CM4_GPIO.kicad_</w:t>
+      </w:r>
+      <w:proofErr w:type="gramStart"/>
+      <w:r>
+        <w:t>sch”</w:t>
+      </w:r>
+      <w:proofErr w:type="gramEnd"/>
     </w:p>
     <w:p>
       <w:pPr>
@@ -20531,7 +23169,7 @@
       <w:pPr>
         <w:pStyle w:val="NoSpacing"/>
       </w:pPr>
-      <w:hyperlink r:id="rId23" w:history="1">
+      <w:hyperlink r:id="rId36" w:history="1">
         <w:r>
           <w:rPr>
             <w:rStyle w:val="Hyperlink"/>
@@ -20557,7 +23195,7 @@
       <w:pPr>
         <w:pStyle w:val="NoSpacing"/>
       </w:pPr>
-      <w:hyperlink r:id="rId24" w:history="1">
+      <w:hyperlink r:id="rId37" w:history="1">
         <w:r>
           <w:rPr>
             <w:rStyle w:val="Hyperlink"/>
@@ -20575,7 +23213,23 @@
           <w:b/>
           <w:bCs/>
         </w:rPr>
-        <w:t xml:space="preserve">Must be changed in </w:t>
+        <w:t xml:space="preserve">Must </w:t>
+      </w:r>
+      <w:proofErr w:type="gramStart"/>
+      <w:r>
+        <w:rPr>
+          <w:b/>
+          <w:bCs/>
+        </w:rPr>
+        <w:t>be changed</w:t>
+      </w:r>
+      <w:proofErr w:type="gramEnd"/>
+      <w:r>
+        <w:rPr>
+          <w:b/>
+          <w:bCs/>
+        </w:rPr>
+        <w:t xml:space="preserve"> in </w:t>
       </w:r>
       <w:proofErr w:type="spellStart"/>
       <w:r>
@@ -20620,7 +23274,7 @@
           <w:lang w:val="nl-NL"/>
         </w:rPr>
       </w:pPr>
-      <w:hyperlink r:id="rId25" w:history="1">
+      <w:hyperlink r:id="rId38" w:history="1">
         <w:r>
           <w:rPr>
             <w:rStyle w:val="Hyperlink"/>
@@ -20643,14 +23297,22 @@
         <w:pStyle w:val="NoSpacing"/>
       </w:pPr>
       <w:r>
-        <w:t>Connector DF40C-100DS-0.4V(51):</w:t>
+        <w:t>Connector DF40C-100DS-0.4</w:t>
+      </w:r>
+      <w:proofErr w:type="gramStart"/>
+      <w:r>
+        <w:t>V(</w:t>
+      </w:r>
+      <w:proofErr w:type="gramEnd"/>
+      <w:r>
+        <w:t>51):</w:t>
       </w:r>
     </w:p>
     <w:p>
       <w:pPr>
         <w:pStyle w:val="NoSpacing"/>
       </w:pPr>
-      <w:hyperlink r:id="rId26" w:history="1">
+      <w:hyperlink r:id="rId39" w:history="1">
         <w:r>
           <w:rPr>
             <w:rStyle w:val="Hyperlink"/>
@@ -20677,7 +23339,6 @@
         <w:pStyle w:val="NoSpacing"/>
       </w:pPr>
       <w:r>
-        <w:lastRenderedPageBreak/>
         <w:t>https://www.snapeda.com/parts/1255AY-3R3N%3DP3/Murata/view-part/?ref=search&amp;t=1255AY-3R3N%3DP3</w:t>
       </w:r>
     </w:p>
@@ -20719,7 +23380,7 @@
       <w:pPr>
         <w:pStyle w:val="NoSpacing"/>
       </w:pPr>
-      <w:hyperlink r:id="rId27" w:history="1">
+      <w:hyperlink r:id="rId40" w:history="1">
         <w:r>
           <w:rPr>
             <w:rStyle w:val="Hyperlink"/>
@@ -20765,7 +23426,7 @@
       <w:pPr>
         <w:pStyle w:val="NoSpacing"/>
       </w:pPr>
-      <w:hyperlink r:id="rId28" w:history="1">
+      <w:hyperlink r:id="rId41" w:history="1">
         <w:r>
           <w:rPr>
             <w:rStyle w:val="Hyperlink"/>
@@ -20791,7 +23452,7 @@
       <w:pPr>
         <w:pStyle w:val="NoSpacing"/>
       </w:pPr>
-      <w:hyperlink r:id="rId29" w:history="1">
+      <w:hyperlink r:id="rId42" w:history="1">
         <w:r>
           <w:rPr>
             <w:rStyle w:val="Hyperlink"/>
@@ -20851,6 +23512,7 @@
       </w:pPr>
     </w:p>
     <w:sectPr>
+      <w:footerReference w:type="default" r:id="rId43"/>
       <w:pgSz w:w="11906" w:h="16838"/>
       <w:pgMar w:top="1440" w:right="1440" w:bottom="1440" w:left="1440" w:header="708" w:footer="708" w:gutter="0"/>
       <w:cols w:space="708"/>
@@ -20858,6 +23520,137 @@
     </w:sectPr>
   </w:body>
 </w:document>
+</file>
+
+<file path=word/comments.xml><?xml version="1.0" encoding="utf-8"?>
+<w:comments xmlns:wpc="http://schemas.microsoft.com/office/word/2010/wordprocessingCanvas" xmlns:cx="http://schemas.microsoft.com/office/drawing/2014/chartex" xmlns:cx1="http://schemas.microsoft.com/office/drawing/2015/9/8/chartex" xmlns:cx2="http://schemas.microsoft.com/office/drawing/2015/10/21/chartex" xmlns:cx3="http://schemas.microsoft.com/office/drawing/2016/5/9/chartex" xmlns:cx4="http://schemas.microsoft.com/office/drawing/2016/5/10/chartex" xmlns:cx5="http://schemas.microsoft.com/office/drawing/2016/5/11/chartex" xmlns:cx6="http://schemas.microsoft.com/office/drawing/2016/5/12/chartex" xmlns:cx7="http://schemas.microsoft.com/office/drawing/2016/5/13/chartex" xmlns:cx8="http://schemas.microsoft.com/office/drawing/2016/5/14/chartex" xmlns:mc="http://schemas.openxmlformats.org/markup-compatibility/2006" xmlns:aink="http://schemas.microsoft.com/office/drawing/2016/ink" xmlns:am3d="http://schemas.microsoft.com/office/drawing/2017/model3d" xmlns:o="urn:schemas-microsoft-com:office:office" xmlns:oel="http://schemas.microsoft.com/office/2019/extlst" xmlns:r="http://schemas.openxmlformats.org/officeDocument/2006/relationships" xmlns:m="http://schemas.openxmlformats.org/officeDocument/2006/math" xmlns:v="urn:schemas-microsoft-com:vml" xmlns:wp14="http://schemas.microsoft.com/office/word/2010/wordprocessingDrawing" xmlns:wp="http://schemas.openxmlformats.org/drawingml/2006/wordprocessingDrawing" xmlns:w10="urn:schemas-microsoft-com:office:word" xmlns:w="http://schemas.openxmlformats.org/wordprocessingml/2006/main" xmlns:w14="http://schemas.microsoft.com/office/word/2010/wordml" xmlns:w15="http://schemas.microsoft.com/office/word/2012/wordml" xmlns:w16cex="http://schemas.microsoft.com/office/word/2018/wordml/cex" xmlns:w16cid="http://schemas.microsoft.com/office/word/2016/wordml/cid" xmlns:w16="http://schemas.microsoft.com/office/word/2018/wordml" xmlns:w16du="http://schemas.microsoft.com/office/word/2023/wordml/word16du" xmlns:w16sdtdh="http://schemas.microsoft.com/office/word/2020/wordml/sdtdatahash" xmlns:w16sdtfl="http://schemas.microsoft.com/office/word/2024/wordml/sdtformatlock" xmlns:w16se="http://schemas.microsoft.com/office/word/2015/wordml/symex" xmlns:wpg="http://schemas.microsoft.com/office/word/2010/wordprocessingGroup" xmlns:wpi="http://schemas.microsoft.com/office/word/2010/wordprocessingInk" xmlns:wne="http://schemas.microsoft.com/office/word/2006/wordml" xmlns:wps="http://schemas.microsoft.com/office/word/2010/wordprocessingShape" mc:Ignorable="w14 w15 w16se w16cid w16 w16cex w16sdtdh w16sdtfl w16du wp14">
+  <w:comment w:id="0" w:author="deniz Dilli" w:date="2026-03-05T23:19:00Z" w:initials="dD">
+    <w:p>
+      <w:pPr>
+        <w:pStyle w:val="CommentText"/>
+      </w:pPr>
+      <w:r>
+        <w:rPr>
+          <w:rStyle w:val="CommentReference"/>
+        </w:rPr>
+        <w:annotationRef/>
+      </w:r>
+      <w:r>
+        <w:t>Gedaan</w:t>
+      </w:r>
+    </w:p>
+  </w:comment>
+</w:comments>
+</file>
+
+<file path=word/commentsExtended.xml><?xml version="1.0" encoding="utf-8"?>
+<w15:commentsEx xmlns:wpc="http://schemas.microsoft.com/office/word/2010/wordprocessingCanvas" xmlns:cx="http://schemas.microsoft.com/office/drawing/2014/chartex" xmlns:cx1="http://schemas.microsoft.com/office/drawing/2015/9/8/chartex" xmlns:cx2="http://schemas.microsoft.com/office/drawing/2015/10/21/chartex" xmlns:cx3="http://schemas.microsoft.com/office/drawing/2016/5/9/chartex" xmlns:cx4="http://schemas.microsoft.com/office/drawing/2016/5/10/chartex" xmlns:cx5="http://schemas.microsoft.com/office/drawing/2016/5/11/chartex" xmlns:cx6="http://schemas.microsoft.com/office/drawing/2016/5/12/chartex" xmlns:cx7="http://schemas.microsoft.com/office/drawing/2016/5/13/chartex" xmlns:cx8="http://schemas.microsoft.com/office/drawing/2016/5/14/chartex" xmlns:mc="http://schemas.openxmlformats.org/markup-compatibility/2006" xmlns:aink="http://schemas.microsoft.com/office/drawing/2016/ink" xmlns:am3d="http://schemas.microsoft.com/office/drawing/2017/model3d" xmlns:o="urn:schemas-microsoft-com:office:office" xmlns:oel="http://schemas.microsoft.com/office/2019/extlst" xmlns:r="http://schemas.openxmlformats.org/officeDocument/2006/relationships" xmlns:m="http://schemas.openxmlformats.org/officeDocument/2006/math" xmlns:v="urn:schemas-microsoft-com:vml" xmlns:wp14="http://schemas.microsoft.com/office/word/2010/wordprocessingDrawing" xmlns:wp="http://schemas.openxmlformats.org/drawingml/2006/wordprocessingDrawing" xmlns:w10="urn:schemas-microsoft-com:office:word" xmlns:w="http://schemas.openxmlformats.org/wordprocessingml/2006/main" xmlns:w14="http://schemas.microsoft.com/office/word/2010/wordml" xmlns:w15="http://schemas.microsoft.com/office/word/2012/wordml" xmlns:w16cex="http://schemas.microsoft.com/office/word/2018/wordml/cex" xmlns:w16cid="http://schemas.microsoft.com/office/word/2016/wordml/cid" xmlns:w16="http://schemas.microsoft.com/office/word/2018/wordml" xmlns:w16du="http://schemas.microsoft.com/office/word/2023/wordml/word16du" xmlns:w16sdtdh="http://schemas.microsoft.com/office/word/2020/wordml/sdtdatahash" xmlns:w16sdtfl="http://schemas.microsoft.com/office/word/2024/wordml/sdtformatlock" xmlns:w16se="http://schemas.microsoft.com/office/word/2015/wordml/symex" xmlns:wpg="http://schemas.microsoft.com/office/word/2010/wordprocessingGroup" xmlns:wpi="http://schemas.microsoft.com/office/word/2010/wordprocessingInk" xmlns:wne="http://schemas.microsoft.com/office/word/2006/wordml" xmlns:wps="http://schemas.microsoft.com/office/word/2010/wordprocessingShape" mc:Ignorable="w14 w15 w16se w16cid w16 w16cex w16sdtdh w16sdtfl w16du wp14">
+  <w15:commentEx w15:paraId="464574BA" w15:done="0"/>
+</w15:commentsEx>
+</file>
+
+<file path=word/commentsExtensible.xml><?xml version="1.0" encoding="utf-8"?>
+<w16cex:commentsExtensible xmlns:wpc="http://schemas.microsoft.com/office/word/2010/wordprocessingCanvas" xmlns:cx="http://schemas.microsoft.com/office/drawing/2014/chartex" xmlns:cx1="http://schemas.microsoft.com/office/drawing/2015/9/8/chartex" xmlns:cx2="http://schemas.microsoft.com/office/drawing/2015/10/21/chartex" xmlns:cx3="http://schemas.microsoft.com/office/drawing/2016/5/9/chartex" xmlns:cx4="http://schemas.microsoft.com/office/drawing/2016/5/10/chartex" xmlns:cx5="http://schemas.microsoft.com/office/drawing/2016/5/11/chartex" xmlns:cx6="http://schemas.microsoft.com/office/drawing/2016/5/12/chartex" xmlns:cx7="http://schemas.microsoft.com/office/drawing/2016/5/13/chartex" xmlns:cx8="http://schemas.microsoft.com/office/drawing/2016/5/14/chartex" xmlns:cr="http://schemas.microsoft.com/office/comments/2020/reactions" xmlns:mc="http://schemas.openxmlformats.org/markup-compatibility/2006" xmlns:aink="http://schemas.microsoft.com/office/drawing/2016/ink" xmlns:am3d="http://schemas.microsoft.com/office/drawing/2017/model3d" xmlns:o="urn:schemas-microsoft-com:office:office" xmlns:oel="http://schemas.microsoft.com/office/2019/extlst" xmlns:r="http://schemas.openxmlformats.org/officeDocument/2006/relationships" xmlns:m="http://schemas.openxmlformats.org/officeDocument/2006/math" xmlns:v="urn:schemas-microsoft-com:vml" xmlns:wp14="http://schemas.microsoft.com/office/word/2010/wordprocessingDrawing" xmlns:wp="http://schemas.openxmlformats.org/drawingml/2006/wordprocessingDrawing" xmlns:w10="urn:schemas-microsoft-com:office:word" xmlns:w="http://schemas.openxmlformats.org/wordprocessingml/2006/main" xmlns:w14="http://schemas.microsoft.com/office/word/2010/wordml" xmlns:w15="http://schemas.microsoft.com/office/word/2012/wordml" xmlns:w16cex="http://schemas.microsoft.com/office/word/2018/wordml/cex" xmlns:w16cid="http://schemas.microsoft.com/office/word/2016/wordml/cid" xmlns:w16="http://schemas.microsoft.com/office/word/2018/wordml" xmlns:w16du="http://schemas.microsoft.com/office/word/2023/wordml/word16du" xmlns:w16sdtdh="http://schemas.microsoft.com/office/word/2020/wordml/sdtdatahash" xmlns:w16sdtfl="http://schemas.microsoft.com/office/word/2024/wordml/sdtformatlock" xmlns:w16se="http://schemas.microsoft.com/office/word/2015/wordml/symex" xmlns:wpg="http://schemas.microsoft.com/office/word/2010/wordprocessingGroup" xmlns:wpi="http://schemas.microsoft.com/office/word/2010/wordprocessingInk" xmlns:wne="http://schemas.microsoft.com/office/word/2006/wordml" xmlns:wps="http://schemas.microsoft.com/office/word/2010/wordprocessingShape" mc:Ignorable="w14 w15 w16se w16cid w16 w16cex w16sdtdh w16sdtfl cr w16du wp14">
+  <w16cex:commentExtensible w16cex:durableId="3EB6346B" w16cex:dateUtc="2026-03-05T22:19:00Z"/>
+</w16cex:commentsExtensible>
+</file>
+
+<file path=word/commentsIds.xml><?xml version="1.0" encoding="utf-8"?>
+<w16cid:commentsIds xmlns:wpc="http://schemas.microsoft.com/office/word/2010/wordprocessingCanvas" xmlns:cx="http://schemas.microsoft.com/office/drawing/2014/chartex" xmlns:cx1="http://schemas.microsoft.com/office/drawing/2015/9/8/chartex" xmlns:cx2="http://schemas.microsoft.com/office/drawing/2015/10/21/chartex" xmlns:cx3="http://schemas.microsoft.com/office/drawing/2016/5/9/chartex" xmlns:cx4="http://schemas.microsoft.com/office/drawing/2016/5/10/chartex" xmlns:cx5="http://schemas.microsoft.com/office/drawing/2016/5/11/chartex" xmlns:cx6="http://schemas.microsoft.com/office/drawing/2016/5/12/chartex" xmlns:cx7="http://schemas.microsoft.com/office/drawing/2016/5/13/chartex" xmlns:cx8="http://schemas.microsoft.com/office/drawing/2016/5/14/chartex" xmlns:mc="http://schemas.openxmlformats.org/markup-compatibility/2006" xmlns:aink="http://schemas.microsoft.com/office/drawing/2016/ink" xmlns:am3d="http://schemas.microsoft.com/office/drawing/2017/model3d" xmlns:o="urn:schemas-microsoft-com:office:office" xmlns:oel="http://schemas.microsoft.com/office/2019/extlst" xmlns:r="http://schemas.openxmlformats.org/officeDocument/2006/relationships" xmlns:m="http://schemas.openxmlformats.org/officeDocument/2006/math" xmlns:v="urn:schemas-microsoft-com:vml" xmlns:wp14="http://schemas.microsoft.com/office/word/2010/wordprocessingDrawing" xmlns:wp="http://schemas.openxmlformats.org/drawingml/2006/wordprocessingDrawing" xmlns:w10="urn:schemas-microsoft-com:office:word" xmlns:w="http://schemas.openxmlformats.org/wordprocessingml/2006/main" xmlns:w14="http://schemas.microsoft.com/office/word/2010/wordml" xmlns:w15="http://schemas.microsoft.com/office/word/2012/wordml" xmlns:w16cex="http://schemas.microsoft.com/office/word/2018/wordml/cex" xmlns:w16cid="http://schemas.microsoft.com/office/word/2016/wordml/cid" xmlns:w16="http://schemas.microsoft.com/office/word/2018/wordml" xmlns:w16du="http://schemas.microsoft.com/office/word/2023/wordml/word16du" xmlns:w16sdtdh="http://schemas.microsoft.com/office/word/2020/wordml/sdtdatahash" xmlns:w16sdtfl="http://schemas.microsoft.com/office/word/2024/wordml/sdtformatlock" xmlns:w16se="http://schemas.microsoft.com/office/word/2015/wordml/symex" xmlns:wpg="http://schemas.microsoft.com/office/word/2010/wordprocessingGroup" xmlns:wpi="http://schemas.microsoft.com/office/word/2010/wordprocessingInk" xmlns:wne="http://schemas.microsoft.com/office/word/2006/wordml" xmlns:wps="http://schemas.microsoft.com/office/word/2010/wordprocessingShape" mc:Ignorable="w14 w15 w16se w16cid w16 w16cex w16sdtdh w16sdtfl w16du wp14">
+  <w16cid:commentId w16cid:paraId="464574BA" w16cid:durableId="3EB6346B"/>
+</w16cid:commentsIds>
+</file>
+
+<file path=word/endnotes.xml><?xml version="1.0" encoding="utf-8"?>
+<w:endnotes xmlns:wpc="http://schemas.microsoft.com/office/word/2010/wordprocessingCanvas" xmlns:cx="http://schemas.microsoft.com/office/drawing/2014/chartex" xmlns:cx1="http://schemas.microsoft.com/office/drawing/2015/9/8/chartex" xmlns:cx2="http://schemas.microsoft.com/office/drawing/2015/10/21/chartex" xmlns:cx3="http://schemas.microsoft.com/office/drawing/2016/5/9/chartex" xmlns:cx4="http://schemas.microsoft.com/office/drawing/2016/5/10/chartex" xmlns:cx5="http://schemas.microsoft.com/office/drawing/2016/5/11/chartex" xmlns:cx6="http://schemas.microsoft.com/office/drawing/2016/5/12/chartex" xmlns:cx7="http://schemas.microsoft.com/office/drawing/2016/5/13/chartex" xmlns:cx8="http://schemas.microsoft.com/office/drawing/2016/5/14/chartex" xmlns:mc="http://schemas.openxmlformats.org/markup-compatibility/2006" xmlns:aink="http://schemas.microsoft.com/office/drawing/2016/ink" xmlns:am3d="http://schemas.microsoft.com/office/drawing/2017/model3d" xmlns:o="urn:schemas-microsoft-com:office:office" xmlns:oel="http://schemas.microsoft.com/office/2019/extlst" xmlns:r="http://schemas.openxmlformats.org/officeDocument/2006/relationships" xmlns:m="http://schemas.openxmlformats.org/officeDocument/2006/math" xmlns:v="urn:schemas-microsoft-com:vml" xmlns:wp14="http://schemas.microsoft.com/office/word/2010/wordprocessingDrawing" xmlns:wp="http://schemas.openxmlformats.org/drawingml/2006/wordprocessingDrawing" xmlns:w10="urn:schemas-microsoft-com:office:word" xmlns:w="http://schemas.openxmlformats.org/wordprocessingml/2006/main" xmlns:w14="http://schemas.microsoft.com/office/word/2010/wordml" xmlns:w15="http://schemas.microsoft.com/office/word/2012/wordml" xmlns:w16cex="http://schemas.microsoft.com/office/word/2018/wordml/cex" xmlns:w16cid="http://schemas.microsoft.com/office/word/2016/wordml/cid" xmlns:w16="http://schemas.microsoft.com/office/word/2018/wordml" xmlns:w16du="http://schemas.microsoft.com/office/word/2023/wordml/word16du" xmlns:w16sdtdh="http://schemas.microsoft.com/office/word/2020/wordml/sdtdatahash" xmlns:w16sdtfl="http://schemas.microsoft.com/office/word/2024/wordml/sdtformatlock" xmlns:w16se="http://schemas.microsoft.com/office/word/2015/wordml/symex" xmlns:wpg="http://schemas.microsoft.com/office/word/2010/wordprocessingGroup" xmlns:wpi="http://schemas.microsoft.com/office/word/2010/wordprocessingInk" xmlns:wne="http://schemas.microsoft.com/office/word/2006/wordml" xmlns:wps="http://schemas.microsoft.com/office/word/2010/wordprocessingShape" mc:Ignorable="w14 w15 w16se w16cid w16 w16cex w16sdtdh w16sdtfl w16du wp14">
+  <w:endnote w:type="separator" w:id="-1">
+    <w:p>
+      <w:pPr>
+        <w:spacing w:after="0" w:line="240" w:lineRule="auto"/>
+      </w:pPr>
+      <w:r>
+        <w:separator/>
+      </w:r>
+    </w:p>
+  </w:endnote>
+  <w:endnote w:type="continuationSeparator" w:id="0">
+    <w:p>
+      <w:pPr>
+        <w:spacing w:after="0" w:line="240" w:lineRule="auto"/>
+      </w:pPr>
+      <w:r>
+        <w:continuationSeparator/>
+      </w:r>
+    </w:p>
+  </w:endnote>
+</w:endnotes>
+</file>
+
+<file path=word/footer1.xml><?xml version="1.0" encoding="utf-8"?>
+<w:ftr xmlns:wpc="http://schemas.microsoft.com/office/word/2010/wordprocessingCanvas" xmlns:cx="http://schemas.microsoft.com/office/drawing/2014/chartex" xmlns:cx1="http://schemas.microsoft.com/office/drawing/2015/9/8/chartex" xmlns:cx2="http://schemas.microsoft.com/office/drawing/2015/10/21/chartex" xmlns:cx3="http://schemas.microsoft.com/office/drawing/2016/5/9/chartex" xmlns:cx4="http://schemas.microsoft.com/office/drawing/2016/5/10/chartex" xmlns:cx5="http://schemas.microsoft.com/office/drawing/2016/5/11/chartex" xmlns:cx6="http://schemas.microsoft.com/office/drawing/2016/5/12/chartex" xmlns:cx7="http://schemas.microsoft.com/office/drawing/2016/5/13/chartex" xmlns:cx8="http://schemas.microsoft.com/office/drawing/2016/5/14/chartex" xmlns:mc="http://schemas.openxmlformats.org/markup-compatibility/2006" xmlns:aink="http://schemas.microsoft.com/office/drawing/2016/ink" xmlns:am3d="http://schemas.microsoft.com/office/drawing/2017/model3d" xmlns:o="urn:schemas-microsoft-com:office:office" xmlns:oel="http://schemas.microsoft.com/office/2019/extlst" xmlns:r="http://schemas.openxmlformats.org/officeDocument/2006/relationships" xmlns:m="http://schemas.openxmlformats.org/officeDocument/2006/math" xmlns:v="urn:schemas-microsoft-com:vml" xmlns:wp14="http://schemas.microsoft.com/office/word/2010/wordprocessingDrawing" xmlns:wp="http://schemas.openxmlformats.org/drawingml/2006/wordprocessingDrawing" xmlns:w10="urn:schemas-microsoft-com:office:word" xmlns:w="http://schemas.openxmlformats.org/wordprocessingml/2006/main" xmlns:w14="http://schemas.microsoft.com/office/word/2010/wordml" xmlns:w15="http://schemas.microsoft.com/office/word/2012/wordml" xmlns:w16cex="http://schemas.microsoft.com/office/word/2018/wordml/cex" xmlns:w16cid="http://schemas.microsoft.com/office/word/2016/wordml/cid" xmlns:w16="http://schemas.microsoft.com/office/word/2018/wordml" xmlns:w16du="http://schemas.microsoft.com/office/word/2023/wordml/word16du" xmlns:w16sdtdh="http://schemas.microsoft.com/office/word/2020/wordml/sdtdatahash" xmlns:w16sdtfl="http://schemas.microsoft.com/office/word/2024/wordml/sdtformatlock" xmlns:w16se="http://schemas.microsoft.com/office/word/2015/wordml/symex" xmlns:wpg="http://schemas.microsoft.com/office/word/2010/wordprocessingGroup" xmlns:wpi="http://schemas.microsoft.com/office/word/2010/wordprocessingInk" xmlns:wne="http://schemas.microsoft.com/office/word/2006/wordml" xmlns:wps="http://schemas.microsoft.com/office/word/2010/wordprocessingShape" mc:Ignorable="w14 w15 w16se w16cid w16 w16cex w16sdtdh w16sdtfl w16du wp14">
+  <w:sdt>
+    <w:sdtPr>
+      <w:id w:val="2095736733"/>
+      <w:docPartObj>
+        <w:docPartGallery w:val="Page Numbers (Bottom of Page)"/>
+        <w:docPartUnique/>
+      </w:docPartObj>
+    </w:sdtPr>
+    <w:sdtContent>
+      <w:p>
+        <w:pPr>
+          <w:pStyle w:val="Footer"/>
+          <w:jc w:val="right"/>
+        </w:pPr>
+        <w:r>
+          <w:fldChar w:fldCharType="begin"/>
+        </w:r>
+        <w:r>
+          <w:instrText>PAGE   \* MERGEFORMAT</w:instrText>
+        </w:r>
+        <w:r>
+          <w:fldChar w:fldCharType="separate"/>
+        </w:r>
+        <w:r>
+          <w:t>2</w:t>
+        </w:r>
+        <w:r>
+          <w:fldChar w:fldCharType="end"/>
+        </w:r>
+      </w:p>
+    </w:sdtContent>
+  </w:sdt>
+  <w:p>
+    <w:pPr>
+      <w:pStyle w:val="Footer"/>
+    </w:pPr>
+  </w:p>
+</w:ftr>
+</file>
+
+<file path=word/footnotes.xml><?xml version="1.0" encoding="utf-8"?>
+<w:footnotes xmlns:wpc="http://schemas.microsoft.com/office/word/2010/wordprocessingCanvas" xmlns:cx="http://schemas.microsoft.com/office/drawing/2014/chartex" xmlns:cx1="http://schemas.microsoft.com/office/drawing/2015/9/8/chartex" xmlns:cx2="http://schemas.microsoft.com/office/drawing/2015/10/21/chartex" xmlns:cx3="http://schemas.microsoft.com/office/drawing/2016/5/9/chartex" xmlns:cx4="http://schemas.microsoft.com/office/drawing/2016/5/10/chartex" xmlns:cx5="http://schemas.microsoft.com/office/drawing/2016/5/11/chartex" xmlns:cx6="http://schemas.microsoft.com/office/drawing/2016/5/12/chartex" xmlns:cx7="http://schemas.microsoft.com/office/drawing/2016/5/13/chartex" xmlns:cx8="http://schemas.microsoft.com/office/drawing/2016/5/14/chartex" xmlns:mc="http://schemas.openxmlformats.org/markup-compatibility/2006" xmlns:aink="http://schemas.microsoft.com/office/drawing/2016/ink" xmlns:am3d="http://schemas.microsoft.com/office/drawing/2017/model3d" xmlns:o="urn:schemas-microsoft-com:office:office" xmlns:oel="http://schemas.microsoft.com/office/2019/extlst" xmlns:r="http://schemas.openxmlformats.org/officeDocument/2006/relationships" xmlns:m="http://schemas.openxmlformats.org/officeDocument/2006/math" xmlns:v="urn:schemas-microsoft-com:vml" xmlns:wp14="http://schemas.microsoft.com/office/word/2010/wordprocessingDrawing" xmlns:wp="http://schemas.openxmlformats.org/drawingml/2006/wordprocessingDrawing" xmlns:w10="urn:schemas-microsoft-com:office:word" xmlns:w="http://schemas.openxmlformats.org/wordprocessingml/2006/main" xmlns:w14="http://schemas.microsoft.com/office/word/2010/wordml" xmlns:w15="http://schemas.microsoft.com/office/word/2012/wordml" xmlns:w16cex="http://schemas.microsoft.com/office/word/2018/wordml/cex" xmlns:w16cid="http://schemas.microsoft.com/office/word/2016/wordml/cid" xmlns:w16="http://schemas.microsoft.com/office/word/2018/wordml" xmlns:w16du="http://schemas.microsoft.com/office/word/2023/wordml/word16du" xmlns:w16sdtdh="http://schemas.microsoft.com/office/word/2020/wordml/sdtdatahash" xmlns:w16sdtfl="http://schemas.microsoft.com/office/word/2024/wordml/sdtformatlock" xmlns:w16se="http://schemas.microsoft.com/office/word/2015/wordml/symex" xmlns:wpg="http://schemas.microsoft.com/office/word/2010/wordprocessingGroup" xmlns:wpi="http://schemas.microsoft.com/office/word/2010/wordprocessingInk" xmlns:wne="http://schemas.microsoft.com/office/word/2006/wordml" xmlns:wps="http://schemas.microsoft.com/office/word/2010/wordprocessingShape" mc:Ignorable="w14 w15 w16se w16cid w16 w16cex w16sdtdh w16sdtfl w16du wp14">
+  <w:footnote w:type="separator" w:id="-1">
+    <w:p>
+      <w:pPr>
+        <w:spacing w:after="0" w:line="240" w:lineRule="auto"/>
+      </w:pPr>
+      <w:r>
+        <w:separator/>
+      </w:r>
+    </w:p>
+  </w:footnote>
+  <w:footnote w:type="continuationSeparator" w:id="0">
+    <w:p>
+      <w:pPr>
+        <w:spacing w:after="0" w:line="240" w:lineRule="auto"/>
+      </w:pPr>
+      <w:r>
+        <w:continuationSeparator/>
+      </w:r>
+    </w:p>
+  </w:footnote>
+</w:footnotes>
 </file>
 
 <file path=word/numbering.xml><?xml version="1.0" encoding="utf-8"?>
@@ -21442,6 +24235,14 @@
     <w:abstractNumId w:val="1"/>
   </w:num>
 </w:numbering>
+</file>
+
+<file path=word/people.xml><?xml version="1.0" encoding="utf-8"?>
+<w15:people xmlns:wpc="http://schemas.microsoft.com/office/word/2010/wordprocessingCanvas" xmlns:cx="http://schemas.microsoft.com/office/drawing/2014/chartex" xmlns:cx1="http://schemas.microsoft.com/office/drawing/2015/9/8/chartex" xmlns:cx2="http://schemas.microsoft.com/office/drawing/2015/10/21/chartex" xmlns:cx3="http://schemas.microsoft.com/office/drawing/2016/5/9/chartex" xmlns:cx4="http://schemas.microsoft.com/office/drawing/2016/5/10/chartex" xmlns:cx5="http://schemas.microsoft.com/office/drawing/2016/5/11/chartex" xmlns:cx6="http://schemas.microsoft.com/office/drawing/2016/5/12/chartex" xmlns:cx7="http://schemas.microsoft.com/office/drawing/2016/5/13/chartex" xmlns:cx8="http://schemas.microsoft.com/office/drawing/2016/5/14/chartex" xmlns:mc="http://schemas.openxmlformats.org/markup-compatibility/2006" xmlns:aink="http://schemas.microsoft.com/office/drawing/2016/ink" xmlns:am3d="http://schemas.microsoft.com/office/drawing/2017/model3d" xmlns:o="urn:schemas-microsoft-com:office:office" xmlns:oel="http://schemas.microsoft.com/office/2019/extlst" xmlns:r="http://schemas.openxmlformats.org/officeDocument/2006/relationships" xmlns:m="http://schemas.openxmlformats.org/officeDocument/2006/math" xmlns:v="urn:schemas-microsoft-com:vml" xmlns:wp14="http://schemas.microsoft.com/office/word/2010/wordprocessingDrawing" xmlns:wp="http://schemas.openxmlformats.org/drawingml/2006/wordprocessingDrawing" xmlns:w10="urn:schemas-microsoft-com:office:word" xmlns:w="http://schemas.openxmlformats.org/wordprocessingml/2006/main" xmlns:w14="http://schemas.microsoft.com/office/word/2010/wordml" xmlns:w15="http://schemas.microsoft.com/office/word/2012/wordml" xmlns:w16cex="http://schemas.microsoft.com/office/word/2018/wordml/cex" xmlns:w16cid="http://schemas.microsoft.com/office/word/2016/wordml/cid" xmlns:w16="http://schemas.microsoft.com/office/word/2018/wordml" xmlns:w16du="http://schemas.microsoft.com/office/word/2023/wordml/word16du" xmlns:w16sdtdh="http://schemas.microsoft.com/office/word/2020/wordml/sdtdatahash" xmlns:w16sdtfl="http://schemas.microsoft.com/office/word/2024/wordml/sdtformatlock" xmlns:w16se="http://schemas.microsoft.com/office/word/2015/wordml/symex" xmlns:wpg="http://schemas.microsoft.com/office/word/2010/wordprocessingGroup" xmlns:wpi="http://schemas.microsoft.com/office/word/2010/wordprocessingInk" xmlns:wne="http://schemas.microsoft.com/office/word/2006/wordml" xmlns:wps="http://schemas.microsoft.com/office/word/2010/wordprocessingShape" mc:Ignorable="w14 w15 w16se w16cid w16 w16cex w16sdtdh w16sdtfl w16du wp14">
+  <w15:person w15:author="deniz Dilli">
+    <w15:presenceInfo w15:providerId="Windows Live" w15:userId="80cc1d3e5251b3a9"/>
+  </w15:person>
+</w15:people>
 </file>
 
 <file path=word/styles.xml><?xml version="1.0" encoding="utf-8"?>
@@ -22497,6 +25298,135 @@
       <w14:ligatures w14:val="none"/>
     </w:rPr>
   </w:style>
+  <w:style w:type="character" w:styleId="CommentReference">
+    <w:name w:val="annotation reference"/>
+    <w:basedOn w:val="DefaultParagraphFont"/>
+    <w:uiPriority w:val="99"/>
+    <w:semiHidden/>
+    <w:unhideWhenUsed/>
+    <w:rsid w:val="007B5355"/>
+    <w:rPr>
+      <w:sz w:val="16"/>
+      <w:szCs w:val="16"/>
+    </w:rPr>
+  </w:style>
+  <w:style w:type="paragraph" w:styleId="CommentText">
+    <w:name w:val="annotation text"/>
+    <w:basedOn w:val="Normal"/>
+    <w:link w:val="CommentTextChar"/>
+    <w:uiPriority w:val="99"/>
+    <w:unhideWhenUsed/>
+    <w:rsid w:val="007B5355"/>
+    <w:pPr>
+      <w:spacing w:line="240" w:lineRule="auto"/>
+    </w:pPr>
+    <w:rPr>
+      <w:sz w:val="20"/>
+      <w:szCs w:val="20"/>
+    </w:rPr>
+  </w:style>
+  <w:style w:type="character" w:customStyle="1" w:styleId="CommentTextChar">
+    <w:name w:val="Comment Text Char"/>
+    <w:basedOn w:val="DefaultParagraphFont"/>
+    <w:link w:val="CommentText"/>
+    <w:uiPriority w:val="99"/>
+    <w:rsid w:val="007B5355"/>
+    <w:rPr>
+      <w:sz w:val="20"/>
+      <w:szCs w:val="20"/>
+      <w:lang w:val="nl-NL"/>
+    </w:rPr>
+  </w:style>
+  <w:style w:type="paragraph" w:styleId="CommentSubject">
+    <w:name w:val="annotation subject"/>
+    <w:basedOn w:val="CommentText"/>
+    <w:next w:val="CommentText"/>
+    <w:link w:val="CommentSubjectChar"/>
+    <w:uiPriority w:val="99"/>
+    <w:semiHidden/>
+    <w:unhideWhenUsed/>
+    <w:rsid w:val="007B5355"/>
+    <w:rPr>
+      <w:b/>
+      <w:bCs/>
+    </w:rPr>
+  </w:style>
+  <w:style w:type="character" w:customStyle="1" w:styleId="CommentSubjectChar">
+    <w:name w:val="Comment Subject Char"/>
+    <w:basedOn w:val="CommentTextChar"/>
+    <w:link w:val="CommentSubject"/>
+    <w:uiPriority w:val="99"/>
+    <w:semiHidden/>
+    <w:rsid w:val="007B5355"/>
+    <w:rPr>
+      <w:b/>
+      <w:bCs/>
+      <w:sz w:val="20"/>
+      <w:szCs w:val="20"/>
+      <w:lang w:val="nl-NL"/>
+    </w:rPr>
+  </w:style>
+  <w:style w:type="paragraph" w:styleId="Header">
+    <w:name w:val="header"/>
+    <w:basedOn w:val="Normal"/>
+    <w:link w:val="HeaderChar"/>
+    <w:uiPriority w:val="99"/>
+    <w:unhideWhenUsed/>
+    <w:rsid w:val="008D24C7"/>
+    <w:pPr>
+      <w:tabs>
+        <w:tab w:val="center" w:pos="4680"/>
+        <w:tab w:val="right" w:pos="9360"/>
+      </w:tabs>
+      <w:spacing w:after="0" w:line="240" w:lineRule="auto"/>
+    </w:pPr>
+  </w:style>
+  <w:style w:type="character" w:customStyle="1" w:styleId="HeaderChar">
+    <w:name w:val="Header Char"/>
+    <w:basedOn w:val="DefaultParagraphFont"/>
+    <w:link w:val="Header"/>
+    <w:uiPriority w:val="99"/>
+    <w:rsid w:val="008D24C7"/>
+    <w:rPr>
+      <w:lang w:val="nl-NL"/>
+    </w:rPr>
+  </w:style>
+  <w:style w:type="paragraph" w:styleId="Footer">
+    <w:name w:val="footer"/>
+    <w:basedOn w:val="Normal"/>
+    <w:link w:val="FooterChar"/>
+    <w:uiPriority w:val="99"/>
+    <w:unhideWhenUsed/>
+    <w:rsid w:val="008D24C7"/>
+    <w:pPr>
+      <w:tabs>
+        <w:tab w:val="center" w:pos="4680"/>
+        <w:tab w:val="right" w:pos="9360"/>
+      </w:tabs>
+      <w:spacing w:after="0" w:line="240" w:lineRule="auto"/>
+    </w:pPr>
+  </w:style>
+  <w:style w:type="character" w:customStyle="1" w:styleId="FooterChar">
+    <w:name w:val="Footer Char"/>
+    <w:basedOn w:val="DefaultParagraphFont"/>
+    <w:link w:val="Footer"/>
+    <w:uiPriority w:val="99"/>
+    <w:rsid w:val="008D24C7"/>
+    <w:rPr>
+      <w:lang w:val="nl-NL"/>
+    </w:rPr>
+  </w:style>
+  <w:style w:type="character" w:styleId="Strong">
+    <w:name w:val="Strong"/>
+    <w:basedOn w:val="DefaultParagraphFont"/>
+    <w:uiPriority w:val="22"/>
+    <w:qFormat/>
+    <w:rsid w:val="00874F96"/>
+    <w:rPr>
+      <w:b/>
+      <w:bCs/>
+    </w:rPr>
+  </w:style>
 </w:styles>
 </file>
 

</xml_diff>

<commit_message>
Added 3d-models, esd protection, cleaned up and made small start with pcb
</commit_message>
<xml_diff>
--- a/ANE21_PCB.docx
+++ b/ANE21_PCB.docx
@@ -136,7 +136,28 @@
                 <w:rStyle w:val="Hyperlink"/>
                 <w:noProof/>
               </w:rPr>
-              <w:t>Voeding</w:t>
+              <w:t>Voe</w:t>
+            </w:r>
+            <w:r>
+              <w:rPr>
+                <w:rStyle w:val="Hyperlink"/>
+                <w:noProof/>
+              </w:rPr>
+              <w:t>d</w:t>
+            </w:r>
+            <w:r>
+              <w:rPr>
+                <w:rStyle w:val="Hyperlink"/>
+                <w:noProof/>
+              </w:rPr>
+              <w:t>i</w:t>
+            </w:r>
+            <w:r>
+              <w:rPr>
+                <w:rStyle w:val="Hyperlink"/>
+                <w:noProof/>
+              </w:rPr>
+              <w:t>ng</w:t>
             </w:r>
             <w:r>
               <w:rPr>
@@ -803,19 +824,7 @@
         <w:rPr>
           <w:lang w:val="nl-NL"/>
         </w:rPr>
-        <w:t xml:space="preserve">PSU voor CM4 vervangen van AP64501S-13 vervangen met </w:t>
-      </w:r>
-      <w:r>
-        <w:rPr>
-          <w:lang w:val="nl-NL"/>
-        </w:rPr>
-        <w:t>AP62300WU</w:t>
-      </w:r>
-      <w:r>
-        <w:rPr>
-          <w:lang w:val="nl-NL"/>
-        </w:rPr>
-        <w:t>-7</w:t>
+        <w:t>PSU voor CM4 vervangen van AP64501S-13 vervangen met AP62300WU-7</w:t>
       </w:r>
     </w:p>
     <w:p>
@@ -825,10 +834,175 @@
           <w:ilvl w:val="0"/>
           <w:numId w:val="5"/>
         </w:numPr>
-        <w:rPr>
-          <w:lang w:val="nl-NL"/>
-        </w:rPr>
-      </w:pPr>
+      </w:pPr>
+      <w:r>
+        <w:t>USB-C for usb d</w:t>
+      </w:r>
+      <w:r>
+        <w:t>evices, dongle and OTG</w:t>
+      </w:r>
+    </w:p>
+    <w:p>
+      <w:pPr>
+        <w:pStyle w:val="NoSpacing"/>
+        <w:numPr>
+          <w:ilvl w:val="0"/>
+          <w:numId w:val="5"/>
+        </w:numPr>
+        <w:rPr>
+          <w:lang w:val="nl-NL"/>
+        </w:rPr>
+      </w:pPr>
+      <w:r>
+        <w:rPr>
+          <w:lang w:val="nl-NL"/>
+        </w:rPr>
+        <w:t>Opzet HMDI of PCIe P</w:t>
+      </w:r>
+      <w:r>
+        <w:rPr>
+          <w:lang w:val="nl-NL"/>
+        </w:rPr>
+        <w:t>CB traces</w:t>
+      </w:r>
+    </w:p>
+    <w:p>
+      <w:pPr>
+        <w:pStyle w:val="NoSpacing"/>
+        <w:numPr>
+          <w:ilvl w:val="0"/>
+          <w:numId w:val="5"/>
+        </w:numPr>
+        <w:rPr>
+          <w:lang w:val="nl-NL"/>
+        </w:rPr>
+      </w:pPr>
+      <w:r>
+        <w:rPr>
+          <w:lang w:val="nl-NL"/>
+        </w:rPr>
+        <w:t>Mogelijkheid voor labvoeding</w:t>
+      </w:r>
+    </w:p>
+    <w:p>
+      <w:pPr>
+        <w:pStyle w:val="NoSpacing"/>
+        <w:numPr>
+          <w:ilvl w:val="0"/>
+          <w:numId w:val="5"/>
+        </w:numPr>
+        <w:rPr>
+          <w:lang w:val="nl-NL"/>
+        </w:rPr>
+      </w:pPr>
+      <w:r>
+        <w:rPr>
+          <w:lang w:val="nl-NL"/>
+        </w:rPr>
+        <w:t xml:space="preserve">Global headers veranderen naar hierarchical </w:t>
+      </w:r>
+    </w:p>
+    <w:p>
+      <w:pPr>
+        <w:pStyle w:val="NoSpacing"/>
+        <w:numPr>
+          <w:ilvl w:val="0"/>
+          <w:numId w:val="5"/>
+        </w:numPr>
+        <w:rPr>
+          <w:lang w:val="nl-NL"/>
+        </w:rPr>
+      </w:pPr>
+      <w:r>
+        <w:rPr>
+          <w:lang w:val="nl-NL"/>
+        </w:rPr>
+        <w:t>GPIO’s naar header zetten</w:t>
+      </w:r>
+    </w:p>
+    <w:p>
+      <w:pPr>
+        <w:pStyle w:val="NoSpacing"/>
+        <w:numPr>
+          <w:ilvl w:val="0"/>
+          <w:numId w:val="5"/>
+        </w:numPr>
+        <w:rPr>
+          <w:lang w:val="nl-NL"/>
+        </w:rPr>
+      </w:pPr>
+      <w:r>
+        <w:rPr>
+          <w:lang w:val="nl-NL"/>
+        </w:rPr>
+        <w:t xml:space="preserve">GPIO_VREF, SCL0, SDA0 kunnen die los? </w:t>
+      </w:r>
+    </w:p>
+    <w:p>
+      <w:pPr>
+        <w:pStyle w:val="NoSpacing"/>
+        <w:numPr>
+          <w:ilvl w:val="0"/>
+          <w:numId w:val="5"/>
+        </w:numPr>
+        <w:rPr>
+          <w:lang w:val="nl-NL"/>
+        </w:rPr>
+      </w:pPr>
+      <w:r>
+        <w:rPr>
+          <w:lang w:val="nl-NL"/>
+        </w:rPr>
+        <w:t>nEXTRST</w:t>
+      </w:r>
+      <w:r>
+        <w:rPr>
+          <w:lang w:val="nl-NL"/>
+        </w:rPr>
+        <w:t xml:space="preserve"> gebruiken als hij nut heeft.</w:t>
+      </w:r>
+    </w:p>
+    <w:p>
+      <w:pPr>
+        <w:pStyle w:val="NoSpacing"/>
+        <w:numPr>
+          <w:ilvl w:val="0"/>
+          <w:numId w:val="5"/>
+        </w:numPr>
+        <w:rPr>
+          <w:lang w:val="nl-NL"/>
+        </w:rPr>
+      </w:pPr>
+      <w:r>
+        <w:rPr>
+          <w:lang w:val="nl-NL"/>
+        </w:rPr>
+        <w:t>Evt 5v en 3.3v output al</w:t>
+      </w:r>
+      <w:r>
+        <w:rPr>
+          <w:lang w:val="nl-NL"/>
+        </w:rPr>
+        <w:t>s header</w:t>
+      </w:r>
+    </w:p>
+    <w:p>
+      <w:pPr>
+        <w:pStyle w:val="NoSpacing"/>
+        <w:numPr>
+          <w:ilvl w:val="0"/>
+          <w:numId w:val="5"/>
+        </w:numPr>
+        <w:rPr>
+          <w:lang w:val="nl-NL"/>
+        </w:rPr>
+      </w:pPr>
+      <w:r>
+        <w:rPr>
+          <w:lang w:val="nl-NL"/>
+        </w:rPr>
+        <w:t>Schema en uitleg over ieder circuit dat er in zit</w:t>
+      </w:r>
     </w:p>
     <w:p>
       <w:pPr>
@@ -1115,13 +1289,8 @@
       <w:pPr>
         <w:pStyle w:val="NoSpacing"/>
       </w:pPr>
-      <w:proofErr w:type="spellStart"/>
-      <w:r>
-        <w:t>Optioneel</w:t>
-      </w:r>
-      <w:proofErr w:type="spellEnd"/>
-      <w:r>
-        <w:t>:</w:t>
+      <w:r>
+        <w:t>Optioneel:</w:t>
       </w:r>
     </w:p>
     <w:p>
@@ -1129,13 +1298,8 @@
         <w:pStyle w:val="NoSpacing"/>
         <w:ind w:left="720"/>
       </w:pPr>
-      <w:proofErr w:type="spellStart"/>
-      <w:r>
-        <w:t>Hardwarematig</w:t>
-      </w:r>
-      <w:proofErr w:type="spellEnd"/>
-      <w:r>
-        <w:t xml:space="preserve"> debugging LED</w:t>
+      <w:r>
+        <w:t>Hardwarematig debugging LED</w:t>
       </w:r>
     </w:p>
     <w:p>
@@ -1153,15 +1317,7 @@
         <w:ind w:left="720"/>
       </w:pPr>
       <w:r>
-        <w:t>Scherm (</w:t>
-      </w:r>
-      <w:proofErr w:type="spellStart"/>
-      <w:r>
-        <w:t>evt</w:t>
-      </w:r>
-      <w:proofErr w:type="spellEnd"/>
-      <w:r>
-        <w:t xml:space="preserve"> touchscreen)</w:t>
+        <w:t>Scherm (evt touchscreen)</w:t>
       </w:r>
     </w:p>
     <w:p>
@@ -1170,31 +1326,7 @@
         <w:ind w:left="720"/>
       </w:pPr>
       <w:r>
-        <w:t xml:space="preserve">Extra </w:t>
-      </w:r>
-      <w:proofErr w:type="spellStart"/>
-      <w:r>
-        <w:t>usb</w:t>
-      </w:r>
-      <w:proofErr w:type="spellEnd"/>
-      <w:r>
-        <w:t xml:space="preserve"> </w:t>
-      </w:r>
-      <w:proofErr w:type="spellStart"/>
-      <w:r>
-        <w:t>poort</w:t>
-      </w:r>
-      <w:proofErr w:type="spellEnd"/>
-      <w:r>
-        <w:t xml:space="preserve"> (of 2 stacked </w:t>
-      </w:r>
-      <w:proofErr w:type="spellStart"/>
-      <w:r>
-        <w:t>usb</w:t>
-      </w:r>
-      <w:proofErr w:type="spellEnd"/>
-      <w:r>
-        <w:t>)</w:t>
+        <w:t>Extra usb poort (of 2 stacked usb)</w:t>
       </w:r>
       <w:r>
         <w:t xml:space="preserve"> (USB-hub </w:t>
@@ -1423,19 +1555,12 @@
       <w:pPr>
         <w:pStyle w:val="NoSpacing"/>
       </w:pPr>
-      <w:proofErr w:type="spellStart"/>
-      <w:r>
-        <w:t>Pinnen</w:t>
-      </w:r>
-      <w:proofErr w:type="spellEnd"/>
-      <w:r>
-        <w:t>: (</w:t>
-      </w:r>
-      <w:proofErr w:type="spellStart"/>
+      <w:r>
+        <w:t>Pinnen: (</w:t>
+      </w:r>
       <w:r>
         <w:t>aantal</w:t>
       </w:r>
-      <w:proofErr w:type="spellEnd"/>
       <w:r>
         <w:t>)</w:t>
       </w:r>
@@ -3119,7 +3244,28 @@
             <w:rStyle w:val="Hyperlink"/>
             <w:lang w:val="nl-NL"/>
           </w:rPr>
-          <w:t>AP64501SP-13</w:t>
+          <w:t>AP645</w:t>
+        </w:r>
+        <w:r>
+          <w:rPr>
+            <w:rStyle w:val="Hyperlink"/>
+            <w:lang w:val="nl-NL"/>
+          </w:rPr>
+          <w:t>0</w:t>
+        </w:r>
+        <w:r>
+          <w:rPr>
+            <w:rStyle w:val="Hyperlink"/>
+            <w:lang w:val="nl-NL"/>
+          </w:rPr>
+          <w:t>1</w:t>
+        </w:r>
+        <w:r>
+          <w:rPr>
+            <w:rStyle w:val="Hyperlink"/>
+            <w:lang w:val="nl-NL"/>
+          </w:rPr>
+          <w:t>SP-13</w:t>
         </w:r>
       </w:hyperlink>
       <w:r>
@@ -4633,7 +4779,7 @@
           <w:noProof/>
         </w:rPr>
         <w:drawing>
-          <wp:inline distT="0" distB="0" distL="0" distR="0" wp14:anchorId="2020065A" wp14:editId="55648F36">
+          <wp:inline distT="0" distB="0" distL="0" distR="0" wp14:anchorId="2020065A" wp14:editId="16D92123">
             <wp:extent cx="2719346" cy="2008025"/>
             <wp:effectExtent l="0" t="0" r="5080" b="0"/>
             <wp:docPr id="619101385" name="Picture 1" descr="Does HDMI 2.0 Support 1080p 120Hz? Addressing HDMI Questions ..."/>
@@ -7939,7 +8085,7 @@
           <w:noProof/>
         </w:rPr>
         <w:drawing>
-          <wp:inline distT="0" distB="0" distL="0" distR="0" wp14:anchorId="0A4037B6" wp14:editId="22313901">
+          <wp:inline distT="0" distB="0" distL="0" distR="0" wp14:anchorId="0A4037B6" wp14:editId="7942E85D">
             <wp:extent cx="1148504" cy="1764803"/>
             <wp:effectExtent l="0" t="0" r="0" b="6985"/>
             <wp:docPr id="958528632" name="Picture 4" descr="What is Micro USB OTG (On-The-Go)? Build DIY OTG Cable"/>
@@ -9656,7 +9802,6 @@
                 <w:szCs w:val="20"/>
               </w:rPr>
             </w:pPr>
-            <w:proofErr w:type="spellStart"/>
             <w:r>
               <w:rPr>
                 <w:sz w:val="20"/>
@@ -9664,7 +9809,6 @@
               </w:rPr>
               <w:t>EEPROM_nWP</w:t>
             </w:r>
-            <w:proofErr w:type="spellEnd"/>
           </w:p>
         </w:tc>
         <w:tc>
@@ -9745,7 +9889,6 @@
                 <w:szCs w:val="20"/>
               </w:rPr>
             </w:pPr>
-            <w:proofErr w:type="spellStart"/>
             <w:r>
               <w:rPr>
                 <w:sz w:val="20"/>
@@ -9753,7 +9896,6 @@
               </w:rPr>
               <w:t>Pi_nLED_Activity</w:t>
             </w:r>
-            <w:proofErr w:type="spellEnd"/>
           </w:p>
         </w:tc>
         <w:tc>
@@ -12912,13 +13054,8 @@
             <w:pPr>
               <w:pStyle w:val="NoSpacing"/>
             </w:pPr>
-            <w:proofErr w:type="spellStart"/>
-            <w:r>
-              <w:t>Ethernet_P</w:t>
-            </w:r>
-            <w:proofErr w:type="spellEnd"/>
-            <w:r>
-              <w:t xml:space="preserve"> (3, 1)</w:t>
+            <w:r>
+              <w:t>Ethernet_P (3, 1)</w:t>
             </w:r>
           </w:p>
         </w:tc>
@@ -12945,13 +13082,8 @@
             <w:pPr>
               <w:pStyle w:val="NoSpacing"/>
             </w:pPr>
-            <w:proofErr w:type="spellStart"/>
-            <w:r>
-              <w:t>Ethernet_N</w:t>
-            </w:r>
-            <w:proofErr w:type="spellEnd"/>
-            <w:r>
-              <w:t xml:space="preserve"> (3, 1)</w:t>
+            <w:r>
+              <w:t>Ethernet_N (3, 1)</w:t>
             </w:r>
           </w:p>
         </w:tc>
@@ -13006,13 +13138,8 @@
             <w:pPr>
               <w:pStyle w:val="NoSpacing"/>
             </w:pPr>
-            <w:proofErr w:type="spellStart"/>
-            <w:r>
-              <w:t>Ethernet_N</w:t>
-            </w:r>
-            <w:proofErr w:type="spellEnd"/>
-            <w:r>
-              <w:t xml:space="preserve"> (2, 0)</w:t>
+            <w:r>
+              <w:t>Ethernet_N (2, 0)</w:t>
             </w:r>
           </w:p>
         </w:tc>
@@ -13039,13 +13166,8 @@
             <w:pPr>
               <w:pStyle w:val="NoSpacing"/>
             </w:pPr>
-            <w:proofErr w:type="spellStart"/>
-            <w:r>
-              <w:t>Ethernet_P</w:t>
-            </w:r>
-            <w:proofErr w:type="spellEnd"/>
-            <w:r>
-              <w:t xml:space="preserve"> (2, 0)</w:t>
+            <w:r>
+              <w:t>Ethernet_P (2, 0)</w:t>
             </w:r>
           </w:p>
         </w:tc>
@@ -13128,11 +13250,9 @@
             <w:pPr>
               <w:pStyle w:val="NoSpacing"/>
             </w:pPr>
-            <w:proofErr w:type="spellStart"/>
             <w:r>
               <w:t>Ethernet_SYNC_IN</w:t>
             </w:r>
-            <w:proofErr w:type="spellEnd"/>
           </w:p>
         </w:tc>
       </w:tr>
@@ -13186,11 +13306,9 @@
             <w:pPr>
               <w:pStyle w:val="NoSpacing"/>
             </w:pPr>
-            <w:proofErr w:type="spellStart"/>
             <w:r>
               <w:t>Ethernet_SYNC_OUT</w:t>
             </w:r>
-            <w:proofErr w:type="spellEnd"/>
           </w:p>
         </w:tc>
       </w:tr>
@@ -13244,11 +13362,9 @@
             <w:pPr>
               <w:pStyle w:val="NoSpacing"/>
             </w:pPr>
-            <w:proofErr w:type="spellStart"/>
             <w:r>
               <w:t>EEPROM_nWP</w:t>
             </w:r>
-            <w:proofErr w:type="spellEnd"/>
           </w:p>
         </w:tc>
       </w:tr>
@@ -13274,11 +13390,9 @@
             <w:pPr>
               <w:pStyle w:val="NoSpacing"/>
             </w:pPr>
-            <w:proofErr w:type="spellStart"/>
             <w:r>
               <w:t>Pi_nLED_Activity</w:t>
             </w:r>
-            <w:proofErr w:type="spellEnd"/>
           </w:p>
         </w:tc>
       </w:tr>
@@ -20259,21 +20373,7 @@
           <w:lang w:val="en-GB"/>
         </w:rPr>
         <w:lastRenderedPageBreak/>
-        <w:t xml:space="preserve">Copied files from existing </w:t>
-      </w:r>
-      <w:proofErr w:type="spellStart"/>
-      <w:r>
-        <w:rPr>
-          <w:lang w:val="en-GB"/>
-        </w:rPr>
-        <w:t>kicad</w:t>
-      </w:r>
-      <w:proofErr w:type="spellEnd"/>
-      <w:r>
-        <w:rPr>
-          <w:lang w:val="en-GB"/>
-        </w:rPr>
-        <w:t xml:space="preserve"> and used footprints/symbols</w:t>
+        <w:t>Copied files from existing kicad and used footprints/symbols</w:t>
       </w:r>
       <w:bookmarkEnd w:id="9"/>
     </w:p>
@@ -20298,13 +20398,8 @@
         <w:pStyle w:val="NoSpacing"/>
       </w:pPr>
       <w:r>
-        <w:t xml:space="preserve">HDMI + </w:t>
-      </w:r>
-      <w:proofErr w:type="spellStart"/>
-      <w:r>
-        <w:t>powersupply</w:t>
-      </w:r>
-      <w:proofErr w:type="spellEnd"/>
+        <w:t>HDMI + powersupply</w:t>
+      </w:r>
     </w:p>
     <w:p>
       <w:pPr>
@@ -20332,15 +20427,7 @@
         <w:pStyle w:val="NoSpacing"/>
       </w:pPr>
       <w:r>
-        <w:t xml:space="preserve">Everything except for Ethernet and </w:t>
-      </w:r>
-      <w:proofErr w:type="spellStart"/>
-      <w:r>
-        <w:t>SDcard</w:t>
-      </w:r>
-      <w:proofErr w:type="spellEnd"/>
-      <w:r>
-        <w:t xml:space="preserve"> slot</w:t>
+        <w:t>Everything except for Ethernet and SDcard slot</w:t>
       </w:r>
     </w:p>
     <w:p>
@@ -20369,15 +20456,7 @@
         <w:pStyle w:val="NoSpacing"/>
       </w:pPr>
       <w:r>
-        <w:t>“</w:t>
-      </w:r>
-      <w:proofErr w:type="spellStart"/>
-      <w:r>
-        <w:t>PCIe.kicad_sch</w:t>
-      </w:r>
-      <w:proofErr w:type="spellEnd"/>
-      <w:r>
-        <w:t>”</w:t>
+        <w:t>“PCIe.kicad_sch”</w:t>
       </w:r>
     </w:p>
     <w:p>
@@ -20385,15 +20464,7 @@
         <w:pStyle w:val="NoSpacing"/>
       </w:pPr>
       <w:r>
-        <w:t>“</w:t>
-      </w:r>
-      <w:proofErr w:type="spellStart"/>
-      <w:r>
-        <w:t>PSUs.kicad_sch</w:t>
-      </w:r>
-      <w:proofErr w:type="spellEnd"/>
-      <w:r>
-        <w:t>”</w:t>
+        <w:t>“PSUs.kicad_sch”</w:t>
       </w:r>
     </w:p>
     <w:p>
@@ -20401,15 +20472,7 @@
         <w:pStyle w:val="NoSpacing"/>
       </w:pPr>
       <w:r>
-        <w:t>“</w:t>
-      </w:r>
-      <w:proofErr w:type="spellStart"/>
-      <w:r>
-        <w:t>RTC.kicad_sch</w:t>
-      </w:r>
-      <w:proofErr w:type="spellEnd"/>
-      <w:r>
-        <w:t>”</w:t>
+        <w:t>“RTC.kicad_sch”</w:t>
       </w:r>
     </w:p>
     <w:p>
@@ -20457,17 +20520,7 @@
         <w:pStyle w:val="NoSpacing"/>
       </w:pPr>
       <w:r>
-        <w:t>“</w:t>
-      </w:r>
-      <w:proofErr w:type="spellStart"/>
-      <w:proofErr w:type="gramStart"/>
-      <w:r>
-        <w:t>fp</w:t>
-      </w:r>
-      <w:proofErr w:type="spellEnd"/>
-      <w:proofErr w:type="gramEnd"/>
-      <w:r>
-        <w:t>-info-cache”</w:t>
+        <w:t>“fp-info-cache”</w:t>
       </w:r>
     </w:p>
     <w:p>
@@ -20475,17 +20528,7 @@
         <w:pStyle w:val="NoSpacing"/>
       </w:pPr>
       <w:r>
-        <w:t>“</w:t>
-      </w:r>
-      <w:proofErr w:type="spellStart"/>
-      <w:proofErr w:type="gramStart"/>
-      <w:r>
-        <w:t>fp</w:t>
-      </w:r>
-      <w:proofErr w:type="spellEnd"/>
-      <w:proofErr w:type="gramEnd"/>
-      <w:r>
-        <w:t>-lib-table”</w:t>
+        <w:t>“fp-lib-table”</w:t>
       </w:r>
     </w:p>
     <w:p>
@@ -20493,17 +20536,7 @@
         <w:pStyle w:val="NoSpacing"/>
       </w:pPr>
       <w:r>
-        <w:t>“</w:t>
-      </w:r>
-      <w:proofErr w:type="spellStart"/>
-      <w:proofErr w:type="gramStart"/>
-      <w:r>
-        <w:t>sym</w:t>
-      </w:r>
-      <w:proofErr w:type="spellEnd"/>
-      <w:proofErr w:type="gramEnd"/>
-      <w:r>
-        <w:t>-lib-table”</w:t>
+        <w:t>“sym-lib-table”</w:t>
       </w:r>
     </w:p>
     <w:p>
@@ -20575,23 +20608,7 @@
           <w:b/>
           <w:bCs/>
         </w:rPr>
-        <w:t xml:space="preserve">Must be changed in </w:t>
-      </w:r>
-      <w:proofErr w:type="spellStart"/>
-      <w:r>
-        <w:rPr>
-          <w:b/>
-          <w:bCs/>
-        </w:rPr>
-        <w:t>KiCad</w:t>
-      </w:r>
-      <w:proofErr w:type="spellEnd"/>
-      <w:r>
-        <w:rPr>
-          <w:b/>
-          <w:bCs/>
-        </w:rPr>
-        <w:t xml:space="preserve"> File</w:t>
+        <w:t>Must be changed in KiCad File</w:t>
       </w:r>
     </w:p>
     <w:p>
@@ -20810,15 +20827,7 @@
         <w:pStyle w:val="NoSpacing"/>
       </w:pPr>
       <w:r>
-        <w:t xml:space="preserve">Not available on </w:t>
-      </w:r>
-      <w:proofErr w:type="spellStart"/>
-      <w:r>
-        <w:t>SnapEDA</w:t>
-      </w:r>
-      <w:proofErr w:type="spellEnd"/>
-      <w:r>
-        <w:t>:</w:t>
+        <w:t>Not available on SnapEDA:</w:t>
       </w:r>
     </w:p>
     <w:p>
@@ -22048,6 +22057,7 @@
   <w:style w:type="character" w:default="1" w:styleId="DefaultParagraphFont">
     <w:name w:val="Default Paragraph Font"/>
     <w:uiPriority w:val="1"/>
+    <w:semiHidden/>
     <w:unhideWhenUsed/>
   </w:style>
   <w:style w:type="table" w:default="1" w:styleId="TableNormal">

</xml_diff>

<commit_message>
Redid the routing and fixed ERC warnings
</commit_message>
<xml_diff>
--- a/ANE21_PCB.docx
+++ b/ANE21_PCB.docx
@@ -136,28 +136,7 @@
                 <w:rStyle w:val="Hyperlink"/>
                 <w:noProof/>
               </w:rPr>
-              <w:t>Voe</w:t>
-            </w:r>
-            <w:r>
-              <w:rPr>
-                <w:rStyle w:val="Hyperlink"/>
-                <w:noProof/>
-              </w:rPr>
-              <w:t>d</w:t>
-            </w:r>
-            <w:r>
-              <w:rPr>
-                <w:rStyle w:val="Hyperlink"/>
-                <w:noProof/>
-              </w:rPr>
-              <w:t>i</w:t>
-            </w:r>
-            <w:r>
-              <w:rPr>
-                <w:rStyle w:val="Hyperlink"/>
-                <w:noProof/>
-              </w:rPr>
-              <w:t>ng</w:t>
+              <w:t>Voeding</w:t>
             </w:r>
             <w:r>
               <w:rPr>
@@ -840,48 +819,6 @@
       </w:r>
       <w:r>
         <w:t>evices, dongle and OTG</w:t>
-      </w:r>
-    </w:p>
-    <w:p>
-      <w:pPr>
-        <w:pStyle w:val="NoSpacing"/>
-        <w:numPr>
-          <w:ilvl w:val="0"/>
-          <w:numId w:val="5"/>
-        </w:numPr>
-        <w:rPr>
-          <w:lang w:val="nl-NL"/>
-        </w:rPr>
-      </w:pPr>
-      <w:r>
-        <w:rPr>
-          <w:lang w:val="nl-NL"/>
-        </w:rPr>
-        <w:t>Opzet HMDI of PCIe P</w:t>
-      </w:r>
-      <w:r>
-        <w:rPr>
-          <w:lang w:val="nl-NL"/>
-        </w:rPr>
-        <w:t>CB traces</w:t>
-      </w:r>
-    </w:p>
-    <w:p>
-      <w:pPr>
-        <w:pStyle w:val="NoSpacing"/>
-        <w:numPr>
-          <w:ilvl w:val="0"/>
-          <w:numId w:val="5"/>
-        </w:numPr>
-        <w:rPr>
-          <w:lang w:val="nl-NL"/>
-        </w:rPr>
-      </w:pPr>
-      <w:r>
-        <w:rPr>
-          <w:lang w:val="nl-NL"/>
-        </w:rPr>
-        <w:t>Mogelijkheid voor labvoeding</w:t>
       </w:r>
     </w:p>
     <w:p>
@@ -3289,28 +3226,7 @@
             <w:rStyle w:val="Hyperlink"/>
             <w:lang w:val="nl-NL"/>
           </w:rPr>
-          <w:t>AP645</w:t>
-        </w:r>
-        <w:r>
-          <w:rPr>
-            <w:rStyle w:val="Hyperlink"/>
-            <w:lang w:val="nl-NL"/>
-          </w:rPr>
-          <w:t>0</w:t>
-        </w:r>
-        <w:r>
-          <w:rPr>
-            <w:rStyle w:val="Hyperlink"/>
-            <w:lang w:val="nl-NL"/>
-          </w:rPr>
-          <w:t>1</w:t>
-        </w:r>
-        <w:r>
-          <w:rPr>
-            <w:rStyle w:val="Hyperlink"/>
-            <w:lang w:val="nl-NL"/>
-          </w:rPr>
-          <w:t>SP-13</w:t>
+          <w:t>AP64501SP-13</w:t>
         </w:r>
       </w:hyperlink>
       <w:r>
@@ -4824,7 +4740,7 @@
           <w:noProof/>
         </w:rPr>
         <w:drawing>
-          <wp:inline distT="0" distB="0" distL="0" distR="0" wp14:anchorId="2020065A" wp14:editId="16D92123">
+          <wp:inline distT="0" distB="0" distL="0" distR="0" wp14:anchorId="2020065A" wp14:editId="4EF131C3">
             <wp:extent cx="2719346" cy="2008025"/>
             <wp:effectExtent l="0" t="0" r="5080" b="0"/>
             <wp:docPr id="619101385" name="Picture 1" descr="Does HDMI 2.0 Support 1080p 120Hz? Addressing HDMI Questions ..."/>
@@ -8130,7 +8046,7 @@
           <w:noProof/>
         </w:rPr>
         <w:drawing>
-          <wp:inline distT="0" distB="0" distL="0" distR="0" wp14:anchorId="0A4037B6" wp14:editId="7942E85D">
+          <wp:inline distT="0" distB="0" distL="0" distR="0" wp14:anchorId="0A4037B6" wp14:editId="244D9245">
             <wp:extent cx="1148504" cy="1764803"/>
             <wp:effectExtent l="0" t="0" r="0" b="6985"/>
             <wp:docPr id="958528632" name="Picture 4" descr="What is Micro USB OTG (On-The-Go)? Build DIY OTG Cable"/>

</xml_diff>

<commit_message>
Redid traces with correct requirements, needs double checking.
</commit_message>
<xml_diff>
--- a/ANE21_PCB.docx
+++ b/ANE21_PCB.docx
@@ -954,6 +954,11 @@
       </w:pPr>
     </w:p>
     <w:p>
+      <w:r>
+        <w:t>Update 09/03/2026</w:t>
+      </w:r>
+    </w:p>
+    <w:p>
       <w:pPr>
         <w:pStyle w:val="ListParagraph"/>
         <w:numPr>
@@ -962,11 +967,862 @@
         </w:numPr>
       </w:pPr>
       <w:r>
-        <w:br w:type="page"/>
+        <w:t>Placed testpoints</w:t>
       </w:r>
     </w:p>
     <w:p>
       <w:pPr>
+        <w:pStyle w:val="ListParagraph"/>
+        <w:numPr>
+          <w:ilvl w:val="0"/>
+          <w:numId w:val="5"/>
+        </w:numPr>
+        <w:rPr>
+          <w:lang w:val="en-GB"/>
+        </w:rPr>
+      </w:pPr>
+      <w:r>
+        <w:rPr>
+          <w:lang w:val="en-GB"/>
+        </w:rPr>
+        <w:t>Added header for UART (G</w:t>
+      </w:r>
+      <w:r>
+        <w:rPr>
+          <w:lang w:val="en-GB"/>
+        </w:rPr>
+        <w:t>PIO 14 and 15)</w:t>
+      </w:r>
+      <w:r>
+        <w:rPr>
+          <w:lang w:val="en-GB"/>
+        </w:rPr>
+        <w:t>`</w:t>
+      </w:r>
+    </w:p>
+    <w:p>
+      <w:pPr>
+        <w:pStyle w:val="ListParagraph"/>
+        <w:numPr>
+          <w:ilvl w:val="0"/>
+          <w:numId w:val="5"/>
+        </w:numPr>
+        <w:rPr>
+          <w:lang w:val="en-GB"/>
+        </w:rPr>
+      </w:pPr>
+      <w:r>
+        <w:rPr>
+          <w:lang w:val="en-GB"/>
+        </w:rPr>
+        <w:t>Removed all via’s placed on pads</w:t>
+      </w:r>
+      <w:r>
+        <w:rPr>
+          <w:lang w:val="en-GB"/>
+        </w:rPr>
+        <w:t>`</w:t>
+      </w:r>
+    </w:p>
+    <w:p>
+      <w:r>
+        <w:t>D</w:t>
+      </w:r>
+      <w:r>
+        <w:t xml:space="preserve">iferential </w:t>
+      </w:r>
+      <w:r>
+        <w:t>P</w:t>
+      </w:r>
+      <w:r>
+        <w:t>air (DP)</w:t>
+      </w:r>
+      <w:r>
+        <w:t xml:space="preserve"> </w:t>
+      </w:r>
+    </w:p>
+    <w:p>
+      <w:pPr>
+        <w:pStyle w:val="ListParagraph"/>
+        <w:numPr>
+          <w:ilvl w:val="0"/>
+          <w:numId w:val="6"/>
+        </w:numPr>
+      </w:pPr>
+      <w:r>
+        <w:t xml:space="preserve">6 </w:t>
+      </w:r>
+      <w:r>
+        <w:sym w:font="Wingdings" w:char="F0E0"/>
+      </w:r>
+      <w:r>
+        <w:t xml:space="preserve"> Per 45°, houd de lengte van de paren zo gelijk mogelijk</w:t>
+      </w:r>
+    </w:p>
+    <w:p>
+      <w:pPr>
+        <w:pStyle w:val="ListParagraph"/>
+        <w:numPr>
+          <w:ilvl w:val="0"/>
+          <w:numId w:val="6"/>
+        </w:numPr>
+      </w:pPr>
+      <w:r>
+        <w:t>Tune DP, match met de langste (Zie eerst welke de langste is)</w:t>
+      </w:r>
+    </w:p>
+    <w:p>
+      <w:pPr>
+        <w:pStyle w:val="ListParagraph"/>
+        <w:numPr>
+          <w:ilvl w:val="0"/>
+          <w:numId w:val="6"/>
+        </w:numPr>
+      </w:pPr>
+      <w:r>
+        <w:t>Tune skew of DP`</w:t>
+      </w:r>
+    </w:p>
+    <w:p>
+      <w:pPr>
+        <w:pStyle w:val="ListParagraph"/>
+        <w:rPr>
+          <w:lang w:val="en-GB"/>
+        </w:rPr>
+      </w:pPr>
+      <w:r>
+        <w:rPr>
+          <w:lang w:val="en-GB"/>
+        </w:rPr>
+        <w:t xml:space="preserve">Click on </w:t>
+      </w:r>
+      <w:r>
+        <w:rPr>
+          <w:lang w:val="en-GB"/>
+        </w:rPr>
+        <w:t>two places of</w:t>
+      </w:r>
+      <w:r>
+        <w:rPr>
+          <w:lang w:val="en-GB"/>
+        </w:rPr>
+        <w:t xml:space="preserve"> </w:t>
+      </w:r>
+      <w:r>
+        <w:rPr>
+          <w:lang w:val="en-GB"/>
+        </w:rPr>
+        <w:t xml:space="preserve">trace. </w:t>
+      </w:r>
+      <w:r>
+        <w:rPr>
+          <w:lang w:val="en-GB"/>
+        </w:rPr>
+        <w:sym w:font="Wingdings" w:char="F0E0"/>
+      </w:r>
+      <w:r>
+        <w:rPr>
+          <w:lang w:val="en-GB"/>
+        </w:rPr>
+        <w:t xml:space="preserve"> Exit </w:t>
+      </w:r>
+      <w:r>
+        <w:rPr>
+          <w:lang w:val="en-GB"/>
+        </w:rPr>
+        <w:sym w:font="Wingdings" w:char="F0E0"/>
+      </w:r>
+      <w:r>
+        <w:rPr>
+          <w:lang w:val="en-GB"/>
+        </w:rPr>
+        <w:t xml:space="preserve"> double click: </w:t>
+      </w:r>
+      <w:proofErr w:type="spellStart"/>
+      <w:r>
+        <w:rPr>
+          <w:lang w:val="en-GB"/>
+        </w:rPr>
+        <w:t>tadaa</w:t>
+      </w:r>
+      <w:proofErr w:type="spellEnd"/>
+      <w:r>
+        <w:rPr>
+          <w:lang w:val="en-GB"/>
+        </w:rPr>
+        <w:t xml:space="preserve"> settings</w:t>
+      </w:r>
+    </w:p>
+    <w:p>
+      <w:pPr>
+        <w:rPr>
+          <w:lang w:val="en-GB"/>
+        </w:rPr>
+      </w:pPr>
+    </w:p>
+    <w:p>
+      <w:pPr>
+        <w:rPr>
+          <w:lang w:val="en-GB"/>
+        </w:rPr>
+      </w:pPr>
+      <w:proofErr w:type="spellStart"/>
+      <w:r>
+        <w:rPr>
+          <w:lang w:val="en-GB"/>
+        </w:rPr>
+        <w:lastRenderedPageBreak/>
+        <w:t>Aisler</w:t>
+      </w:r>
+      <w:proofErr w:type="spellEnd"/>
+    </w:p>
+    <w:p>
+      <w:pPr>
+        <w:rPr>
+          <w:lang w:val="en-GB"/>
+        </w:rPr>
+      </w:pPr>
+      <w:r>
+        <w:rPr>
+          <w:lang w:val="en-GB"/>
+        </w:rPr>
+        <w:drawing>
+          <wp:inline distT="0" distB="0" distL="0" distR="0" wp14:anchorId="28754FCC" wp14:editId="6F8CD891">
+            <wp:extent cx="3298613" cy="1269231"/>
+            <wp:effectExtent l="0" t="0" r="0" b="7620"/>
+            <wp:docPr id="2094230950" name="Picture 1" descr="A screenshot of a computer&#10;&#10;AI-generated content may be incorrect."/>
+            <wp:cNvGraphicFramePr>
+              <a:graphicFrameLocks xmlns:a="http://schemas.openxmlformats.org/drawingml/2006/main" noChangeAspect="1"/>
+            </wp:cNvGraphicFramePr>
+            <a:graphic xmlns:a="http://schemas.openxmlformats.org/drawingml/2006/main">
+              <a:graphicData uri="http://schemas.openxmlformats.org/drawingml/2006/picture">
+                <pic:pic xmlns:pic="http://schemas.openxmlformats.org/drawingml/2006/picture">
+                  <pic:nvPicPr>
+                    <pic:cNvPr id="2094230950" name="Picture 1" descr="A screenshot of a computer&#10;&#10;AI-generated content may be incorrect."/>
+                    <pic:cNvPicPr/>
+                  </pic:nvPicPr>
+                  <pic:blipFill>
+                    <a:blip r:embed="rId6"/>
+                    <a:stretch>
+                      <a:fillRect/>
+                    </a:stretch>
+                  </pic:blipFill>
+                  <pic:spPr>
+                    <a:xfrm>
+                      <a:off x="0" y="0"/>
+                      <a:ext cx="3329063" cy="1280948"/>
+                    </a:xfrm>
+                    <a:prstGeom prst="rect">
+                      <a:avLst/>
+                    </a:prstGeom>
+                  </pic:spPr>
+                </pic:pic>
+              </a:graphicData>
+            </a:graphic>
+          </wp:inline>
+        </w:drawing>
+      </w:r>
+    </w:p>
+    <w:p>
+      <w:pPr>
+        <w:rPr>
+          <w:sz w:val="22"/>
+          <w:szCs w:val="22"/>
+          <w:lang w:val="en-GB"/>
+        </w:rPr>
+      </w:pPr>
+      <w:r>
+        <w:rPr>
+          <w:sz w:val="22"/>
+          <w:szCs w:val="22"/>
+          <w:lang w:val="en-GB"/>
+        </w:rPr>
+        <w:t xml:space="preserve">In </w:t>
+      </w:r>
+      <w:proofErr w:type="spellStart"/>
+      <w:r>
+        <w:rPr>
+          <w:sz w:val="22"/>
+          <w:szCs w:val="22"/>
+          <w:lang w:val="en-GB"/>
+        </w:rPr>
+        <w:t>KiCad</w:t>
+      </w:r>
+      <w:proofErr w:type="spellEnd"/>
+      <w:r>
+        <w:rPr>
+          <w:sz w:val="22"/>
+          <w:szCs w:val="22"/>
+          <w:lang w:val="en-GB"/>
+        </w:rPr>
+        <w:t xml:space="preserve">, the difference between coplanar and non-coplanar (often called microstrip or </w:t>
+      </w:r>
+      <w:proofErr w:type="spellStart"/>
+      <w:r>
+        <w:rPr>
+          <w:sz w:val="22"/>
+          <w:szCs w:val="22"/>
+          <w:lang w:val="en-GB"/>
+        </w:rPr>
+        <w:t>stripline</w:t>
+      </w:r>
+      <w:proofErr w:type="spellEnd"/>
+      <w:r>
+        <w:rPr>
+          <w:sz w:val="22"/>
+          <w:szCs w:val="22"/>
+          <w:lang w:val="en-GB"/>
+        </w:rPr>
+        <w:t xml:space="preserve">) refers to how a signal trace is referenced to its ground return path regarding their physical plane on the PCB. This distinction is crucial for controlling signal integrity and impedance. </w:t>
+      </w:r>
+    </w:p>
+    <w:p>
+      <w:pPr>
+        <w:rPr>
+          <w:b/>
+          <w:bCs/>
+          <w:sz w:val="22"/>
+          <w:szCs w:val="22"/>
+          <w:lang w:val="en-GB"/>
+        </w:rPr>
+      </w:pPr>
+      <w:r>
+        <w:rPr>
+          <w:b/>
+          <w:bCs/>
+          <w:sz w:val="22"/>
+          <w:szCs w:val="22"/>
+          <w:lang w:val="en-GB"/>
+        </w:rPr>
+        <w:t>Coplanar (GCPW - Grounded Coplanar Waveguide)</w:t>
+      </w:r>
+    </w:p>
+    <w:p>
+      <w:pPr>
+        <w:pStyle w:val="ListParagraph"/>
+        <w:numPr>
+          <w:ilvl w:val="0"/>
+          <w:numId w:val="5"/>
+        </w:numPr>
+        <w:rPr>
+          <w:sz w:val="22"/>
+          <w:szCs w:val="22"/>
+          <w:lang w:val="en-GB"/>
+        </w:rPr>
+      </w:pPr>
+      <w:r>
+        <w:rPr>
+          <w:sz w:val="22"/>
+          <w:szCs w:val="22"/>
+          <w:lang w:val="en-GB"/>
+        </w:rPr>
+        <w:t>Definition: The signal trace and its ground reference are on the same layer (e.g., Top Layer).</w:t>
+      </w:r>
+    </w:p>
+    <w:p>
+      <w:pPr>
+        <w:pStyle w:val="ListParagraph"/>
+        <w:numPr>
+          <w:ilvl w:val="0"/>
+          <w:numId w:val="5"/>
+        </w:numPr>
+        <w:rPr>
+          <w:sz w:val="22"/>
+          <w:szCs w:val="22"/>
+          <w:lang w:val="en-GB"/>
+        </w:rPr>
+      </w:pPr>
+      <w:r>
+        <w:rPr>
+          <w:sz w:val="22"/>
+          <w:szCs w:val="22"/>
+          <w:lang w:val="en-GB"/>
+        </w:rPr>
+        <w:t>Structure: Signal traces are surrounded by a ground pour (GND) on the same layer, providing a "co-planar" return path.</w:t>
+      </w:r>
+    </w:p>
+    <w:p>
+      <w:pPr>
+        <w:pStyle w:val="ListParagraph"/>
+        <w:numPr>
+          <w:ilvl w:val="0"/>
+          <w:numId w:val="5"/>
+        </w:numPr>
+        <w:rPr>
+          <w:sz w:val="22"/>
+          <w:szCs w:val="22"/>
+          <w:lang w:val="en-GB"/>
+        </w:rPr>
+      </w:pPr>
+      <w:r>
+        <w:rPr>
+          <w:sz w:val="22"/>
+          <w:szCs w:val="22"/>
+          <w:lang w:val="en-GB"/>
+        </w:rPr>
+        <w:t>Use Case: Often used for high-frequency (RF) signals, allowing for better shielding and lower radiation.</w:t>
+      </w:r>
+    </w:p>
+    <w:p>
+      <w:pPr>
+        <w:pStyle w:val="ListParagraph"/>
+        <w:numPr>
+          <w:ilvl w:val="0"/>
+          <w:numId w:val="5"/>
+        </w:numPr>
+        <w:rPr>
+          <w:sz w:val="22"/>
+          <w:szCs w:val="22"/>
+          <w:lang w:val="en-GB"/>
+        </w:rPr>
+      </w:pPr>
+      <w:proofErr w:type="spellStart"/>
+      <w:r>
+        <w:rPr>
+          <w:sz w:val="22"/>
+          <w:szCs w:val="22"/>
+          <w:lang w:val="en-GB"/>
+        </w:rPr>
+        <w:t>KiCad</w:t>
+      </w:r>
+      <w:proofErr w:type="spellEnd"/>
+      <w:r>
+        <w:rPr>
+          <w:sz w:val="22"/>
+          <w:szCs w:val="22"/>
+          <w:lang w:val="en-GB"/>
+        </w:rPr>
+        <w:t xml:space="preserve"> Calculation: Requires inputting the gap between the trace and the adjacent ground pour.</w:t>
+      </w:r>
+    </w:p>
+    <w:p>
+      <w:pPr>
+        <w:pStyle w:val="ListParagraph"/>
+        <w:numPr>
+          <w:ilvl w:val="0"/>
+          <w:numId w:val="5"/>
+        </w:numPr>
+        <w:rPr>
+          <w:sz w:val="22"/>
+          <w:szCs w:val="22"/>
+          <w:lang w:val="en-GB"/>
+        </w:rPr>
+      </w:pPr>
+      <w:r>
+        <w:rPr>
+          <w:sz w:val="22"/>
+          <w:szCs w:val="22"/>
+          <w:lang w:val="en-GB"/>
+        </w:rPr>
+        <w:t xml:space="preserve">Advantage: Can result in narrower traces for the same impedance compared to standard microstrip. </w:t>
+      </w:r>
+    </w:p>
+    <w:p>
+      <w:pPr>
+        <w:rPr>
+          <w:b/>
+          <w:bCs/>
+          <w:sz w:val="22"/>
+          <w:szCs w:val="22"/>
+          <w:lang w:val="en-GB"/>
+        </w:rPr>
+      </w:pPr>
+      <w:r>
+        <w:rPr>
+          <w:b/>
+          <w:bCs/>
+          <w:sz w:val="22"/>
+          <w:szCs w:val="22"/>
+          <w:lang w:val="en-GB"/>
+        </w:rPr>
+        <w:t>Non-Coplanar (Microstrip/</w:t>
+      </w:r>
+      <w:proofErr w:type="spellStart"/>
+      <w:r>
+        <w:rPr>
+          <w:b/>
+          <w:bCs/>
+          <w:sz w:val="22"/>
+          <w:szCs w:val="22"/>
+          <w:lang w:val="en-GB"/>
+        </w:rPr>
+        <w:t>Stripline</w:t>
+      </w:r>
+      <w:proofErr w:type="spellEnd"/>
+      <w:r>
+        <w:rPr>
+          <w:b/>
+          <w:bCs/>
+          <w:sz w:val="22"/>
+          <w:szCs w:val="22"/>
+          <w:lang w:val="en-GB"/>
+        </w:rPr>
+        <w:t>)</w:t>
+      </w:r>
+    </w:p>
+    <w:p>
+      <w:pPr>
+        <w:pStyle w:val="ListParagraph"/>
+        <w:numPr>
+          <w:ilvl w:val="0"/>
+          <w:numId w:val="5"/>
+        </w:numPr>
+        <w:rPr>
+          <w:sz w:val="22"/>
+          <w:szCs w:val="22"/>
+          <w:lang w:val="en-GB"/>
+        </w:rPr>
+      </w:pPr>
+      <w:r>
+        <w:rPr>
+          <w:sz w:val="22"/>
+          <w:szCs w:val="22"/>
+          <w:lang w:val="en-GB"/>
+        </w:rPr>
+        <w:t>Definition: The signal trace is on one layer, and its ground reference is on a different layer (usually the layer immediately below).</w:t>
+      </w:r>
+    </w:p>
+    <w:p>
+      <w:pPr>
+        <w:pStyle w:val="ListParagraph"/>
+        <w:numPr>
+          <w:ilvl w:val="0"/>
+          <w:numId w:val="5"/>
+        </w:numPr>
+        <w:rPr>
+          <w:sz w:val="22"/>
+          <w:szCs w:val="22"/>
+          <w:lang w:val="en-GB"/>
+        </w:rPr>
+      </w:pPr>
+      <w:r>
+        <w:rPr>
+          <w:sz w:val="22"/>
+          <w:szCs w:val="22"/>
+          <w:lang w:val="en-GB"/>
+        </w:rPr>
+        <w:t>Structure: No ground copper is present on the same layer as the signal, or the nearby copper is too far away to act as a primary reference.</w:t>
+      </w:r>
+    </w:p>
+    <w:p>
+      <w:pPr>
+        <w:pStyle w:val="ListParagraph"/>
+        <w:numPr>
+          <w:ilvl w:val="0"/>
+          <w:numId w:val="5"/>
+        </w:numPr>
+        <w:rPr>
+          <w:sz w:val="22"/>
+          <w:szCs w:val="22"/>
+          <w:lang w:val="en-GB"/>
+        </w:rPr>
+      </w:pPr>
+      <w:r>
+        <w:rPr>
+          <w:sz w:val="22"/>
+          <w:szCs w:val="22"/>
+          <w:lang w:val="en-GB"/>
+        </w:rPr>
+        <w:t>Use Case: Standard differential pair routing for digital signals (USB, Ethernet).</w:t>
+      </w:r>
+    </w:p>
+    <w:p>
+      <w:pPr>
+        <w:pStyle w:val="ListParagraph"/>
+        <w:numPr>
+          <w:ilvl w:val="0"/>
+          <w:numId w:val="5"/>
+        </w:numPr>
+        <w:rPr>
+          <w:sz w:val="22"/>
+          <w:szCs w:val="22"/>
+          <w:lang w:val="en-GB"/>
+        </w:rPr>
+      </w:pPr>
+      <w:proofErr w:type="spellStart"/>
+      <w:r>
+        <w:rPr>
+          <w:sz w:val="22"/>
+          <w:szCs w:val="22"/>
+          <w:lang w:val="en-GB"/>
+        </w:rPr>
+        <w:t>KiCad</w:t>
+      </w:r>
+      <w:proofErr w:type="spellEnd"/>
+      <w:r>
+        <w:rPr>
+          <w:sz w:val="22"/>
+          <w:szCs w:val="22"/>
+          <w:lang w:val="en-GB"/>
+        </w:rPr>
+        <w:t xml:space="preserve"> Calculation: Uses the distance to the plane below (dielectric thickness).</w:t>
+      </w:r>
+    </w:p>
+    <w:p>
+      <w:pPr>
+        <w:pStyle w:val="ListParagraph"/>
+        <w:numPr>
+          <w:ilvl w:val="0"/>
+          <w:numId w:val="5"/>
+        </w:numPr>
+        <w:rPr>
+          <w:lang w:val="en-GB"/>
+        </w:rPr>
+      </w:pPr>
+      <w:r>
+        <w:rPr>
+          <w:sz w:val="22"/>
+          <w:szCs w:val="22"/>
+          <w:lang w:val="en-GB"/>
+        </w:rPr>
+        <w:t xml:space="preserve">Advantage: Easier to calculate and manage, standard design approach. </w:t>
+      </w:r>
+    </w:p>
+    <w:p>
+      <w:pPr>
+        <w:pStyle w:val="NoSpacing"/>
+      </w:pPr>
+      <w:r>
+        <w:t>Summary Table</w:t>
+      </w:r>
+    </w:p>
+    <w:p>
+      <w:pPr>
+        <w:pStyle w:val="NoSpacing"/>
+        <w:rPr>
+          <w:b/>
+          <w:bCs/>
+        </w:rPr>
+      </w:pPr>
+      <w:r>
+        <w:rPr>
+          <w:b/>
+          <w:bCs/>
+        </w:rPr>
+        <w:t xml:space="preserve">Feature </w:t>
+      </w:r>
+      <w:r>
+        <w:rPr>
+          <w:b/>
+          <w:bCs/>
+        </w:rPr>
+        <w:tab/>
+      </w:r>
+      <w:r>
+        <w:rPr>
+          <w:b/>
+          <w:bCs/>
+        </w:rPr>
+        <w:tab/>
+      </w:r>
+      <w:r>
+        <w:rPr>
+          <w:b/>
+          <w:bCs/>
+        </w:rPr>
+        <w:tab/>
+      </w:r>
+      <w:r>
+        <w:rPr>
+          <w:b/>
+          <w:bCs/>
+        </w:rPr>
+        <w:t>Coplanar (GCPW)</w:t>
+      </w:r>
+      <w:r>
+        <w:rPr>
+          <w:b/>
+          <w:bCs/>
+        </w:rPr>
+        <w:tab/>
+      </w:r>
+      <w:r>
+        <w:rPr>
+          <w:b/>
+          <w:bCs/>
+        </w:rPr>
+        <w:tab/>
+      </w:r>
+      <w:r>
+        <w:rPr>
+          <w:b/>
+          <w:bCs/>
+        </w:rPr>
+        <w:t>Non-Coplanar (Microstrip)</w:t>
+      </w:r>
+    </w:p>
+    <w:p>
+      <w:pPr>
+        <w:pStyle w:val="NoSpacing"/>
+      </w:pPr>
+      <w:r>
+        <w:t>Ground Location</w:t>
+      </w:r>
+      <w:r>
+        <w:tab/>
+      </w:r>
+      <w:r>
+        <w:tab/>
+      </w:r>
+      <w:r>
+        <w:t>Same Layer as Signal</w:t>
+      </w:r>
+      <w:r>
+        <w:tab/>
+        <w:t>Different Layer (Below)</w:t>
+      </w:r>
+    </w:p>
+    <w:p>
+      <w:pPr>
+        <w:pStyle w:val="NoSpacing"/>
+      </w:pPr>
+      <w:r>
+        <w:t xml:space="preserve">Primary EMI </w:t>
+      </w:r>
+      <w:proofErr w:type="spellStart"/>
+      <w:r>
+        <w:t>Defense</w:t>
+      </w:r>
+      <w:proofErr w:type="spellEnd"/>
+      <w:r>
+        <w:tab/>
+      </w:r>
+      <w:r>
+        <w:tab/>
+      </w:r>
+      <w:r>
+        <w:t>Coplanar Pour + Vias</w:t>
+      </w:r>
+      <w:r>
+        <w:tab/>
+      </w:r>
+      <w:r>
+        <w:tab/>
+      </w:r>
+      <w:r>
+        <w:t>Ground Plane Below</w:t>
+      </w:r>
+    </w:p>
+    <w:p>
+      <w:pPr>
+        <w:pStyle w:val="NoSpacing"/>
+      </w:pPr>
+      <w:r>
+        <w:t>Impedance Setting</w:t>
+      </w:r>
+      <w:r>
+        <w:tab/>
+      </w:r>
+      <w:r>
+        <w:tab/>
+      </w:r>
+      <w:proofErr w:type="spellStart"/>
+      <w:r>
+        <w:t>C</w:t>
+      </w:r>
+      <w:r>
+        <w:t>ntrl</w:t>
+      </w:r>
+      <w:r>
+        <w:t>d</w:t>
+      </w:r>
+      <w:proofErr w:type="spellEnd"/>
+      <w:r>
+        <w:t xml:space="preserve"> by Gap to Copper</w:t>
+      </w:r>
+      <w:r>
+        <w:t xml:space="preserve"> </w:t>
+      </w:r>
+      <w:r>
+        <w:tab/>
+      </w:r>
+      <w:proofErr w:type="spellStart"/>
+      <w:r>
+        <w:t>C</w:t>
+      </w:r>
+      <w:r>
+        <w:t>ntrl</w:t>
+      </w:r>
+      <w:r>
+        <w:t>d</w:t>
+      </w:r>
+      <w:proofErr w:type="spellEnd"/>
+      <w:r>
+        <w:t xml:space="preserve"> by Distance to Plane (</w:t>
+      </w:r>
+      <w:r>
+        <w:t>H</w:t>
+      </w:r>
+      <w:r>
+        <w:t>)</w:t>
+      </w:r>
+    </w:p>
+    <w:p>
+      <w:pPr>
+        <w:pStyle w:val="NoSpacing"/>
+      </w:pPr>
+      <w:r>
+        <w:t>Typical Usage</w:t>
+      </w:r>
+      <w:r>
+        <w:tab/>
+      </w:r>
+      <w:r>
+        <w:tab/>
+      </w:r>
+      <w:r>
+        <w:tab/>
+        <w:t>High-Frequency RF</w:t>
+      </w:r>
+      <w:r>
+        <w:tab/>
+      </w:r>
+      <w:r>
+        <w:tab/>
+      </w:r>
+      <w:r>
+        <w:t>General High-Speed Digital</w:t>
+      </w:r>
+    </w:p>
+    <w:p>
+      <w:pPr>
+        <w:pStyle w:val="NoSpacing"/>
+      </w:pPr>
+      <w:proofErr w:type="spellStart"/>
+      <w:r>
+        <w:t>KiCad</w:t>
+      </w:r>
+      <w:proofErr w:type="spellEnd"/>
+      <w:r>
+        <w:t xml:space="preserve"> Calculator</w:t>
+      </w:r>
+      <w:r>
+        <w:tab/>
+      </w:r>
+      <w:r>
+        <w:tab/>
+      </w:r>
+      <w:r>
+        <w:t>"Coplanar Waveguide"</w:t>
+      </w:r>
+      <w:r>
+        <w:tab/>
+        <w:t>"Microstrip" or "</w:t>
+      </w:r>
+      <w:proofErr w:type="spellStart"/>
+      <w:r>
+        <w:t>Stripline</w:t>
+      </w:r>
+      <w:proofErr w:type="spellEnd"/>
+      <w:r>
+        <w:t>"</w:t>
+      </w:r>
+      <w:r>
+        <w:br w:type="page"/>
+      </w:r>
+    </w:p>
+    <w:p>
+      <w:pPr>
         <w:pStyle w:val="NoSpacing"/>
         <w:rPr>
           <w:lang w:val="nl-NL"/>
@@ -979,13 +1835,13 @@
         </w:rPr>
         <w:lastRenderedPageBreak/>
         <w:drawing>
-          <wp:anchor distT="0" distB="0" distL="114300" distR="114300" simplePos="0" relativeHeight="251658240" behindDoc="0" locked="0" layoutInCell="1" allowOverlap="1" wp14:anchorId="01550FC1" wp14:editId="6C3E9048">
+          <wp:anchor distT="0" distB="0" distL="114300" distR="114300" simplePos="0" relativeHeight="251658240" behindDoc="0" locked="0" layoutInCell="1" allowOverlap="1" wp14:anchorId="01550FC1" wp14:editId="3F770860">
             <wp:simplePos x="0" y="0"/>
             <wp:positionH relativeFrom="column">
-              <wp:posOffset>1206280</wp:posOffset>
+              <wp:posOffset>1171786</wp:posOffset>
             </wp:positionH>
             <wp:positionV relativeFrom="paragraph">
-              <wp:posOffset>-802529</wp:posOffset>
+              <wp:posOffset>-693208</wp:posOffset>
             </wp:positionV>
             <wp:extent cx="1000125" cy="1424420"/>
             <wp:effectExtent l="0" t="0" r="0" b="4445"/>
@@ -1004,7 +1860,7 @@
                     </pic:cNvPicPr>
                   </pic:nvPicPr>
                   <pic:blipFill>
-                    <a:blip r:embed="rId6" cstate="print">
+                    <a:blip r:embed="rId7" cstate="print">
                       <a:extLst>
                         <a:ext uri="{28A0092B-C50C-407E-A947-70E740481C1C}">
                           <a14:useLocalDpi xmlns:a14="http://schemas.microsoft.com/office/drawing/2010/main" val="0"/>
@@ -1335,7 +2191,7 @@
       <w:pPr>
         <w:pStyle w:val="NoSpacing"/>
       </w:pPr>
-      <w:hyperlink r:id="rId7" w:history="1">
+      <w:hyperlink r:id="rId8" w:history="1">
         <w:r>
           <w:rPr>
             <w:rStyle w:val="Hyperlink"/>
@@ -1348,7 +2204,7 @@
       <w:pPr>
         <w:pStyle w:val="NoSpacing"/>
       </w:pPr>
-      <w:hyperlink r:id="rId8" w:history="1">
+      <w:hyperlink r:id="rId9" w:history="1">
         <w:r>
           <w:rPr>
             <w:rStyle w:val="Hyperlink"/>
@@ -1472,7 +2328,7 @@
                     </pic:cNvPicPr>
                   </pic:nvPicPr>
                   <pic:blipFill rotWithShape="1">
-                    <a:blip r:embed="rId9">
+                    <a:blip r:embed="rId10">
                       <a:extLst>
                         <a:ext uri="{28A0092B-C50C-407E-A947-70E740481C1C}">
                           <a14:useLocalDpi xmlns:a14="http://schemas.microsoft.com/office/drawing/2010/main" val="0"/>
@@ -3174,14 +4030,6 @@
     </w:p>
     <w:p>
       <w:pPr>
-        <w:pStyle w:val="NoSpacing"/>
-        <w:rPr>
-          <w:lang w:val="nl-NL"/>
-        </w:rPr>
-      </w:pPr>
-    </w:p>
-    <w:p>
-      <w:pPr>
         <w:pStyle w:val="Heading3"/>
       </w:pPr>
       <w:bookmarkStart w:id="1" w:name="_Toc223434584"/>
@@ -3197,7 +4045,7 @@
           <w:lang w:val="nl-NL"/>
         </w:rPr>
       </w:pPr>
-      <w:hyperlink r:id="rId10" w:history="1">
+      <w:hyperlink r:id="rId11" w:history="1">
         <w:r>
           <w:rPr>
             <w:rStyle w:val="Hyperlink"/>
@@ -3220,7 +4068,7 @@
           <w:lang w:val="nl-NL"/>
         </w:rPr>
       </w:pPr>
-      <w:hyperlink r:id="rId11" w:history="1">
+      <w:hyperlink r:id="rId12" w:history="1">
         <w:r>
           <w:rPr>
             <w:rStyle w:val="Hyperlink"/>
@@ -3249,17 +4097,710 @@
         <w:pStyle w:val="NoSpacing"/>
       </w:pPr>
       <w:bookmarkStart w:id="2" w:name="_Toc223434585"/>
+      <w:bookmarkStart w:id="3" w:name="_Toc223434587"/>
       <w:r>
         <w:rPr>
           <w:rStyle w:val="Heading3Char"/>
         </w:rPr>
+        <w:t>USB / USB_OTG</w:t>
+      </w:r>
+      <w:bookmarkEnd w:id="3"/>
+      <w:r>
+        <w:t xml:space="preserve"> (</w:t>
+      </w:r>
+      <w:hyperlink r:id="rId13" w:anchor="page=8" w:history="1">
+        <w:r>
+          <w:rPr>
+            <w:rStyle w:val="Hyperlink"/>
+          </w:rPr>
+          <w:t>2.4. USB 2.0 (high speed) datasheet</w:t>
+        </w:r>
+      </w:hyperlink>
+      <w:r>
+        <w:t>)</w:t>
+      </w:r>
+    </w:p>
+    <w:tbl>
+      <w:tblPr>
+        <w:tblStyle w:val="TableGrid"/>
+        <w:tblW w:w="0" w:type="auto"/>
+        <w:tblLook w:val="04A0" w:firstRow="1" w:lastRow="0" w:firstColumn="1" w:lastColumn="0" w:noHBand="0" w:noVBand="1"/>
+      </w:tblPr>
+      <w:tblGrid>
+        <w:gridCol w:w="1696"/>
+        <w:gridCol w:w="1701"/>
+        <w:gridCol w:w="2012"/>
+        <w:gridCol w:w="1803"/>
+        <w:gridCol w:w="1804"/>
+      </w:tblGrid>
+      <w:tr>
+        <w:tc>
+          <w:tcPr>
+            <w:tcW w:w="1696" w:type="dxa"/>
+          </w:tcPr>
+          <w:p>
+            <w:pPr>
+              <w:pStyle w:val="NoSpacing"/>
+              <w:rPr>
+                <w:b/>
+                <w:bCs/>
+                <w:lang w:val="nl-NL"/>
+              </w:rPr>
+            </w:pPr>
+            <w:r>
+              <w:rPr>
+                <w:b/>
+                <w:bCs/>
+                <w:lang w:val="nl-NL"/>
+              </w:rPr>
+              <w:t>Name</w:t>
+            </w:r>
+          </w:p>
+        </w:tc>
+        <w:tc>
+          <w:tcPr>
+            <w:tcW w:w="1701" w:type="dxa"/>
+          </w:tcPr>
+          <w:p>
+            <w:pPr>
+              <w:pStyle w:val="NoSpacing"/>
+              <w:rPr>
+                <w:b/>
+                <w:bCs/>
+                <w:lang w:val="nl-NL"/>
+              </w:rPr>
+            </w:pPr>
+            <w:r>
+              <w:rPr>
+                <w:b/>
+                <w:bCs/>
+                <w:lang w:val="nl-NL"/>
+              </w:rPr>
+              <w:t>Pin (CM4)</w:t>
+            </w:r>
+          </w:p>
+        </w:tc>
+        <w:tc>
+          <w:tcPr>
+            <w:tcW w:w="2012" w:type="dxa"/>
+          </w:tcPr>
+          <w:p>
+            <w:pPr>
+              <w:pStyle w:val="NoSpacing"/>
+              <w:rPr>
+                <w:b/>
+                <w:bCs/>
+                <w:lang w:val="nl-NL"/>
+              </w:rPr>
+            </w:pPr>
+            <w:r>
+              <w:rPr>
+                <w:b/>
+                <w:bCs/>
+                <w:lang w:val="nl-NL"/>
+              </w:rPr>
+              <w:t>Pin (connector)</w:t>
+            </w:r>
+          </w:p>
+        </w:tc>
+        <w:tc>
+          <w:tcPr>
+            <w:tcW w:w="1803" w:type="dxa"/>
+          </w:tcPr>
+          <w:p>
+            <w:pPr>
+              <w:pStyle w:val="NoSpacing"/>
+              <w:rPr>
+                <w:lang w:val="nl-NL"/>
+              </w:rPr>
+            </w:pPr>
+            <w:r>
+              <w:rPr>
+                <w:b/>
+                <w:bCs/>
+                <w:lang w:val="nl-NL"/>
+              </w:rPr>
+              <w:t>Function</w:t>
+            </w:r>
+          </w:p>
+        </w:tc>
+        <w:tc>
+          <w:tcPr>
+            <w:tcW w:w="1804" w:type="dxa"/>
+          </w:tcPr>
+          <w:p>
+            <w:pPr>
+              <w:pStyle w:val="NoSpacing"/>
+              <w:rPr>
+                <w:lang w:val="nl-NL"/>
+              </w:rPr>
+            </w:pPr>
+          </w:p>
+        </w:tc>
+      </w:tr>
+      <w:tr>
+        <w:tc>
+          <w:tcPr>
+            <w:tcW w:w="1696" w:type="dxa"/>
+          </w:tcPr>
+          <w:p>
+            <w:pPr>
+              <w:pStyle w:val="NoSpacing"/>
+              <w:rPr>
+                <w:lang w:val="nl-NL"/>
+              </w:rPr>
+            </w:pPr>
+            <w:r>
+              <w:rPr>
+                <w:lang w:val="nl-NL"/>
+              </w:rPr>
+              <w:t>USB_OTG_ID</w:t>
+            </w:r>
+          </w:p>
+        </w:tc>
+        <w:tc>
+          <w:tcPr>
+            <w:tcW w:w="1701" w:type="dxa"/>
+          </w:tcPr>
+          <w:p>
+            <w:pPr>
+              <w:pStyle w:val="NoSpacing"/>
+              <w:rPr>
+                <w:lang w:val="nl-NL"/>
+              </w:rPr>
+            </w:pPr>
+            <w:r>
+              <w:rPr>
+                <w:lang w:val="nl-NL"/>
+              </w:rPr>
+              <w:t>101</w:t>
+            </w:r>
+          </w:p>
+        </w:tc>
+        <w:tc>
+          <w:tcPr>
+            <w:tcW w:w="2012" w:type="dxa"/>
+          </w:tcPr>
+          <w:p>
+            <w:pPr>
+              <w:pStyle w:val="NoSpacing"/>
+              <w:rPr>
+                <w:lang w:val="nl-NL"/>
+              </w:rPr>
+            </w:pPr>
+          </w:p>
+        </w:tc>
+        <w:tc>
+          <w:tcPr>
+            <w:tcW w:w="1803" w:type="dxa"/>
+          </w:tcPr>
+          <w:p>
+            <w:pPr>
+              <w:pStyle w:val="NoSpacing"/>
+              <w:rPr>
+                <w:lang w:val="nl-NL"/>
+              </w:rPr>
+            </w:pPr>
+          </w:p>
+        </w:tc>
+        <w:tc>
+          <w:tcPr>
+            <w:tcW w:w="1804" w:type="dxa"/>
+          </w:tcPr>
+          <w:p>
+            <w:pPr>
+              <w:pStyle w:val="NoSpacing"/>
+              <w:rPr>
+                <w:lang w:val="nl-NL"/>
+              </w:rPr>
+            </w:pPr>
+          </w:p>
+        </w:tc>
+      </w:tr>
+      <w:tr>
+        <w:tc>
+          <w:tcPr>
+            <w:tcW w:w="1696" w:type="dxa"/>
+          </w:tcPr>
+          <w:p>
+            <w:pPr>
+              <w:pStyle w:val="NoSpacing"/>
+              <w:rPr>
+                <w:lang w:val="nl-NL"/>
+              </w:rPr>
+            </w:pPr>
+            <w:r>
+              <w:rPr>
+                <w:lang w:val="nl-NL"/>
+              </w:rPr>
+              <w:t>USBD-</w:t>
+            </w:r>
+          </w:p>
+        </w:tc>
+        <w:tc>
+          <w:tcPr>
+            <w:tcW w:w="1701" w:type="dxa"/>
+          </w:tcPr>
+          <w:p>
+            <w:pPr>
+              <w:pStyle w:val="NoSpacing"/>
+              <w:rPr>
+                <w:lang w:val="nl-NL"/>
+              </w:rPr>
+            </w:pPr>
+            <w:r>
+              <w:rPr>
+                <w:lang w:val="nl-NL"/>
+              </w:rPr>
+              <w:t>104</w:t>
+            </w:r>
+          </w:p>
+        </w:tc>
+        <w:tc>
+          <w:tcPr>
+            <w:tcW w:w="2012" w:type="dxa"/>
+          </w:tcPr>
+          <w:p>
+            <w:pPr>
+              <w:pStyle w:val="NoSpacing"/>
+              <w:rPr>
+                <w:lang w:val="nl-NL"/>
+              </w:rPr>
+            </w:pPr>
+          </w:p>
+        </w:tc>
+        <w:tc>
+          <w:tcPr>
+            <w:tcW w:w="1803" w:type="dxa"/>
+          </w:tcPr>
+          <w:p>
+            <w:pPr>
+              <w:pStyle w:val="NoSpacing"/>
+              <w:rPr>
+                <w:lang w:val="nl-NL"/>
+              </w:rPr>
+            </w:pPr>
+          </w:p>
+        </w:tc>
+        <w:tc>
+          <w:tcPr>
+            <w:tcW w:w="1804" w:type="dxa"/>
+          </w:tcPr>
+          <w:p>
+            <w:pPr>
+              <w:pStyle w:val="NoSpacing"/>
+              <w:rPr>
+                <w:lang w:val="nl-NL"/>
+              </w:rPr>
+            </w:pPr>
+          </w:p>
+        </w:tc>
+      </w:tr>
+      <w:tr>
+        <w:tc>
+          <w:tcPr>
+            <w:tcW w:w="1696" w:type="dxa"/>
+          </w:tcPr>
+          <w:p>
+            <w:pPr>
+              <w:pStyle w:val="NoSpacing"/>
+              <w:rPr>
+                <w:lang w:val="nl-NL"/>
+              </w:rPr>
+            </w:pPr>
+            <w:r>
+              <w:rPr>
+                <w:lang w:val="nl-NL"/>
+              </w:rPr>
+              <w:t>USBD+</w:t>
+            </w:r>
+          </w:p>
+        </w:tc>
+        <w:tc>
+          <w:tcPr>
+            <w:tcW w:w="1701" w:type="dxa"/>
+          </w:tcPr>
+          <w:p>
+            <w:pPr>
+              <w:pStyle w:val="NoSpacing"/>
+              <w:rPr>
+                <w:lang w:val="nl-NL"/>
+              </w:rPr>
+            </w:pPr>
+            <w:r>
+              <w:rPr>
+                <w:lang w:val="nl-NL"/>
+              </w:rPr>
+              <w:t>105</w:t>
+            </w:r>
+          </w:p>
+        </w:tc>
+        <w:tc>
+          <w:tcPr>
+            <w:tcW w:w="2012" w:type="dxa"/>
+          </w:tcPr>
+          <w:p>
+            <w:pPr>
+              <w:pStyle w:val="NoSpacing"/>
+              <w:rPr>
+                <w:lang w:val="nl-NL"/>
+              </w:rPr>
+            </w:pPr>
+          </w:p>
+        </w:tc>
+        <w:tc>
+          <w:tcPr>
+            <w:tcW w:w="1803" w:type="dxa"/>
+          </w:tcPr>
+          <w:p>
+            <w:pPr>
+              <w:pStyle w:val="NoSpacing"/>
+              <w:rPr>
+                <w:lang w:val="nl-NL"/>
+              </w:rPr>
+            </w:pPr>
+          </w:p>
+        </w:tc>
+        <w:tc>
+          <w:tcPr>
+            <w:tcW w:w="1804" w:type="dxa"/>
+          </w:tcPr>
+          <w:p>
+            <w:pPr>
+              <w:pStyle w:val="NoSpacing"/>
+              <w:rPr>
+                <w:lang w:val="nl-NL"/>
+              </w:rPr>
+            </w:pPr>
+          </w:p>
+        </w:tc>
+      </w:tr>
+      <w:tr>
+        <w:tc>
+          <w:tcPr>
+            <w:tcW w:w="1696" w:type="dxa"/>
+          </w:tcPr>
+          <w:p>
+            <w:pPr>
+              <w:pStyle w:val="NoSpacing"/>
+              <w:rPr>
+                <w:lang w:val="nl-NL"/>
+              </w:rPr>
+            </w:pPr>
+            <w:r>
+              <w:rPr>
+                <w:lang w:val="nl-NL"/>
+              </w:rPr>
+              <w:t>+5v</w:t>
+            </w:r>
+          </w:p>
+        </w:tc>
+        <w:tc>
+          <w:tcPr>
+            <w:tcW w:w="1701" w:type="dxa"/>
+          </w:tcPr>
+          <w:p>
+            <w:pPr>
+              <w:pStyle w:val="NoSpacing"/>
+              <w:rPr>
+                <w:lang w:val="nl-NL"/>
+              </w:rPr>
+            </w:pPr>
+            <w:r>
+              <w:rPr>
+                <w:lang w:val="nl-NL"/>
+              </w:rPr>
+              <w:t>-</w:t>
+            </w:r>
+          </w:p>
+        </w:tc>
+        <w:tc>
+          <w:tcPr>
+            <w:tcW w:w="2012" w:type="dxa"/>
+          </w:tcPr>
+          <w:p>
+            <w:pPr>
+              <w:pStyle w:val="NoSpacing"/>
+              <w:rPr>
+                <w:lang w:val="nl-NL"/>
+              </w:rPr>
+            </w:pPr>
+          </w:p>
+        </w:tc>
+        <w:tc>
+          <w:tcPr>
+            <w:tcW w:w="1803" w:type="dxa"/>
+          </w:tcPr>
+          <w:p>
+            <w:pPr>
+              <w:pStyle w:val="NoSpacing"/>
+              <w:rPr>
+                <w:lang w:val="nl-NL"/>
+              </w:rPr>
+            </w:pPr>
+          </w:p>
+        </w:tc>
+        <w:tc>
+          <w:tcPr>
+            <w:tcW w:w="1804" w:type="dxa"/>
+          </w:tcPr>
+          <w:p>
+            <w:pPr>
+              <w:pStyle w:val="NoSpacing"/>
+              <w:rPr>
+                <w:lang w:val="nl-NL"/>
+              </w:rPr>
+            </w:pPr>
+          </w:p>
+        </w:tc>
+      </w:tr>
+      <w:tr>
+        <w:tc>
+          <w:tcPr>
+            <w:tcW w:w="1696" w:type="dxa"/>
+          </w:tcPr>
+          <w:p>
+            <w:pPr>
+              <w:pStyle w:val="NoSpacing"/>
+              <w:rPr>
+                <w:lang w:val="nl-NL"/>
+              </w:rPr>
+            </w:pPr>
+            <w:r>
+              <w:rPr>
+                <w:lang w:val="nl-NL"/>
+              </w:rPr>
+              <w:t>GND</w:t>
+            </w:r>
+          </w:p>
+        </w:tc>
+        <w:tc>
+          <w:tcPr>
+            <w:tcW w:w="1701" w:type="dxa"/>
+          </w:tcPr>
+          <w:p>
+            <w:pPr>
+              <w:pStyle w:val="NoSpacing"/>
+              <w:rPr>
+                <w:lang w:val="nl-NL"/>
+              </w:rPr>
+            </w:pPr>
+            <w:r>
+              <w:rPr>
+                <w:lang w:val="nl-NL"/>
+              </w:rPr>
+              <w:t>-</w:t>
+            </w:r>
+          </w:p>
+        </w:tc>
+        <w:tc>
+          <w:tcPr>
+            <w:tcW w:w="2012" w:type="dxa"/>
+          </w:tcPr>
+          <w:p>
+            <w:pPr>
+              <w:pStyle w:val="NoSpacing"/>
+              <w:rPr>
+                <w:lang w:val="nl-NL"/>
+              </w:rPr>
+            </w:pPr>
+            <w:r>
+              <w:rPr>
+                <w:lang w:val="nl-NL"/>
+              </w:rPr>
+              <w:tab/>
+            </w:r>
+          </w:p>
+        </w:tc>
+        <w:tc>
+          <w:tcPr>
+            <w:tcW w:w="1803" w:type="dxa"/>
+          </w:tcPr>
+          <w:p>
+            <w:pPr>
+              <w:pStyle w:val="NoSpacing"/>
+              <w:rPr>
+                <w:lang w:val="nl-NL"/>
+              </w:rPr>
+            </w:pPr>
+          </w:p>
+        </w:tc>
+        <w:tc>
+          <w:tcPr>
+            <w:tcW w:w="1804" w:type="dxa"/>
+          </w:tcPr>
+          <w:p>
+            <w:pPr>
+              <w:pStyle w:val="NoSpacing"/>
+              <w:rPr>
+                <w:lang w:val="nl-NL"/>
+              </w:rPr>
+            </w:pPr>
+          </w:p>
+        </w:tc>
+      </w:tr>
+    </w:tbl>
+    <w:p>
+      <w:pPr>
+        <w:pStyle w:val="NoSpacing"/>
+      </w:pPr>
+      <w:r>
+        <w:t>Short Pin #4 to Pin #5 (ID/Sense to GND) for OTG</w:t>
+      </w:r>
+    </w:p>
+    <w:p>
+      <w:pPr>
+        <w:rPr>
+          <w:rStyle w:val="Heading3Char"/>
+          <w:lang w:val="en-GB"/>
+        </w:rPr>
+      </w:pPr>
+      <w:r>
+        <w:rPr>
+          <w:noProof/>
+        </w:rPr>
+        <w:drawing>
+          <wp:inline distT="0" distB="0" distL="0" distR="0" wp14:anchorId="2BEC65E6" wp14:editId="09ADD8F8">
+            <wp:extent cx="1645920" cy="1053203"/>
+            <wp:effectExtent l="0" t="0" r="0" b="0"/>
+            <wp:docPr id="1496846373" name="Picture 3" descr="USB 3.0 Information"/>
+            <wp:cNvGraphicFramePr>
+              <a:graphicFrameLocks xmlns:a="http://schemas.openxmlformats.org/drawingml/2006/main" noChangeAspect="1"/>
+            </wp:cNvGraphicFramePr>
+            <a:graphic xmlns:a="http://schemas.openxmlformats.org/drawingml/2006/main">
+              <a:graphicData uri="http://schemas.openxmlformats.org/drawingml/2006/picture">
+                <pic:pic xmlns:pic="http://schemas.openxmlformats.org/drawingml/2006/picture">
+                  <pic:nvPicPr>
+                    <pic:cNvPr id="0" name="Picture 5" descr="USB 3.0 Information"/>
+                    <pic:cNvPicPr>
+                      <a:picLocks noChangeAspect="1" noChangeArrowheads="1"/>
+                    </pic:cNvPicPr>
+                  </pic:nvPicPr>
+                  <pic:blipFill rotWithShape="1">
+                    <a:blip r:embed="rId14">
+                      <a:extLst>
+                        <a:ext uri="{28A0092B-C50C-407E-A947-70E740481C1C}">
+                          <a14:useLocalDpi xmlns:a14="http://schemas.microsoft.com/office/drawing/2010/main" val="0"/>
+                        </a:ext>
+                      </a:extLst>
+                    </a:blip>
+                    <a:srcRect l="14196" t="6442" r="5154" b="24903"/>
+                    <a:stretch>
+                      <a:fillRect/>
+                    </a:stretch>
+                  </pic:blipFill>
+                  <pic:spPr bwMode="auto">
+                    <a:xfrm>
+                      <a:off x="0" y="0"/>
+                      <a:ext cx="1653199" cy="1057861"/>
+                    </a:xfrm>
+                    <a:prstGeom prst="rect">
+                      <a:avLst/>
+                    </a:prstGeom>
+                    <a:noFill/>
+                    <a:ln>
+                      <a:noFill/>
+                    </a:ln>
+                    <a:extLst>
+                      <a:ext uri="{53640926-AAD7-44D8-BBD7-CCE9431645EC}">
+                        <a14:shadowObscured xmlns:a14="http://schemas.microsoft.com/office/drawing/2010/main"/>
+                      </a:ext>
+                    </a:extLst>
+                  </pic:spPr>
+                </pic:pic>
+              </a:graphicData>
+            </a:graphic>
+          </wp:inline>
+        </w:drawing>
+      </w:r>
+      <w:r>
+        <w:rPr>
+          <w:noProof/>
+        </w:rPr>
+        <w:t xml:space="preserve"> </w:t>
+      </w:r>
+      <w:r>
+        <w:rPr>
+          <w:noProof/>
+        </w:rPr>
+        <w:drawing>
+          <wp:inline distT="0" distB="0" distL="0" distR="0" wp14:anchorId="3CE9DA6B" wp14:editId="72359269">
+            <wp:extent cx="1097280" cy="1222749"/>
+            <wp:effectExtent l="0" t="0" r="7620" b="0"/>
+            <wp:docPr id="958528632" name="Picture 4" descr="What is Micro USB OTG (On-The-Go)? Build DIY OTG Cable"/>
+            <wp:cNvGraphicFramePr>
+              <a:graphicFrameLocks xmlns:a="http://schemas.openxmlformats.org/drawingml/2006/main" noChangeAspect="1"/>
+            </wp:cNvGraphicFramePr>
+            <a:graphic xmlns:a="http://schemas.openxmlformats.org/drawingml/2006/main">
+              <a:graphicData uri="http://schemas.openxmlformats.org/drawingml/2006/picture">
+                <pic:pic xmlns:pic="http://schemas.openxmlformats.org/drawingml/2006/picture">
+                  <pic:nvPicPr>
+                    <pic:cNvPr id="0" name="Picture 7" descr="What is Micro USB OTG (On-The-Go)? Build DIY OTG Cable"/>
+                    <pic:cNvPicPr>
+                      <a:picLocks noChangeAspect="1" noChangeArrowheads="1"/>
+                    </pic:cNvPicPr>
+                  </pic:nvPicPr>
+                  <pic:blipFill rotWithShape="1">
+                    <a:blip r:embed="rId15" cstate="print">
+                      <a:extLst>
+                        <a:ext uri="{28A0092B-C50C-407E-A947-70E740481C1C}">
+                          <a14:useLocalDpi xmlns:a14="http://schemas.microsoft.com/office/drawing/2010/main" val="0"/>
+                        </a:ext>
+                      </a:extLst>
+                    </a:blip>
+                    <a:srcRect l="37569" t="14927" r="41198" b="43016"/>
+                    <a:stretch>
+                      <a:fillRect/>
+                    </a:stretch>
+                  </pic:blipFill>
+                  <pic:spPr bwMode="auto">
+                    <a:xfrm>
+                      <a:off x="0" y="0"/>
+                      <a:ext cx="1123205" cy="1251639"/>
+                    </a:xfrm>
+                    <a:prstGeom prst="rect">
+                      <a:avLst/>
+                    </a:prstGeom>
+                    <a:noFill/>
+                    <a:ln>
+                      <a:noFill/>
+                    </a:ln>
+                    <a:extLst>
+                      <a:ext uri="{53640926-AAD7-44D8-BBD7-CCE9431645EC}">
+                        <a14:shadowObscured xmlns:a14="http://schemas.microsoft.com/office/drawing/2010/main"/>
+                      </a:ext>
+                    </a:extLst>
+                  </pic:spPr>
+                </pic:pic>
+              </a:graphicData>
+            </a:graphic>
+          </wp:inline>
+        </w:drawing>
+      </w:r>
+      <w:r>
+        <w:rPr>
+          <w:rStyle w:val="Heading3Char"/>
+          <w:lang w:val="en-GB"/>
+        </w:rPr>
+        <w:br w:type="page"/>
+      </w:r>
+    </w:p>
+    <w:p>
+      <w:pPr>
+        <w:pStyle w:val="NoSpacing"/>
+      </w:pPr>
+      <w:r>
+        <w:rPr>
+          <w:rStyle w:val="Heading3Char"/>
+        </w:rPr>
+        <w:lastRenderedPageBreak/>
         <w:t>HDMI</w:t>
       </w:r>
       <w:bookmarkEnd w:id="2"/>
       <w:r>
         <w:t xml:space="preserve"> </w:t>
       </w:r>
-      <w:hyperlink r:id="rId12" w:anchor="page=11" w:history="1">
+      <w:hyperlink r:id="rId16" w:anchor="page=11" w:history="1">
         <w:r>
           <w:rPr>
             <w:rStyle w:val="Hyperlink"/>
@@ -4481,7 +6022,6 @@
               <w:rPr>
                 <w:lang w:val="nl-NL"/>
               </w:rPr>
-              <w:lastRenderedPageBreak/>
               <w:t>HDMI</w:t>
             </w:r>
             <w:r>
@@ -4740,7 +6280,7 @@
           <w:noProof/>
         </w:rPr>
         <w:drawing>
-          <wp:inline distT="0" distB="0" distL="0" distR="0" wp14:anchorId="2020065A" wp14:editId="4EF131C3">
+          <wp:inline distT="0" distB="0" distL="0" distR="0" wp14:anchorId="2020065A" wp14:editId="5E5B5E17">
             <wp:extent cx="2719346" cy="2008025"/>
             <wp:effectExtent l="0" t="0" r="5080" b="0"/>
             <wp:docPr id="619101385" name="Picture 1" descr="Does HDMI 2.0 Support 1080p 120Hz? Addressing HDMI Questions ..."/>
@@ -4757,7 +6297,7 @@
                     </pic:cNvPicPr>
                   </pic:nvPicPr>
                   <pic:blipFill>
-                    <a:blip r:embed="rId13" cstate="print">
+                    <a:blip r:embed="rId17" cstate="print">
                       <a:extLst>
                         <a:ext uri="{28A0092B-C50C-407E-A947-70E740481C1C}">
                           <a14:useLocalDpi xmlns:a14="http://schemas.microsoft.com/office/drawing/2010/main" val="0"/>
@@ -4804,7 +6344,7 @@
           <w:lang w:val="nl-NL"/>
         </w:rPr>
       </w:pPr>
-      <w:bookmarkStart w:id="3" w:name="_Toc223434586"/>
+      <w:bookmarkStart w:id="4" w:name="_Toc223434586"/>
       <w:r>
         <w:rPr>
           <w:rStyle w:val="Heading3Char"/>
@@ -4812,14 +6352,14 @@
         </w:rPr>
         <w:t>NVME</w:t>
       </w:r>
-      <w:bookmarkEnd w:id="3"/>
+      <w:bookmarkEnd w:id="4"/>
       <w:r>
         <w:rPr>
           <w:lang w:val="nl-NL"/>
         </w:rPr>
         <w:t xml:space="preserve"> (</w:t>
       </w:r>
-      <w:hyperlink r:id="rId14" w:anchor="page=7" w:history="1">
+      <w:hyperlink r:id="rId18" w:anchor="page=7" w:history="1">
         <w:r>
           <w:rPr>
             <w:rStyle w:val="Hyperlink"/>
@@ -4891,7 +6431,7 @@
       <w:pPr>
         <w:pStyle w:val="NoSpacing"/>
       </w:pPr>
-      <w:hyperlink r:id="rId15" w:anchor="page=12" w:history="1">
+      <w:hyperlink r:id="rId19" w:anchor="page=12" w:history="1">
         <w:r>
           <w:rPr>
             <w:rStyle w:val="Hyperlink"/>
@@ -5924,6 +7464,7 @@
               <w:rPr>
                 <w:lang w:val="nl-NL"/>
               </w:rPr>
+              <w:lastRenderedPageBreak/>
               <w:t>PETn0</w:t>
             </w:r>
           </w:p>
@@ -6927,7 +8468,6 @@
               <w:rPr>
                 <w:lang w:val="nl-NL"/>
               </w:rPr>
-              <w:lastRenderedPageBreak/>
               <w:t>PEDET</w:t>
             </w:r>
           </w:p>
@@ -7384,7 +8924,7 @@
                     <pic:cNvPicPr/>
                   </pic:nvPicPr>
                   <pic:blipFill>
-                    <a:blip r:embed="rId16"/>
+                    <a:blip r:embed="rId20"/>
                     <a:stretch>
                       <a:fillRect/>
                     </a:stretch>
@@ -7421,556 +8961,12 @@
     <w:p>
       <w:pPr>
         <w:pStyle w:val="NoSpacing"/>
-      </w:pPr>
-      <w:bookmarkStart w:id="4" w:name="_Toc223434587"/>
-      <w:r>
-        <w:rPr>
-          <w:rStyle w:val="Heading3Char"/>
-        </w:rPr>
-        <w:t>USB / USB_OTG</w:t>
-      </w:r>
-      <w:bookmarkEnd w:id="4"/>
-      <w:r>
-        <w:t xml:space="preserve"> (</w:t>
-      </w:r>
-      <w:hyperlink r:id="rId17" w:anchor="page=8" w:history="1">
-        <w:r>
-          <w:rPr>
-            <w:rStyle w:val="Hyperlink"/>
-          </w:rPr>
-          <w:t>2.4. USB 2.0 (high speed) datasheet</w:t>
-        </w:r>
-      </w:hyperlink>
-      <w:r>
-        <w:t>)</w:t>
-      </w:r>
-    </w:p>
-    <w:tbl>
-      <w:tblPr>
-        <w:tblStyle w:val="TableGrid"/>
-        <w:tblW w:w="0" w:type="auto"/>
-        <w:tblLook w:val="04A0" w:firstRow="1" w:lastRow="0" w:firstColumn="1" w:lastColumn="0" w:noHBand="0" w:noVBand="1"/>
-      </w:tblPr>
-      <w:tblGrid>
-        <w:gridCol w:w="1696"/>
-        <w:gridCol w:w="1701"/>
-        <w:gridCol w:w="2012"/>
-        <w:gridCol w:w="1803"/>
-        <w:gridCol w:w="1804"/>
-      </w:tblGrid>
-      <w:tr>
-        <w:tc>
-          <w:tcPr>
-            <w:tcW w:w="1696" w:type="dxa"/>
-          </w:tcPr>
-          <w:p>
-            <w:pPr>
-              <w:pStyle w:val="NoSpacing"/>
-              <w:rPr>
-                <w:b/>
-                <w:bCs/>
-                <w:lang w:val="nl-NL"/>
-              </w:rPr>
-            </w:pPr>
-            <w:r>
-              <w:rPr>
-                <w:b/>
-                <w:bCs/>
-                <w:lang w:val="nl-NL"/>
-              </w:rPr>
-              <w:t>Name</w:t>
-            </w:r>
-          </w:p>
-        </w:tc>
-        <w:tc>
-          <w:tcPr>
-            <w:tcW w:w="1701" w:type="dxa"/>
-          </w:tcPr>
-          <w:p>
-            <w:pPr>
-              <w:pStyle w:val="NoSpacing"/>
-              <w:rPr>
-                <w:b/>
-                <w:bCs/>
-                <w:lang w:val="nl-NL"/>
-              </w:rPr>
-            </w:pPr>
-            <w:r>
-              <w:rPr>
-                <w:b/>
-                <w:bCs/>
-                <w:lang w:val="nl-NL"/>
-              </w:rPr>
-              <w:t>Pin (CM4)</w:t>
-            </w:r>
-          </w:p>
-        </w:tc>
-        <w:tc>
-          <w:tcPr>
-            <w:tcW w:w="2012" w:type="dxa"/>
-          </w:tcPr>
-          <w:p>
-            <w:pPr>
-              <w:pStyle w:val="NoSpacing"/>
-              <w:rPr>
-                <w:b/>
-                <w:bCs/>
-                <w:lang w:val="nl-NL"/>
-              </w:rPr>
-            </w:pPr>
-            <w:r>
-              <w:rPr>
-                <w:b/>
-                <w:bCs/>
-                <w:lang w:val="nl-NL"/>
-              </w:rPr>
-              <w:t>Pin (connector)</w:t>
-            </w:r>
-          </w:p>
-        </w:tc>
-        <w:tc>
-          <w:tcPr>
-            <w:tcW w:w="1803" w:type="dxa"/>
-          </w:tcPr>
-          <w:p>
-            <w:pPr>
-              <w:pStyle w:val="NoSpacing"/>
-              <w:rPr>
-                <w:lang w:val="nl-NL"/>
-              </w:rPr>
-            </w:pPr>
-            <w:r>
-              <w:rPr>
-                <w:b/>
-                <w:bCs/>
-                <w:lang w:val="nl-NL"/>
-              </w:rPr>
-              <w:t>Function</w:t>
-            </w:r>
-          </w:p>
-        </w:tc>
-        <w:tc>
-          <w:tcPr>
-            <w:tcW w:w="1804" w:type="dxa"/>
-          </w:tcPr>
-          <w:p>
-            <w:pPr>
-              <w:pStyle w:val="NoSpacing"/>
-              <w:rPr>
-                <w:lang w:val="nl-NL"/>
-              </w:rPr>
-            </w:pPr>
-          </w:p>
-        </w:tc>
-      </w:tr>
-      <w:tr>
-        <w:tc>
-          <w:tcPr>
-            <w:tcW w:w="1696" w:type="dxa"/>
-          </w:tcPr>
-          <w:p>
-            <w:pPr>
-              <w:pStyle w:val="NoSpacing"/>
-              <w:rPr>
-                <w:lang w:val="nl-NL"/>
-              </w:rPr>
-            </w:pPr>
-            <w:r>
-              <w:rPr>
-                <w:lang w:val="nl-NL"/>
-              </w:rPr>
-              <w:t>USB_OTG_ID</w:t>
-            </w:r>
-          </w:p>
-        </w:tc>
-        <w:tc>
-          <w:tcPr>
-            <w:tcW w:w="1701" w:type="dxa"/>
-          </w:tcPr>
-          <w:p>
-            <w:pPr>
-              <w:pStyle w:val="NoSpacing"/>
-              <w:rPr>
-                <w:lang w:val="nl-NL"/>
-              </w:rPr>
-            </w:pPr>
-            <w:r>
-              <w:rPr>
-                <w:lang w:val="nl-NL"/>
-              </w:rPr>
-              <w:t>101</w:t>
-            </w:r>
-          </w:p>
-        </w:tc>
-        <w:tc>
-          <w:tcPr>
-            <w:tcW w:w="2012" w:type="dxa"/>
-          </w:tcPr>
-          <w:p>
-            <w:pPr>
-              <w:pStyle w:val="NoSpacing"/>
-              <w:rPr>
-                <w:lang w:val="nl-NL"/>
-              </w:rPr>
-            </w:pPr>
-          </w:p>
-        </w:tc>
-        <w:tc>
-          <w:tcPr>
-            <w:tcW w:w="1803" w:type="dxa"/>
-          </w:tcPr>
-          <w:p>
-            <w:pPr>
-              <w:pStyle w:val="NoSpacing"/>
-              <w:rPr>
-                <w:lang w:val="nl-NL"/>
-              </w:rPr>
-            </w:pPr>
-          </w:p>
-        </w:tc>
-        <w:tc>
-          <w:tcPr>
-            <w:tcW w:w="1804" w:type="dxa"/>
-          </w:tcPr>
-          <w:p>
-            <w:pPr>
-              <w:pStyle w:val="NoSpacing"/>
-              <w:rPr>
-                <w:lang w:val="nl-NL"/>
-              </w:rPr>
-            </w:pPr>
-          </w:p>
-        </w:tc>
-      </w:tr>
-      <w:tr>
-        <w:tc>
-          <w:tcPr>
-            <w:tcW w:w="1696" w:type="dxa"/>
-          </w:tcPr>
-          <w:p>
-            <w:pPr>
-              <w:pStyle w:val="NoSpacing"/>
-              <w:rPr>
-                <w:lang w:val="nl-NL"/>
-              </w:rPr>
-            </w:pPr>
-            <w:r>
-              <w:rPr>
-                <w:lang w:val="nl-NL"/>
-              </w:rPr>
-              <w:t>USBD-</w:t>
-            </w:r>
-          </w:p>
-        </w:tc>
-        <w:tc>
-          <w:tcPr>
-            <w:tcW w:w="1701" w:type="dxa"/>
-          </w:tcPr>
-          <w:p>
-            <w:pPr>
-              <w:pStyle w:val="NoSpacing"/>
-              <w:rPr>
-                <w:lang w:val="nl-NL"/>
-              </w:rPr>
-            </w:pPr>
-            <w:r>
-              <w:rPr>
-                <w:lang w:val="nl-NL"/>
-              </w:rPr>
-              <w:t>104</w:t>
-            </w:r>
-          </w:p>
-        </w:tc>
-        <w:tc>
-          <w:tcPr>
-            <w:tcW w:w="2012" w:type="dxa"/>
-          </w:tcPr>
-          <w:p>
-            <w:pPr>
-              <w:pStyle w:val="NoSpacing"/>
-              <w:rPr>
-                <w:lang w:val="nl-NL"/>
-              </w:rPr>
-            </w:pPr>
-          </w:p>
-        </w:tc>
-        <w:tc>
-          <w:tcPr>
-            <w:tcW w:w="1803" w:type="dxa"/>
-          </w:tcPr>
-          <w:p>
-            <w:pPr>
-              <w:pStyle w:val="NoSpacing"/>
-              <w:rPr>
-                <w:lang w:val="nl-NL"/>
-              </w:rPr>
-            </w:pPr>
-          </w:p>
-        </w:tc>
-        <w:tc>
-          <w:tcPr>
-            <w:tcW w:w="1804" w:type="dxa"/>
-          </w:tcPr>
-          <w:p>
-            <w:pPr>
-              <w:pStyle w:val="NoSpacing"/>
-              <w:rPr>
-                <w:lang w:val="nl-NL"/>
-              </w:rPr>
-            </w:pPr>
-          </w:p>
-        </w:tc>
-      </w:tr>
-      <w:tr>
-        <w:tc>
-          <w:tcPr>
-            <w:tcW w:w="1696" w:type="dxa"/>
-          </w:tcPr>
-          <w:p>
-            <w:pPr>
-              <w:pStyle w:val="NoSpacing"/>
-              <w:rPr>
-                <w:lang w:val="nl-NL"/>
-              </w:rPr>
-            </w:pPr>
-            <w:r>
-              <w:rPr>
-                <w:lang w:val="nl-NL"/>
-              </w:rPr>
-              <w:t>USBD+</w:t>
-            </w:r>
-          </w:p>
-        </w:tc>
-        <w:tc>
-          <w:tcPr>
-            <w:tcW w:w="1701" w:type="dxa"/>
-          </w:tcPr>
-          <w:p>
-            <w:pPr>
-              <w:pStyle w:val="NoSpacing"/>
-              <w:rPr>
-                <w:lang w:val="nl-NL"/>
-              </w:rPr>
-            </w:pPr>
-            <w:r>
-              <w:rPr>
-                <w:lang w:val="nl-NL"/>
-              </w:rPr>
-              <w:t>105</w:t>
-            </w:r>
-          </w:p>
-        </w:tc>
-        <w:tc>
-          <w:tcPr>
-            <w:tcW w:w="2012" w:type="dxa"/>
-          </w:tcPr>
-          <w:p>
-            <w:pPr>
-              <w:pStyle w:val="NoSpacing"/>
-              <w:rPr>
-                <w:lang w:val="nl-NL"/>
-              </w:rPr>
-            </w:pPr>
-          </w:p>
-        </w:tc>
-        <w:tc>
-          <w:tcPr>
-            <w:tcW w:w="1803" w:type="dxa"/>
-          </w:tcPr>
-          <w:p>
-            <w:pPr>
-              <w:pStyle w:val="NoSpacing"/>
-              <w:rPr>
-                <w:lang w:val="nl-NL"/>
-              </w:rPr>
-            </w:pPr>
-          </w:p>
-        </w:tc>
-        <w:tc>
-          <w:tcPr>
-            <w:tcW w:w="1804" w:type="dxa"/>
-          </w:tcPr>
-          <w:p>
-            <w:pPr>
-              <w:pStyle w:val="NoSpacing"/>
-              <w:rPr>
-                <w:lang w:val="nl-NL"/>
-              </w:rPr>
-            </w:pPr>
-          </w:p>
-        </w:tc>
-      </w:tr>
-      <w:tr>
-        <w:tc>
-          <w:tcPr>
-            <w:tcW w:w="1696" w:type="dxa"/>
-          </w:tcPr>
-          <w:p>
-            <w:pPr>
-              <w:pStyle w:val="NoSpacing"/>
-              <w:rPr>
-                <w:lang w:val="nl-NL"/>
-              </w:rPr>
-            </w:pPr>
-            <w:r>
-              <w:rPr>
-                <w:lang w:val="nl-NL"/>
-              </w:rPr>
-              <w:t>+5v</w:t>
-            </w:r>
-          </w:p>
-        </w:tc>
-        <w:tc>
-          <w:tcPr>
-            <w:tcW w:w="1701" w:type="dxa"/>
-          </w:tcPr>
-          <w:p>
-            <w:pPr>
-              <w:pStyle w:val="NoSpacing"/>
-              <w:rPr>
-                <w:lang w:val="nl-NL"/>
-              </w:rPr>
-            </w:pPr>
-            <w:r>
-              <w:rPr>
-                <w:lang w:val="nl-NL"/>
-              </w:rPr>
-              <w:t>-</w:t>
-            </w:r>
-          </w:p>
-        </w:tc>
-        <w:tc>
-          <w:tcPr>
-            <w:tcW w:w="2012" w:type="dxa"/>
-          </w:tcPr>
-          <w:p>
-            <w:pPr>
-              <w:pStyle w:val="NoSpacing"/>
-              <w:rPr>
-                <w:lang w:val="nl-NL"/>
-              </w:rPr>
-            </w:pPr>
-          </w:p>
-        </w:tc>
-        <w:tc>
-          <w:tcPr>
-            <w:tcW w:w="1803" w:type="dxa"/>
-          </w:tcPr>
-          <w:p>
-            <w:pPr>
-              <w:pStyle w:val="NoSpacing"/>
-              <w:rPr>
-                <w:lang w:val="nl-NL"/>
-              </w:rPr>
-            </w:pPr>
-          </w:p>
-        </w:tc>
-        <w:tc>
-          <w:tcPr>
-            <w:tcW w:w="1804" w:type="dxa"/>
-          </w:tcPr>
-          <w:p>
-            <w:pPr>
-              <w:pStyle w:val="NoSpacing"/>
-              <w:rPr>
-                <w:lang w:val="nl-NL"/>
-              </w:rPr>
-            </w:pPr>
-          </w:p>
-        </w:tc>
-      </w:tr>
-      <w:tr>
-        <w:tc>
-          <w:tcPr>
-            <w:tcW w:w="1696" w:type="dxa"/>
-          </w:tcPr>
-          <w:p>
-            <w:pPr>
-              <w:pStyle w:val="NoSpacing"/>
-              <w:rPr>
-                <w:lang w:val="nl-NL"/>
-              </w:rPr>
-            </w:pPr>
-            <w:r>
-              <w:rPr>
-                <w:lang w:val="nl-NL"/>
-              </w:rPr>
-              <w:t>GND</w:t>
-            </w:r>
-          </w:p>
-        </w:tc>
-        <w:tc>
-          <w:tcPr>
-            <w:tcW w:w="1701" w:type="dxa"/>
-          </w:tcPr>
-          <w:p>
-            <w:pPr>
-              <w:pStyle w:val="NoSpacing"/>
-              <w:rPr>
-                <w:lang w:val="nl-NL"/>
-              </w:rPr>
-            </w:pPr>
-            <w:r>
-              <w:rPr>
-                <w:lang w:val="nl-NL"/>
-              </w:rPr>
-              <w:t>-</w:t>
-            </w:r>
-          </w:p>
-        </w:tc>
-        <w:tc>
-          <w:tcPr>
-            <w:tcW w:w="2012" w:type="dxa"/>
-          </w:tcPr>
-          <w:p>
-            <w:pPr>
-              <w:pStyle w:val="NoSpacing"/>
-              <w:rPr>
-                <w:lang w:val="nl-NL"/>
-              </w:rPr>
-            </w:pPr>
-            <w:r>
-              <w:rPr>
-                <w:lang w:val="nl-NL"/>
-              </w:rPr>
-              <w:tab/>
-            </w:r>
-          </w:p>
-        </w:tc>
-        <w:tc>
-          <w:tcPr>
-            <w:tcW w:w="1803" w:type="dxa"/>
-          </w:tcPr>
-          <w:p>
-            <w:pPr>
-              <w:pStyle w:val="NoSpacing"/>
-              <w:rPr>
-                <w:lang w:val="nl-NL"/>
-              </w:rPr>
-            </w:pPr>
-          </w:p>
-        </w:tc>
-        <w:tc>
-          <w:tcPr>
-            <w:tcW w:w="1804" w:type="dxa"/>
-          </w:tcPr>
-          <w:p>
-            <w:pPr>
-              <w:pStyle w:val="NoSpacing"/>
-              <w:rPr>
-                <w:lang w:val="nl-NL"/>
-              </w:rPr>
-            </w:pPr>
-          </w:p>
-        </w:tc>
-      </w:tr>
-    </w:tbl>
-    <w:p>
-      <w:pPr>
-        <w:pStyle w:val="NoSpacing"/>
-      </w:pPr>
-      <w:r>
-        <w:t>Short Pin #4 to Pin #5 (ID/Sense to GND) for OTG</w:t>
+        <w:rPr>
+          <w:lang w:val="nl-NL"/>
+        </w:rPr>
+      </w:pPr>
+      <w:r>
+        <w:t xml:space="preserve"> </w:t>
       </w:r>
     </w:p>
     <w:p>
@@ -7980,125 +8976,6 @@
           <w:lang w:val="nl-NL"/>
         </w:rPr>
       </w:pPr>
-      <w:r>
-        <w:rPr>
-          <w:noProof/>
-        </w:rPr>
-        <w:drawing>
-          <wp:inline distT="0" distB="0" distL="0" distR="0" wp14:anchorId="60F9D653" wp14:editId="64DD63A0">
-            <wp:extent cx="1986881" cy="1271380"/>
-            <wp:effectExtent l="0" t="0" r="0" b="5080"/>
-            <wp:docPr id="1496846373" name="Picture 3" descr="USB 3.0 Information"/>
-            <wp:cNvGraphicFramePr>
-              <a:graphicFrameLocks xmlns:a="http://schemas.openxmlformats.org/drawingml/2006/main" noChangeAspect="1"/>
-            </wp:cNvGraphicFramePr>
-            <a:graphic xmlns:a="http://schemas.openxmlformats.org/drawingml/2006/main">
-              <a:graphicData uri="http://schemas.openxmlformats.org/drawingml/2006/picture">
-                <pic:pic xmlns:pic="http://schemas.openxmlformats.org/drawingml/2006/picture">
-                  <pic:nvPicPr>
-                    <pic:cNvPr id="0" name="Picture 5" descr="USB 3.0 Information"/>
-                    <pic:cNvPicPr>
-                      <a:picLocks noChangeAspect="1" noChangeArrowheads="1"/>
-                    </pic:cNvPicPr>
-                  </pic:nvPicPr>
-                  <pic:blipFill rotWithShape="1">
-                    <a:blip r:embed="rId18">
-                      <a:extLst>
-                        <a:ext uri="{28A0092B-C50C-407E-A947-70E740481C1C}">
-                          <a14:useLocalDpi xmlns:a14="http://schemas.microsoft.com/office/drawing/2010/main" val="0"/>
-                        </a:ext>
-                      </a:extLst>
-                    </a:blip>
-                    <a:srcRect l="14196" t="6442" r="5154" b="24903"/>
-                    <a:stretch>
-                      <a:fillRect/>
-                    </a:stretch>
-                  </pic:blipFill>
-                  <pic:spPr bwMode="auto">
-                    <a:xfrm>
-                      <a:off x="0" y="0"/>
-                      <a:ext cx="1988064" cy="1272137"/>
-                    </a:xfrm>
-                    <a:prstGeom prst="rect">
-                      <a:avLst/>
-                    </a:prstGeom>
-                    <a:noFill/>
-                    <a:ln>
-                      <a:noFill/>
-                    </a:ln>
-                    <a:extLst>
-                      <a:ext uri="{53640926-AAD7-44D8-BBD7-CCE9431645EC}">
-                        <a14:shadowObscured xmlns:a14="http://schemas.microsoft.com/office/drawing/2010/main"/>
-                      </a:ext>
-                    </a:extLst>
-                  </pic:spPr>
-                </pic:pic>
-              </a:graphicData>
-            </a:graphic>
-          </wp:inline>
-        </w:drawing>
-      </w:r>
-      <w:r>
-        <w:t xml:space="preserve"> </w:t>
-      </w:r>
-      <w:r>
-        <w:rPr>
-          <w:noProof/>
-        </w:rPr>
-        <w:drawing>
-          <wp:inline distT="0" distB="0" distL="0" distR="0" wp14:anchorId="0A4037B6" wp14:editId="244D9245">
-            <wp:extent cx="1148504" cy="1764803"/>
-            <wp:effectExtent l="0" t="0" r="0" b="6985"/>
-            <wp:docPr id="958528632" name="Picture 4" descr="What is Micro USB OTG (On-The-Go)? Build DIY OTG Cable"/>
-            <wp:cNvGraphicFramePr>
-              <a:graphicFrameLocks xmlns:a="http://schemas.openxmlformats.org/drawingml/2006/main" noChangeAspect="1"/>
-            </wp:cNvGraphicFramePr>
-            <a:graphic xmlns:a="http://schemas.openxmlformats.org/drawingml/2006/main">
-              <a:graphicData uri="http://schemas.openxmlformats.org/drawingml/2006/picture">
-                <pic:pic xmlns:pic="http://schemas.openxmlformats.org/drawingml/2006/picture">
-                  <pic:nvPicPr>
-                    <pic:cNvPr id="0" name="Picture 7" descr="What is Micro USB OTG (On-The-Go)? Build DIY OTG Cable"/>
-                    <pic:cNvPicPr>
-                      <a:picLocks noChangeAspect="1" noChangeArrowheads="1"/>
-                    </pic:cNvPicPr>
-                  </pic:nvPicPr>
-                  <pic:blipFill rotWithShape="1">
-                    <a:blip r:embed="rId19" cstate="print">
-                      <a:extLst>
-                        <a:ext uri="{28A0092B-C50C-407E-A947-70E740481C1C}">
-                          <a14:useLocalDpi xmlns:a14="http://schemas.microsoft.com/office/drawing/2010/main" val="0"/>
-                        </a:ext>
-                      </a:extLst>
-                    </a:blip>
-                    <a:srcRect l="37569" t="7647" r="41198" b="34359"/>
-                    <a:stretch>
-                      <a:fillRect/>
-                    </a:stretch>
-                  </pic:blipFill>
-                  <pic:spPr bwMode="auto">
-                    <a:xfrm>
-                      <a:off x="0" y="0"/>
-                      <a:ext cx="1151566" cy="1769508"/>
-                    </a:xfrm>
-                    <a:prstGeom prst="rect">
-                      <a:avLst/>
-                    </a:prstGeom>
-                    <a:noFill/>
-                    <a:ln>
-                      <a:noFill/>
-                    </a:ln>
-                    <a:extLst>
-                      <a:ext uri="{53640926-AAD7-44D8-BBD7-CCE9431645EC}">
-                        <a14:shadowObscured xmlns:a14="http://schemas.microsoft.com/office/drawing/2010/main"/>
-                      </a:ext>
-                    </a:extLst>
-                  </pic:spPr>
-                </pic:pic>
-              </a:graphicData>
-            </a:graphic>
-          </wp:inline>
-        </w:drawing>
-      </w:r>
     </w:p>
     <w:p>
       <w:pPr>
@@ -8110,11 +8987,18 @@
     </w:p>
     <w:p>
       <w:pPr>
-        <w:pStyle w:val="NoSpacing"/>
-        <w:rPr>
-          <w:lang w:val="nl-NL"/>
-        </w:rPr>
-      </w:pPr>
+        <w:rPr>
+          <w:rStyle w:val="Heading3Char"/>
+          <w:lang w:val="en-GB"/>
+        </w:rPr>
+      </w:pPr>
+      <w:bookmarkStart w:id="5" w:name="_Toc223434588"/>
+      <w:r>
+        <w:rPr>
+          <w:rStyle w:val="Heading3Char"/>
+        </w:rPr>
+        <w:br w:type="page"/>
+      </w:r>
     </w:p>
     <w:p>
       <w:pPr>
@@ -8123,11 +9007,11 @@
           <w:lang w:val="nl-NL"/>
         </w:rPr>
       </w:pPr>
-      <w:bookmarkStart w:id="5" w:name="_Toc223434588"/>
       <w:r>
         <w:rPr>
           <w:rStyle w:val="Heading3Char"/>
         </w:rPr>
+        <w:lastRenderedPageBreak/>
         <w:t>Ethernet</w:t>
       </w:r>
       <w:bookmarkEnd w:id="5"/>
@@ -8137,7 +9021,7 @@
         </w:rPr>
         <w:t xml:space="preserve"> </w:t>
       </w:r>
-      <w:hyperlink r:id="rId20" w:anchor="page=7" w:history="1">
+      <w:hyperlink r:id="rId21" w:anchor="page=7" w:history="1">
         <w:r>
           <w:rPr>
             <w:rStyle w:val="Hyperlink"/>
@@ -8366,7 +9250,6 @@
               <w:rPr>
                 <w:lang w:val="nl-NL"/>
               </w:rPr>
-              <w:lastRenderedPageBreak/>
               <w:t>Ethernet_P1P</w:t>
             </w:r>
           </w:p>
@@ -9485,7 +10368,7 @@
           <w:lang w:val="nl-NL"/>
         </w:rPr>
       </w:pPr>
-      <w:hyperlink r:id="rId21" w:anchor="page=18" w:history="1">
+      <w:hyperlink r:id="rId22" w:anchor="page=18" w:history="1">
         <w:r>
           <w:rPr>
             <w:rStyle w:val="Hyperlink"/>
@@ -12921,7 +13804,7 @@
           <w:lang w:val="nl-NL"/>
         </w:rPr>
       </w:pPr>
-      <w:hyperlink r:id="rId22" w:anchor="page=18" w:history="1">
+      <w:hyperlink r:id="rId23" w:anchor="page=18" w:history="1">
         <w:r>
           <w:rPr>
             <w:rStyle w:val="Hyperlink"/>
@@ -20638,7 +21521,7 @@
       <w:pPr>
         <w:pStyle w:val="NoSpacing"/>
       </w:pPr>
-      <w:hyperlink r:id="rId23" w:history="1">
+      <w:hyperlink r:id="rId24" w:history="1">
         <w:r>
           <w:rPr>
             <w:rStyle w:val="Hyperlink"/>
@@ -20664,7 +21547,7 @@
       <w:pPr>
         <w:pStyle w:val="NoSpacing"/>
       </w:pPr>
-      <w:hyperlink r:id="rId24" w:history="1">
+      <w:hyperlink r:id="rId25" w:history="1">
         <w:r>
           <w:rPr>
             <w:rStyle w:val="Hyperlink"/>
@@ -20727,7 +21610,7 @@
           <w:lang w:val="nl-NL"/>
         </w:rPr>
       </w:pPr>
-      <w:hyperlink r:id="rId25" w:history="1">
+      <w:hyperlink r:id="rId26" w:history="1">
         <w:r>
           <w:rPr>
             <w:rStyle w:val="Hyperlink"/>
@@ -20757,7 +21640,7 @@
       <w:pPr>
         <w:pStyle w:val="NoSpacing"/>
       </w:pPr>
-      <w:hyperlink r:id="rId26" w:history="1">
+      <w:hyperlink r:id="rId27" w:history="1">
         <w:r>
           <w:rPr>
             <w:rStyle w:val="Hyperlink"/>
@@ -20826,7 +21709,7 @@
       <w:pPr>
         <w:pStyle w:val="NoSpacing"/>
       </w:pPr>
-      <w:hyperlink r:id="rId27" w:history="1">
+      <w:hyperlink r:id="rId28" w:history="1">
         <w:r>
           <w:rPr>
             <w:rStyle w:val="Hyperlink"/>
@@ -20872,7 +21755,7 @@
       <w:pPr>
         <w:pStyle w:val="NoSpacing"/>
       </w:pPr>
-      <w:hyperlink r:id="rId28" w:history="1">
+      <w:hyperlink r:id="rId29" w:history="1">
         <w:r>
           <w:rPr>
             <w:rStyle w:val="Hyperlink"/>
@@ -20898,7 +21781,7 @@
       <w:pPr>
         <w:pStyle w:val="NoSpacing"/>
       </w:pPr>
-      <w:hyperlink r:id="rId29" w:history="1">
+      <w:hyperlink r:id="rId30" w:history="1">
         <w:r>
           <w:rPr>
             <w:rStyle w:val="Hyperlink"/>
@@ -21421,6 +22304,95 @@
     </w:lvl>
   </w:abstractNum>
   <w:abstractNum w:abstractNumId="4" w15:restartNumberingAfterBreak="0">
+    <w:nsid w:val="6F5E3B2C"/>
+    <w:multiLevelType w:val="hybridMultilevel"/>
+    <w:tmpl w:val="BDD08770"/>
+    <w:lvl w:ilvl="0" w:tplc="08090011">
+      <w:start w:val="1"/>
+      <w:numFmt w:val="decimal"/>
+      <w:lvlText w:val="%1)"/>
+      <w:lvlJc w:val="left"/>
+      <w:pPr>
+        <w:ind w:left="720" w:hanging="360"/>
+      </w:pPr>
+      <w:rPr>
+        <w:rFonts w:hint="default"/>
+      </w:rPr>
+    </w:lvl>
+    <w:lvl w:ilvl="1" w:tplc="08090019" w:tentative="1">
+      <w:start w:val="1"/>
+      <w:numFmt w:val="lowerLetter"/>
+      <w:lvlText w:val="%2."/>
+      <w:lvlJc w:val="left"/>
+      <w:pPr>
+        <w:ind w:left="1440" w:hanging="360"/>
+      </w:pPr>
+    </w:lvl>
+    <w:lvl w:ilvl="2" w:tplc="0809001B" w:tentative="1">
+      <w:start w:val="1"/>
+      <w:numFmt w:val="lowerRoman"/>
+      <w:lvlText w:val="%3."/>
+      <w:lvlJc w:val="right"/>
+      <w:pPr>
+        <w:ind w:left="2160" w:hanging="180"/>
+      </w:pPr>
+    </w:lvl>
+    <w:lvl w:ilvl="3" w:tplc="0809000F" w:tentative="1">
+      <w:start w:val="1"/>
+      <w:numFmt w:val="decimal"/>
+      <w:lvlText w:val="%4."/>
+      <w:lvlJc w:val="left"/>
+      <w:pPr>
+        <w:ind w:left="2880" w:hanging="360"/>
+      </w:pPr>
+    </w:lvl>
+    <w:lvl w:ilvl="4" w:tplc="08090019" w:tentative="1">
+      <w:start w:val="1"/>
+      <w:numFmt w:val="lowerLetter"/>
+      <w:lvlText w:val="%5."/>
+      <w:lvlJc w:val="left"/>
+      <w:pPr>
+        <w:ind w:left="3600" w:hanging="360"/>
+      </w:pPr>
+    </w:lvl>
+    <w:lvl w:ilvl="5" w:tplc="0809001B" w:tentative="1">
+      <w:start w:val="1"/>
+      <w:numFmt w:val="lowerRoman"/>
+      <w:lvlText w:val="%6."/>
+      <w:lvlJc w:val="right"/>
+      <w:pPr>
+        <w:ind w:left="4320" w:hanging="180"/>
+      </w:pPr>
+    </w:lvl>
+    <w:lvl w:ilvl="6" w:tplc="0809000F" w:tentative="1">
+      <w:start w:val="1"/>
+      <w:numFmt w:val="decimal"/>
+      <w:lvlText w:val="%7."/>
+      <w:lvlJc w:val="left"/>
+      <w:pPr>
+        <w:ind w:left="5040" w:hanging="360"/>
+      </w:pPr>
+    </w:lvl>
+    <w:lvl w:ilvl="7" w:tplc="08090019" w:tentative="1">
+      <w:start w:val="1"/>
+      <w:numFmt w:val="lowerLetter"/>
+      <w:lvlText w:val="%8."/>
+      <w:lvlJc w:val="left"/>
+      <w:pPr>
+        <w:ind w:left="5760" w:hanging="360"/>
+      </w:pPr>
+    </w:lvl>
+    <w:lvl w:ilvl="8" w:tplc="0809001B" w:tentative="1">
+      <w:start w:val="1"/>
+      <w:numFmt w:val="lowerRoman"/>
+      <w:lvlText w:val="%9."/>
+      <w:lvlJc w:val="right"/>
+      <w:pPr>
+        <w:ind w:left="6480" w:hanging="180"/>
+      </w:pPr>
+    </w:lvl>
+  </w:abstractNum>
+  <w:abstractNum w:abstractNumId="5" w15:restartNumberingAfterBreak="0">
     <w:nsid w:val="75E227B0"/>
     <w:multiLevelType w:val="multilevel"/>
     <w:tmpl w:val="7F903274"/>
@@ -21534,7 +22506,7 @@
     </w:lvl>
   </w:abstractNum>
   <w:num w:numId="1" w16cid:durableId="4944822">
-    <w:abstractNumId w:val="4"/>
+    <w:abstractNumId w:val="5"/>
   </w:num>
   <w:num w:numId="2" w16cid:durableId="145902259">
     <w:abstractNumId w:val="2"/>
@@ -21547,6 +22519,9 @@
   </w:num>
   <w:num w:numId="5" w16cid:durableId="642080162">
     <w:abstractNumId w:val="1"/>
+  </w:num>
+  <w:num w:numId="6" w16cid:durableId="105270409">
+    <w:abstractNumId w:val="4"/>
   </w:num>
 </w:numbering>
 </file>

</xml_diff>

<commit_message>
Hehe, smol board now
</commit_message>
<xml_diff>
--- a/ANE21_PCB.docx
+++ b/ANE21_PCB.docx
@@ -803,7 +803,37 @@
         <w:rPr>
           <w:lang w:val="nl-NL"/>
         </w:rPr>
-        <w:t>PSU voor CM4 vervangen van AP64501S-13 vervangen met AP62300WU-7</w:t>
+        <w:t>PSU voor CM4 vervangen van</w:t>
+      </w:r>
+      <w:r>
+        <w:rPr>
+          <w:lang w:val="nl-NL"/>
+        </w:rPr>
+        <w:t xml:space="preserve"> </w:t>
+      </w:r>
+      <w:r>
+        <w:rPr>
+          <w:lang w:val="nl-NL"/>
+        </w:rPr>
+        <w:t>AP62300WU-7</w:t>
+      </w:r>
+      <w:r>
+        <w:rPr>
+          <w:lang w:val="nl-NL"/>
+        </w:rPr>
+        <w:t xml:space="preserve"> </w:t>
+      </w:r>
+      <w:r>
+        <w:rPr>
+          <w:lang w:val="nl-NL"/>
+        </w:rPr>
+        <w:t xml:space="preserve">vervangen met </w:t>
+      </w:r>
+      <w:r>
+        <w:rPr>
+          <w:lang w:val="nl-NL"/>
+        </w:rPr>
+        <w:t>AP64501S-13</w:t>
       </w:r>
     </w:p>
     <w:p>
@@ -813,12 +843,45 @@
           <w:ilvl w:val="0"/>
           <w:numId w:val="5"/>
         </w:numPr>
-      </w:pPr>
-      <w:r>
-        <w:t>USB-C for usb d</w:t>
-      </w:r>
-      <w:r>
-        <w:t>evices, dongle and OTG</w:t>
+        <w:rPr>
+          <w:lang w:val="nl-NL"/>
+        </w:rPr>
+      </w:pPr>
+      <w:r>
+        <w:rPr>
+          <w:lang w:val="nl-NL"/>
+        </w:rPr>
+        <w:t>GPIO’s uitzoeken</w:t>
+      </w:r>
+    </w:p>
+    <w:p>
+      <w:pPr>
+        <w:pStyle w:val="NoSpacing"/>
+        <w:numPr>
+          <w:ilvl w:val="1"/>
+          <w:numId w:val="5"/>
+        </w:numPr>
+        <w:rPr>
+          <w:lang w:val="nl-NL"/>
+        </w:rPr>
+      </w:pPr>
+      <w:r>
+        <w:rPr>
+          <w:lang w:val="nl-NL"/>
+        </w:rPr>
+        <w:t>GPIO’s naar header zetten</w:t>
+      </w:r>
+    </w:p>
+    <w:p>
+      <w:pPr>
+        <w:pStyle w:val="ListParagraph"/>
+        <w:numPr>
+          <w:ilvl w:val="1"/>
+          <w:numId w:val="5"/>
+        </w:numPr>
+      </w:pPr>
+      <w:r>
+        <w:t>Evt 5v en 3.3v output als header</w:t>
       </w:r>
     </w:p>
     <w:p>
@@ -836,7 +899,7 @@
         <w:rPr>
           <w:lang w:val="nl-NL"/>
         </w:rPr>
-        <w:t xml:space="preserve">Global headers veranderen naar hierarchical </w:t>
+        <w:t>Schema en uitleg over ieder circuit dat er in zit</w:t>
       </w:r>
     </w:p>
     <w:p>
@@ -854,7 +917,7 @@
         <w:rPr>
           <w:lang w:val="nl-NL"/>
         </w:rPr>
-        <w:t>GPIO’s naar header zetten</w:t>
+        <w:t xml:space="preserve">Nalopen traces (incl. Kennis) </w:t>
       </w:r>
     </w:p>
     <w:p>
@@ -872,7 +935,29 @@
         <w:rPr>
           <w:lang w:val="nl-NL"/>
         </w:rPr>
-        <w:t xml:space="preserve">GPIO_VREF, SCL0, SDA0 kunnen die los? </w:t>
+        <w:t>“lage” signaal pinnen op onderkant zetten</w:t>
+      </w:r>
+    </w:p>
+    <w:p>
+      <w:pPr>
+        <w:pStyle w:val="NoSpacing"/>
+        <w:rPr>
+          <w:lang w:val="nl-NL"/>
+        </w:rPr>
+      </w:pPr>
+    </w:p>
+    <w:p>
+      <w:pPr>
+        <w:pStyle w:val="NoSpacing"/>
+        <w:rPr>
+          <w:lang w:val="nl-NL"/>
+        </w:rPr>
+      </w:pPr>
+      <w:r>
+        <w:rPr>
+          <w:lang w:val="nl-NL"/>
+        </w:rPr>
+        <w:t>Eventueel:</w:t>
       </w:r>
     </w:p>
     <w:p>
@@ -882,75 +967,86 @@
           <w:ilvl w:val="0"/>
           <w:numId w:val="5"/>
         </w:numPr>
-        <w:rPr>
-          <w:lang w:val="nl-NL"/>
-        </w:rPr>
-      </w:pPr>
-      <w:r>
-        <w:rPr>
-          <w:lang w:val="nl-NL"/>
-        </w:rPr>
-        <w:t>nEXTRST</w:t>
-      </w:r>
-      <w:r>
-        <w:rPr>
-          <w:lang w:val="nl-NL"/>
-        </w:rPr>
-        <w:t xml:space="preserve"> gebruiken als hij nut heeft.</w:t>
+      </w:pPr>
+      <w:r>
+        <w:t>USB-C for usb d</w:t>
+      </w:r>
+      <w:r>
+        <w:t>evices, dongle and OTG</w:t>
       </w:r>
     </w:p>
     <w:p>
       <w:pPr>
         <w:pStyle w:val="NoSpacing"/>
-        <w:numPr>
-          <w:ilvl w:val="0"/>
-          <w:numId w:val="5"/>
-        </w:numPr>
-        <w:rPr>
-          <w:lang w:val="nl-NL"/>
-        </w:rPr>
-      </w:pPr>
-      <w:r>
-        <w:rPr>
-          <w:lang w:val="nl-NL"/>
-        </w:rPr>
-        <w:t>Evt 5v en 3.3v output al</w:t>
-      </w:r>
-      <w:r>
-        <w:rPr>
-          <w:lang w:val="nl-NL"/>
-        </w:rPr>
-        <w:t>s header</w:t>
+        <w:ind w:left="720"/>
+      </w:pPr>
+      <w:r>
+        <w:rPr>
+          <w:noProof/>
+        </w:rPr>
+        <w:drawing>
+          <wp:inline distT="0" distB="0" distL="0" distR="0" wp14:anchorId="38772D56" wp14:editId="717EFC66">
+            <wp:extent cx="3432062" cy="1661886"/>
+            <wp:effectExtent l="0" t="0" r="0" b="0"/>
+            <wp:docPr id="518631005" name="Picture 1" descr="USB C OTG Wiring Diagram For Cable, Schematic, DIY &amp; Manufacturing -"/>
+            <wp:cNvGraphicFramePr>
+              <a:graphicFrameLocks xmlns:a="http://schemas.openxmlformats.org/drawingml/2006/main" noChangeAspect="1"/>
+            </wp:cNvGraphicFramePr>
+            <a:graphic xmlns:a="http://schemas.openxmlformats.org/drawingml/2006/main">
+              <a:graphicData uri="http://schemas.openxmlformats.org/drawingml/2006/picture">
+                <pic:pic xmlns:pic="http://schemas.openxmlformats.org/drawingml/2006/picture">
+                  <pic:nvPicPr>
+                    <pic:cNvPr id="0" name="Picture 1" descr="USB C OTG Wiring Diagram For Cable, Schematic, DIY &amp; Manufacturing -"/>
+                    <pic:cNvPicPr>
+                      <a:picLocks noChangeAspect="1" noChangeArrowheads="1"/>
+                    </pic:cNvPicPr>
+                  </pic:nvPicPr>
+                  <pic:blipFill rotWithShape="1">
+                    <a:blip r:embed="rId6" cstate="print">
+                      <a:extLst>
+                        <a:ext uri="{28A0092B-C50C-407E-A947-70E740481C1C}">
+                          <a14:useLocalDpi xmlns:a14="http://schemas.microsoft.com/office/drawing/2010/main" val="0"/>
+                        </a:ext>
+                      </a:extLst>
+                    </a:blip>
+                    <a:srcRect b="31344"/>
+                    <a:stretch>
+                      <a:fillRect/>
+                    </a:stretch>
+                  </pic:blipFill>
+                  <pic:spPr bwMode="auto">
+                    <a:xfrm>
+                      <a:off x="0" y="0"/>
+                      <a:ext cx="3438844" cy="1665170"/>
+                    </a:xfrm>
+                    <a:prstGeom prst="rect">
+                      <a:avLst/>
+                    </a:prstGeom>
+                    <a:noFill/>
+                    <a:ln>
+                      <a:noFill/>
+                    </a:ln>
+                    <a:extLst>
+                      <a:ext uri="{53640926-AAD7-44D8-BBD7-CCE9431645EC}">
+                        <a14:shadowObscured xmlns:a14="http://schemas.microsoft.com/office/drawing/2010/main"/>
+                      </a:ext>
+                    </a:extLst>
+                  </pic:spPr>
+                </pic:pic>
+              </a:graphicData>
+            </a:graphic>
+          </wp:inline>
+        </w:drawing>
       </w:r>
     </w:p>
     <w:p>
       <w:pPr>
         <w:pStyle w:val="NoSpacing"/>
-        <w:numPr>
-          <w:ilvl w:val="0"/>
-          <w:numId w:val="5"/>
-        </w:numPr>
-        <w:rPr>
-          <w:lang w:val="nl-NL"/>
-        </w:rPr>
-      </w:pPr>
-      <w:r>
-        <w:rPr>
-          <w:lang w:val="nl-NL"/>
-        </w:rPr>
-        <w:t>Schema en uitleg over ieder circuit dat er in zit</w:t>
-      </w:r>
+      </w:pPr>
     </w:p>
     <w:p>
       <w:pPr>
         <w:pStyle w:val="NoSpacing"/>
-        <w:numPr>
-          <w:ilvl w:val="0"/>
-          <w:numId w:val="5"/>
-        </w:numPr>
-        <w:rPr>
-          <w:lang w:val="nl-NL"/>
-        </w:rPr>
       </w:pPr>
     </w:p>
     <w:p>
@@ -985,6 +1081,7 @@
         <w:rPr>
           <w:lang w:val="en-GB"/>
         </w:rPr>
+        <w:lastRenderedPageBreak/>
         <w:t>Added header for UART (G</w:t>
       </w:r>
       <w:r>
@@ -1171,7 +1268,6 @@
         <w:rPr>
           <w:lang w:val="en-GB"/>
         </w:rPr>
-        <w:lastRenderedPageBreak/>
         <w:t>Aisler</w:t>
       </w:r>
       <w:proofErr w:type="spellEnd"/>
@@ -1184,6 +1280,7 @@
       </w:pPr>
       <w:r>
         <w:rPr>
+          <w:noProof/>
           <w:lang w:val="en-GB"/>
         </w:rPr>
         <w:drawing>
@@ -1202,7 +1299,7 @@
                     <pic:cNvPicPr/>
                   </pic:nvPicPr>
                   <pic:blipFill>
-                    <a:blip r:embed="rId6"/>
+                    <a:blip r:embed="rId7"/>
                     <a:stretch>
                       <a:fillRect/>
                     </a:stretch>
@@ -1575,6 +1672,7 @@
           <w:szCs w:val="22"/>
           <w:lang w:val="en-GB"/>
         </w:rPr>
+        <w:lastRenderedPageBreak/>
         <w:t xml:space="preserve">Advantage: Easier to calculate and manage, standard design approach. </w:t>
       </w:r>
     </w:p>
@@ -1621,13 +1719,14 @@
           <w:bCs/>
         </w:rPr>
         <w:tab/>
+        <w:t>Coplanar (GCPW)</w:t>
       </w:r>
       <w:r>
         <w:rPr>
           <w:b/>
           <w:bCs/>
         </w:rPr>
-        <w:t>Coplanar (GCPW)</w:t>
+        <w:tab/>
       </w:r>
       <w:r>
         <w:rPr>
@@ -1635,19 +1734,6 @@
           <w:bCs/>
         </w:rPr>
         <w:tab/>
-      </w:r>
-      <w:r>
-        <w:rPr>
-          <w:b/>
-          <w:bCs/>
-        </w:rPr>
-        <w:tab/>
-      </w:r>
-      <w:r>
-        <w:rPr>
-          <w:b/>
-          <w:bCs/>
-        </w:rPr>
         <w:t>Non-Coplanar (Microstrip)</w:t>
       </w:r>
     </w:p>
@@ -1860,7 +1946,7 @@
                     </pic:cNvPicPr>
                   </pic:nvPicPr>
                   <pic:blipFill>
-                    <a:blip r:embed="rId7" cstate="print">
+                    <a:blip r:embed="rId8" cstate="print">
                       <a:extLst>
                         <a:ext uri="{28A0092B-C50C-407E-A947-70E740481C1C}">
                           <a14:useLocalDpi xmlns:a14="http://schemas.microsoft.com/office/drawing/2010/main" val="0"/>
@@ -2191,7 +2277,7 @@
       <w:pPr>
         <w:pStyle w:val="NoSpacing"/>
       </w:pPr>
-      <w:hyperlink r:id="rId8" w:history="1">
+      <w:hyperlink r:id="rId9" w:history="1">
         <w:r>
           <w:rPr>
             <w:rStyle w:val="Hyperlink"/>
@@ -2204,7 +2290,7 @@
       <w:pPr>
         <w:pStyle w:val="NoSpacing"/>
       </w:pPr>
-      <w:hyperlink r:id="rId9" w:history="1">
+      <w:hyperlink r:id="rId10" w:history="1">
         <w:r>
           <w:rPr>
             <w:rStyle w:val="Hyperlink"/>
@@ -2328,7 +2414,7 @@
                     </pic:cNvPicPr>
                   </pic:nvPicPr>
                   <pic:blipFill rotWithShape="1">
-                    <a:blip r:embed="rId10">
+                    <a:blip r:embed="rId11">
                       <a:extLst>
                         <a:ext uri="{28A0092B-C50C-407E-A947-70E740481C1C}">
                           <a14:useLocalDpi xmlns:a14="http://schemas.microsoft.com/office/drawing/2010/main" val="0"/>
@@ -4045,7 +4131,7 @@
           <w:lang w:val="nl-NL"/>
         </w:rPr>
       </w:pPr>
-      <w:hyperlink r:id="rId11" w:history="1">
+      <w:hyperlink r:id="rId12" w:history="1">
         <w:r>
           <w:rPr>
             <w:rStyle w:val="Hyperlink"/>
@@ -4068,7 +4154,7 @@
           <w:lang w:val="nl-NL"/>
         </w:rPr>
       </w:pPr>
-      <w:hyperlink r:id="rId12" w:history="1">
+      <w:hyperlink r:id="rId13" w:history="1">
         <w:r>
           <w:rPr>
             <w:rStyle w:val="Hyperlink"/>
@@ -4096,19 +4182,19 @@
       <w:pPr>
         <w:pStyle w:val="NoSpacing"/>
       </w:pPr>
-      <w:bookmarkStart w:id="2" w:name="_Toc223434585"/>
-      <w:bookmarkStart w:id="3" w:name="_Toc223434587"/>
+      <w:bookmarkStart w:id="2" w:name="_Toc223434587"/>
+      <w:bookmarkStart w:id="3" w:name="_Toc223434585"/>
       <w:r>
         <w:rPr>
           <w:rStyle w:val="Heading3Char"/>
         </w:rPr>
         <w:t>USB / USB_OTG</w:t>
       </w:r>
-      <w:bookmarkEnd w:id="3"/>
+      <w:bookmarkEnd w:id="2"/>
       <w:r>
         <w:t xml:space="preserve"> (</w:t>
       </w:r>
-      <w:hyperlink r:id="rId13" w:anchor="page=8" w:history="1">
+      <w:hyperlink r:id="rId14" w:anchor="page=8" w:history="1">
         <w:r>
           <w:rPr>
             <w:rStyle w:val="Hyperlink"/>
@@ -4677,7 +4763,7 @@
                     </pic:cNvPicPr>
                   </pic:nvPicPr>
                   <pic:blipFill rotWithShape="1">
-                    <a:blip r:embed="rId14">
+                    <a:blip r:embed="rId15">
                       <a:extLst>
                         <a:ext uri="{28A0092B-C50C-407E-A947-70E740481C1C}">
                           <a14:useLocalDpi xmlns:a14="http://schemas.microsoft.com/office/drawing/2010/main" val="0"/>
@@ -4716,6 +4802,7 @@
       <w:r>
         <w:rPr>
           <w:noProof/>
+          <w:lang w:val="en-GB"/>
         </w:rPr>
         <w:t xml:space="preserve"> </w:t>
       </w:r>
@@ -4724,7 +4811,7 @@
           <w:noProof/>
         </w:rPr>
         <w:drawing>
-          <wp:inline distT="0" distB="0" distL="0" distR="0" wp14:anchorId="3CE9DA6B" wp14:editId="72359269">
+          <wp:inline distT="0" distB="0" distL="0" distR="0" wp14:anchorId="3CE9DA6B" wp14:editId="3E919146">
             <wp:extent cx="1097280" cy="1222749"/>
             <wp:effectExtent l="0" t="0" r="7620" b="0"/>
             <wp:docPr id="958528632" name="Picture 4" descr="What is Micro USB OTG (On-The-Go)? Build DIY OTG Cable"/>
@@ -4741,7 +4828,7 @@
                     </pic:cNvPicPr>
                   </pic:nvPicPr>
                   <pic:blipFill rotWithShape="1">
-                    <a:blip r:embed="rId15" cstate="print">
+                    <a:blip r:embed="rId16" cstate="print">
                       <a:extLst>
                         <a:ext uri="{28A0092B-C50C-407E-A947-70E740481C1C}">
                           <a14:useLocalDpi xmlns:a14="http://schemas.microsoft.com/office/drawing/2010/main" val="0"/>
@@ -4796,11 +4883,11 @@
         <w:lastRenderedPageBreak/>
         <w:t>HDMI</w:t>
       </w:r>
-      <w:bookmarkEnd w:id="2"/>
+      <w:bookmarkEnd w:id="3"/>
       <w:r>
         <w:t xml:space="preserve"> </w:t>
       </w:r>
-      <w:hyperlink r:id="rId16" w:anchor="page=11" w:history="1">
+      <w:hyperlink r:id="rId17" w:anchor="page=11" w:history="1">
         <w:r>
           <w:rPr>
             <w:rStyle w:val="Hyperlink"/>
@@ -6280,7 +6367,7 @@
           <w:noProof/>
         </w:rPr>
         <w:drawing>
-          <wp:inline distT="0" distB="0" distL="0" distR="0" wp14:anchorId="2020065A" wp14:editId="5E5B5E17">
+          <wp:inline distT="0" distB="0" distL="0" distR="0" wp14:anchorId="2020065A" wp14:editId="27493561">
             <wp:extent cx="2719346" cy="2008025"/>
             <wp:effectExtent l="0" t="0" r="5080" b="0"/>
             <wp:docPr id="619101385" name="Picture 1" descr="Does HDMI 2.0 Support 1080p 120Hz? Addressing HDMI Questions ..."/>
@@ -6297,7 +6384,7 @@
                     </pic:cNvPicPr>
                   </pic:nvPicPr>
                   <pic:blipFill>
-                    <a:blip r:embed="rId17" cstate="print">
+                    <a:blip r:embed="rId18" cstate="print">
                       <a:extLst>
                         <a:ext uri="{28A0092B-C50C-407E-A947-70E740481C1C}">
                           <a14:useLocalDpi xmlns:a14="http://schemas.microsoft.com/office/drawing/2010/main" val="0"/>
@@ -6359,7 +6446,7 @@
         </w:rPr>
         <w:t xml:space="preserve"> (</w:t>
       </w:r>
-      <w:hyperlink r:id="rId18" w:anchor="page=7" w:history="1">
+      <w:hyperlink r:id="rId19" w:anchor="page=7" w:history="1">
         <w:r>
           <w:rPr>
             <w:rStyle w:val="Hyperlink"/>
@@ -6431,7 +6518,7 @@
       <w:pPr>
         <w:pStyle w:val="NoSpacing"/>
       </w:pPr>
-      <w:hyperlink r:id="rId19" w:anchor="page=12" w:history="1">
+      <w:hyperlink r:id="rId20" w:anchor="page=12" w:history="1">
         <w:r>
           <w:rPr>
             <w:rStyle w:val="Hyperlink"/>
@@ -8924,7 +9011,7 @@
                     <pic:cNvPicPr/>
                   </pic:nvPicPr>
                   <pic:blipFill>
-                    <a:blip r:embed="rId20"/>
+                    <a:blip r:embed="rId21"/>
                     <a:stretch>
                       <a:fillRect/>
                     </a:stretch>
@@ -9021,7 +9108,7 @@
         </w:rPr>
         <w:t xml:space="preserve"> </w:t>
       </w:r>
-      <w:hyperlink r:id="rId21" w:anchor="page=7" w:history="1">
+      <w:hyperlink r:id="rId22" w:anchor="page=7" w:history="1">
         <w:r>
           <w:rPr>
             <w:rStyle w:val="Hyperlink"/>
@@ -10294,6 +10381,22 @@
       <w:pPr>
         <w:pStyle w:val="NoSpacing"/>
       </w:pPr>
+      <w:r>
+        <w:t>TPS25730D</w:t>
+      </w:r>
+    </w:p>
+    <w:p>
+      <w:pPr>
+        <w:pStyle w:val="NoSpacing"/>
+      </w:pPr>
+      <w:r>
+        <w:t>https://www.ti.com/lit/ds/symlink/tps25730.pdf</w:t>
+      </w:r>
+    </w:p>
+    <w:p>
+      <w:pPr>
+        <w:pStyle w:val="NoSpacing"/>
+      </w:pPr>
     </w:p>
     <w:p>
       <w:pPr>
@@ -10368,7 +10471,7 @@
           <w:lang w:val="nl-NL"/>
         </w:rPr>
       </w:pPr>
-      <w:hyperlink r:id="rId22" w:anchor="page=18" w:history="1">
+      <w:hyperlink r:id="rId23" w:anchor="page=18" w:history="1">
         <w:r>
           <w:rPr>
             <w:rStyle w:val="Hyperlink"/>
@@ -13804,7 +13907,7 @@
           <w:lang w:val="nl-NL"/>
         </w:rPr>
       </w:pPr>
-      <w:hyperlink r:id="rId23" w:anchor="page=18" w:history="1">
+      <w:hyperlink r:id="rId24" w:anchor="page=18" w:history="1">
         <w:r>
           <w:rPr>
             <w:rStyle w:val="Hyperlink"/>
@@ -21521,7 +21624,7 @@
       <w:pPr>
         <w:pStyle w:val="NoSpacing"/>
       </w:pPr>
-      <w:hyperlink r:id="rId24" w:history="1">
+      <w:hyperlink r:id="rId25" w:history="1">
         <w:r>
           <w:rPr>
             <w:rStyle w:val="Hyperlink"/>
@@ -21547,7 +21650,7 @@
       <w:pPr>
         <w:pStyle w:val="NoSpacing"/>
       </w:pPr>
-      <w:hyperlink r:id="rId25" w:history="1">
+      <w:hyperlink r:id="rId26" w:history="1">
         <w:r>
           <w:rPr>
             <w:rStyle w:val="Hyperlink"/>
@@ -21610,7 +21713,7 @@
           <w:lang w:val="nl-NL"/>
         </w:rPr>
       </w:pPr>
-      <w:hyperlink r:id="rId26" w:history="1">
+      <w:hyperlink r:id="rId27" w:history="1">
         <w:r>
           <w:rPr>
             <w:rStyle w:val="Hyperlink"/>
@@ -21640,7 +21743,7 @@
       <w:pPr>
         <w:pStyle w:val="NoSpacing"/>
       </w:pPr>
-      <w:hyperlink r:id="rId27" w:history="1">
+      <w:hyperlink r:id="rId28" w:history="1">
         <w:r>
           <w:rPr>
             <w:rStyle w:val="Hyperlink"/>
@@ -21709,7 +21812,7 @@
       <w:pPr>
         <w:pStyle w:val="NoSpacing"/>
       </w:pPr>
-      <w:hyperlink r:id="rId28" w:history="1">
+      <w:hyperlink r:id="rId29" w:history="1">
         <w:r>
           <w:rPr>
             <w:rStyle w:val="Hyperlink"/>
@@ -21755,7 +21858,7 @@
       <w:pPr>
         <w:pStyle w:val="NoSpacing"/>
       </w:pPr>
-      <w:hyperlink r:id="rId29" w:history="1">
+      <w:hyperlink r:id="rId30" w:history="1">
         <w:r>
           <w:rPr>
             <w:rStyle w:val="Hyperlink"/>
@@ -21781,7 +21884,7 @@
       <w:pPr>
         <w:pStyle w:val="NoSpacing"/>
       </w:pPr>
-      <w:hyperlink r:id="rId30" w:history="1">
+      <w:hyperlink r:id="rId31" w:history="1">
         <w:r>
           <w:rPr>
             <w:rStyle w:val="Hyperlink"/>
@@ -21981,7 +22084,7 @@
         <w:rFonts w:ascii="Symbol" w:eastAsiaTheme="minorHAnsi" w:hAnsi="Symbol" w:cstheme="minorBidi" w:hint="default"/>
       </w:rPr>
     </w:lvl>
-    <w:lvl w:ilvl="1" w:tplc="08090003" w:tentative="1">
+    <w:lvl w:ilvl="1" w:tplc="08090003">
       <w:start w:val="1"/>
       <w:numFmt w:val="bullet"/>
       <w:lvlText w:val="o"/>
@@ -23130,7 +23233,6 @@
   <w:style w:type="character" w:default="1" w:styleId="DefaultParagraphFont">
     <w:name w:val="Default Paragraph Font"/>
     <w:uiPriority w:val="1"/>
-    <w:semiHidden/>
     <w:unhideWhenUsed/>
   </w:style>
   <w:style w:type="table" w:default="1" w:styleId="TableNormal">

</xml_diff>

<commit_message>
heb een kleine tabel gemaakt met de pins
</commit_message>
<xml_diff>
--- a/ANE21_PCB.docx
+++ b/ANE21_PCB.docx
@@ -985,7 +985,7 @@
           <w:noProof/>
         </w:rPr>
         <w:drawing>
-          <wp:inline distT="0" distB="0" distL="0" distR="0" wp14:anchorId="38772D56" wp14:editId="717EFC66">
+          <wp:inline distT="0" distB="0" distL="0" distR="0" wp14:anchorId="38772D56" wp14:editId="67361461">
             <wp:extent cx="3432062" cy="1661886"/>
             <wp:effectExtent l="0" t="0" r="0" b="0"/>
             <wp:docPr id="518631005" name="Picture 1" descr="USB C OTG Wiring Diagram For Cable, Schematic, DIY &amp; Manufacturing -"/>
@@ -2235,7 +2235,15 @@
         <w:ind w:left="720"/>
       </w:pPr>
       <w:r>
-        <w:t xml:space="preserve">Extra usb </w:t>
+        <w:t xml:space="preserve">Extra </w:t>
+      </w:r>
+      <w:proofErr w:type="spellStart"/>
+      <w:r>
+        <w:t>usb</w:t>
+      </w:r>
+      <w:proofErr w:type="spellEnd"/>
+      <w:r>
+        <w:t xml:space="preserve"> </w:t>
       </w:r>
       <w:proofErr w:type="spellStart"/>
       <w:r>
@@ -2463,7 +2471,6 @@
         <w:rPr>
           <w:lang w:val="en-GB"/>
         </w:rPr>
-        <w:lastRenderedPageBreak/>
         <w:t>Pin definitions per unit</w:t>
       </w:r>
       <w:bookmarkEnd w:id="0"/>
@@ -4811,7 +4818,7 @@
           <w:noProof/>
         </w:rPr>
         <w:drawing>
-          <wp:inline distT="0" distB="0" distL="0" distR="0" wp14:anchorId="3CE9DA6B" wp14:editId="3E919146">
+          <wp:inline distT="0" distB="0" distL="0" distR="0" wp14:anchorId="3CE9DA6B" wp14:editId="794BACEE">
             <wp:extent cx="1097280" cy="1222749"/>
             <wp:effectExtent l="0" t="0" r="7620" b="0"/>
             <wp:docPr id="958528632" name="Picture 4" descr="What is Micro USB OTG (On-The-Go)? Build DIY OTG Cable"/>
@@ -4880,7 +4887,6 @@
         <w:rPr>
           <w:rStyle w:val="Heading3Char"/>
         </w:rPr>
-        <w:lastRenderedPageBreak/>
         <w:t>HDMI</w:t>
       </w:r>
       <w:bookmarkEnd w:id="3"/>
@@ -6367,7 +6373,7 @@
           <w:noProof/>
         </w:rPr>
         <w:drawing>
-          <wp:inline distT="0" distB="0" distL="0" distR="0" wp14:anchorId="2020065A" wp14:editId="27493561">
+          <wp:inline distT="0" distB="0" distL="0" distR="0" wp14:anchorId="2020065A" wp14:editId="6D01CE13">
             <wp:extent cx="2719346" cy="2008025"/>
             <wp:effectExtent l="0" t="0" r="5080" b="0"/>
             <wp:docPr id="619101385" name="Picture 1" descr="Does HDMI 2.0 Support 1080p 120Hz? Addressing HDMI Questions ..."/>
@@ -7551,7 +7557,6 @@
               <w:rPr>
                 <w:lang w:val="nl-NL"/>
               </w:rPr>
-              <w:lastRenderedPageBreak/>
               <w:t>PETn0</w:t>
             </w:r>
           </w:p>
@@ -9098,7 +9103,6 @@
         <w:rPr>
           <w:rStyle w:val="Heading3Char"/>
         </w:rPr>
-        <w:lastRenderedPageBreak/>
         <w:t>Ethernet</w:t>
       </w:r>
       <w:bookmarkEnd w:id="5"/>
@@ -10423,7 +10427,6 @@
         <w:rPr>
           <w:lang w:val="en-GB"/>
         </w:rPr>
-        <w:lastRenderedPageBreak/>
         <w:t>Pinout table</w:t>
       </w:r>
       <w:bookmarkEnd w:id="7"/>
@@ -15376,7 +15379,6 @@
               <w:pStyle w:val="NoSpacing"/>
             </w:pPr>
             <w:r>
-              <w:lastRenderedPageBreak/>
               <w:t>55</w:t>
             </w:r>
           </w:p>
@@ -16947,7 +16949,6 @@
               <w:pStyle w:val="NoSpacing"/>
             </w:pPr>
             <w:r>
-              <w:lastRenderedPageBreak/>
               <w:t>110</w:t>
             </w:r>
           </w:p>
@@ -18512,7 +18513,6 @@
               <w:pStyle w:val="NoSpacing"/>
             </w:pPr>
             <w:r>
-              <w:lastRenderedPageBreak/>
               <w:t>163</w:t>
             </w:r>
           </w:p>
@@ -19545,12 +19545,2048 @@
       </w:r>
     </w:p>
     <w:p>
+      <w:r>
+        <w:t>GPIO pinnen die misschien nodig zijn:</w:t>
+      </w:r>
+    </w:p>
+    <w:tbl>
+      <w:tblPr>
+        <w:tblStyle w:val="TableGrid"/>
+        <w:tblW w:w="0" w:type="auto"/>
+        <w:tblLook w:val="04A0" w:firstRow="1" w:lastRow="0" w:firstColumn="1" w:lastColumn="0" w:noHBand="0" w:noVBand="1"/>
+      </w:tblPr>
+      <w:tblGrid>
+        <w:gridCol w:w="956"/>
+        <w:gridCol w:w="1156"/>
+        <w:gridCol w:w="2435"/>
+      </w:tblGrid>
+      <w:tr>
+        <w:tc>
+          <w:tcPr>
+            <w:tcW w:w="0" w:type="auto"/>
+            <w:hideMark/>
+          </w:tcPr>
+          <w:p>
+            <w:pPr>
+              <w:spacing w:after="160" w:line="278" w:lineRule="auto"/>
+              <w:rPr>
+                <w:b/>
+                <w:bCs/>
+                <w:sz w:val="20"/>
+                <w:szCs w:val="20"/>
+              </w:rPr>
+            </w:pPr>
+            <w:r>
+              <w:rPr>
+                <w:b/>
+                <w:bCs/>
+                <w:sz w:val="20"/>
+                <w:szCs w:val="20"/>
+              </w:rPr>
+              <w:t>CM4 pin</w:t>
+            </w:r>
+          </w:p>
+        </w:tc>
+        <w:tc>
+          <w:tcPr>
+            <w:tcW w:w="0" w:type="auto"/>
+            <w:hideMark/>
+          </w:tcPr>
+          <w:p>
+            <w:pPr>
+              <w:spacing w:after="160" w:line="278" w:lineRule="auto"/>
+              <w:rPr>
+                <w:b/>
+                <w:bCs/>
+                <w:sz w:val="20"/>
+                <w:szCs w:val="20"/>
+              </w:rPr>
+            </w:pPr>
+            <w:r>
+              <w:rPr>
+                <w:b/>
+                <w:bCs/>
+                <w:sz w:val="20"/>
+                <w:szCs w:val="20"/>
+              </w:rPr>
+              <w:t>BCM GPIO</w:t>
+            </w:r>
+          </w:p>
+        </w:tc>
+        <w:tc>
+          <w:tcPr>
+            <w:tcW w:w="0" w:type="auto"/>
+            <w:hideMark/>
+          </w:tcPr>
+          <w:p>
+            <w:pPr>
+              <w:spacing w:after="160" w:line="278" w:lineRule="auto"/>
+              <w:rPr>
+                <w:b/>
+                <w:bCs/>
+                <w:sz w:val="20"/>
+                <w:szCs w:val="20"/>
+              </w:rPr>
+            </w:pPr>
+            <w:r>
+              <w:rPr>
+                <w:b/>
+                <w:bCs/>
+                <w:sz w:val="20"/>
+                <w:szCs w:val="20"/>
+              </w:rPr>
+              <w:t>Handig voor</w:t>
+            </w:r>
+          </w:p>
+        </w:tc>
+      </w:tr>
+      <w:tr>
+        <w:tc>
+          <w:tcPr>
+            <w:tcW w:w="0" w:type="auto"/>
+            <w:hideMark/>
+          </w:tcPr>
+          <w:p>
+            <w:pPr>
+              <w:spacing w:after="160" w:line="278" w:lineRule="auto"/>
+              <w:rPr>
+                <w:sz w:val="20"/>
+                <w:szCs w:val="20"/>
+              </w:rPr>
+            </w:pPr>
+            <w:r>
+              <w:rPr>
+                <w:sz w:val="20"/>
+                <w:szCs w:val="20"/>
+              </w:rPr>
+              <w:t>24</w:t>
+            </w:r>
+          </w:p>
+        </w:tc>
+        <w:tc>
+          <w:tcPr>
+            <w:tcW w:w="0" w:type="auto"/>
+            <w:hideMark/>
+          </w:tcPr>
+          <w:p>
+            <w:pPr>
+              <w:spacing w:after="160" w:line="278" w:lineRule="auto"/>
+              <w:rPr>
+                <w:sz w:val="20"/>
+                <w:szCs w:val="20"/>
+              </w:rPr>
+            </w:pPr>
+            <w:r>
+              <w:rPr>
+                <w:sz w:val="20"/>
+                <w:szCs w:val="20"/>
+              </w:rPr>
+              <w:t>GPIO26</w:t>
+            </w:r>
+          </w:p>
+        </w:tc>
+        <w:tc>
+          <w:tcPr>
+            <w:tcW w:w="0" w:type="auto"/>
+            <w:hideMark/>
+          </w:tcPr>
+          <w:p>
+            <w:pPr>
+              <w:spacing w:after="160" w:line="278" w:lineRule="auto"/>
+              <w:rPr>
+                <w:sz w:val="20"/>
+                <w:szCs w:val="20"/>
+              </w:rPr>
+            </w:pPr>
+            <w:r>
+              <w:rPr>
+                <w:sz w:val="20"/>
+                <w:szCs w:val="20"/>
+              </w:rPr>
+              <w:t xml:space="preserve">GPIO / extra CS / </w:t>
+            </w:r>
+            <w:proofErr w:type="spellStart"/>
+            <w:r>
+              <w:rPr>
+                <w:sz w:val="20"/>
+                <w:szCs w:val="20"/>
+              </w:rPr>
+              <w:t>interrupt</w:t>
+            </w:r>
+            <w:proofErr w:type="spellEnd"/>
+          </w:p>
+        </w:tc>
+      </w:tr>
+      <w:tr>
+        <w:tc>
+          <w:tcPr>
+            <w:tcW w:w="0" w:type="auto"/>
+            <w:hideMark/>
+          </w:tcPr>
+          <w:p>
+            <w:pPr>
+              <w:spacing w:after="160" w:line="278" w:lineRule="auto"/>
+              <w:rPr>
+                <w:sz w:val="20"/>
+                <w:szCs w:val="20"/>
+              </w:rPr>
+            </w:pPr>
+            <w:r>
+              <w:rPr>
+                <w:sz w:val="20"/>
+                <w:szCs w:val="20"/>
+              </w:rPr>
+              <w:t>25</w:t>
+            </w:r>
+          </w:p>
+        </w:tc>
+        <w:tc>
+          <w:tcPr>
+            <w:tcW w:w="0" w:type="auto"/>
+            <w:hideMark/>
+          </w:tcPr>
+          <w:p>
+            <w:pPr>
+              <w:spacing w:after="160" w:line="278" w:lineRule="auto"/>
+              <w:rPr>
+                <w:sz w:val="20"/>
+                <w:szCs w:val="20"/>
+              </w:rPr>
+            </w:pPr>
+            <w:r>
+              <w:rPr>
+                <w:sz w:val="20"/>
+                <w:szCs w:val="20"/>
+              </w:rPr>
+              <w:t>GPIO21</w:t>
+            </w:r>
+          </w:p>
+        </w:tc>
+        <w:tc>
+          <w:tcPr>
+            <w:tcW w:w="0" w:type="auto"/>
+            <w:hideMark/>
+          </w:tcPr>
+          <w:p>
+            <w:pPr>
+              <w:spacing w:after="160" w:line="278" w:lineRule="auto"/>
+              <w:rPr>
+                <w:sz w:val="20"/>
+                <w:szCs w:val="20"/>
+              </w:rPr>
+            </w:pPr>
+            <w:r>
+              <w:rPr>
+                <w:sz w:val="20"/>
+                <w:szCs w:val="20"/>
+              </w:rPr>
+              <w:t>GPIO / SPI1 SCLK alt</w:t>
+            </w:r>
+          </w:p>
+        </w:tc>
+      </w:tr>
+      <w:tr>
+        <w:tc>
+          <w:tcPr>
+            <w:tcW w:w="0" w:type="auto"/>
+            <w:hideMark/>
+          </w:tcPr>
+          <w:p>
+            <w:pPr>
+              <w:spacing w:after="160" w:line="278" w:lineRule="auto"/>
+              <w:rPr>
+                <w:sz w:val="20"/>
+                <w:szCs w:val="20"/>
+              </w:rPr>
+            </w:pPr>
+            <w:r>
+              <w:rPr>
+                <w:sz w:val="20"/>
+                <w:szCs w:val="20"/>
+              </w:rPr>
+              <w:t>26</w:t>
+            </w:r>
+          </w:p>
+        </w:tc>
+        <w:tc>
+          <w:tcPr>
+            <w:tcW w:w="0" w:type="auto"/>
+            <w:hideMark/>
+          </w:tcPr>
+          <w:p>
+            <w:pPr>
+              <w:spacing w:after="160" w:line="278" w:lineRule="auto"/>
+              <w:rPr>
+                <w:sz w:val="20"/>
+                <w:szCs w:val="20"/>
+              </w:rPr>
+            </w:pPr>
+            <w:r>
+              <w:rPr>
+                <w:sz w:val="20"/>
+                <w:szCs w:val="20"/>
+              </w:rPr>
+              <w:t>GPIO19</w:t>
+            </w:r>
+          </w:p>
+        </w:tc>
+        <w:tc>
+          <w:tcPr>
+            <w:tcW w:w="0" w:type="auto"/>
+            <w:hideMark/>
+          </w:tcPr>
+          <w:p>
+            <w:pPr>
+              <w:spacing w:after="160" w:line="278" w:lineRule="auto"/>
+              <w:rPr>
+                <w:sz w:val="20"/>
+                <w:szCs w:val="20"/>
+              </w:rPr>
+            </w:pPr>
+            <w:r>
+              <w:rPr>
+                <w:sz w:val="20"/>
+                <w:szCs w:val="20"/>
+              </w:rPr>
+              <w:t>SPI1 MISO / PWM / GPIO</w:t>
+            </w:r>
+          </w:p>
+        </w:tc>
+      </w:tr>
+      <w:tr>
+        <w:tc>
+          <w:tcPr>
+            <w:tcW w:w="0" w:type="auto"/>
+            <w:hideMark/>
+          </w:tcPr>
+          <w:p>
+            <w:pPr>
+              <w:spacing w:after="160" w:line="278" w:lineRule="auto"/>
+              <w:rPr>
+                <w:sz w:val="20"/>
+                <w:szCs w:val="20"/>
+              </w:rPr>
+            </w:pPr>
+            <w:r>
+              <w:rPr>
+                <w:sz w:val="20"/>
+                <w:szCs w:val="20"/>
+              </w:rPr>
+              <w:t>27</w:t>
+            </w:r>
+          </w:p>
+        </w:tc>
+        <w:tc>
+          <w:tcPr>
+            <w:tcW w:w="0" w:type="auto"/>
+            <w:hideMark/>
+          </w:tcPr>
+          <w:p>
+            <w:pPr>
+              <w:spacing w:after="160" w:line="278" w:lineRule="auto"/>
+              <w:rPr>
+                <w:sz w:val="20"/>
+                <w:szCs w:val="20"/>
+              </w:rPr>
+            </w:pPr>
+            <w:r>
+              <w:rPr>
+                <w:sz w:val="20"/>
+                <w:szCs w:val="20"/>
+              </w:rPr>
+              <w:t>GPIO20</w:t>
+            </w:r>
+          </w:p>
+        </w:tc>
+        <w:tc>
+          <w:tcPr>
+            <w:tcW w:w="0" w:type="auto"/>
+            <w:hideMark/>
+          </w:tcPr>
+          <w:p>
+            <w:pPr>
+              <w:spacing w:after="160" w:line="278" w:lineRule="auto"/>
+              <w:rPr>
+                <w:sz w:val="20"/>
+                <w:szCs w:val="20"/>
+              </w:rPr>
+            </w:pPr>
+            <w:r>
+              <w:rPr>
+                <w:sz w:val="20"/>
+                <w:szCs w:val="20"/>
+              </w:rPr>
+              <w:t>SPI1 MOSI / GPIO</w:t>
+            </w:r>
+          </w:p>
+        </w:tc>
+      </w:tr>
+      <w:tr>
+        <w:tc>
+          <w:tcPr>
+            <w:tcW w:w="0" w:type="auto"/>
+            <w:hideMark/>
+          </w:tcPr>
+          <w:p>
+            <w:pPr>
+              <w:spacing w:after="160" w:line="278" w:lineRule="auto"/>
+              <w:rPr>
+                <w:sz w:val="20"/>
+                <w:szCs w:val="20"/>
+              </w:rPr>
+            </w:pPr>
+            <w:r>
+              <w:rPr>
+                <w:sz w:val="20"/>
+                <w:szCs w:val="20"/>
+              </w:rPr>
+              <w:t>28</w:t>
+            </w:r>
+          </w:p>
+        </w:tc>
+        <w:tc>
+          <w:tcPr>
+            <w:tcW w:w="0" w:type="auto"/>
+            <w:hideMark/>
+          </w:tcPr>
+          <w:p>
+            <w:pPr>
+              <w:spacing w:after="160" w:line="278" w:lineRule="auto"/>
+              <w:rPr>
+                <w:sz w:val="20"/>
+                <w:szCs w:val="20"/>
+              </w:rPr>
+            </w:pPr>
+            <w:r>
+              <w:rPr>
+                <w:sz w:val="20"/>
+                <w:szCs w:val="20"/>
+              </w:rPr>
+              <w:t>GPIO13</w:t>
+            </w:r>
+          </w:p>
+        </w:tc>
+        <w:tc>
+          <w:tcPr>
+            <w:tcW w:w="0" w:type="auto"/>
+            <w:hideMark/>
+          </w:tcPr>
+          <w:p>
+            <w:pPr>
+              <w:spacing w:after="160" w:line="278" w:lineRule="auto"/>
+              <w:rPr>
+                <w:sz w:val="20"/>
+                <w:szCs w:val="20"/>
+              </w:rPr>
+            </w:pPr>
+            <w:r>
+              <w:rPr>
+                <w:sz w:val="20"/>
+                <w:szCs w:val="20"/>
+              </w:rPr>
+              <w:t>PWM / GPIO</w:t>
+            </w:r>
+          </w:p>
+        </w:tc>
+      </w:tr>
+      <w:tr>
+        <w:tc>
+          <w:tcPr>
+            <w:tcW w:w="0" w:type="auto"/>
+            <w:hideMark/>
+          </w:tcPr>
+          <w:p>
+            <w:pPr>
+              <w:spacing w:after="160" w:line="278" w:lineRule="auto"/>
+              <w:rPr>
+                <w:sz w:val="20"/>
+                <w:szCs w:val="20"/>
+              </w:rPr>
+            </w:pPr>
+            <w:r>
+              <w:rPr>
+                <w:sz w:val="20"/>
+                <w:szCs w:val="20"/>
+              </w:rPr>
+              <w:t>29</w:t>
+            </w:r>
+          </w:p>
+        </w:tc>
+        <w:tc>
+          <w:tcPr>
+            <w:tcW w:w="0" w:type="auto"/>
+            <w:hideMark/>
+          </w:tcPr>
+          <w:p>
+            <w:pPr>
+              <w:spacing w:after="160" w:line="278" w:lineRule="auto"/>
+              <w:rPr>
+                <w:sz w:val="20"/>
+                <w:szCs w:val="20"/>
+              </w:rPr>
+            </w:pPr>
+            <w:r>
+              <w:rPr>
+                <w:sz w:val="20"/>
+                <w:szCs w:val="20"/>
+              </w:rPr>
+              <w:t>GPIO16</w:t>
+            </w:r>
+          </w:p>
+        </w:tc>
+        <w:tc>
+          <w:tcPr>
+            <w:tcW w:w="0" w:type="auto"/>
+            <w:hideMark/>
+          </w:tcPr>
+          <w:p>
+            <w:pPr>
+              <w:spacing w:after="160" w:line="278" w:lineRule="auto"/>
+              <w:rPr>
+                <w:sz w:val="20"/>
+                <w:szCs w:val="20"/>
+              </w:rPr>
+            </w:pPr>
+            <w:r>
+              <w:rPr>
+                <w:sz w:val="20"/>
+                <w:szCs w:val="20"/>
+              </w:rPr>
+              <w:t>GPIO / SPI1 CE2 alt</w:t>
+            </w:r>
+          </w:p>
+        </w:tc>
+      </w:tr>
+      <w:tr>
+        <w:tc>
+          <w:tcPr>
+            <w:tcW w:w="0" w:type="auto"/>
+            <w:hideMark/>
+          </w:tcPr>
+          <w:p>
+            <w:pPr>
+              <w:spacing w:after="160" w:line="278" w:lineRule="auto"/>
+              <w:rPr>
+                <w:sz w:val="20"/>
+                <w:szCs w:val="20"/>
+              </w:rPr>
+            </w:pPr>
+            <w:r>
+              <w:rPr>
+                <w:sz w:val="20"/>
+                <w:szCs w:val="20"/>
+              </w:rPr>
+              <w:t>30</w:t>
+            </w:r>
+          </w:p>
+        </w:tc>
+        <w:tc>
+          <w:tcPr>
+            <w:tcW w:w="0" w:type="auto"/>
+            <w:hideMark/>
+          </w:tcPr>
+          <w:p>
+            <w:pPr>
+              <w:spacing w:after="160" w:line="278" w:lineRule="auto"/>
+              <w:rPr>
+                <w:sz w:val="20"/>
+                <w:szCs w:val="20"/>
+              </w:rPr>
+            </w:pPr>
+            <w:r>
+              <w:rPr>
+                <w:sz w:val="20"/>
+                <w:szCs w:val="20"/>
+              </w:rPr>
+              <w:t>GPIO6</w:t>
+            </w:r>
+          </w:p>
+        </w:tc>
+        <w:tc>
+          <w:tcPr>
+            <w:tcW w:w="0" w:type="auto"/>
+            <w:hideMark/>
+          </w:tcPr>
+          <w:p>
+            <w:pPr>
+              <w:spacing w:after="160" w:line="278" w:lineRule="auto"/>
+              <w:rPr>
+                <w:sz w:val="20"/>
+                <w:szCs w:val="20"/>
+              </w:rPr>
+            </w:pPr>
+            <w:r>
+              <w:rPr>
+                <w:sz w:val="20"/>
+                <w:szCs w:val="20"/>
+              </w:rPr>
+              <w:t>GPIO / I2C alt</w:t>
+            </w:r>
+          </w:p>
+        </w:tc>
+      </w:tr>
+      <w:tr>
+        <w:tc>
+          <w:tcPr>
+            <w:tcW w:w="0" w:type="auto"/>
+            <w:hideMark/>
+          </w:tcPr>
+          <w:p>
+            <w:pPr>
+              <w:spacing w:after="160" w:line="278" w:lineRule="auto"/>
+              <w:rPr>
+                <w:sz w:val="20"/>
+                <w:szCs w:val="20"/>
+              </w:rPr>
+            </w:pPr>
+            <w:r>
+              <w:rPr>
+                <w:sz w:val="20"/>
+                <w:szCs w:val="20"/>
+              </w:rPr>
+              <w:t>31</w:t>
+            </w:r>
+          </w:p>
+        </w:tc>
+        <w:tc>
+          <w:tcPr>
+            <w:tcW w:w="0" w:type="auto"/>
+            <w:hideMark/>
+          </w:tcPr>
+          <w:p>
+            <w:pPr>
+              <w:spacing w:after="160" w:line="278" w:lineRule="auto"/>
+              <w:rPr>
+                <w:sz w:val="20"/>
+                <w:szCs w:val="20"/>
+              </w:rPr>
+            </w:pPr>
+            <w:r>
+              <w:rPr>
+                <w:sz w:val="20"/>
+                <w:szCs w:val="20"/>
+              </w:rPr>
+              <w:t>GPIO12</w:t>
+            </w:r>
+          </w:p>
+        </w:tc>
+        <w:tc>
+          <w:tcPr>
+            <w:tcW w:w="0" w:type="auto"/>
+            <w:hideMark/>
+          </w:tcPr>
+          <w:p>
+            <w:pPr>
+              <w:spacing w:after="160" w:line="278" w:lineRule="auto"/>
+              <w:rPr>
+                <w:sz w:val="20"/>
+                <w:szCs w:val="20"/>
+              </w:rPr>
+            </w:pPr>
+            <w:r>
+              <w:rPr>
+                <w:sz w:val="20"/>
+                <w:szCs w:val="20"/>
+              </w:rPr>
+              <w:t>PWM / GPIO</w:t>
+            </w:r>
+          </w:p>
+        </w:tc>
+      </w:tr>
+      <w:tr>
+        <w:tc>
+          <w:tcPr>
+            <w:tcW w:w="0" w:type="auto"/>
+            <w:hideMark/>
+          </w:tcPr>
+          <w:p>
+            <w:pPr>
+              <w:spacing w:after="160" w:line="278" w:lineRule="auto"/>
+              <w:rPr>
+                <w:sz w:val="20"/>
+                <w:szCs w:val="20"/>
+              </w:rPr>
+            </w:pPr>
+            <w:r>
+              <w:rPr>
+                <w:sz w:val="20"/>
+                <w:szCs w:val="20"/>
+              </w:rPr>
+              <w:t>34</w:t>
+            </w:r>
+          </w:p>
+        </w:tc>
+        <w:tc>
+          <w:tcPr>
+            <w:tcW w:w="0" w:type="auto"/>
+            <w:hideMark/>
+          </w:tcPr>
+          <w:p>
+            <w:pPr>
+              <w:spacing w:after="160" w:line="278" w:lineRule="auto"/>
+              <w:rPr>
+                <w:sz w:val="20"/>
+                <w:szCs w:val="20"/>
+              </w:rPr>
+            </w:pPr>
+            <w:r>
+              <w:rPr>
+                <w:sz w:val="20"/>
+                <w:szCs w:val="20"/>
+              </w:rPr>
+              <w:t>GPIO5</w:t>
+            </w:r>
+          </w:p>
+        </w:tc>
+        <w:tc>
+          <w:tcPr>
+            <w:tcW w:w="0" w:type="auto"/>
+            <w:hideMark/>
+          </w:tcPr>
+          <w:p>
+            <w:pPr>
+              <w:spacing w:after="160" w:line="278" w:lineRule="auto"/>
+              <w:rPr>
+                <w:sz w:val="20"/>
+                <w:szCs w:val="20"/>
+              </w:rPr>
+            </w:pPr>
+            <w:r>
+              <w:rPr>
+                <w:sz w:val="20"/>
+                <w:szCs w:val="20"/>
+              </w:rPr>
+              <w:t>GPIO / I2C alt</w:t>
+            </w:r>
+          </w:p>
+        </w:tc>
+      </w:tr>
+      <w:tr>
+        <w:tc>
+          <w:tcPr>
+            <w:tcW w:w="0" w:type="auto"/>
+            <w:hideMark/>
+          </w:tcPr>
+          <w:p>
+            <w:pPr>
+              <w:spacing w:after="160" w:line="278" w:lineRule="auto"/>
+              <w:rPr>
+                <w:sz w:val="20"/>
+                <w:szCs w:val="20"/>
+              </w:rPr>
+            </w:pPr>
+            <w:r>
+              <w:rPr>
+                <w:sz w:val="20"/>
+                <w:szCs w:val="20"/>
+              </w:rPr>
+              <w:t>35</w:t>
+            </w:r>
+          </w:p>
+        </w:tc>
+        <w:tc>
+          <w:tcPr>
+            <w:tcW w:w="0" w:type="auto"/>
+            <w:hideMark/>
+          </w:tcPr>
+          <w:p>
+            <w:pPr>
+              <w:spacing w:after="160" w:line="278" w:lineRule="auto"/>
+              <w:rPr>
+                <w:sz w:val="20"/>
+                <w:szCs w:val="20"/>
+              </w:rPr>
+            </w:pPr>
+            <w:r>
+              <w:rPr>
+                <w:sz w:val="20"/>
+                <w:szCs w:val="20"/>
+              </w:rPr>
+              <w:t>GPIO1</w:t>
+            </w:r>
+          </w:p>
+        </w:tc>
+        <w:tc>
+          <w:tcPr>
+            <w:tcW w:w="0" w:type="auto"/>
+            <w:hideMark/>
+          </w:tcPr>
+          <w:p>
+            <w:pPr>
+              <w:spacing w:after="160" w:line="278" w:lineRule="auto"/>
+              <w:rPr>
+                <w:sz w:val="20"/>
+                <w:szCs w:val="20"/>
+              </w:rPr>
+            </w:pPr>
+            <w:r>
+              <w:rPr>
+                <w:b/>
+                <w:bCs/>
+                <w:sz w:val="20"/>
+                <w:szCs w:val="20"/>
+              </w:rPr>
+              <w:t>I2C0 SCL</w:t>
+            </w:r>
+          </w:p>
+        </w:tc>
+      </w:tr>
+      <w:tr>
+        <w:tc>
+          <w:tcPr>
+            <w:tcW w:w="0" w:type="auto"/>
+            <w:hideMark/>
+          </w:tcPr>
+          <w:p>
+            <w:pPr>
+              <w:spacing w:after="160" w:line="278" w:lineRule="auto"/>
+              <w:rPr>
+                <w:sz w:val="20"/>
+                <w:szCs w:val="20"/>
+              </w:rPr>
+            </w:pPr>
+            <w:r>
+              <w:rPr>
+                <w:sz w:val="20"/>
+                <w:szCs w:val="20"/>
+              </w:rPr>
+              <w:t>36</w:t>
+            </w:r>
+          </w:p>
+        </w:tc>
+        <w:tc>
+          <w:tcPr>
+            <w:tcW w:w="0" w:type="auto"/>
+            <w:hideMark/>
+          </w:tcPr>
+          <w:p>
+            <w:pPr>
+              <w:spacing w:after="160" w:line="278" w:lineRule="auto"/>
+              <w:rPr>
+                <w:sz w:val="20"/>
+                <w:szCs w:val="20"/>
+              </w:rPr>
+            </w:pPr>
+            <w:r>
+              <w:rPr>
+                <w:sz w:val="20"/>
+                <w:szCs w:val="20"/>
+              </w:rPr>
+              <w:t>GPIO0</w:t>
+            </w:r>
+          </w:p>
+        </w:tc>
+        <w:tc>
+          <w:tcPr>
+            <w:tcW w:w="0" w:type="auto"/>
+            <w:hideMark/>
+          </w:tcPr>
+          <w:p>
+            <w:pPr>
+              <w:spacing w:after="160" w:line="278" w:lineRule="auto"/>
+              <w:rPr>
+                <w:sz w:val="20"/>
+                <w:szCs w:val="20"/>
+              </w:rPr>
+            </w:pPr>
+            <w:r>
+              <w:rPr>
+                <w:b/>
+                <w:bCs/>
+                <w:sz w:val="20"/>
+                <w:szCs w:val="20"/>
+              </w:rPr>
+              <w:t>I2C0 SDA</w:t>
+            </w:r>
+          </w:p>
+        </w:tc>
+      </w:tr>
+      <w:tr>
+        <w:tc>
+          <w:tcPr>
+            <w:tcW w:w="0" w:type="auto"/>
+            <w:hideMark/>
+          </w:tcPr>
+          <w:p>
+            <w:pPr>
+              <w:spacing w:after="160" w:line="278" w:lineRule="auto"/>
+              <w:rPr>
+                <w:sz w:val="20"/>
+                <w:szCs w:val="20"/>
+              </w:rPr>
+            </w:pPr>
+            <w:r>
+              <w:rPr>
+                <w:sz w:val="20"/>
+                <w:szCs w:val="20"/>
+              </w:rPr>
+              <w:t>37</w:t>
+            </w:r>
+          </w:p>
+        </w:tc>
+        <w:tc>
+          <w:tcPr>
+            <w:tcW w:w="0" w:type="auto"/>
+            <w:hideMark/>
+          </w:tcPr>
+          <w:p>
+            <w:pPr>
+              <w:spacing w:after="160" w:line="278" w:lineRule="auto"/>
+              <w:rPr>
+                <w:sz w:val="20"/>
+                <w:szCs w:val="20"/>
+              </w:rPr>
+            </w:pPr>
+            <w:r>
+              <w:rPr>
+                <w:sz w:val="20"/>
+                <w:szCs w:val="20"/>
+              </w:rPr>
+              <w:t>GPIO7</w:t>
+            </w:r>
+          </w:p>
+        </w:tc>
+        <w:tc>
+          <w:tcPr>
+            <w:tcW w:w="0" w:type="auto"/>
+            <w:hideMark/>
+          </w:tcPr>
+          <w:p>
+            <w:pPr>
+              <w:spacing w:after="160" w:line="278" w:lineRule="auto"/>
+              <w:rPr>
+                <w:sz w:val="20"/>
+                <w:szCs w:val="20"/>
+              </w:rPr>
+            </w:pPr>
+            <w:r>
+              <w:rPr>
+                <w:b/>
+                <w:bCs/>
+                <w:sz w:val="20"/>
+                <w:szCs w:val="20"/>
+              </w:rPr>
+              <w:t>SPI0 CE1</w:t>
+            </w:r>
+          </w:p>
+        </w:tc>
+      </w:tr>
+      <w:tr>
+        <w:tc>
+          <w:tcPr>
+            <w:tcW w:w="0" w:type="auto"/>
+            <w:hideMark/>
+          </w:tcPr>
+          <w:p>
+            <w:pPr>
+              <w:spacing w:after="160" w:line="278" w:lineRule="auto"/>
+              <w:rPr>
+                <w:sz w:val="20"/>
+                <w:szCs w:val="20"/>
+              </w:rPr>
+            </w:pPr>
+            <w:r>
+              <w:rPr>
+                <w:sz w:val="20"/>
+                <w:szCs w:val="20"/>
+              </w:rPr>
+              <w:t>38</w:t>
+            </w:r>
+          </w:p>
+        </w:tc>
+        <w:tc>
+          <w:tcPr>
+            <w:tcW w:w="0" w:type="auto"/>
+            <w:hideMark/>
+          </w:tcPr>
+          <w:p>
+            <w:pPr>
+              <w:spacing w:after="160" w:line="278" w:lineRule="auto"/>
+              <w:rPr>
+                <w:sz w:val="20"/>
+                <w:szCs w:val="20"/>
+              </w:rPr>
+            </w:pPr>
+            <w:r>
+              <w:rPr>
+                <w:sz w:val="20"/>
+                <w:szCs w:val="20"/>
+              </w:rPr>
+              <w:t>GPIO11</w:t>
+            </w:r>
+          </w:p>
+        </w:tc>
+        <w:tc>
+          <w:tcPr>
+            <w:tcW w:w="0" w:type="auto"/>
+            <w:hideMark/>
+          </w:tcPr>
+          <w:p>
+            <w:pPr>
+              <w:spacing w:after="160" w:line="278" w:lineRule="auto"/>
+              <w:rPr>
+                <w:sz w:val="20"/>
+                <w:szCs w:val="20"/>
+              </w:rPr>
+            </w:pPr>
+            <w:r>
+              <w:rPr>
+                <w:b/>
+                <w:bCs/>
+                <w:sz w:val="20"/>
+                <w:szCs w:val="20"/>
+              </w:rPr>
+              <w:t>SPI0 SCLK</w:t>
+            </w:r>
+          </w:p>
+        </w:tc>
+      </w:tr>
+      <w:tr>
+        <w:tc>
+          <w:tcPr>
+            <w:tcW w:w="0" w:type="auto"/>
+            <w:hideMark/>
+          </w:tcPr>
+          <w:p>
+            <w:pPr>
+              <w:spacing w:after="160" w:line="278" w:lineRule="auto"/>
+              <w:rPr>
+                <w:sz w:val="20"/>
+                <w:szCs w:val="20"/>
+              </w:rPr>
+            </w:pPr>
+            <w:r>
+              <w:rPr>
+                <w:sz w:val="20"/>
+                <w:szCs w:val="20"/>
+              </w:rPr>
+              <w:t>39</w:t>
+            </w:r>
+          </w:p>
+        </w:tc>
+        <w:tc>
+          <w:tcPr>
+            <w:tcW w:w="0" w:type="auto"/>
+            <w:hideMark/>
+          </w:tcPr>
+          <w:p>
+            <w:pPr>
+              <w:spacing w:after="160" w:line="278" w:lineRule="auto"/>
+              <w:rPr>
+                <w:sz w:val="20"/>
+                <w:szCs w:val="20"/>
+              </w:rPr>
+            </w:pPr>
+            <w:r>
+              <w:rPr>
+                <w:sz w:val="20"/>
+                <w:szCs w:val="20"/>
+              </w:rPr>
+              <w:t>GPIO8</w:t>
+            </w:r>
+          </w:p>
+        </w:tc>
+        <w:tc>
+          <w:tcPr>
+            <w:tcW w:w="0" w:type="auto"/>
+            <w:hideMark/>
+          </w:tcPr>
+          <w:p>
+            <w:pPr>
+              <w:spacing w:after="160" w:line="278" w:lineRule="auto"/>
+              <w:rPr>
+                <w:sz w:val="20"/>
+                <w:szCs w:val="20"/>
+              </w:rPr>
+            </w:pPr>
+            <w:r>
+              <w:rPr>
+                <w:b/>
+                <w:bCs/>
+                <w:sz w:val="20"/>
+                <w:szCs w:val="20"/>
+              </w:rPr>
+              <w:t>SPI0 CE0</w:t>
+            </w:r>
+          </w:p>
+        </w:tc>
+      </w:tr>
+      <w:tr>
+        <w:tc>
+          <w:tcPr>
+            <w:tcW w:w="0" w:type="auto"/>
+            <w:hideMark/>
+          </w:tcPr>
+          <w:p>
+            <w:pPr>
+              <w:spacing w:after="160" w:line="278" w:lineRule="auto"/>
+              <w:rPr>
+                <w:sz w:val="20"/>
+                <w:szCs w:val="20"/>
+              </w:rPr>
+            </w:pPr>
+            <w:r>
+              <w:rPr>
+                <w:sz w:val="20"/>
+                <w:szCs w:val="20"/>
+              </w:rPr>
+              <w:t>40</w:t>
+            </w:r>
+          </w:p>
+        </w:tc>
+        <w:tc>
+          <w:tcPr>
+            <w:tcW w:w="0" w:type="auto"/>
+            <w:hideMark/>
+          </w:tcPr>
+          <w:p>
+            <w:pPr>
+              <w:spacing w:after="160" w:line="278" w:lineRule="auto"/>
+              <w:rPr>
+                <w:sz w:val="20"/>
+                <w:szCs w:val="20"/>
+              </w:rPr>
+            </w:pPr>
+            <w:r>
+              <w:rPr>
+                <w:sz w:val="20"/>
+                <w:szCs w:val="20"/>
+              </w:rPr>
+              <w:t>GPIO9</w:t>
+            </w:r>
+          </w:p>
+        </w:tc>
+        <w:tc>
+          <w:tcPr>
+            <w:tcW w:w="0" w:type="auto"/>
+            <w:hideMark/>
+          </w:tcPr>
+          <w:p>
+            <w:pPr>
+              <w:spacing w:after="160" w:line="278" w:lineRule="auto"/>
+              <w:rPr>
+                <w:sz w:val="20"/>
+                <w:szCs w:val="20"/>
+              </w:rPr>
+            </w:pPr>
+            <w:r>
+              <w:rPr>
+                <w:b/>
+                <w:bCs/>
+                <w:sz w:val="20"/>
+                <w:szCs w:val="20"/>
+              </w:rPr>
+              <w:t>SPI0 MISO</w:t>
+            </w:r>
+          </w:p>
+        </w:tc>
+      </w:tr>
+      <w:tr>
+        <w:tc>
+          <w:tcPr>
+            <w:tcW w:w="0" w:type="auto"/>
+            <w:hideMark/>
+          </w:tcPr>
+          <w:p>
+            <w:pPr>
+              <w:spacing w:after="160" w:line="278" w:lineRule="auto"/>
+              <w:rPr>
+                <w:sz w:val="20"/>
+                <w:szCs w:val="20"/>
+              </w:rPr>
+            </w:pPr>
+            <w:r>
+              <w:rPr>
+                <w:sz w:val="20"/>
+                <w:szCs w:val="20"/>
+              </w:rPr>
+              <w:t>41</w:t>
+            </w:r>
+          </w:p>
+        </w:tc>
+        <w:tc>
+          <w:tcPr>
+            <w:tcW w:w="0" w:type="auto"/>
+            <w:hideMark/>
+          </w:tcPr>
+          <w:p>
+            <w:pPr>
+              <w:spacing w:after="160" w:line="278" w:lineRule="auto"/>
+              <w:rPr>
+                <w:sz w:val="20"/>
+                <w:szCs w:val="20"/>
+              </w:rPr>
+            </w:pPr>
+            <w:r>
+              <w:rPr>
+                <w:sz w:val="20"/>
+                <w:szCs w:val="20"/>
+              </w:rPr>
+              <w:t>GPIO25</w:t>
+            </w:r>
+          </w:p>
+        </w:tc>
+        <w:tc>
+          <w:tcPr>
+            <w:tcW w:w="0" w:type="auto"/>
+            <w:hideMark/>
+          </w:tcPr>
+          <w:p>
+            <w:pPr>
+              <w:spacing w:after="160" w:line="278" w:lineRule="auto"/>
+              <w:rPr>
+                <w:sz w:val="20"/>
+                <w:szCs w:val="20"/>
+              </w:rPr>
+            </w:pPr>
+            <w:r>
+              <w:rPr>
+                <w:sz w:val="20"/>
+                <w:szCs w:val="20"/>
+              </w:rPr>
+              <w:t>GPIO</w:t>
+            </w:r>
+          </w:p>
+        </w:tc>
+      </w:tr>
+      <w:tr>
+        <w:tc>
+          <w:tcPr>
+            <w:tcW w:w="0" w:type="auto"/>
+            <w:hideMark/>
+          </w:tcPr>
+          <w:p>
+            <w:pPr>
+              <w:spacing w:after="160" w:line="278" w:lineRule="auto"/>
+              <w:rPr>
+                <w:sz w:val="20"/>
+                <w:szCs w:val="20"/>
+              </w:rPr>
+            </w:pPr>
+            <w:r>
+              <w:rPr>
+                <w:sz w:val="20"/>
+                <w:szCs w:val="20"/>
+              </w:rPr>
+              <w:t>44</w:t>
+            </w:r>
+          </w:p>
+        </w:tc>
+        <w:tc>
+          <w:tcPr>
+            <w:tcW w:w="0" w:type="auto"/>
+            <w:hideMark/>
+          </w:tcPr>
+          <w:p>
+            <w:pPr>
+              <w:spacing w:after="160" w:line="278" w:lineRule="auto"/>
+              <w:rPr>
+                <w:sz w:val="20"/>
+                <w:szCs w:val="20"/>
+              </w:rPr>
+            </w:pPr>
+            <w:r>
+              <w:rPr>
+                <w:sz w:val="20"/>
+                <w:szCs w:val="20"/>
+              </w:rPr>
+              <w:t>GPIO10</w:t>
+            </w:r>
+          </w:p>
+        </w:tc>
+        <w:tc>
+          <w:tcPr>
+            <w:tcW w:w="0" w:type="auto"/>
+            <w:hideMark/>
+          </w:tcPr>
+          <w:p>
+            <w:pPr>
+              <w:spacing w:after="160" w:line="278" w:lineRule="auto"/>
+              <w:rPr>
+                <w:sz w:val="20"/>
+                <w:szCs w:val="20"/>
+              </w:rPr>
+            </w:pPr>
+            <w:r>
+              <w:rPr>
+                <w:b/>
+                <w:bCs/>
+                <w:sz w:val="20"/>
+                <w:szCs w:val="20"/>
+              </w:rPr>
+              <w:t>SPI0 MOSI</w:t>
+            </w:r>
+          </w:p>
+        </w:tc>
+      </w:tr>
+      <w:tr>
+        <w:tc>
+          <w:tcPr>
+            <w:tcW w:w="0" w:type="auto"/>
+            <w:hideMark/>
+          </w:tcPr>
+          <w:p>
+            <w:pPr>
+              <w:spacing w:after="160" w:line="278" w:lineRule="auto"/>
+              <w:rPr>
+                <w:sz w:val="20"/>
+                <w:szCs w:val="20"/>
+              </w:rPr>
+            </w:pPr>
+            <w:r>
+              <w:rPr>
+                <w:sz w:val="20"/>
+                <w:szCs w:val="20"/>
+              </w:rPr>
+              <w:t>45</w:t>
+            </w:r>
+          </w:p>
+        </w:tc>
+        <w:tc>
+          <w:tcPr>
+            <w:tcW w:w="0" w:type="auto"/>
+            <w:hideMark/>
+          </w:tcPr>
+          <w:p>
+            <w:pPr>
+              <w:spacing w:after="160" w:line="278" w:lineRule="auto"/>
+              <w:rPr>
+                <w:sz w:val="20"/>
+                <w:szCs w:val="20"/>
+              </w:rPr>
+            </w:pPr>
+            <w:r>
+              <w:rPr>
+                <w:sz w:val="20"/>
+                <w:szCs w:val="20"/>
+              </w:rPr>
+              <w:t>GPIO24</w:t>
+            </w:r>
+          </w:p>
+        </w:tc>
+        <w:tc>
+          <w:tcPr>
+            <w:tcW w:w="0" w:type="auto"/>
+            <w:hideMark/>
+          </w:tcPr>
+          <w:p>
+            <w:pPr>
+              <w:spacing w:after="160" w:line="278" w:lineRule="auto"/>
+              <w:rPr>
+                <w:sz w:val="20"/>
+                <w:szCs w:val="20"/>
+              </w:rPr>
+            </w:pPr>
+            <w:r>
+              <w:rPr>
+                <w:sz w:val="20"/>
+                <w:szCs w:val="20"/>
+              </w:rPr>
+              <w:t>GPIO</w:t>
+            </w:r>
+          </w:p>
+        </w:tc>
+      </w:tr>
+      <w:tr>
+        <w:tc>
+          <w:tcPr>
+            <w:tcW w:w="0" w:type="auto"/>
+            <w:hideMark/>
+          </w:tcPr>
+          <w:p>
+            <w:pPr>
+              <w:spacing w:after="160" w:line="278" w:lineRule="auto"/>
+              <w:rPr>
+                <w:sz w:val="20"/>
+                <w:szCs w:val="20"/>
+              </w:rPr>
+            </w:pPr>
+            <w:r>
+              <w:rPr>
+                <w:sz w:val="20"/>
+                <w:szCs w:val="20"/>
+              </w:rPr>
+              <w:t>46</w:t>
+            </w:r>
+          </w:p>
+        </w:tc>
+        <w:tc>
+          <w:tcPr>
+            <w:tcW w:w="0" w:type="auto"/>
+            <w:hideMark/>
+          </w:tcPr>
+          <w:p>
+            <w:pPr>
+              <w:spacing w:after="160" w:line="278" w:lineRule="auto"/>
+              <w:rPr>
+                <w:sz w:val="20"/>
+                <w:szCs w:val="20"/>
+              </w:rPr>
+            </w:pPr>
+            <w:r>
+              <w:rPr>
+                <w:sz w:val="20"/>
+                <w:szCs w:val="20"/>
+              </w:rPr>
+              <w:t>GPIO22</w:t>
+            </w:r>
+          </w:p>
+        </w:tc>
+        <w:tc>
+          <w:tcPr>
+            <w:tcW w:w="0" w:type="auto"/>
+            <w:hideMark/>
+          </w:tcPr>
+          <w:p>
+            <w:pPr>
+              <w:spacing w:after="160" w:line="278" w:lineRule="auto"/>
+              <w:rPr>
+                <w:sz w:val="20"/>
+                <w:szCs w:val="20"/>
+              </w:rPr>
+            </w:pPr>
+            <w:r>
+              <w:rPr>
+                <w:sz w:val="20"/>
+                <w:szCs w:val="20"/>
+              </w:rPr>
+              <w:t>GPIO</w:t>
+            </w:r>
+          </w:p>
+        </w:tc>
+      </w:tr>
+      <w:tr>
+        <w:tc>
+          <w:tcPr>
+            <w:tcW w:w="0" w:type="auto"/>
+            <w:hideMark/>
+          </w:tcPr>
+          <w:p>
+            <w:pPr>
+              <w:spacing w:after="160" w:line="278" w:lineRule="auto"/>
+              <w:rPr>
+                <w:sz w:val="20"/>
+                <w:szCs w:val="20"/>
+              </w:rPr>
+            </w:pPr>
+            <w:r>
+              <w:rPr>
+                <w:sz w:val="20"/>
+                <w:szCs w:val="20"/>
+              </w:rPr>
+              <w:t>47</w:t>
+            </w:r>
+          </w:p>
+        </w:tc>
+        <w:tc>
+          <w:tcPr>
+            <w:tcW w:w="0" w:type="auto"/>
+            <w:hideMark/>
+          </w:tcPr>
+          <w:p>
+            <w:pPr>
+              <w:spacing w:after="160" w:line="278" w:lineRule="auto"/>
+              <w:rPr>
+                <w:sz w:val="20"/>
+                <w:szCs w:val="20"/>
+              </w:rPr>
+            </w:pPr>
+            <w:r>
+              <w:rPr>
+                <w:sz w:val="20"/>
+                <w:szCs w:val="20"/>
+              </w:rPr>
+              <w:t>GPIO23</w:t>
+            </w:r>
+          </w:p>
+        </w:tc>
+        <w:tc>
+          <w:tcPr>
+            <w:tcW w:w="0" w:type="auto"/>
+            <w:hideMark/>
+          </w:tcPr>
+          <w:p>
+            <w:pPr>
+              <w:spacing w:after="160" w:line="278" w:lineRule="auto"/>
+              <w:rPr>
+                <w:sz w:val="20"/>
+                <w:szCs w:val="20"/>
+              </w:rPr>
+            </w:pPr>
+            <w:r>
+              <w:rPr>
+                <w:sz w:val="20"/>
+                <w:szCs w:val="20"/>
+              </w:rPr>
+              <w:t>GPIO</w:t>
+            </w:r>
+          </w:p>
+        </w:tc>
+      </w:tr>
+      <w:tr>
+        <w:tc>
+          <w:tcPr>
+            <w:tcW w:w="0" w:type="auto"/>
+            <w:hideMark/>
+          </w:tcPr>
+          <w:p>
+            <w:pPr>
+              <w:spacing w:after="160" w:line="278" w:lineRule="auto"/>
+              <w:rPr>
+                <w:sz w:val="20"/>
+                <w:szCs w:val="20"/>
+              </w:rPr>
+            </w:pPr>
+            <w:r>
+              <w:rPr>
+                <w:sz w:val="20"/>
+                <w:szCs w:val="20"/>
+              </w:rPr>
+              <w:t>48</w:t>
+            </w:r>
+          </w:p>
+        </w:tc>
+        <w:tc>
+          <w:tcPr>
+            <w:tcW w:w="0" w:type="auto"/>
+            <w:hideMark/>
+          </w:tcPr>
+          <w:p>
+            <w:pPr>
+              <w:spacing w:after="160" w:line="278" w:lineRule="auto"/>
+              <w:rPr>
+                <w:sz w:val="20"/>
+                <w:szCs w:val="20"/>
+              </w:rPr>
+            </w:pPr>
+            <w:r>
+              <w:rPr>
+                <w:sz w:val="20"/>
+                <w:szCs w:val="20"/>
+              </w:rPr>
+              <w:t>GPIO27</w:t>
+            </w:r>
+          </w:p>
+        </w:tc>
+        <w:tc>
+          <w:tcPr>
+            <w:tcW w:w="0" w:type="auto"/>
+            <w:hideMark/>
+          </w:tcPr>
+          <w:p>
+            <w:pPr>
+              <w:spacing w:after="160" w:line="278" w:lineRule="auto"/>
+              <w:rPr>
+                <w:sz w:val="20"/>
+                <w:szCs w:val="20"/>
+              </w:rPr>
+            </w:pPr>
+            <w:r>
+              <w:rPr>
+                <w:sz w:val="20"/>
+                <w:szCs w:val="20"/>
+              </w:rPr>
+              <w:t>GPIO</w:t>
+            </w:r>
+          </w:p>
+        </w:tc>
+      </w:tr>
+      <w:tr>
+        <w:tc>
+          <w:tcPr>
+            <w:tcW w:w="0" w:type="auto"/>
+            <w:hideMark/>
+          </w:tcPr>
+          <w:p>
+            <w:pPr>
+              <w:spacing w:after="160" w:line="278" w:lineRule="auto"/>
+              <w:rPr>
+                <w:sz w:val="20"/>
+                <w:szCs w:val="20"/>
+              </w:rPr>
+            </w:pPr>
+            <w:r>
+              <w:rPr>
+                <w:sz w:val="20"/>
+                <w:szCs w:val="20"/>
+              </w:rPr>
+              <w:t>49</w:t>
+            </w:r>
+          </w:p>
+        </w:tc>
+        <w:tc>
+          <w:tcPr>
+            <w:tcW w:w="0" w:type="auto"/>
+            <w:hideMark/>
+          </w:tcPr>
+          <w:p>
+            <w:pPr>
+              <w:spacing w:after="160" w:line="278" w:lineRule="auto"/>
+              <w:rPr>
+                <w:sz w:val="20"/>
+                <w:szCs w:val="20"/>
+              </w:rPr>
+            </w:pPr>
+            <w:r>
+              <w:rPr>
+                <w:sz w:val="20"/>
+                <w:szCs w:val="20"/>
+              </w:rPr>
+              <w:t>GPIO18</w:t>
+            </w:r>
+          </w:p>
+        </w:tc>
+        <w:tc>
+          <w:tcPr>
+            <w:tcW w:w="0" w:type="auto"/>
+            <w:hideMark/>
+          </w:tcPr>
+          <w:p>
+            <w:pPr>
+              <w:spacing w:after="160" w:line="278" w:lineRule="auto"/>
+              <w:rPr>
+                <w:sz w:val="20"/>
+                <w:szCs w:val="20"/>
+              </w:rPr>
+            </w:pPr>
+            <w:r>
+              <w:rPr>
+                <w:sz w:val="20"/>
+                <w:szCs w:val="20"/>
+              </w:rPr>
+              <w:t>SPI1 CE0 / PWM / GPIO</w:t>
+            </w:r>
+          </w:p>
+        </w:tc>
+      </w:tr>
+      <w:tr>
+        <w:tc>
+          <w:tcPr>
+            <w:tcW w:w="0" w:type="auto"/>
+            <w:hideMark/>
+          </w:tcPr>
+          <w:p>
+            <w:pPr>
+              <w:spacing w:after="160" w:line="278" w:lineRule="auto"/>
+              <w:rPr>
+                <w:sz w:val="20"/>
+                <w:szCs w:val="20"/>
+              </w:rPr>
+            </w:pPr>
+            <w:r>
+              <w:rPr>
+                <w:sz w:val="20"/>
+                <w:szCs w:val="20"/>
+              </w:rPr>
+              <w:t>50</w:t>
+            </w:r>
+          </w:p>
+        </w:tc>
+        <w:tc>
+          <w:tcPr>
+            <w:tcW w:w="0" w:type="auto"/>
+            <w:hideMark/>
+          </w:tcPr>
+          <w:p>
+            <w:pPr>
+              <w:spacing w:after="160" w:line="278" w:lineRule="auto"/>
+              <w:rPr>
+                <w:sz w:val="20"/>
+                <w:szCs w:val="20"/>
+              </w:rPr>
+            </w:pPr>
+            <w:r>
+              <w:rPr>
+                <w:sz w:val="20"/>
+                <w:szCs w:val="20"/>
+              </w:rPr>
+              <w:t>GPIO17</w:t>
+            </w:r>
+          </w:p>
+        </w:tc>
+        <w:tc>
+          <w:tcPr>
+            <w:tcW w:w="0" w:type="auto"/>
+            <w:hideMark/>
+          </w:tcPr>
+          <w:p>
+            <w:pPr>
+              <w:spacing w:after="160" w:line="278" w:lineRule="auto"/>
+              <w:rPr>
+                <w:sz w:val="20"/>
+                <w:szCs w:val="20"/>
+              </w:rPr>
+            </w:pPr>
+            <w:r>
+              <w:rPr>
+                <w:sz w:val="20"/>
+                <w:szCs w:val="20"/>
+              </w:rPr>
+              <w:t>GPIO / SPI1 CE1 alt</w:t>
+            </w:r>
+          </w:p>
+        </w:tc>
+      </w:tr>
+      <w:tr>
+        <w:tc>
+          <w:tcPr>
+            <w:tcW w:w="0" w:type="auto"/>
+            <w:hideMark/>
+          </w:tcPr>
+          <w:p>
+            <w:pPr>
+              <w:spacing w:after="160" w:line="278" w:lineRule="auto"/>
+              <w:rPr>
+                <w:sz w:val="20"/>
+                <w:szCs w:val="20"/>
+              </w:rPr>
+            </w:pPr>
+            <w:r>
+              <w:rPr>
+                <w:sz w:val="20"/>
+                <w:szCs w:val="20"/>
+              </w:rPr>
+              <w:t>51</w:t>
+            </w:r>
+          </w:p>
+        </w:tc>
+        <w:tc>
+          <w:tcPr>
+            <w:tcW w:w="0" w:type="auto"/>
+            <w:hideMark/>
+          </w:tcPr>
+          <w:p>
+            <w:pPr>
+              <w:spacing w:after="160" w:line="278" w:lineRule="auto"/>
+              <w:rPr>
+                <w:sz w:val="20"/>
+                <w:szCs w:val="20"/>
+              </w:rPr>
+            </w:pPr>
+            <w:r>
+              <w:rPr>
+                <w:sz w:val="20"/>
+                <w:szCs w:val="20"/>
+              </w:rPr>
+              <w:t>GPIO15</w:t>
+            </w:r>
+          </w:p>
+        </w:tc>
+        <w:tc>
+          <w:tcPr>
+            <w:tcW w:w="0" w:type="auto"/>
+            <w:hideMark/>
+          </w:tcPr>
+          <w:p>
+            <w:pPr>
+              <w:spacing w:after="160" w:line="278" w:lineRule="auto"/>
+              <w:rPr>
+                <w:sz w:val="20"/>
+                <w:szCs w:val="20"/>
+              </w:rPr>
+            </w:pPr>
+            <w:r>
+              <w:rPr>
+                <w:b/>
+                <w:bCs/>
+                <w:sz w:val="20"/>
+                <w:szCs w:val="20"/>
+              </w:rPr>
+              <w:t>UART RX</w:t>
+            </w:r>
+          </w:p>
+        </w:tc>
+      </w:tr>
+      <w:tr>
+        <w:tc>
+          <w:tcPr>
+            <w:tcW w:w="0" w:type="auto"/>
+            <w:hideMark/>
+          </w:tcPr>
+          <w:p>
+            <w:pPr>
+              <w:spacing w:after="160" w:line="278" w:lineRule="auto"/>
+              <w:rPr>
+                <w:sz w:val="20"/>
+                <w:szCs w:val="20"/>
+              </w:rPr>
+            </w:pPr>
+            <w:r>
+              <w:rPr>
+                <w:sz w:val="20"/>
+                <w:szCs w:val="20"/>
+              </w:rPr>
+              <w:t>54</w:t>
+            </w:r>
+          </w:p>
+        </w:tc>
+        <w:tc>
+          <w:tcPr>
+            <w:tcW w:w="0" w:type="auto"/>
+            <w:hideMark/>
+          </w:tcPr>
+          <w:p>
+            <w:pPr>
+              <w:spacing w:after="160" w:line="278" w:lineRule="auto"/>
+              <w:rPr>
+                <w:sz w:val="20"/>
+                <w:szCs w:val="20"/>
+              </w:rPr>
+            </w:pPr>
+            <w:r>
+              <w:rPr>
+                <w:sz w:val="20"/>
+                <w:szCs w:val="20"/>
+              </w:rPr>
+              <w:t>GPIO4</w:t>
+            </w:r>
+          </w:p>
+        </w:tc>
+        <w:tc>
+          <w:tcPr>
+            <w:tcW w:w="0" w:type="auto"/>
+            <w:hideMark/>
+          </w:tcPr>
+          <w:p>
+            <w:pPr>
+              <w:spacing w:after="160" w:line="278" w:lineRule="auto"/>
+              <w:rPr>
+                <w:sz w:val="20"/>
+                <w:szCs w:val="20"/>
+              </w:rPr>
+            </w:pPr>
+            <w:r>
+              <w:rPr>
+                <w:sz w:val="20"/>
+                <w:szCs w:val="20"/>
+              </w:rPr>
+              <w:t>GPIO / GPCLK / I2C alt</w:t>
+            </w:r>
+          </w:p>
+        </w:tc>
+      </w:tr>
+      <w:tr>
+        <w:tc>
+          <w:tcPr>
+            <w:tcW w:w="0" w:type="auto"/>
+            <w:hideMark/>
+          </w:tcPr>
+          <w:p>
+            <w:pPr>
+              <w:spacing w:after="160" w:line="278" w:lineRule="auto"/>
+              <w:rPr>
+                <w:sz w:val="20"/>
+                <w:szCs w:val="20"/>
+              </w:rPr>
+            </w:pPr>
+            <w:r>
+              <w:rPr>
+                <w:sz w:val="20"/>
+                <w:szCs w:val="20"/>
+              </w:rPr>
+              <w:t>55</w:t>
+            </w:r>
+          </w:p>
+        </w:tc>
+        <w:tc>
+          <w:tcPr>
+            <w:tcW w:w="0" w:type="auto"/>
+            <w:hideMark/>
+          </w:tcPr>
+          <w:p>
+            <w:pPr>
+              <w:spacing w:after="160" w:line="278" w:lineRule="auto"/>
+              <w:rPr>
+                <w:sz w:val="20"/>
+                <w:szCs w:val="20"/>
+              </w:rPr>
+            </w:pPr>
+            <w:r>
+              <w:rPr>
+                <w:sz w:val="20"/>
+                <w:szCs w:val="20"/>
+              </w:rPr>
+              <w:t>GPIO14</w:t>
+            </w:r>
+          </w:p>
+        </w:tc>
+        <w:tc>
+          <w:tcPr>
+            <w:tcW w:w="0" w:type="auto"/>
+            <w:hideMark/>
+          </w:tcPr>
+          <w:p>
+            <w:pPr>
+              <w:spacing w:after="160" w:line="278" w:lineRule="auto"/>
+              <w:rPr>
+                <w:sz w:val="20"/>
+                <w:szCs w:val="20"/>
+              </w:rPr>
+            </w:pPr>
+            <w:r>
+              <w:rPr>
+                <w:b/>
+                <w:bCs/>
+                <w:sz w:val="20"/>
+                <w:szCs w:val="20"/>
+              </w:rPr>
+              <w:t>UART TX</w:t>
+            </w:r>
+          </w:p>
+        </w:tc>
+      </w:tr>
+      <w:tr>
+        <w:tc>
+          <w:tcPr>
+            <w:tcW w:w="0" w:type="auto"/>
+            <w:hideMark/>
+          </w:tcPr>
+          <w:p>
+            <w:pPr>
+              <w:spacing w:after="160" w:line="278" w:lineRule="auto"/>
+              <w:rPr>
+                <w:sz w:val="20"/>
+                <w:szCs w:val="20"/>
+              </w:rPr>
+            </w:pPr>
+            <w:r>
+              <w:rPr>
+                <w:sz w:val="20"/>
+                <w:szCs w:val="20"/>
+              </w:rPr>
+              <w:t>56</w:t>
+            </w:r>
+          </w:p>
+        </w:tc>
+        <w:tc>
+          <w:tcPr>
+            <w:tcW w:w="0" w:type="auto"/>
+            <w:hideMark/>
+          </w:tcPr>
+          <w:p>
+            <w:pPr>
+              <w:spacing w:after="160" w:line="278" w:lineRule="auto"/>
+              <w:rPr>
+                <w:sz w:val="20"/>
+                <w:szCs w:val="20"/>
+              </w:rPr>
+            </w:pPr>
+            <w:r>
+              <w:rPr>
+                <w:sz w:val="20"/>
+                <w:szCs w:val="20"/>
+              </w:rPr>
+              <w:t>GPIO3</w:t>
+            </w:r>
+          </w:p>
+        </w:tc>
+        <w:tc>
+          <w:tcPr>
+            <w:tcW w:w="0" w:type="auto"/>
+            <w:hideMark/>
+          </w:tcPr>
+          <w:p>
+            <w:pPr>
+              <w:spacing w:after="160" w:line="278" w:lineRule="auto"/>
+              <w:rPr>
+                <w:sz w:val="20"/>
+                <w:szCs w:val="20"/>
+              </w:rPr>
+            </w:pPr>
+            <w:r>
+              <w:rPr>
+                <w:b/>
+                <w:bCs/>
+                <w:sz w:val="20"/>
+                <w:szCs w:val="20"/>
+              </w:rPr>
+              <w:t>I2C1 SCL</w:t>
+            </w:r>
+          </w:p>
+        </w:tc>
+      </w:tr>
+      <w:tr>
+        <w:tc>
+          <w:tcPr>
+            <w:tcW w:w="0" w:type="auto"/>
+            <w:hideMark/>
+          </w:tcPr>
+          <w:p>
+            <w:pPr>
+              <w:spacing w:after="160" w:line="278" w:lineRule="auto"/>
+              <w:rPr>
+                <w:sz w:val="20"/>
+                <w:szCs w:val="20"/>
+              </w:rPr>
+            </w:pPr>
+            <w:r>
+              <w:rPr>
+                <w:sz w:val="20"/>
+                <w:szCs w:val="20"/>
+              </w:rPr>
+              <w:t>58</w:t>
+            </w:r>
+          </w:p>
+        </w:tc>
+        <w:tc>
+          <w:tcPr>
+            <w:tcW w:w="0" w:type="auto"/>
+            <w:hideMark/>
+          </w:tcPr>
+          <w:p>
+            <w:pPr>
+              <w:spacing w:after="160" w:line="278" w:lineRule="auto"/>
+              <w:rPr>
+                <w:sz w:val="20"/>
+                <w:szCs w:val="20"/>
+              </w:rPr>
+            </w:pPr>
+            <w:r>
+              <w:rPr>
+                <w:sz w:val="20"/>
+                <w:szCs w:val="20"/>
+              </w:rPr>
+              <w:t>GPIO2</w:t>
+            </w:r>
+          </w:p>
+        </w:tc>
+        <w:tc>
+          <w:tcPr>
+            <w:tcW w:w="0" w:type="auto"/>
+            <w:hideMark/>
+          </w:tcPr>
+          <w:p>
+            <w:pPr>
+              <w:spacing w:after="160" w:line="278" w:lineRule="auto"/>
+              <w:rPr>
+                <w:sz w:val="20"/>
+                <w:szCs w:val="20"/>
+              </w:rPr>
+            </w:pPr>
+            <w:r>
+              <w:rPr>
+                <w:b/>
+                <w:bCs/>
+                <w:sz w:val="20"/>
+                <w:szCs w:val="20"/>
+              </w:rPr>
+              <w:t>I2C1 SDA</w:t>
+            </w:r>
+          </w:p>
+        </w:tc>
+      </w:tr>
+    </w:tbl>
+    <w:p>
+      <w:r>
+        <w:br w:type="page"/>
+      </w:r>
+    </w:p>
+    <w:p>
       <w:pPr>
         <w:pStyle w:val="Heading1"/>
       </w:pPr>
       <w:bookmarkStart w:id="8" w:name="_Toc223434591"/>
       <w:r>
-        <w:lastRenderedPageBreak/>
         <w:t>Formules</w:t>
       </w:r>
       <w:bookmarkEnd w:id="8"/>
@@ -21351,7 +23387,6 @@
         <w:rPr>
           <w:lang w:val="en-GB"/>
         </w:rPr>
-        <w:lastRenderedPageBreak/>
         <w:t xml:space="preserve">Copied files from existing </w:t>
       </w:r>
       <w:proofErr w:type="spellStart"/>
@@ -21770,7 +23805,6 @@
         <w:pStyle w:val="NoSpacing"/>
       </w:pPr>
       <w:r>
-        <w:lastRenderedPageBreak/>
         <w:t>https://www.snapeda.com/parts/1255AY-3R3N%3DP3/Murata/view-part/?ref=search&amp;t=1255AY-3R3N%3DP3</w:t>
       </w:r>
     </w:p>

</xml_diff>